<commit_message>
fix(arch): align Week 3 architecture with submitted SRS Revision 2.8 and university evaluator feedback
</commit_message>
<xml_diff>
--- a/Resources/HIGH_LEVEL_ARCHITECTURE.docx
+++ b/Resources/HIGH_LEVEL_ARCHITECTURE.docx
@@ -299,7 +299,7 @@
                 <w:sz w:val="20"/>
                 <w:szCs w:val="20"/>
               </w:rPr>
-              <w:t xml:space="preserve">Revision 1.0 (Academic Milestone Delivery)</w:t>
+              <w:t xml:space="preserve">Revision 1.1 (Academic Milestone Baseline — Evaluator Aligned)</w:t>
             </w:r>
           </w:p>
         </w:tc>
@@ -366,7 +366,7 @@
                 <w:sz w:val="20"/>
                 <w:szCs w:val="20"/>
               </w:rPr>
-              <w:t xml:space="preserve">October 14, 2026</w:t>
+              <w:t xml:space="preserve">October 16, 2026</w:t>
             </w:r>
           </w:p>
         </w:tc>
@@ -2345,7 +2345,63 @@
           <w:sz w:val="22"/>
           <w:szCs w:val="22"/>
         </w:rPr>
-        <w:t xml:space="preserve">)—before transitioning through an attested 15-state lifecycle automaton backed by an append-only, hash-chained audit ledger (</w:t>
+        <w:t xml:space="preserve">)—before transitioning through an attested 15-state lifecycle automaton backed by an append-only, dual hash-chained audit ledger (</w:t>
+      </w:r>
+      <w:r>
+        <w:rPr>
+          <w:rFonts w:ascii="Times New Roman" w:cs="Times New Roman" w:eastAsia="Times New Roman" w:hAnsi="Times New Roman"/>
+          <w:b w:val="0"/>
+          <w:bCs w:val="0"/>
+          <w:i w:val="0"/>
+          <w:iCs w:val="0"/>
+          <w:u w:val="none"/>
+          <w:color w:val="000000"/>
+          <w:sz w:val="22"/>
+          <w:szCs w:val="22"/>
+        </w:rPr>
+        <w:t xml:space="preserve">tenant_row_hash</w:t>
+      </w:r>
+      <w:r>
+        <w:rPr>
+          <w:rFonts w:ascii="Times New Roman" w:cs="Times New Roman" w:eastAsia="Times New Roman" w:hAnsi="Times New Roman"/>
+          <w:b w:val="0"/>
+          <w:bCs w:val="0"/>
+          <w:i w:val="0"/>
+          <w:iCs w:val="0"/>
+          <w:u w:val="none"/>
+          <w:color w:val="000000"/>
+          <w:sz w:val="22"/>
+          <w:szCs w:val="22"/>
+        </w:rPr>
+        <w:t xml:space="preserve"> and </w:t>
+      </w:r>
+      <w:r>
+        <w:rPr>
+          <w:rFonts w:ascii="Times New Roman" w:cs="Times New Roman" w:eastAsia="Times New Roman" w:hAnsi="Times New Roman"/>
+          <w:b w:val="0"/>
+          <w:bCs w:val="0"/>
+          <w:i w:val="0"/>
+          <w:iCs w:val="0"/>
+          <w:u w:val="none"/>
+          <w:color w:val="000000"/>
+          <w:sz w:val="22"/>
+          <w:szCs w:val="22"/>
+        </w:rPr>
+        <w:t xml:space="preserve">report_chain_hash</w:t>
+      </w:r>
+      <w:r>
+        <w:rPr>
+          <w:rFonts w:ascii="Times New Roman" w:cs="Times New Roman" w:eastAsia="Times New Roman" w:hAnsi="Times New Roman"/>
+          <w:b w:val="0"/>
+          <w:bCs w:val="0"/>
+          <w:i w:val="0"/>
+          <w:iCs w:val="0"/>
+          <w:u w:val="none"/>
+          <w:color w:val="000000"/>
+          <w:sz w:val="22"/>
+          <w:szCs w:val="22"/>
+        </w:rPr>
+        <w:t xml:space="preserve">, </w:t>
       </w:r>
       <w:r>
         <w:rPr>
@@ -2624,21 +2680,49 @@
           <w:sz w:val="22"/>
           <w:szCs w:val="22"/>
         </w:rPr>
-        <w:t xml:space="preserve">) is immutably anchored in an append-only ledger using SHA-256 state chaining (</w:t>
-      </w:r>
-      <w:r>
-        <w:rPr>
-          <w:rFonts w:ascii="Times New Roman" w:cs="Times New Roman" w:eastAsia="Times New Roman" w:hAnsi="Times New Roman"/>
-          <w:b w:val="0"/>
-          <w:bCs w:val="0"/>
-          <w:i w:val="0"/>
-          <w:iCs w:val="0"/>
-          <w:u w:val="none"/>
-          <w:color w:val="000000"/>
-          <w:sz w:val="22"/>
-          <w:szCs w:val="22"/>
-        </w:rPr>
-        <w:t xml:space="preserve">prev_hash</w:t>
+        <w:t xml:space="preserve">) is immutably anchored in an append-only ledger using SHA-256 dual state chaining (</w:t>
+      </w:r>
+      <w:r>
+        <w:rPr>
+          <w:rFonts w:ascii="Times New Roman" w:cs="Times New Roman" w:eastAsia="Times New Roman" w:hAnsi="Times New Roman"/>
+          <w:b w:val="0"/>
+          <w:bCs w:val="0"/>
+          <w:i w:val="0"/>
+          <w:iCs w:val="0"/>
+          <w:u w:val="none"/>
+          <w:color w:val="000000"/>
+          <w:sz w:val="22"/>
+          <w:szCs w:val="22"/>
+        </w:rPr>
+        <w:t xml:space="preserve">tenant_row_hash</w:t>
+      </w:r>
+      <w:r>
+        <w:rPr>
+          <w:rFonts w:ascii="Times New Roman" w:cs="Times New Roman" w:eastAsia="Times New Roman" w:hAnsi="Times New Roman"/>
+          <w:b w:val="0"/>
+          <w:bCs w:val="0"/>
+          <w:i w:val="0"/>
+          <w:iCs w:val="0"/>
+          <w:u w:val="none"/>
+          <w:color w:val="000000"/>
+          <w:sz w:val="22"/>
+          <w:szCs w:val="22"/>
+        </w:rPr>
+        <w:t xml:space="preserve"> and </w:t>
+      </w:r>
+      <w:r>
+        <w:rPr>
+          <w:rFonts w:ascii="Times New Roman" w:cs="Times New Roman" w:eastAsia="Times New Roman" w:hAnsi="Times New Roman"/>
+          <w:b w:val="0"/>
+          <w:bCs w:val="0"/>
+          <w:i w:val="0"/>
+          <w:iCs w:val="0"/>
+          <w:u w:val="none"/>
+          <w:color w:val="000000"/>
+          <w:sz w:val="22"/>
+          <w:szCs w:val="22"/>
+        </w:rPr>
+        <w:t xml:space="preserve">report_chain_hash</w:t>
       </w:r>
       <w:r>
         <w:rPr>
@@ -2701,7 +2785,7 @@
           <w:sz w:val="22"/>
           <w:szCs w:val="22"/>
         </w:rPr>
-        <w:t xml:space="preserve">: API serverless routes achieve &lt; 250 ms p95 response times; client-side OpenPGP v6 Curve25519 key generation executes in &lt; 50 ms; deterministic CVSS v3.1 scoring executes in &lt; 5 ms.</w:t>
+        <w:t xml:space="preserve">: API serverless routes achieve p95 latency &lt;= 400 ms on warm invocations and &lt;= 1,200 ms on cold starts; client-side OpenPGP v6 Curve25519 key generation executes in &lt; 50 ms; deterministic CVSS v3.1 scoring executes in &lt; 5 ms.</w:t>
       </w:r>
     </w:p>
     <w:p>
@@ -2778,7 +2862,7 @@
           <w:sz w:val="22"/>
           <w:szCs w:val="22"/>
         </w:rPr>
-        <w:t xml:space="preserve"> on verified free tiers for university evaluation, while commercial scaling requires only </w:t>
+        <w:t xml:space="preserve"> on verified permanent free tiers for university evaluation, while commercial scaling requires only </w:t>
       </w:r>
       <w:r>
         <w:rPr>
@@ -3187,7 +3271,7 @@
           <w:sz w:val="18"/>
           <w:szCs w:val="18"/>
         </w:rPr>
-        <w:t xml:space="preserve">|  - Server-Side RBAC, Session Governance, Shared-Store Rate Limiting           |</w:t>
+        <w:t xml:space="preserve">|  - Server-Side RBAC, CSPRNG Session Tokens, Shared-Store Rate Limiting        |</w:t>
       </w:r>
     </w:p>
     <w:p>
@@ -3247,7 +3331,7 @@
           <w:sz w:val="18"/>
           <w:szCs w:val="18"/>
         </w:rPr>
-        <w:t xml:space="preserve">|  - Hourly Scheduled Cron Engine (Ed25519 X-Cron-Signature Authentication)     |</w:t>
+        <w:t xml:space="preserve">|  - Scheduled Cron Worker (POST /api/v1/internal/cron/sla-check HMAC-SHA256)   |</w:t>
       </w:r>
     </w:p>
     <w:p>
@@ -3307,7 +3391,7 @@
           <w:sz w:val="18"/>
           <w:szCs w:val="18"/>
         </w:rPr>
-        <w:t xml:space="preserve">                     TLS 1.3 Pooled TCP (PgBouncer: Port 6543)</w:t>
+        <w:t xml:space="preserve">                      TLS 1.3 Pooled TCP (PgBouncer: Port 6543)</w:t>
       </w:r>
     </w:p>
     <w:p>
@@ -3407,7 +3491,7 @@
           <w:sz w:val="18"/>
           <w:szCs w:val="18"/>
         </w:rPr>
-        <w:t xml:space="preserve">|    * FORCE ROW LEVEL SECURITY on all tenant tables (bbt_app_runtime role)     |</w:t>
+        <w:t xml:space="preserve">|    * FORCE ROW LEVEL SECURITY on all tenant tables (bbt_app role)             |</w:t>
       </w:r>
     </w:p>
     <w:p>
@@ -3447,7 +3531,7 @@
           <w:sz w:val="18"/>
           <w:szCs w:val="18"/>
         </w:rPr>
-        <w:t xml:space="preserve">|    * Append-Only Hash-Chained Audit Ledger (SHA-256 prev_hash &amp; Checkpoints) |</w:t>
+        <w:t xml:space="preserve">|    * Dual Hash-Chained Audit Ledger (tenant_row_hash &amp; report_chain_hash)     |</w:t>
       </w:r>
     </w:p>
     <w:p>
@@ -4276,7 +4360,35 @@
           <w:sz w:val="22"/>
           <w:szCs w:val="22"/>
         </w:rPr>
-        <w:t xml:space="preserve">). Serverless functions are stateless and spin up in &lt; 150 ms.</w:t>
+        <w:t xml:space="preserve">). Serverless functions are stateless, achieving warm p95 response times &lt;= 400 ms and cold-start execution &lt;= 1,200 ms (</w:t>
+      </w:r>
+      <w:r>
+        <w:rPr>
+          <w:rFonts w:ascii="Times New Roman" w:cs="Times New Roman" w:eastAsia="Times New Roman" w:hAnsi="Times New Roman"/>
+          <w:b w:val="0"/>
+          <w:bCs w:val="0"/>
+          <w:i w:val="0"/>
+          <w:iCs w:val="0"/>
+          <w:u w:val="none"/>
+          <w:color w:val="000000"/>
+          <w:sz w:val="22"/>
+          <w:szCs w:val="22"/>
+        </w:rPr>
+        <w:t xml:space="preserve">NFR-01</w:t>
+      </w:r>
+      <w:r>
+        <w:rPr>
+          <w:rFonts w:ascii="Times New Roman" w:cs="Times New Roman" w:eastAsia="Times New Roman" w:hAnsi="Times New Roman"/>
+          <w:b w:val="0"/>
+          <w:bCs w:val="0"/>
+          <w:i w:val="0"/>
+          <w:iCs w:val="0"/>
+          <w:u w:val="none"/>
+          <w:color w:val="000000"/>
+          <w:sz w:val="22"/>
+          <w:szCs w:val="22"/>
+        </w:rPr>
+        <w:t xml:space="preserve">).</w:t>
       </w:r>
     </w:p>
     <w:p>
@@ -4325,35 +4437,231 @@
           <w:sz w:val="22"/>
           <w:szCs w:val="22"/>
         </w:rPr>
-        <w:t xml:space="preserve">: Validates Argon2id session tokens, checks HTTP-only </w:t>
-      </w:r>
-      <w:r>
-        <w:rPr>
-          <w:rFonts w:ascii="Times New Roman" w:cs="Times New Roman" w:eastAsia="Times New Roman" w:hAnsi="Times New Roman"/>
-          <w:b w:val="0"/>
-          <w:bCs w:val="0"/>
-          <w:i w:val="0"/>
-          <w:iCs w:val="0"/>
-          <w:u w:val="none"/>
-          <w:color w:val="000000"/>
-          <w:sz w:val="22"/>
-          <w:szCs w:val="22"/>
-        </w:rPr>
-        <w:t xml:space="preserve">SameSite=Strict</w:t>
-      </w:r>
-      <w:r>
-        <w:rPr>
-          <w:rFonts w:ascii="Times New Roman" w:cs="Times New Roman" w:eastAsia="Times New Roman" w:hAnsi="Times New Roman"/>
-          <w:b w:val="0"/>
-          <w:bCs w:val="0"/>
-          <w:i w:val="0"/>
-          <w:iCs w:val="0"/>
-          <w:u w:val="none"/>
-          <w:color w:val="000000"/>
-          <w:sz w:val="22"/>
-          <w:szCs w:val="22"/>
-        </w:rPr>
-        <w:t xml:space="preserve"> cookies, enforces tenant isolation by injecting </w:t>
+        <w:t xml:space="preserve">: Manages session governance using 256-bit cryptographically secure pseudorandom values (CSPRNG), storing only SHA-256 hashes in the database (</w:t>
+      </w:r>
+      <w:r>
+        <w:rPr>
+          <w:rFonts w:ascii="Times New Roman" w:cs="Times New Roman" w:eastAsia="Times New Roman" w:hAnsi="Times New Roman"/>
+          <w:b w:val="0"/>
+          <w:bCs w:val="0"/>
+          <w:i w:val="0"/>
+          <w:iCs w:val="0"/>
+          <w:u w:val="none"/>
+          <w:color w:val="000000"/>
+          <w:sz w:val="22"/>
+          <w:szCs w:val="22"/>
+        </w:rPr>
+        <w:t xml:space="preserve">bbt_core.sessions.token_hash</w:t>
+      </w:r>
+      <w:r>
+        <w:rPr>
+          <w:rFonts w:ascii="Times New Roman" w:cs="Times New Roman" w:eastAsia="Times New Roman" w:hAnsi="Times New Roman"/>
+          <w:b w:val="0"/>
+          <w:bCs w:val="0"/>
+          <w:i w:val="0"/>
+          <w:iCs w:val="0"/>
+          <w:u w:val="none"/>
+          <w:color w:val="000000"/>
+          <w:sz w:val="22"/>
+          <w:szCs w:val="22"/>
+        </w:rPr>
+        <w:t xml:space="preserve">). User passwords are protected using Argon2id (</w:t>
+      </w:r>
+      <w:r>
+        <w:rPr>
+          <w:rFonts w:ascii="Times New Roman" w:cs="Times New Roman" w:eastAsia="Times New Roman" w:hAnsi="Times New Roman"/>
+          <w:b w:val="0"/>
+          <w:bCs w:val="0"/>
+          <w:i w:val="0"/>
+          <w:iCs w:val="0"/>
+          <w:u w:val="none"/>
+          <w:color w:val="000000"/>
+          <w:sz w:val="22"/>
+          <w:szCs w:val="22"/>
+        </w:rPr>
+        <w:t xml:space="preserve">FR-1.3a</w:t>
+      </w:r>
+      <w:r>
+        <w:rPr>
+          <w:rFonts w:ascii="Times New Roman" w:cs="Times New Roman" w:eastAsia="Times New Roman" w:hAnsi="Times New Roman"/>
+          <w:b w:val="0"/>
+          <w:bCs w:val="0"/>
+          <w:i w:val="0"/>
+          <w:iCs w:val="0"/>
+          <w:u w:val="none"/>
+          <w:color w:val="000000"/>
+          <w:sz w:val="22"/>
+          <w:szCs w:val="22"/>
+        </w:rPr>
+        <w:t xml:space="preserve">). Session cookies use the secure cookie name </w:t>
+      </w:r>
+      <w:r>
+        <w:rPr>
+          <w:rFonts w:ascii="Times New Roman" w:cs="Times New Roman" w:eastAsia="Times New Roman" w:hAnsi="Times New Roman"/>
+          <w:b w:val="0"/>
+          <w:bCs w:val="0"/>
+          <w:i w:val="0"/>
+          <w:iCs w:val="0"/>
+          <w:u w:val="none"/>
+          <w:color w:val="000000"/>
+          <w:sz w:val="22"/>
+          <w:szCs w:val="22"/>
+        </w:rPr>
+        <w:t xml:space="preserve">__Host-bbt-session</w:t>
+      </w:r>
+      <w:r>
+        <w:rPr>
+          <w:rFonts w:ascii="Times New Roman" w:cs="Times New Roman" w:eastAsia="Times New Roman" w:hAnsi="Times New Roman"/>
+          <w:b w:val="0"/>
+          <w:bCs w:val="0"/>
+          <w:i w:val="0"/>
+          <w:iCs w:val="0"/>
+          <w:u w:val="none"/>
+          <w:color w:val="000000"/>
+          <w:sz w:val="22"/>
+          <w:szCs w:val="22"/>
+        </w:rPr>
+        <w:t xml:space="preserve"> with attributes </w:t>
+      </w:r>
+      <w:r>
+        <w:rPr>
+          <w:rFonts w:ascii="Times New Roman" w:cs="Times New Roman" w:eastAsia="Times New Roman" w:hAnsi="Times New Roman"/>
+          <w:b w:val="0"/>
+          <w:bCs w:val="0"/>
+          <w:i w:val="0"/>
+          <w:iCs w:val="0"/>
+          <w:u w:val="none"/>
+          <w:color w:val="000000"/>
+          <w:sz w:val="22"/>
+          <w:szCs w:val="22"/>
+        </w:rPr>
+        <w:t xml:space="preserve">SameSite=Lax</w:t>
+      </w:r>
+      <w:r>
+        <w:rPr>
+          <w:rFonts w:ascii="Times New Roman" w:cs="Times New Roman" w:eastAsia="Times New Roman" w:hAnsi="Times New Roman"/>
+          <w:b w:val="0"/>
+          <w:bCs w:val="0"/>
+          <w:i w:val="0"/>
+          <w:iCs w:val="0"/>
+          <w:u w:val="none"/>
+          <w:color w:val="000000"/>
+          <w:sz w:val="22"/>
+          <w:szCs w:val="22"/>
+        </w:rPr>
+        <w:t xml:space="preserve">, </w:t>
+      </w:r>
+      <w:r>
+        <w:rPr>
+          <w:rFonts w:ascii="Times New Roman" w:cs="Times New Roman" w:eastAsia="Times New Roman" w:hAnsi="Times New Roman"/>
+          <w:b w:val="0"/>
+          <w:bCs w:val="0"/>
+          <w:i w:val="0"/>
+          <w:iCs w:val="0"/>
+          <w:u w:val="none"/>
+          <w:color w:val="000000"/>
+          <w:sz w:val="22"/>
+          <w:szCs w:val="22"/>
+        </w:rPr>
+        <w:t xml:space="preserve">Secure</w:t>
+      </w:r>
+      <w:r>
+        <w:rPr>
+          <w:rFonts w:ascii="Times New Roman" w:cs="Times New Roman" w:eastAsia="Times New Roman" w:hAnsi="Times New Roman"/>
+          <w:b w:val="0"/>
+          <w:bCs w:val="0"/>
+          <w:i w:val="0"/>
+          <w:iCs w:val="0"/>
+          <w:u w:val="none"/>
+          <w:color w:val="000000"/>
+          <w:sz w:val="22"/>
+          <w:szCs w:val="22"/>
+        </w:rPr>
+        <w:t xml:space="preserve">, </w:t>
+      </w:r>
+      <w:r>
+        <w:rPr>
+          <w:rFonts w:ascii="Times New Roman" w:cs="Times New Roman" w:eastAsia="Times New Roman" w:hAnsi="Times New Roman"/>
+          <w:b w:val="0"/>
+          <w:bCs w:val="0"/>
+          <w:i w:val="0"/>
+          <w:iCs w:val="0"/>
+          <w:u w:val="none"/>
+          <w:color w:val="000000"/>
+          <w:sz w:val="22"/>
+          <w:szCs w:val="22"/>
+        </w:rPr>
+        <w:t xml:space="preserve">HttpOnly</w:t>
+      </w:r>
+      <w:r>
+        <w:rPr>
+          <w:rFonts w:ascii="Times New Roman" w:cs="Times New Roman" w:eastAsia="Times New Roman" w:hAnsi="Times New Roman"/>
+          <w:b w:val="0"/>
+          <w:bCs w:val="0"/>
+          <w:i w:val="0"/>
+          <w:iCs w:val="0"/>
+          <w:u w:val="none"/>
+          <w:color w:val="000000"/>
+          <w:sz w:val="22"/>
+          <w:szCs w:val="22"/>
+        </w:rPr>
+        <w:t xml:space="preserve">, and </w:t>
+      </w:r>
+      <w:r>
+        <w:rPr>
+          <w:rFonts w:ascii="Times New Roman" w:cs="Times New Roman" w:eastAsia="Times New Roman" w:hAnsi="Times New Roman"/>
+          <w:b w:val="0"/>
+          <w:bCs w:val="0"/>
+          <w:i w:val="0"/>
+          <w:iCs w:val="0"/>
+          <w:u w:val="none"/>
+          <w:color w:val="000000"/>
+          <w:sz w:val="22"/>
+          <w:szCs w:val="22"/>
+        </w:rPr>
+        <w:t xml:space="preserve">Path=/</w:t>
+      </w:r>
+      <w:r>
+        <w:rPr>
+          <w:rFonts w:ascii="Times New Roman" w:cs="Times New Roman" w:eastAsia="Times New Roman" w:hAnsi="Times New Roman"/>
+          <w:b w:val="0"/>
+          <w:bCs w:val="0"/>
+          <w:i w:val="0"/>
+          <w:iCs w:val="0"/>
+          <w:u w:val="none"/>
+          <w:color w:val="000000"/>
+          <w:sz w:val="22"/>
+          <w:szCs w:val="22"/>
+        </w:rPr>
+        <w:t xml:space="preserve">. The </w:t>
+      </w:r>
+      <w:r>
+        <w:rPr>
+          <w:rFonts w:ascii="Times New Roman" w:cs="Times New Roman" w:eastAsia="Times New Roman" w:hAnsi="Times New Roman"/>
+          <w:b w:val="0"/>
+          <w:bCs w:val="0"/>
+          <w:i w:val="0"/>
+          <w:iCs w:val="0"/>
+          <w:u w:val="none"/>
+          <w:color w:val="000000"/>
+          <w:sz w:val="22"/>
+          <w:szCs w:val="22"/>
+        </w:rPr>
+        <w:t xml:space="preserve">SameSite=Lax</w:t>
+      </w:r>
+      <w:r>
+        <w:rPr>
+          <w:rFonts w:ascii="Times New Roman" w:cs="Times New Roman" w:eastAsia="Times New Roman" w:hAnsi="Times New Roman"/>
+          <w:b w:val="0"/>
+          <w:bCs w:val="0"/>
+          <w:i w:val="0"/>
+          <w:iCs w:val="0"/>
+          <w:u w:val="none"/>
+          <w:color w:val="000000"/>
+          <w:sz w:val="22"/>
+          <w:szCs w:val="22"/>
+        </w:rPr>
+        <w:t xml:space="preserve"> policy allows legitimate top-level navigations (such as following email notifications or external bookmarks) to retain active session state, preventing disruptive session drops on safe GET requests, while withholding cookies on cross-site subrequests. All state-changing endpoints (POST, PUT, PATCH, DELETE) enforce JSON payload requirements and anti-CSRF request validation. Tenant isolation is enforced by injecting </w:t>
       </w:r>
       <w:r>
         <w:rPr>
@@ -4381,7 +4689,7 @@
           <w:sz w:val="22"/>
           <w:szCs w:val="22"/>
         </w:rPr>
-        <w:t xml:space="preserve"> into database execution contexts, and requires mandatory TOTP MFA step-up for </w:t>
+        <w:t xml:space="preserve"> into database execution contexts, and mandatory TOTP MFA step-up is required for </w:t>
       </w:r>
       <w:r>
         <w:rPr>
@@ -4486,7 +4794,63 @@
           <w:sz w:val="22"/>
           <w:szCs w:val="22"/>
         </w:rPr>
-        <w:t xml:space="preserve">: A pure TypeScript implementation of FIRST.org CVSS v3.1 Base scoring. It calculates vulnerability scores on the server using the official coefficient </w:t>
+        <w:t xml:space="preserve">: A pure TypeScript implementation of FIRST.org CVSS v3.1 Base scoring (</w:t>
+      </w:r>
+      <w:r>
+        <w:rPr>
+          <w:rFonts w:ascii="Times New Roman" w:cs="Times New Roman" w:eastAsia="Times New Roman" w:hAnsi="Times New Roman"/>
+          <w:b w:val="0"/>
+          <w:bCs w:val="0"/>
+          <w:i w:val="0"/>
+          <w:iCs w:val="0"/>
+          <w:u w:val="none"/>
+          <w:color w:val="000000"/>
+          <w:sz w:val="22"/>
+          <w:szCs w:val="22"/>
+        </w:rPr>
+        <w:t xml:space="preserve">FR-4.1</w:t>
+      </w:r>
+      <w:r>
+        <w:rPr>
+          <w:rFonts w:ascii="Times New Roman" w:cs="Times New Roman" w:eastAsia="Times New Roman" w:hAnsi="Times New Roman"/>
+          <w:b w:val="0"/>
+          <w:bCs w:val="0"/>
+          <w:i w:val="0"/>
+          <w:iCs w:val="0"/>
+          <w:u w:val="none"/>
+          <w:color w:val="000000"/>
+          <w:sz w:val="22"/>
+          <w:szCs w:val="22"/>
+        </w:rPr>
+        <w:t xml:space="preserve"> – </w:t>
+      </w:r>
+      <w:r>
+        <w:rPr>
+          <w:rFonts w:ascii="Times New Roman" w:cs="Times New Roman" w:eastAsia="Times New Roman" w:hAnsi="Times New Roman"/>
+          <w:b w:val="0"/>
+          <w:bCs w:val="0"/>
+          <w:i w:val="0"/>
+          <w:iCs w:val="0"/>
+          <w:u w:val="none"/>
+          <w:color w:val="000000"/>
+          <w:sz w:val="22"/>
+          <w:szCs w:val="22"/>
+        </w:rPr>
+        <w:t xml:space="preserve">FR-4.4</w:t>
+      </w:r>
+      <w:r>
+        <w:rPr>
+          <w:rFonts w:ascii="Times New Roman" w:cs="Times New Roman" w:eastAsia="Times New Roman" w:hAnsi="Times New Roman"/>
+          <w:b w:val="0"/>
+          <w:bCs w:val="0"/>
+          <w:i w:val="0"/>
+          <w:iCs w:val="0"/>
+          <w:u w:val="none"/>
+          <w:color w:val="000000"/>
+          <w:sz w:val="22"/>
+          <w:szCs w:val="22"/>
+        </w:rPr>
+        <w:t xml:space="preserve">). It accepts valid CVSS v3.1 base metrics in any ordering, parses and validates all mandatory metrics, computes the Base score using the official coefficient </w:t>
       </w:r>
       <w:r>
         <w:rPr>
@@ -4542,7 +4906,63 @@
           <w:sz w:val="22"/>
           <w:szCs w:val="22"/>
         </w:rPr>
-        <w:t xml:space="preserve"> ceiling function, verifying 100% mathematical parity across the 45 reference test fixtures.</w:t>
+        <w:t xml:space="preserve"> ceiling function in &lt; 5 ms (</w:t>
+      </w:r>
+      <w:r>
+        <w:rPr>
+          <w:rFonts w:ascii="Times New Roman" w:cs="Times New Roman" w:eastAsia="Times New Roman" w:hAnsi="Times New Roman"/>
+          <w:b w:val="0"/>
+          <w:bCs w:val="0"/>
+          <w:i w:val="0"/>
+          <w:iCs w:val="0"/>
+          <w:u w:val="none"/>
+          <w:color w:val="000000"/>
+          <w:sz w:val="22"/>
+          <w:szCs w:val="22"/>
+        </w:rPr>
+        <w:t xml:space="preserve">NFR-02</w:t>
+      </w:r>
+      <w:r>
+        <w:rPr>
+          <w:rFonts w:ascii="Times New Roman" w:cs="Times New Roman" w:eastAsia="Times New Roman" w:hAnsi="Times New Roman"/>
+          <w:b w:val="0"/>
+          <w:bCs w:val="0"/>
+          <w:i w:val="0"/>
+          <w:iCs w:val="0"/>
+          <w:u w:val="none"/>
+          <w:color w:val="000000"/>
+          <w:sz w:val="22"/>
+          <w:szCs w:val="22"/>
+        </w:rPr>
+        <w:t xml:space="preserve">), and serializes metrics into the canonical FIRST.org vector format (</w:t>
+      </w:r>
+      <w:r>
+        <w:rPr>
+          <w:rFonts w:ascii="Times New Roman" w:cs="Times New Roman" w:eastAsia="Times New Roman" w:hAnsi="Times New Roman"/>
+          <w:b w:val="0"/>
+          <w:bCs w:val="0"/>
+          <w:i w:val="0"/>
+          <w:iCs w:val="0"/>
+          <w:u w:val="none"/>
+          <w:color w:val="000000"/>
+          <w:sz w:val="22"/>
+          <w:szCs w:val="22"/>
+        </w:rPr>
+        <w:t xml:space="preserve">CVSS:3.1/AV:X/AC:X/PR:X/UI:X/S:X/C:X/I:X/A:X</w:t>
+      </w:r>
+      <w:r>
+        <w:rPr>
+          <w:rFonts w:ascii="Times New Roman" w:cs="Times New Roman" w:eastAsia="Times New Roman" w:hAnsi="Times New Roman"/>
+          <w:b w:val="0"/>
+          <w:bCs w:val="0"/>
+          <w:i w:val="0"/>
+          <w:iCs w:val="0"/>
+          <w:u w:val="none"/>
+          <w:color w:val="000000"/>
+          <w:sz w:val="22"/>
+          <w:szCs w:val="22"/>
+        </w:rPr>
+        <w:t xml:space="preserve">).</w:t>
       </w:r>
     </w:p>
     <w:p>
@@ -4591,7 +5011,35 @@
           <w:sz w:val="22"/>
           <w:szCs w:val="22"/>
         </w:rPr>
-        <w:t xml:space="preserve">: Integrates with the GitHub REST API v3 to verify commit existence and branch inclusion (</w:t>
+        <w:t xml:space="preserve">: Integrates with the GitHub REST API v3 to verify commit existence and branch inclusion via </w:t>
+      </w:r>
+      <w:r>
+        <w:rPr>
+          <w:rFonts w:ascii="Times New Roman" w:cs="Times New Roman" w:eastAsia="Times New Roman" w:hAnsi="Times New Roman"/>
+          <w:b w:val="0"/>
+          <w:bCs w:val="0"/>
+          <w:i w:val="0"/>
+          <w:iCs w:val="0"/>
+          <w:u w:val="none"/>
+          <w:color w:val="000000"/>
+          <w:sz w:val="22"/>
+          <w:szCs w:val="22"/>
+        </w:rPr>
+        <w:t xml:space="preserve">GET /repos/{owner}/{repo}/compare/{branch}...{sha}</w:t>
+      </w:r>
+      <w:r>
+        <w:rPr>
+          <w:rFonts w:ascii="Times New Roman" w:cs="Times New Roman" w:eastAsia="Times New Roman" w:hAnsi="Times New Roman"/>
+          <w:b w:val="0"/>
+          <w:bCs w:val="0"/>
+          <w:i w:val="0"/>
+          <w:iCs w:val="0"/>
+          <w:u w:val="none"/>
+          <w:color w:val="000000"/>
+          <w:sz w:val="22"/>
+          <w:szCs w:val="22"/>
+        </w:rPr>
+        <w:t xml:space="preserve"> (</w:t>
       </w:r>
       <w:r>
         <w:rPr>
@@ -4647,21 +5095,105 @@
           <w:sz w:val="22"/>
           <w:szCs w:val="22"/>
         </w:rPr>
-        <w:t xml:space="preserve">), and executes hourly claim-lease cleanup tasks authenticated via Ed25519 signed JWT headers (</w:t>
-      </w:r>
-      <w:r>
-        <w:rPr>
-          <w:rFonts w:ascii="Times New Roman" w:cs="Times New Roman" w:eastAsia="Times New Roman" w:hAnsi="Times New Roman"/>
-          <w:b w:val="0"/>
-          <w:bCs w:val="0"/>
-          <w:i w:val="0"/>
-          <w:iCs w:val="0"/>
-          <w:u w:val="none"/>
-          <w:color w:val="000000"/>
-          <w:sz w:val="22"/>
-          <w:szCs w:val="22"/>
-        </w:rPr>
-        <w:t xml:space="preserve">X-Cron-Signature</w:t>
+        <w:t xml:space="preserve">), and executes hourly claim-lease cleanup tasks on </w:t>
+      </w:r>
+      <w:r>
+        <w:rPr>
+          <w:rFonts w:ascii="Times New Roman" w:cs="Times New Roman" w:eastAsia="Times New Roman" w:hAnsi="Times New Roman"/>
+          <w:b w:val="0"/>
+          <w:bCs w:val="0"/>
+          <w:i w:val="0"/>
+          <w:iCs w:val="0"/>
+          <w:u w:val="none"/>
+          <w:color w:val="000000"/>
+          <w:sz w:val="22"/>
+          <w:szCs w:val="22"/>
+        </w:rPr>
+        <w:t xml:space="preserve">POST /api/v1/internal/cron/sla-check</w:t>
+      </w:r>
+      <w:r>
+        <w:rPr>
+          <w:rFonts w:ascii="Times New Roman" w:cs="Times New Roman" w:eastAsia="Times New Roman" w:hAnsi="Times New Roman"/>
+          <w:b w:val="0"/>
+          <w:bCs w:val="0"/>
+          <w:i w:val="0"/>
+          <w:iCs w:val="0"/>
+          <w:u w:val="none"/>
+          <w:color w:val="000000"/>
+          <w:sz w:val="22"/>
+          <w:szCs w:val="22"/>
+        </w:rPr>
+        <w:t xml:space="preserve"> authenticated via HMAC-SHA256 request headers (</w:t>
+      </w:r>
+      <w:r>
+        <w:rPr>
+          <w:rFonts w:ascii="Times New Roman" w:cs="Times New Roman" w:eastAsia="Times New Roman" w:hAnsi="Times New Roman"/>
+          <w:b w:val="0"/>
+          <w:bCs w:val="0"/>
+          <w:i w:val="0"/>
+          <w:iCs w:val="0"/>
+          <w:u w:val="none"/>
+          <w:color w:val="000000"/>
+          <w:sz w:val="22"/>
+          <w:szCs w:val="22"/>
+        </w:rPr>
+        <w:t xml:space="preserve">X-Cron-Timestamp</w:t>
+      </w:r>
+      <w:r>
+        <w:rPr>
+          <w:rFonts w:ascii="Times New Roman" w:cs="Times New Roman" w:eastAsia="Times New Roman" w:hAnsi="Times New Roman"/>
+          <w:b w:val="0"/>
+          <w:bCs w:val="0"/>
+          <w:i w:val="0"/>
+          <w:iCs w:val="0"/>
+          <w:u w:val="none"/>
+          <w:color w:val="000000"/>
+          <w:sz w:val="22"/>
+          <w:szCs w:val="22"/>
+        </w:rPr>
+        <w:t xml:space="preserve"> and </w:t>
+      </w:r>
+      <w:r>
+        <w:rPr>
+          <w:rFonts w:ascii="Times New Roman" w:cs="Times New Roman" w:eastAsia="Times New Roman" w:hAnsi="Times New Roman"/>
+          <w:b w:val="0"/>
+          <w:bCs w:val="0"/>
+          <w:i w:val="0"/>
+          <w:iCs w:val="0"/>
+          <w:u w:val="none"/>
+          <w:color w:val="000000"/>
+          <w:sz w:val="22"/>
+          <w:szCs w:val="22"/>
+        </w:rPr>
+        <w:t xml:space="preserve">X-Cron-Signature: sha256=&lt;64-hex-hmac&gt;</w:t>
+      </w:r>
+      <w:r>
+        <w:rPr>
+          <w:rFonts w:ascii="Times New Roman" w:cs="Times New Roman" w:eastAsia="Times New Roman" w:hAnsi="Times New Roman"/>
+          <w:b w:val="0"/>
+          <w:bCs w:val="0"/>
+          <w:i w:val="0"/>
+          <w:iCs w:val="0"/>
+          <w:u w:val="none"/>
+          <w:color w:val="000000"/>
+          <w:sz w:val="22"/>
+          <w:szCs w:val="22"/>
+        </w:rPr>
+        <w:t xml:space="preserve">, </w:t>
+      </w:r>
+      <w:r>
+        <w:rPr>
+          <w:rFonts w:ascii="Times New Roman" w:cs="Times New Roman" w:eastAsia="Times New Roman" w:hAnsi="Times New Roman"/>
+          <w:b w:val="0"/>
+          <w:bCs w:val="0"/>
+          <w:i w:val="0"/>
+          <w:iCs w:val="0"/>
+          <w:u w:val="none"/>
+          <w:color w:val="000000"/>
+          <w:sz w:val="22"/>
+          <w:szCs w:val="22"/>
+        </w:rPr>
+        <w:t xml:space="preserve">FR-8.4c</w:t>
       </w:r>
       <w:r>
         <w:rPr>
@@ -4835,21 +5367,49 @@
           <w:sz w:val="22"/>
           <w:szCs w:val="22"/>
         </w:rPr>
-        <w:t xml:space="preserve">bbt_app_runtime</w:t>
-      </w:r>
-      <w:r>
-        <w:rPr>
-          <w:rFonts w:ascii="Times New Roman" w:cs="Times New Roman" w:eastAsia="Times New Roman" w:hAnsi="Times New Roman"/>
-          <w:b w:val="0"/>
-          <w:bCs w:val="0"/>
-          <w:i w:val="0"/>
-          <w:iCs w:val="0"/>
-          <w:u w:val="none"/>
-          <w:color w:val="000000"/>
-          <w:sz w:val="22"/>
-          <w:szCs w:val="22"/>
-        </w:rPr>
-        <w:t xml:space="preserve"> database role. Connection pooling is multiplexed through PgBouncer (</w:t>
+        <w:t xml:space="preserve">bbt_app</w:t>
+      </w:r>
+      <w:r>
+        <w:rPr>
+          <w:rFonts w:ascii="Times New Roman" w:cs="Times New Roman" w:eastAsia="Times New Roman" w:hAnsi="Times New Roman"/>
+          <w:b w:val="0"/>
+          <w:bCs w:val="0"/>
+          <w:i w:val="0"/>
+          <w:iCs w:val="0"/>
+          <w:u w:val="none"/>
+          <w:color w:val="000000"/>
+          <w:sz w:val="22"/>
+          <w:szCs w:val="22"/>
+        </w:rPr>
+        <w:t xml:space="preserve"> database role (</w:t>
+      </w:r>
+      <w:r>
+        <w:rPr>
+          <w:rFonts w:ascii="Times New Roman" w:cs="Times New Roman" w:eastAsia="Times New Roman" w:hAnsi="Times New Roman"/>
+          <w:b w:val="0"/>
+          <w:bCs w:val="0"/>
+          <w:i w:val="0"/>
+          <w:iCs w:val="0"/>
+          <w:u w:val="none"/>
+          <w:color w:val="000000"/>
+          <w:sz w:val="22"/>
+          <w:szCs w:val="22"/>
+        </w:rPr>
+        <w:t xml:space="preserve">NOSUPERUSER NOBYPASSRLS</w:t>
+      </w:r>
+      <w:r>
+        <w:rPr>
+          <w:rFonts w:ascii="Times New Roman" w:cs="Times New Roman" w:eastAsia="Times New Roman" w:hAnsi="Times New Roman"/>
+          <w:b w:val="0"/>
+          <w:bCs w:val="0"/>
+          <w:i w:val="0"/>
+          <w:iCs w:val="0"/>
+          <w:u w:val="none"/>
+          <w:color w:val="000000"/>
+          <w:sz w:val="22"/>
+          <w:szCs w:val="22"/>
+        </w:rPr>
+        <w:t xml:space="preserve">). Connection pooling is multiplexed through PgBouncer (</w:t>
       </w:r>
       <w:r>
         <w:rPr>
@@ -4912,7 +5472,7 @@
           <w:sz w:val="22"/>
           <w:szCs w:val="22"/>
         </w:rPr>
-        <w:t xml:space="preserve">Hash-Chained Audit Ledger</w:t>
+        <w:t xml:space="preserve">Dual Hash-Chained Audit Ledger</w:t>
       </w:r>
       <w:r>
         <w:rPr>
@@ -4954,35 +5514,153 @@
           <w:sz w:val="22"/>
           <w:szCs w:val="22"/>
         </w:rPr>
-        <w:t xml:space="preserve">) where every state transition, access grant, and remediation attestation is cryptographically bound to the previous event via SHA-256 (</w:t>
-      </w:r>
-      <w:r>
-        <w:rPr>
-          <w:rFonts w:ascii="Times New Roman" w:cs="Times New Roman" w:eastAsia="Times New Roman" w:hAnsi="Times New Roman"/>
-          <w:b w:val="0"/>
-          <w:bCs w:val="0"/>
-          <w:i w:val="0"/>
-          <w:iCs w:val="0"/>
-          <w:u w:val="none"/>
-          <w:color w:val="000000"/>
-          <w:sz w:val="22"/>
-          <w:szCs w:val="22"/>
-        </w:rPr>
-        <w:t xml:space="preserve">prev_hash</w:t>
-      </w:r>
-      <w:r>
-        <w:rPr>
-          <w:rFonts w:ascii="Times New Roman" w:cs="Times New Roman" w:eastAsia="Times New Roman" w:hAnsi="Times New Roman"/>
-          <w:b w:val="0"/>
-          <w:bCs w:val="0"/>
-          <w:i w:val="0"/>
-          <w:iCs w:val="0"/>
-          <w:u w:val="none"/>
-          <w:color w:val="000000"/>
-          <w:sz w:val="22"/>
-          <w:szCs w:val="22"/>
-        </w:rPr>
-        <w:t xml:space="preserve">).</w:t>
+        <w:t xml:space="preserve">) where every state transition, access grant, and remediation attestation is cryptographically bound using two concurrent hash chains:</w:t>
+      </w:r>
+    </w:p>
+    <w:p>
+      <w:pPr>
+        <w:spacing w:before="30" w:after="30" w:line="240" w:lineRule="auto"/>
+        <w:jc w:val="left"/>
+        <w:ind w:left="720"/>
+      </w:pPr>
+      <w:r>
+        <w:rPr>
+          <w:rFonts w:ascii="Times New Roman" w:cs="Times New Roman" w:eastAsia="Times New Roman" w:hAnsi="Times New Roman"/>
+          <w:b w:val="0"/>
+          <w:bCs w:val="0"/>
+          <w:i w:val="0"/>
+          <w:iCs w:val="0"/>
+          <w:u w:val="none"/>
+          <w:color w:val="000000"/>
+          <w:sz w:val="22"/>
+          <w:szCs w:val="22"/>
+        </w:rPr>
+        <w:t xml:space="preserve">1. </w:t>
+      </w:r>
+      <w:r>
+        <w:rPr>
+          <w:rFonts w:ascii="Times New Roman" w:cs="Times New Roman" w:eastAsia="Times New Roman" w:hAnsi="Times New Roman"/>
+          <w:b w:val="0"/>
+          <w:bCs w:val="0"/>
+          <w:i w:val="0"/>
+          <w:iCs w:val="0"/>
+          <w:u w:val="none"/>
+          <w:color w:val="000000"/>
+          <w:sz w:val="22"/>
+          <w:szCs w:val="22"/>
+        </w:rPr>
+        <w:t xml:space="preserve">tenant_row_hash</w:t>
+      </w:r>
+      <w:r>
+        <w:rPr>
+          <w:rFonts w:ascii="Times New Roman" w:cs="Times New Roman" w:eastAsia="Times New Roman" w:hAnsi="Times New Roman"/>
+          <w:b w:val="0"/>
+          <w:bCs w:val="0"/>
+          <w:i w:val="0"/>
+          <w:iCs w:val="0"/>
+          <w:u w:val="none"/>
+          <w:color w:val="000000"/>
+          <w:sz w:val="22"/>
+          <w:szCs w:val="22"/>
+        </w:rPr>
+        <w:t xml:space="preserve">: A tenant-wide chronological hash chain linking all organization audit events.</w:t>
+      </w:r>
+    </w:p>
+    <w:p>
+      <w:pPr>
+        <w:spacing w:before="30" w:after="30" w:line="240" w:lineRule="auto"/>
+        <w:jc w:val="left"/>
+        <w:ind w:left="720"/>
+      </w:pPr>
+      <w:r>
+        <w:rPr>
+          <w:rFonts w:ascii="Times New Roman" w:cs="Times New Roman" w:eastAsia="Times New Roman" w:hAnsi="Times New Roman"/>
+          <w:b w:val="0"/>
+          <w:bCs w:val="0"/>
+          <w:i w:val="0"/>
+          <w:iCs w:val="0"/>
+          <w:u w:val="none"/>
+          <w:color w:val="000000"/>
+          <w:sz w:val="22"/>
+          <w:szCs w:val="22"/>
+        </w:rPr>
+        <w:t xml:space="preserve">2. </w:t>
+      </w:r>
+      <w:r>
+        <w:rPr>
+          <w:rFonts w:ascii="Times New Roman" w:cs="Times New Roman" w:eastAsia="Times New Roman" w:hAnsi="Times New Roman"/>
+          <w:b w:val="0"/>
+          <w:bCs w:val="0"/>
+          <w:i w:val="0"/>
+          <w:iCs w:val="0"/>
+          <w:u w:val="none"/>
+          <w:color w:val="000000"/>
+          <w:sz w:val="22"/>
+          <w:szCs w:val="22"/>
+        </w:rPr>
+        <w:t xml:space="preserve">report_chain_hash</w:t>
+      </w:r>
+      <w:r>
+        <w:rPr>
+          <w:rFonts w:ascii="Times New Roman" w:cs="Times New Roman" w:eastAsia="Times New Roman" w:hAnsi="Times New Roman"/>
+          <w:b w:val="0"/>
+          <w:bCs w:val="0"/>
+          <w:i w:val="0"/>
+          <w:iCs w:val="0"/>
+          <w:u w:val="none"/>
+          <w:color w:val="000000"/>
+          <w:sz w:val="22"/>
+          <w:szCs w:val="22"/>
+        </w:rPr>
+        <w:t xml:space="preserve">: A report-scoped hash chain linking the lifecycle events of an individual report.</w:t>
+      </w:r>
+    </w:p>
+    <w:p>
+      <w:pPr>
+        <w:spacing w:before="60" w:after="80" w:line="240" w:lineRule="auto"/>
+        <w:jc w:val="left"/>
+      </w:pPr>
+      <w:r>
+        <w:rPr>
+          <w:rFonts w:ascii="Times New Roman" w:cs="Times New Roman" w:eastAsia="Times New Roman" w:hAnsi="Times New Roman"/>
+          <w:b w:val="0"/>
+          <w:bCs w:val="0"/>
+          <w:i w:val="0"/>
+          <w:iCs w:val="0"/>
+          <w:u w:val="none"/>
+          <w:color w:val="000000"/>
+          <w:sz w:val="22"/>
+          <w:szCs w:val="22"/>
+        </w:rPr>
+        <w:t xml:space="preserve">Both chains compute SHA-256 digests over </w:t>
+      </w:r>
+      <w:r>
+        <w:rPr>
+          <w:rFonts w:ascii="Times New Roman" w:cs="Times New Roman" w:eastAsia="Times New Roman" w:hAnsi="Times New Roman"/>
+          <w:b w:val="0"/>
+          <w:bCs w:val="0"/>
+          <w:i w:val="0"/>
+          <w:iCs w:val="0"/>
+          <w:u w:val="none"/>
+          <w:color w:val="000000"/>
+          <w:sz w:val="22"/>
+          <w:szCs w:val="22"/>
+        </w:rPr>
+        <w:t xml:space="preserve">(prev_hash, sequence_no, event_type, actor_id, payload_digest, timestamp)</w:t>
+      </w:r>
+      <w:r>
+        <w:rPr>
+          <w:rFonts w:ascii="Times New Roman" w:cs="Times New Roman" w:eastAsia="Times New Roman" w:hAnsi="Times New Roman"/>
+          <w:b w:val="0"/>
+          <w:bCs w:val="0"/>
+          <w:i w:val="0"/>
+          <w:iCs w:val="0"/>
+          <w:u w:val="none"/>
+          <w:color w:val="000000"/>
+          <w:sz w:val="22"/>
+          <w:szCs w:val="22"/>
+        </w:rPr>
+        <w:t xml:space="preserve">.</w:t>
       </w:r>
     </w:p>
     <w:p>
@@ -5031,7 +5709,7 @@
           <w:sz w:val="22"/>
           <w:szCs w:val="22"/>
         </w:rPr>
-        <w:t xml:space="preserve">: S3-compatible, zero-egress-fee distributed object storage holding client-encrypted binary PoC attachments. Objects are addressed by UUIDv4 keys and protected at rest by Cloudflare SSE-R2 AES-256 encryption.</w:t>
+        <w:t xml:space="preserve">: S3-compatible, zero-egress-fee distributed object storage holding client-encrypted binary PoC attachments. Objects are addressed by immutable UUIDv4 keys and protected at rest by Cloudflare SSE-R2 AES-256 encryption.</w:t>
       </w:r>
     </w:p>
     <w:p>
@@ -5091,7 +5769,7 @@
       <w:r>
         <w:drawing>
           <wp:inline xmlns:wp="http://schemas.openxmlformats.org/drawingml/2006/wordprocessingDrawing" xmlns:a="http://schemas.openxmlformats.org/drawingml/2006/main" xmlns:pic="http://schemas.openxmlformats.org/drawingml/2006/picture" xmlns:r="http://schemas.openxmlformats.org/officeDocument/2006/relationships" distT="0" distB="0" distL="0" distR="0">
-            <wp:extent cx="5800000" cy="3132338"/>
+            <wp:extent cx="5800000" cy="6461139"/>
             <wp:effectExtent l="0" t="0" r="0" b="0"/>
             <wp:docPr id="201" name="Figure 3.1 3-Tier Zero-Plaintext Architecture Diagram" descr="Figure 3.1 3-Tier Zero-Plaintext Architecture Diagram"/>
             <wp:cNvGraphicFramePr>
@@ -5115,7 +5793,7 @@
                   <pic:spPr>
                     <a:xfrm>
                       <a:off x="0" y="0"/>
-                      <a:ext cx="5800000" cy="3132338"/>
+                      <a:ext cx="5800000" cy="6461139"/>
                     </a:xfrm>
                     <a:prstGeom prst="rect">
                       <a:avLst/>
@@ -5499,7 +6177,105 @@
                 <w:sz w:val="20"/>
                 <w:szCs w:val="20"/>
               </w:rPr>
-              <w:t xml:space="preserve">HTTP-only Session Cookie / Turnstile Token; JSON payloads (Class A metadata + Class B/C armored ciphertext).</w:t>
+              <w:t xml:space="preserve">__Host-bbt-session</w:t>
+            </w:r>
+            <w:r>
+              <w:rPr>
+                <w:rFonts w:ascii="Times New Roman" w:cs="Times New Roman" w:eastAsia="Times New Roman" w:hAnsi="Times New Roman"/>
+                <w:b w:val="0"/>
+                <w:bCs w:val="0"/>
+                <w:i w:val="0"/>
+                <w:iCs w:val="0"/>
+                <w:u w:val="none"/>
+                <w:color w:val="000000"/>
+                <w:sz w:val="20"/>
+                <w:szCs w:val="20"/>
+              </w:rPr>
+              <w:t xml:space="preserve"> Cookie (</w:t>
+            </w:r>
+            <w:r>
+              <w:rPr>
+                <w:rFonts w:ascii="Times New Roman" w:cs="Times New Roman" w:eastAsia="Times New Roman" w:hAnsi="Times New Roman"/>
+                <w:b w:val="0"/>
+                <w:bCs w:val="0"/>
+                <w:i w:val="0"/>
+                <w:iCs w:val="0"/>
+                <w:u w:val="none"/>
+                <w:color w:val="000000"/>
+                <w:sz w:val="20"/>
+                <w:szCs w:val="20"/>
+              </w:rPr>
+              <w:t xml:space="preserve">SameSite=Lax</w:t>
+            </w:r>
+            <w:r>
+              <w:rPr>
+                <w:rFonts w:ascii="Times New Roman" w:cs="Times New Roman" w:eastAsia="Times New Roman" w:hAnsi="Times New Roman"/>
+                <w:b w:val="0"/>
+                <w:bCs w:val="0"/>
+                <w:i w:val="0"/>
+                <w:iCs w:val="0"/>
+                <w:u w:val="none"/>
+                <w:color w:val="000000"/>
+                <w:sz w:val="20"/>
+                <w:szCs w:val="20"/>
+              </w:rPr>
+              <w:t xml:space="preserve">, </w:t>
+            </w:r>
+            <w:r>
+              <w:rPr>
+                <w:rFonts w:ascii="Times New Roman" w:cs="Times New Roman" w:eastAsia="Times New Roman" w:hAnsi="Times New Roman"/>
+                <w:b w:val="0"/>
+                <w:bCs w:val="0"/>
+                <w:i w:val="0"/>
+                <w:iCs w:val="0"/>
+                <w:u w:val="none"/>
+                <w:color w:val="000000"/>
+                <w:sz w:val="20"/>
+                <w:szCs w:val="20"/>
+              </w:rPr>
+              <w:t xml:space="preserve">Secure</w:t>
+            </w:r>
+            <w:r>
+              <w:rPr>
+                <w:rFonts w:ascii="Times New Roman" w:cs="Times New Roman" w:eastAsia="Times New Roman" w:hAnsi="Times New Roman"/>
+                <w:b w:val="0"/>
+                <w:bCs w:val="0"/>
+                <w:i w:val="0"/>
+                <w:iCs w:val="0"/>
+                <w:u w:val="none"/>
+                <w:color w:val="000000"/>
+                <w:sz w:val="20"/>
+                <w:szCs w:val="20"/>
+              </w:rPr>
+              <w:t xml:space="preserve">, </w:t>
+            </w:r>
+            <w:r>
+              <w:rPr>
+                <w:rFonts w:ascii="Times New Roman" w:cs="Times New Roman" w:eastAsia="Times New Roman" w:hAnsi="Times New Roman"/>
+                <w:b w:val="0"/>
+                <w:bCs w:val="0"/>
+                <w:i w:val="0"/>
+                <w:iCs w:val="0"/>
+                <w:u w:val="none"/>
+                <w:color w:val="000000"/>
+                <w:sz w:val="20"/>
+                <w:szCs w:val="20"/>
+              </w:rPr>
+              <w:t xml:space="preserve">HttpOnly</w:t>
+            </w:r>
+            <w:r>
+              <w:rPr>
+                <w:rFonts w:ascii="Times New Roman" w:cs="Times New Roman" w:eastAsia="Times New Roman" w:hAnsi="Times New Roman"/>
+                <w:b w:val="0"/>
+                <w:bCs w:val="0"/>
+                <w:i w:val="0"/>
+                <w:iCs w:val="0"/>
+                <w:u w:val="none"/>
+                <w:color w:val="000000"/>
+                <w:sz w:val="20"/>
+                <w:szCs w:val="20"/>
+              </w:rPr>
+              <w:t xml:space="preserve">) or Turnstile Token; JSON payloads (Class A metadata + Class B/C armored ciphertext).</w:t>
             </w:r>
           </w:p>
         </w:tc>
@@ -5903,7 +6679,7 @@
                 <w:sz w:val="20"/>
                 <w:szCs w:val="20"/>
               </w:rPr>
-              <w:t xml:space="preserve"> URL (15-minute expiry); streaming binary ciphertext decrypted locally in browser.</w:t>
+              <w:t xml:space="preserve"> URL (15-minute lease expiry); streaming binary ciphertext decrypted locally in browser.</w:t>
             </w:r>
           </w:p>
         </w:tc>
@@ -6063,7 +6839,35 @@
                 <w:sz w:val="20"/>
                 <w:szCs w:val="20"/>
               </w:rPr>
-              <w:t xml:space="preserve">Prisma ORM 5.x connection via PgBouncer; queries execute within parameterized SQL transactions.</w:t>
+              <w:t xml:space="preserve">Prisma ORM 5.x connection via PgBouncer as unprivileged </w:t>
+            </w:r>
+            <w:r>
+              <w:rPr>
+                <w:rFonts w:ascii="Times New Roman" w:cs="Times New Roman" w:eastAsia="Times New Roman" w:hAnsi="Times New Roman"/>
+                <w:b w:val="0"/>
+                <w:bCs w:val="0"/>
+                <w:i w:val="0"/>
+                <w:iCs w:val="0"/>
+                <w:u w:val="none"/>
+                <w:color w:val="000000"/>
+                <w:sz w:val="20"/>
+                <w:szCs w:val="20"/>
+              </w:rPr>
+              <w:t xml:space="preserve">bbt_app</w:t>
+            </w:r>
+            <w:r>
+              <w:rPr>
+                <w:rFonts w:ascii="Times New Roman" w:cs="Times New Roman" w:eastAsia="Times New Roman" w:hAnsi="Times New Roman"/>
+                <w:b w:val="0"/>
+                <w:bCs w:val="0"/>
+                <w:i w:val="0"/>
+                <w:iCs w:val="0"/>
+                <w:u w:val="none"/>
+                <w:color w:val="000000"/>
+                <w:sz w:val="20"/>
+                <w:szCs w:val="20"/>
+              </w:rPr>
+              <w:t xml:space="preserve"> role; queries execute within parameterized SQL transactions.</w:t>
             </w:r>
           </w:p>
         </w:tc>
@@ -6237,21 +7041,21 @@
                 <w:sz w:val="20"/>
                 <w:szCs w:val="20"/>
               </w:rPr>
-              <w:t xml:space="preserve">GET /repos/{owner}/{repo}/commits/{sha}</w:t>
-            </w:r>
-            <w:r>
-              <w:rPr>
-                <w:rFonts w:ascii="Times New Roman" w:cs="Times New Roman" w:eastAsia="Times New Roman" w:hAnsi="Times New Roman"/>
-                <w:b w:val="0"/>
-                <w:bCs w:val="0"/>
-                <w:i w:val="0"/>
-                <w:iCs w:val="0"/>
-                <w:u w:val="none"/>
-                <w:color w:val="000000"/>
-                <w:sz w:val="20"/>
-                <w:szCs w:val="20"/>
-              </w:rPr>
-              <w:t xml:space="preserve"> and branch comparisons.</w:t>
+              <w:t xml:space="preserve">GET /repos/{owner}/{repo}/compare/{branch}...{sha}</w:t>
+            </w:r>
+            <w:r>
+              <w:rPr>
+                <w:rFonts w:ascii="Times New Roman" w:cs="Times New Roman" w:eastAsia="Times New Roman" w:hAnsi="Times New Roman"/>
+                <w:b w:val="0"/>
+                <w:bCs w:val="0"/>
+                <w:i w:val="0"/>
+                <w:iCs w:val="0"/>
+                <w:u w:val="none"/>
+                <w:color w:val="000000"/>
+                <w:sz w:val="20"/>
+                <w:szCs w:val="20"/>
+              </w:rPr>
+              <w:t xml:space="preserve"> and commit metadata.</w:t>
             </w:r>
           </w:p>
         </w:tc>
@@ -6585,49 +7389,105 @@
                 <w:sz w:val="20"/>
                 <w:szCs w:val="20"/>
               </w:rPr>
-              <w:t xml:space="preserve">POST /api/cron/process-deadlines</w:t>
-            </w:r>
-            <w:r>
-              <w:rPr>
-                <w:rFonts w:ascii="Times New Roman" w:cs="Times New Roman" w:eastAsia="Times New Roman" w:hAnsi="Times New Roman"/>
-                <w:b w:val="0"/>
-                <w:bCs w:val="0"/>
-                <w:i w:val="0"/>
-                <w:iCs w:val="0"/>
-                <w:u w:val="none"/>
-                <w:color w:val="000000"/>
-                <w:sz w:val="20"/>
-                <w:szCs w:val="20"/>
-              </w:rPr>
-              <w:t xml:space="preserve"> with Ed25519-signed JWT in header </w:t>
-            </w:r>
-            <w:r>
-              <w:rPr>
-                <w:rFonts w:ascii="Times New Roman" w:cs="Times New Roman" w:eastAsia="Times New Roman" w:hAnsi="Times New Roman"/>
-                <w:b w:val="0"/>
-                <w:bCs w:val="0"/>
-                <w:i w:val="0"/>
-                <w:iCs w:val="0"/>
-                <w:u w:val="none"/>
-                <w:color w:val="000000"/>
-                <w:sz w:val="20"/>
-                <w:szCs w:val="20"/>
-              </w:rPr>
-              <w:t xml:space="preserve">X-Cron-Signature</w:t>
-            </w:r>
-            <w:r>
-              <w:rPr>
-                <w:rFonts w:ascii="Times New Roman" w:cs="Times New Roman" w:eastAsia="Times New Roman" w:hAnsi="Times New Roman"/>
-                <w:b w:val="0"/>
-                <w:bCs w:val="0"/>
-                <w:i w:val="0"/>
-                <w:iCs w:val="0"/>
-                <w:u w:val="none"/>
-                <w:color w:val="000000"/>
-                <w:sz w:val="20"/>
-                <w:szCs w:val="20"/>
-              </w:rPr>
-              <w:t xml:space="preserve">.</w:t>
+              <w:t xml:space="preserve">POST /api/v1/internal/cron/sla-check</w:t>
+            </w:r>
+            <w:r>
+              <w:rPr>
+                <w:rFonts w:ascii="Times New Roman" w:cs="Times New Roman" w:eastAsia="Times New Roman" w:hAnsi="Times New Roman"/>
+                <w:b w:val="0"/>
+                <w:bCs w:val="0"/>
+                <w:i w:val="0"/>
+                <w:iCs w:val="0"/>
+                <w:u w:val="none"/>
+                <w:color w:val="000000"/>
+                <w:sz w:val="20"/>
+                <w:szCs w:val="20"/>
+              </w:rPr>
+              <w:t xml:space="preserve"> with </w:t>
+            </w:r>
+            <w:r>
+              <w:rPr>
+                <w:rFonts w:ascii="Times New Roman" w:cs="Times New Roman" w:eastAsia="Times New Roman" w:hAnsi="Times New Roman"/>
+                <w:b w:val="0"/>
+                <w:bCs w:val="0"/>
+                <w:i w:val="0"/>
+                <w:iCs w:val="0"/>
+                <w:u w:val="none"/>
+                <w:color w:val="000000"/>
+                <w:sz w:val="20"/>
+                <w:szCs w:val="20"/>
+              </w:rPr>
+              <w:t xml:space="preserve">X-Cron-Timestamp</w:t>
+            </w:r>
+            <w:r>
+              <w:rPr>
+                <w:rFonts w:ascii="Times New Roman" w:cs="Times New Roman" w:eastAsia="Times New Roman" w:hAnsi="Times New Roman"/>
+                <w:b w:val="0"/>
+                <w:bCs w:val="0"/>
+                <w:i w:val="0"/>
+                <w:iCs w:val="0"/>
+                <w:u w:val="none"/>
+                <w:color w:val="000000"/>
+                <w:sz w:val="20"/>
+                <w:szCs w:val="20"/>
+              </w:rPr>
+              <w:t xml:space="preserve"> and </w:t>
+            </w:r>
+            <w:r>
+              <w:rPr>
+                <w:rFonts w:ascii="Times New Roman" w:cs="Times New Roman" w:eastAsia="Times New Roman" w:hAnsi="Times New Roman"/>
+                <w:b w:val="0"/>
+                <w:bCs w:val="0"/>
+                <w:i w:val="0"/>
+                <w:iCs w:val="0"/>
+                <w:u w:val="none"/>
+                <w:color w:val="000000"/>
+                <w:sz w:val="20"/>
+                <w:szCs w:val="20"/>
+              </w:rPr>
+              <w:t xml:space="preserve">X-Cron-Signature: sha256=&lt;64-hex-hmac&gt;</w:t>
+            </w:r>
+            <w:r>
+              <w:rPr>
+                <w:rFonts w:ascii="Times New Roman" w:cs="Times New Roman" w:eastAsia="Times New Roman" w:hAnsi="Times New Roman"/>
+                <w:b w:val="0"/>
+                <w:bCs w:val="0"/>
+                <w:i w:val="0"/>
+                <w:iCs w:val="0"/>
+                <w:u w:val="none"/>
+                <w:color w:val="000000"/>
+                <w:sz w:val="20"/>
+                <w:szCs w:val="20"/>
+              </w:rPr>
+              <w:t xml:space="preserve"> (</w:t>
+            </w:r>
+            <w:r>
+              <w:rPr>
+                <w:rFonts w:ascii="Times New Roman" w:cs="Times New Roman" w:eastAsia="Times New Roman" w:hAnsi="Times New Roman"/>
+                <w:b w:val="0"/>
+                <w:bCs w:val="0"/>
+                <w:i w:val="0"/>
+                <w:iCs w:val="0"/>
+                <w:u w:val="none"/>
+                <w:color w:val="000000"/>
+                <w:sz w:val="20"/>
+                <w:szCs w:val="20"/>
+              </w:rPr>
+              <w:t xml:space="preserve">FR-8.4c</w:t>
+            </w:r>
+            <w:r>
+              <w:rPr>
+                <w:rFonts w:ascii="Times New Roman" w:cs="Times New Roman" w:eastAsia="Times New Roman" w:hAnsi="Times New Roman"/>
+                <w:b w:val="0"/>
+                <w:bCs w:val="0"/>
+                <w:i w:val="0"/>
+                <w:iCs w:val="0"/>
+                <w:u w:val="none"/>
+                <w:color w:val="000000"/>
+                <w:sz w:val="20"/>
+                <w:szCs w:val="20"/>
+              </w:rPr>
+              <w:t xml:space="preserve">).</w:t>
             </w:r>
           </w:p>
         </w:tc>
@@ -6742,7 +7602,7 @@
       <w:r>
         <w:drawing>
           <wp:inline xmlns:wp="http://schemas.openxmlformats.org/drawingml/2006/wordprocessingDrawing" xmlns:a="http://schemas.openxmlformats.org/drawingml/2006/main" xmlns:pic="http://schemas.openxmlformats.org/drawingml/2006/picture" xmlns:r="http://schemas.openxmlformats.org/officeDocument/2006/relationships" distT="0" distB="0" distL="0" distR="0">
-            <wp:extent cx="5800000" cy="4219949"/>
+            <wp:extent cx="5800000" cy="4656781"/>
             <wp:effectExtent l="0" t="0" r="0" b="0"/>
             <wp:docPr id="202" name="Figure 3.2 DFD Level 0 Context Diagram" descr="Figure 3.2 DFD Level 0 Context Diagram"/>
             <wp:cNvGraphicFramePr>
@@ -6766,7 +7626,7 @@
                   <pic:spPr>
                     <a:xfrm>
                       <a:off x="0" y="0"/>
-                      <a:ext cx="5800000" cy="4219949"/>
+                      <a:ext cx="5800000" cy="4656781"/>
                     </a:xfrm>
                     <a:prstGeom prst="rect">
                       <a:avLst/>
@@ -7175,6 +8035,34 @@
           <w:sz w:val="22"/>
           <w:szCs w:val="22"/>
         </w:rPr>
+        <w:t xml:space="preserve">, P2 extension under </w:t>
+      </w:r>
+      <w:r>
+        <w:rPr>
+          <w:rFonts w:ascii="Times New Roman" w:cs="Times New Roman" w:eastAsia="Times New Roman" w:hAnsi="Times New Roman"/>
+          <w:b w:val="0"/>
+          <w:bCs w:val="0"/>
+          <w:i w:val="0"/>
+          <w:iCs w:val="0"/>
+          <w:u w:val="none"/>
+          <w:color w:val="000000"/>
+          <w:sz w:val="22"/>
+          <w:szCs w:val="22"/>
+        </w:rPr>
+        <w:t xml:space="preserve">FR-7.7</w:t>
+      </w:r>
+      <w:r>
+        <w:rPr>
+          <w:rFonts w:ascii="Times New Roman" w:cs="Times New Roman" w:eastAsia="Times New Roman" w:hAnsi="Times New Roman"/>
+          <w:b w:val="0"/>
+          <w:bCs w:val="0"/>
+          <w:i w:val="0"/>
+          <w:iCs w:val="0"/>
+          <w:u w:val="none"/>
+          <w:color w:val="000000"/>
+          <w:sz w:val="22"/>
+          <w:szCs w:val="22"/>
+        </w:rPr>
         <w:t xml:space="preserve">).</w:t>
       </w:r>
     </w:p>
@@ -7210,7 +8098,7 @@
           <w:sz w:val="22"/>
           <w:szCs w:val="22"/>
         </w:rPr>
-        <w:t xml:space="preserve">E3: GitHub REST API v3 (Version Control Integration)</w:t>
+        <w:t xml:space="preserve">E3: Version Control Forge (GitHub REST API v3)</w:t>
       </w:r>
     </w:p>
     <w:p>
@@ -7462,7 +8350,7 @@
           <w:sz w:val="22"/>
           <w:szCs w:val="22"/>
         </w:rPr>
-        <w:t xml:space="preserve">GET /repos/{owner}/{repo}/compare/{sha}...{branch}</w:t>
+        <w:t xml:space="preserve">GET /repos/{owner}/{repo}/compare/{branch}...{sha}</w:t>
       </w:r>
       <w:r>
         <w:rPr>
@@ -7511,7 +8399,7 @@
           <w:sz w:val="22"/>
           <w:szCs w:val="22"/>
         </w:rPr>
-        <w:t xml:space="preserve">E4: Resend Mail Service (Transactional Notifications)</w:t>
+        <w:t xml:space="preserve">E4: Email Notification Service (Resend Mail Service)</w:t>
       </w:r>
     </w:p>
     <w:p>
@@ -7595,7 +8483,7 @@
           <w:sz w:val="22"/>
           <w:szCs w:val="22"/>
         </w:rPr>
-        <w:t xml:space="preserve">E5: Cloudflare R2 Object Storage (Encrypted Attachment Store)</w:t>
+        <w:t xml:space="preserve">E5: Object Storage Service (Cloudflare R2 Storage)</w:t>
       </w:r>
     </w:p>
     <w:p>
@@ -7749,35 +8637,7 @@
           <w:sz w:val="22"/>
           <w:szCs w:val="22"/>
         </w:rPr>
-        <w:t xml:space="preserve">) via presigned URLs issued to authorized defenders; </w:t>
-      </w:r>
-      <w:r>
-        <w:rPr>
-          <w:rFonts w:ascii="Times New Roman" w:cs="Times New Roman" w:eastAsia="Times New Roman" w:hAnsi="Times New Roman"/>
-          <w:b w:val="0"/>
-          <w:bCs w:val="0"/>
-          <w:i w:val="0"/>
-          <w:iCs w:val="0"/>
-          <w:u w:val="none"/>
-          <w:color w:val="000000"/>
-          <w:sz w:val="22"/>
-          <w:szCs w:val="22"/>
-        </w:rPr>
-        <w:t xml:space="preserve">HeadObjectCommand</w:t>
-      </w:r>
-      <w:r>
-        <w:rPr>
-          <w:rFonts w:ascii="Times New Roman" w:cs="Times New Roman" w:eastAsia="Times New Roman" w:hAnsi="Times New Roman"/>
-          <w:b w:val="0"/>
-          <w:bCs w:val="0"/>
-          <w:i w:val="0"/>
-          <w:iCs w:val="0"/>
-          <w:u w:val="none"/>
-          <w:color w:val="000000"/>
-          <w:sz w:val="22"/>
-          <w:szCs w:val="22"/>
-        </w:rPr>
-        <w:t xml:space="preserve"> metadata queries issued by API routes.</w:t>
+        <w:t xml:space="preserve">) via presigned URLs issued to authorized defenders; attachment storage health and lease reclamation confirmations.</w:t>
       </w:r>
     </w:p>
     <w:p>
@@ -7812,7 +8672,7 @@
           <w:sz w:val="22"/>
           <w:szCs w:val="22"/>
         </w:rPr>
-        <w:t xml:space="preserve">E6: GitHub Actions Automation (Hourly Cron Scheduler)</w:t>
+        <w:t xml:space="preserve">E6: Scheduled Job Runner (GitHub Actions Automation)</w:t>
       </w:r>
     </w:p>
     <w:p>
@@ -7875,49 +8735,154 @@
           <w:sz w:val="22"/>
           <w:szCs w:val="22"/>
         </w:rPr>
-        <w:t xml:space="preserve">POST</w:t>
-      </w:r>
-      <w:r>
-        <w:rPr>
-          <w:rFonts w:ascii="Times New Roman" w:cs="Times New Roman" w:eastAsia="Times New Roman" w:hAnsi="Times New Roman"/>
-          <w:b w:val="0"/>
-          <w:bCs w:val="0"/>
-          <w:i w:val="0"/>
-          <w:iCs w:val="0"/>
-          <w:u w:val="none"/>
-          <w:color w:val="000000"/>
-          <w:sz w:val="22"/>
-          <w:szCs w:val="22"/>
-        </w:rPr>
-        <w:t xml:space="preserve"> triggers authenticated via Ed25519-signed JSON Web Tokens (</w:t>
-      </w:r>
-      <w:r>
-        <w:rPr>
-          <w:rFonts w:ascii="Times New Roman" w:cs="Times New Roman" w:eastAsia="Times New Roman" w:hAnsi="Times New Roman"/>
-          <w:b w:val="0"/>
-          <w:bCs w:val="0"/>
-          <w:i w:val="0"/>
-          <w:iCs w:val="0"/>
-          <w:u w:val="none"/>
-          <w:color w:val="000000"/>
-          <w:sz w:val="22"/>
-          <w:szCs w:val="22"/>
-        </w:rPr>
-        <w:t xml:space="preserve">X-Cron-Signature</w:t>
-      </w:r>
-      <w:r>
-        <w:rPr>
-          <w:rFonts w:ascii="Times New Roman" w:cs="Times New Roman" w:eastAsia="Times New Roman" w:hAnsi="Times New Roman"/>
-          <w:b w:val="0"/>
-          <w:bCs w:val="0"/>
-          <w:i w:val="0"/>
-          <w:iCs w:val="0"/>
-          <w:u w:val="none"/>
-          <w:color w:val="000000"/>
-          <w:sz w:val="22"/>
-          <w:szCs w:val="22"/>
-        </w:rPr>
-        <w:t xml:space="preserve">) initiating claim-lease cleanup, overdue clarification timeouts, and storage reclamation.</w:t>
+        <w:t xml:space="preserve">POST /api/v1/internal/cron/sla-check</w:t>
+      </w:r>
+      <w:r>
+        <w:rPr>
+          <w:rFonts w:ascii="Times New Roman" w:cs="Times New Roman" w:eastAsia="Times New Roman" w:hAnsi="Times New Roman"/>
+          <w:b w:val="0"/>
+          <w:bCs w:val="0"/>
+          <w:i w:val="0"/>
+          <w:iCs w:val="0"/>
+          <w:u w:val="none"/>
+          <w:color w:val="000000"/>
+          <w:sz w:val="22"/>
+          <w:szCs w:val="22"/>
+        </w:rPr>
+        <w:t xml:space="preserve"> triggers authenticated via HMAC-SHA256 request signatures (</w:t>
+      </w:r>
+      <w:r>
+        <w:rPr>
+          <w:rFonts w:ascii="Times New Roman" w:cs="Times New Roman" w:eastAsia="Times New Roman" w:hAnsi="Times New Roman"/>
+          <w:b w:val="0"/>
+          <w:bCs w:val="0"/>
+          <w:i w:val="0"/>
+          <w:iCs w:val="0"/>
+          <w:u w:val="none"/>
+          <w:color w:val="000000"/>
+          <w:sz w:val="22"/>
+          <w:szCs w:val="22"/>
+        </w:rPr>
+        <w:t xml:space="preserve">X-Cron-Signature: sha256=&lt;64-hex-hmac&gt;</w:t>
+      </w:r>
+      <w:r>
+        <w:rPr>
+          <w:rFonts w:ascii="Times New Roman" w:cs="Times New Roman" w:eastAsia="Times New Roman" w:hAnsi="Times New Roman"/>
+          <w:b w:val="0"/>
+          <w:bCs w:val="0"/>
+          <w:i w:val="0"/>
+          <w:iCs w:val="0"/>
+          <w:u w:val="none"/>
+          <w:color w:val="000000"/>
+          <w:sz w:val="22"/>
+          <w:szCs w:val="22"/>
+        </w:rPr>
+        <w:t xml:space="preserve">) initiating claim-lease cleanup, overdue clarification timeouts, and storage reclamation (</w:t>
+      </w:r>
+      <w:r>
+        <w:rPr>
+          <w:rFonts w:ascii="Times New Roman" w:cs="Times New Roman" w:eastAsia="Times New Roman" w:hAnsi="Times New Roman"/>
+          <w:b w:val="0"/>
+          <w:bCs w:val="0"/>
+          <w:i w:val="0"/>
+          <w:iCs w:val="0"/>
+          <w:u w:val="none"/>
+          <w:color w:val="000000"/>
+          <w:sz w:val="22"/>
+          <w:szCs w:val="22"/>
+        </w:rPr>
+        <w:t xml:space="preserve">FR-8.4c</w:t>
+      </w:r>
+      <w:r>
+        <w:rPr>
+          <w:rFonts w:ascii="Times New Roman" w:cs="Times New Roman" w:eastAsia="Times New Roman" w:hAnsi="Times New Roman"/>
+          <w:b w:val="0"/>
+          <w:bCs w:val="0"/>
+          <w:i w:val="0"/>
+          <w:iCs w:val="0"/>
+          <w:u w:val="none"/>
+          <w:color w:val="000000"/>
+          <w:sz w:val="22"/>
+          <w:szCs w:val="22"/>
+        </w:rPr>
+        <w:t xml:space="preserve">).</w:t>
+      </w:r>
+    </w:p>
+    <w:p>
+      <w:pPr>
+        <w:spacing w:before="30" w:after="30" w:line="240" w:lineRule="auto"/>
+        <w:jc w:val="left"/>
+        <w:ind w:left="720"/>
+      </w:pPr>
+      <w:r>
+        <w:rPr>
+          <w:rFonts w:ascii="Times New Roman" w:cs="Times New Roman" w:eastAsia="Times New Roman" w:hAnsi="Times New Roman"/>
+          <w:b w:val="0"/>
+          <w:bCs w:val="0"/>
+          <w:i w:val="0"/>
+          <w:iCs w:val="0"/>
+          <w:u w:val="none"/>
+          <w:color w:val="000000"/>
+          <w:sz w:val="22"/>
+          <w:szCs w:val="22"/>
+        </w:rPr>
+        <w:t xml:space="preserve">◦  </w:t>
+      </w:r>
+      <w:r>
+        <w:rPr>
+          <w:rFonts w:ascii="Times New Roman" w:cs="Times New Roman" w:eastAsia="Times New Roman" w:hAnsi="Times New Roman"/>
+          <w:b w:val="0"/>
+          <w:bCs w:val="0"/>
+          <w:i/>
+          <w:iCs/>
+          <w:u w:val="none"/>
+          <w:color w:val="000000"/>
+          <w:sz w:val="22"/>
+          <w:szCs w:val="22"/>
+        </w:rPr>
+        <w:t xml:space="preserve">Outflows to Scheduler</w:t>
+      </w:r>
+      <w:r>
+        <w:rPr>
+          <w:rFonts w:ascii="Times New Roman" w:cs="Times New Roman" w:eastAsia="Times New Roman" w:hAnsi="Times New Roman"/>
+          <w:b w:val="0"/>
+          <w:bCs w:val="0"/>
+          <w:i w:val="0"/>
+          <w:iCs w:val="0"/>
+          <w:u w:val="none"/>
+          <w:color w:val="000000"/>
+          <w:sz w:val="22"/>
+          <w:szCs w:val="22"/>
+        </w:rPr>
+        <w:t xml:space="preserve">: Structured JSON execution summary containing processed count, reclaimed bytes, and backlog status (</w:t>
+      </w:r>
+      <w:r>
+        <w:rPr>
+          <w:rFonts w:ascii="Times New Roman" w:cs="Times New Roman" w:eastAsia="Times New Roman" w:hAnsi="Times New Roman"/>
+          <w:b w:val="0"/>
+          <w:bCs w:val="0"/>
+          <w:i w:val="0"/>
+          <w:iCs w:val="0"/>
+          <w:u w:val="none"/>
+          <w:color w:val="000000"/>
+          <w:sz w:val="22"/>
+          <w:szCs w:val="22"/>
+        </w:rPr>
+        <w:t xml:space="preserve">has_more_backlog</w:t>
+      </w:r>
+      <w:r>
+        <w:rPr>
+          <w:rFonts w:ascii="Times New Roman" w:cs="Times New Roman" w:eastAsia="Times New Roman" w:hAnsi="Times New Roman"/>
+          <w:b w:val="0"/>
+          <w:bCs w:val="0"/>
+          <w:i w:val="0"/>
+          <w:iCs w:val="0"/>
+          <w:u w:val="none"/>
+          <w:color w:val="000000"/>
+          <w:sz w:val="22"/>
+          <w:szCs w:val="22"/>
+        </w:rPr>
+        <w:t xml:space="preserve">).</w:t>
       </w:r>
     </w:p>
     <w:p>
@@ -8005,7 +8970,7 @@
       <w:r>
         <w:drawing>
           <wp:inline xmlns:wp="http://schemas.openxmlformats.org/drawingml/2006/wordprocessingDrawing" xmlns:a="http://schemas.openxmlformats.org/drawingml/2006/main" xmlns:pic="http://schemas.openxmlformats.org/drawingml/2006/picture" xmlns:r="http://schemas.openxmlformats.org/officeDocument/2006/relationships" distT="0" distB="0" distL="0" distR="0">
-            <wp:extent cx="5800000" cy="1659301"/>
+            <wp:extent cx="5800000" cy="1708740"/>
             <wp:effectExtent l="0" t="0" r="0" b="0"/>
             <wp:docPr id="203" name="Figure 3.3 DFD Level 1 Functional Decomposition Diagram" descr="Figure 3.3 DFD Level 1 Functional Decomposition Diagram"/>
             <wp:cNvGraphicFramePr>
@@ -8029,7 +8994,7 @@
                   <pic:spPr>
                     <a:xfrm>
                       <a:off x="0" y="0"/>
-                      <a:ext cx="5800000" cy="1659301"/>
+                      <a:ext cx="5800000" cy="1708740"/>
                     </a:xfrm>
                     <a:prstGeom prst="rect">
                       <a:avLst/>
@@ -8116,7 +9081,147 @@
           <w:sz w:val="22"/>
           <w:szCs w:val="22"/>
         </w:rPr>
-        <w:t xml:space="preserve">◦  Handles organization onboarding, custom slug reservation, Argon2id user password hashing, session issuance, and mandatory TOTP MFA step-up verification.</w:t>
+        <w:t xml:space="preserve">◦  Handles organization onboarding, custom slug reservation, Argon2id user password hashing (</w:t>
+      </w:r>
+      <w:r>
+        <w:rPr>
+          <w:rFonts w:ascii="Times New Roman" w:cs="Times New Roman" w:eastAsia="Times New Roman" w:hAnsi="Times New Roman"/>
+          <w:b w:val="0"/>
+          <w:bCs w:val="0"/>
+          <w:i w:val="0"/>
+          <w:iCs w:val="0"/>
+          <w:u w:val="none"/>
+          <w:color w:val="000000"/>
+          <w:sz w:val="22"/>
+          <w:szCs w:val="22"/>
+        </w:rPr>
+        <w:t xml:space="preserve">FR-1.3a</w:t>
+      </w:r>
+      <w:r>
+        <w:rPr>
+          <w:rFonts w:ascii="Times New Roman" w:cs="Times New Roman" w:eastAsia="Times New Roman" w:hAnsi="Times New Roman"/>
+          <w:b w:val="0"/>
+          <w:bCs w:val="0"/>
+          <w:i w:val="0"/>
+          <w:iCs w:val="0"/>
+          <w:u w:val="none"/>
+          <w:color w:val="000000"/>
+          <w:sz w:val="22"/>
+          <w:szCs w:val="22"/>
+        </w:rPr>
+        <w:t xml:space="preserve">), CSPRNG 256-bit session token issuance with SHA-256 persistence in </w:t>
+      </w:r>
+      <w:r>
+        <w:rPr>
+          <w:rFonts w:ascii="Times New Roman" w:cs="Times New Roman" w:eastAsia="Times New Roman" w:hAnsi="Times New Roman"/>
+          <w:b w:val="0"/>
+          <w:bCs w:val="0"/>
+          <w:i w:val="0"/>
+          <w:iCs w:val="0"/>
+          <w:u w:val="none"/>
+          <w:color w:val="000000"/>
+          <w:sz w:val="22"/>
+          <w:szCs w:val="22"/>
+        </w:rPr>
+        <w:t xml:space="preserve">token_hash</w:t>
+      </w:r>
+      <w:r>
+        <w:rPr>
+          <w:rFonts w:ascii="Times New Roman" w:cs="Times New Roman" w:eastAsia="Times New Roman" w:hAnsi="Times New Roman"/>
+          <w:b w:val="0"/>
+          <w:bCs w:val="0"/>
+          <w:i w:val="0"/>
+          <w:iCs w:val="0"/>
+          <w:u w:val="none"/>
+          <w:color w:val="000000"/>
+          <w:sz w:val="22"/>
+          <w:szCs w:val="22"/>
+        </w:rPr>
+        <w:t xml:space="preserve">, </w:t>
+      </w:r>
+      <w:r>
+        <w:rPr>
+          <w:rFonts w:ascii="Times New Roman" w:cs="Times New Roman" w:eastAsia="Times New Roman" w:hAnsi="Times New Roman"/>
+          <w:b w:val="0"/>
+          <w:bCs w:val="0"/>
+          <w:i w:val="0"/>
+          <w:iCs w:val="0"/>
+          <w:u w:val="none"/>
+          <w:color w:val="000000"/>
+          <w:sz w:val="22"/>
+          <w:szCs w:val="22"/>
+        </w:rPr>
+        <w:t xml:space="preserve">__Host-bbt-session</w:t>
+      </w:r>
+      <w:r>
+        <w:rPr>
+          <w:rFonts w:ascii="Times New Roman" w:cs="Times New Roman" w:eastAsia="Times New Roman" w:hAnsi="Times New Roman"/>
+          <w:b w:val="0"/>
+          <w:bCs w:val="0"/>
+          <w:i w:val="0"/>
+          <w:iCs w:val="0"/>
+          <w:u w:val="none"/>
+          <w:color w:val="000000"/>
+          <w:sz w:val="22"/>
+          <w:szCs w:val="22"/>
+        </w:rPr>
+        <w:t xml:space="preserve"> cookie management (</w:t>
+      </w:r>
+      <w:r>
+        <w:rPr>
+          <w:rFonts w:ascii="Times New Roman" w:cs="Times New Roman" w:eastAsia="Times New Roman" w:hAnsi="Times New Roman"/>
+          <w:b w:val="0"/>
+          <w:bCs w:val="0"/>
+          <w:i w:val="0"/>
+          <w:iCs w:val="0"/>
+          <w:u w:val="none"/>
+          <w:color w:val="000000"/>
+          <w:sz w:val="22"/>
+          <w:szCs w:val="22"/>
+        </w:rPr>
+        <w:t xml:space="preserve">SameSite=Lax</w:t>
+      </w:r>
+      <w:r>
+        <w:rPr>
+          <w:rFonts w:ascii="Times New Roman" w:cs="Times New Roman" w:eastAsia="Times New Roman" w:hAnsi="Times New Roman"/>
+          <w:b w:val="0"/>
+          <w:bCs w:val="0"/>
+          <w:i w:val="0"/>
+          <w:iCs w:val="0"/>
+          <w:u w:val="none"/>
+          <w:color w:val="000000"/>
+          <w:sz w:val="22"/>
+          <w:szCs w:val="22"/>
+        </w:rPr>
+        <w:t xml:space="preserve">, </w:t>
+      </w:r>
+      <w:r>
+        <w:rPr>
+          <w:rFonts w:ascii="Times New Roman" w:cs="Times New Roman" w:eastAsia="Times New Roman" w:hAnsi="Times New Roman"/>
+          <w:b w:val="0"/>
+          <w:bCs w:val="0"/>
+          <w:i w:val="0"/>
+          <w:iCs w:val="0"/>
+          <w:u w:val="none"/>
+          <w:color w:val="000000"/>
+          <w:sz w:val="22"/>
+          <w:szCs w:val="22"/>
+        </w:rPr>
+        <w:t xml:space="preserve">Secure</w:t>
+      </w:r>
+      <w:r>
+        <w:rPr>
+          <w:rFonts w:ascii="Times New Roman" w:cs="Times New Roman" w:eastAsia="Times New Roman" w:hAnsi="Times New Roman"/>
+          <w:b w:val="0"/>
+          <w:bCs w:val="0"/>
+          <w:i w:val="0"/>
+          <w:iCs w:val="0"/>
+          <w:u w:val="none"/>
+          <w:color w:val="000000"/>
+          <w:sz w:val="22"/>
+          <w:szCs w:val="22"/>
+        </w:rPr>
+        <w:t xml:space="preserve">), and mandatory TOTP MFA step-up verification.</w:t>
       </w:r>
     </w:p>
     <w:p>
@@ -8207,7 +9312,35 @@
           <w:sz w:val="22"/>
           <w:szCs w:val="22"/>
         </w:rPr>
-        <w:t xml:space="preserve">D2: Key Store &amp; Recipient Snapshots</w:t>
+        <w:t xml:space="preserve">D2: Cryptographic Key Store</w:t>
+      </w:r>
+      <w:r>
+        <w:rPr>
+          <w:rFonts w:ascii="Times New Roman" w:cs="Times New Roman" w:eastAsia="Times New Roman" w:hAnsi="Times New Roman"/>
+          <w:b w:val="0"/>
+          <w:bCs w:val="0"/>
+          <w:i w:val="0"/>
+          <w:iCs w:val="0"/>
+          <w:u w:val="none"/>
+          <w:color w:val="000000"/>
+          <w:sz w:val="22"/>
+          <w:szCs w:val="22"/>
+        </w:rPr>
+        <w:t xml:space="preserve">; Writes audit events to </w:t>
+      </w:r>
+      <w:r>
+        <w:rPr>
+          <w:rFonts w:ascii="Times New Roman" w:cs="Times New Roman" w:eastAsia="Times New Roman" w:hAnsi="Times New Roman"/>
+          <w:b w:val="0"/>
+          <w:bCs w:val="0"/>
+          <w:i w:val="0"/>
+          <w:iCs w:val="0"/>
+          <w:u w:val="none"/>
+          <w:color w:val="000000"/>
+          <w:sz w:val="22"/>
+          <w:szCs w:val="22"/>
+        </w:rPr>
+        <w:t xml:space="preserve">D6: Hash-Chained Audit Ledger Store</w:t>
       </w:r>
       <w:r>
         <w:rPr>
@@ -8438,6 +9571,34 @@
           <w:sz w:val="22"/>
           <w:szCs w:val="22"/>
         </w:rPr>
+        <w:t xml:space="preserve">; Writes key lifecycle events to </w:t>
+      </w:r>
+      <w:r>
+        <w:rPr>
+          <w:rFonts w:ascii="Times New Roman" w:cs="Times New Roman" w:eastAsia="Times New Roman" w:hAnsi="Times New Roman"/>
+          <w:b w:val="0"/>
+          <w:bCs w:val="0"/>
+          <w:i w:val="0"/>
+          <w:iCs w:val="0"/>
+          <w:u w:val="none"/>
+          <w:color w:val="000000"/>
+          <w:sz w:val="22"/>
+          <w:szCs w:val="22"/>
+        </w:rPr>
+        <w:t xml:space="preserve">D6</w:t>
+      </w:r>
+      <w:r>
+        <w:rPr>
+          <w:rFonts w:ascii="Times New Roman" w:cs="Times New Roman" w:eastAsia="Times New Roman" w:hAnsi="Times New Roman"/>
+          <w:b w:val="0"/>
+          <w:bCs w:val="0"/>
+          <w:i w:val="0"/>
+          <w:iCs w:val="0"/>
+          <w:u w:val="none"/>
+          <w:color w:val="000000"/>
+          <w:sz w:val="22"/>
+          <w:szCs w:val="22"/>
+        </w:rPr>
         <w:t xml:space="preserve">.</w:t>
       </w:r>
     </w:p>
@@ -8473,7 +9634,7 @@
           <w:sz w:val="22"/>
           <w:szCs w:val="22"/>
         </w:rPr>
-        <w:t xml:space="preserve">Process 3.0: Cryptographic Intake &amp; Encrypted Attachment Pipeline (`FR-3.5`, `FR-3.6`, `FR-1.6`)</w:t>
+        <w:t xml:space="preserve">Process 3.0: Cryptographic Intake &amp; Storage Accounting (`FR-3.5`, `FR-3.6`, `FR-1.6`, `FR-8.3`, `FR-8.4`)</w:t>
       </w:r>
     </w:p>
     <w:p>
@@ -8494,7 +9655,35 @@
           <w:sz w:val="22"/>
           <w:szCs w:val="22"/>
         </w:rPr>
-        <w:t xml:space="preserve">◦  Verifies Cloudflare Turnstile tokens, issues single-use submission session tokens, validates program key version snapshots (</w:t>
+        <w:t xml:space="preserve">◦  Verifies Cloudflare Turnstile tokens, enforces IP-based rate limiting (10 submissions/hour/IP, </w:t>
+      </w:r>
+      <w:r>
+        <w:rPr>
+          <w:rFonts w:ascii="Times New Roman" w:cs="Times New Roman" w:eastAsia="Times New Roman" w:hAnsi="Times New Roman"/>
+          <w:b w:val="0"/>
+          <w:bCs w:val="0"/>
+          <w:i w:val="0"/>
+          <w:iCs w:val="0"/>
+          <w:u w:val="none"/>
+          <w:color w:val="000000"/>
+          <w:sz w:val="22"/>
+          <w:szCs w:val="22"/>
+        </w:rPr>
+        <w:t xml:space="preserve">FR-8.3</w:t>
+      </w:r>
+      <w:r>
+        <w:rPr>
+          <w:rFonts w:ascii="Times New Roman" w:cs="Times New Roman" w:eastAsia="Times New Roman" w:hAnsi="Times New Roman"/>
+          <w:b w:val="0"/>
+          <w:bCs w:val="0"/>
+          <w:i w:val="0"/>
+          <w:iCs w:val="0"/>
+          <w:u w:val="none"/>
+          <w:color w:val="000000"/>
+          <w:sz w:val="22"/>
+          <w:szCs w:val="22"/>
+        </w:rPr>
+        <w:t xml:space="preserve">), validates program key version snapshots (</w:t>
       </w:r>
       <w:r>
         <w:rPr>
@@ -8522,35 +9711,63 @@
           <w:sz w:val="22"/>
           <w:szCs w:val="22"/>
         </w:rPr>
-        <w:t xml:space="preserve">), generates S3 presigned upload URLs after checking quota boundaries (</w:t>
-      </w:r>
-      <w:r>
-        <w:rPr>
-          <w:rFonts w:ascii="Times New Roman" w:cs="Times New Roman" w:eastAsia="Times New Roman" w:hAnsi="Times New Roman"/>
-          <w:b w:val="0"/>
-          <w:bCs w:val="0"/>
-          <w:i w:val="0"/>
-          <w:iCs w:val="0"/>
-          <w:u w:val="none"/>
-          <w:color w:val="000000"/>
-          <w:sz w:val="22"/>
-          <w:szCs w:val="22"/>
-        </w:rPr>
-        <w:t xml:space="preserve">D7</w:t>
-      </w:r>
-      <w:r>
-        <w:rPr>
-          <w:rFonts w:ascii="Times New Roman" w:cs="Times New Roman" w:eastAsia="Times New Roman" w:hAnsi="Times New Roman"/>
-          <w:b w:val="0"/>
-          <w:bCs w:val="0"/>
-          <w:i w:val="0"/>
-          <w:iCs w:val="0"/>
-          <w:u w:val="none"/>
-          <w:color w:val="000000"/>
-          <w:sz w:val="22"/>
-          <w:szCs w:val="22"/>
-        </w:rPr>
-        <w:t xml:space="preserve">), and records initial reports in </w:t>
+        <w:t xml:space="preserve">), checks storage quota boundaries (20 MiB intake pool, 6 MiB reserve floor, </w:t>
+      </w:r>
+      <w:r>
+        <w:rPr>
+          <w:rFonts w:ascii="Times New Roman" w:cs="Times New Roman" w:eastAsia="Times New Roman" w:hAnsi="Times New Roman"/>
+          <w:b w:val="0"/>
+          <w:bCs w:val="0"/>
+          <w:i w:val="0"/>
+          <w:iCs w:val="0"/>
+          <w:u w:val="none"/>
+          <w:color w:val="000000"/>
+          <w:sz w:val="22"/>
+          <w:szCs w:val="22"/>
+        </w:rPr>
+        <w:t xml:space="preserve">FR-8.4</w:t>
+      </w:r>
+      <w:r>
+        <w:rPr>
+          <w:rFonts w:ascii="Times New Roman" w:cs="Times New Roman" w:eastAsia="Times New Roman" w:hAnsi="Times New Roman"/>
+          <w:b w:val="0"/>
+          <w:bCs w:val="0"/>
+          <w:i w:val="0"/>
+          <w:iCs w:val="0"/>
+          <w:u w:val="none"/>
+          <w:color w:val="000000"/>
+          <w:sz w:val="22"/>
+          <w:szCs w:val="22"/>
+        </w:rPr>
+        <w:t xml:space="preserve">), generates S3 presigned upload URLs, stores encrypted binary attachments in </w:t>
+      </w:r>
+      <w:r>
+        <w:rPr>
+          <w:rFonts w:ascii="Times New Roman" w:cs="Times New Roman" w:eastAsia="Times New Roman" w:hAnsi="Times New Roman"/>
+          <w:b w:val="0"/>
+          <w:bCs w:val="0"/>
+          <w:i w:val="0"/>
+          <w:iCs w:val="0"/>
+          <w:u w:val="none"/>
+          <w:color w:val="000000"/>
+          <w:sz w:val="22"/>
+          <w:szCs w:val="22"/>
+        </w:rPr>
+        <w:t xml:space="preserve">D5</w:t>
+      </w:r>
+      <w:r>
+        <w:rPr>
+          <w:rFonts w:ascii="Times New Roman" w:cs="Times New Roman" w:eastAsia="Times New Roman" w:hAnsi="Times New Roman"/>
+          <w:b w:val="0"/>
+          <w:bCs w:val="0"/>
+          <w:i w:val="0"/>
+          <w:iCs w:val="0"/>
+          <w:u w:val="none"/>
+          <w:color w:val="000000"/>
+          <w:sz w:val="22"/>
+          <w:szCs w:val="22"/>
+        </w:rPr>
+        <w:t xml:space="preserve">, and records initial reports in </w:t>
       </w:r>
       <w:r>
         <w:rPr>
@@ -8578,7 +9795,35 @@
           <w:sz w:val="22"/>
           <w:szCs w:val="22"/>
         </w:rPr>
-        <w:t xml:space="preserve">.</w:t>
+        <w:t xml:space="preserve"> (</w:t>
+      </w:r>
+      <w:r>
+        <w:rPr>
+          <w:rFonts w:ascii="Times New Roman" w:cs="Times New Roman" w:eastAsia="Times New Roman" w:hAnsi="Times New Roman"/>
+          <w:b w:val="0"/>
+          <w:bCs w:val="0"/>
+          <w:i w:val="0"/>
+          <w:iCs w:val="0"/>
+          <w:u w:val="none"/>
+          <w:color w:val="000000"/>
+          <w:sz w:val="22"/>
+          <w:szCs w:val="22"/>
+        </w:rPr>
+        <w:t xml:space="preserve">D3</w:t>
+      </w:r>
+      <w:r>
+        <w:rPr>
+          <w:rFonts w:ascii="Times New Roman" w:cs="Times New Roman" w:eastAsia="Times New Roman" w:hAnsi="Times New Roman"/>
+          <w:b w:val="0"/>
+          <w:bCs w:val="0"/>
+          <w:i w:val="0"/>
+          <w:iCs w:val="0"/>
+          <w:u w:val="none"/>
+          <w:color w:val="000000"/>
+          <w:sz w:val="22"/>
+          <w:szCs w:val="22"/>
+        </w:rPr>
+        <w:t xml:space="preserve">).</w:t>
       </w:r>
     </w:p>
     <w:p>
@@ -8697,7 +9942,7 @@
           <w:sz w:val="22"/>
           <w:szCs w:val="22"/>
         </w:rPr>
-        <w:t xml:space="preserve">D3: Reports &amp; Triage Threads</w:t>
+        <w:t xml:space="preserve">D3: Reports &amp; Triage Message Store</w:t>
       </w:r>
       <w:r>
         <w:rPr>
@@ -8725,7 +9970,7 @@
           <w:sz w:val="22"/>
           <w:szCs w:val="22"/>
         </w:rPr>
-        <w:t xml:space="preserve">D5: Cloudflare R2 Encrypted Files</w:t>
+        <w:t xml:space="preserve">D5: Encrypted Attachment Store</w:t>
       </w:r>
       <w:r>
         <w:rPr>
@@ -8753,7 +9998,35 @@
           <w:sz w:val="22"/>
           <w:szCs w:val="22"/>
         </w:rPr>
-        <w:t xml:space="preserve">D6: Hash-Chained Audit Ledger</w:t>
+        <w:t xml:space="preserve">D6: Hash-Chained Audit Ledger Store</w:t>
+      </w:r>
+      <w:r>
+        <w:rPr>
+          <w:rFonts w:ascii="Times New Roman" w:cs="Times New Roman" w:eastAsia="Times New Roman" w:hAnsi="Times New Roman"/>
+          <w:b w:val="0"/>
+          <w:bCs w:val="0"/>
+          <w:i w:val="0"/>
+          <w:iCs w:val="0"/>
+          <w:u w:val="none"/>
+          <w:color w:val="000000"/>
+          <w:sz w:val="22"/>
+          <w:szCs w:val="22"/>
+        </w:rPr>
+        <w:t xml:space="preserve">; Emits initial base metrics to </w:t>
+      </w:r>
+      <w:r>
+        <w:rPr>
+          <w:rFonts w:ascii="Times New Roman" w:cs="Times New Roman" w:eastAsia="Times New Roman" w:hAnsi="Times New Roman"/>
+          <w:b w:val="0"/>
+          <w:bCs w:val="0"/>
+          <w:i w:val="0"/>
+          <w:iCs w:val="0"/>
+          <w:u w:val="none"/>
+          <w:color w:val="000000"/>
+          <w:sz w:val="22"/>
+          <w:szCs w:val="22"/>
+        </w:rPr>
+        <w:t xml:space="preserve">P4</w:t>
       </w:r>
       <w:r>
         <w:rPr>
@@ -8823,7 +10096,7 @@
           <w:sz w:val="22"/>
           <w:szCs w:val="22"/>
         </w:rPr>
-        <w:t xml:space="preserve">◦  Parses the 8 FIRST.org Base metrics, rejects invalid or out-of-order combinations, executes the official mathematical scoring algorithm with the </w:t>
+        <w:t xml:space="preserve">◦  Parses the 8 FIRST.org Base metrics in any order, verifies completeness, executes the official mathematical scoring algorithm with the </w:t>
       </w:r>
       <w:r>
         <w:rPr>
@@ -8851,7 +10124,63 @@
           <w:sz w:val="22"/>
           <w:szCs w:val="22"/>
         </w:rPr>
-        <w:t xml:space="preserve"> coefficient, and stores the canonical vector string and calculated numeric score.</w:t>
+        <w:t xml:space="preserve"> coefficient in &lt; 5 ms (</w:t>
+      </w:r>
+      <w:r>
+        <w:rPr>
+          <w:rFonts w:ascii="Times New Roman" w:cs="Times New Roman" w:eastAsia="Times New Roman" w:hAnsi="Times New Roman"/>
+          <w:b w:val="0"/>
+          <w:bCs w:val="0"/>
+          <w:i w:val="0"/>
+          <w:iCs w:val="0"/>
+          <w:u w:val="none"/>
+          <w:color w:val="000000"/>
+          <w:sz w:val="22"/>
+          <w:szCs w:val="22"/>
+        </w:rPr>
+        <w:t xml:space="preserve">NFR-02</w:t>
+      </w:r>
+      <w:r>
+        <w:rPr>
+          <w:rFonts w:ascii="Times New Roman" w:cs="Times New Roman" w:eastAsia="Times New Roman" w:hAnsi="Times New Roman"/>
+          <w:b w:val="0"/>
+          <w:bCs w:val="0"/>
+          <w:i w:val="0"/>
+          <w:iCs w:val="0"/>
+          <w:u w:val="none"/>
+          <w:color w:val="000000"/>
+          <w:sz w:val="22"/>
+          <w:szCs w:val="22"/>
+        </w:rPr>
+        <w:t xml:space="preserve">), and serializes the canonical vector string and calculated numeric score into </w:t>
+      </w:r>
+      <w:r>
+        <w:rPr>
+          <w:rFonts w:ascii="Times New Roman" w:cs="Times New Roman" w:eastAsia="Times New Roman" w:hAnsi="Times New Roman"/>
+          <w:b w:val="0"/>
+          <w:bCs w:val="0"/>
+          <w:i w:val="0"/>
+          <w:iCs w:val="0"/>
+          <w:u w:val="none"/>
+          <w:color w:val="000000"/>
+          <w:sz w:val="22"/>
+          <w:szCs w:val="22"/>
+        </w:rPr>
+        <w:t xml:space="preserve">D3</w:t>
+      </w:r>
+      <w:r>
+        <w:rPr>
+          <w:rFonts w:ascii="Times New Roman" w:cs="Times New Roman" w:eastAsia="Times New Roman" w:hAnsi="Times New Roman"/>
+          <w:b w:val="0"/>
+          <w:bCs w:val="0"/>
+          <w:i w:val="0"/>
+          <w:iCs w:val="0"/>
+          <w:u w:val="none"/>
+          <w:color w:val="000000"/>
+          <w:sz w:val="22"/>
+          <w:szCs w:val="22"/>
+        </w:rPr>
+        <w:t xml:space="preserve">.</w:t>
       </w:r>
     </w:p>
     <w:p>
@@ -8900,7 +10229,7 @@
           <w:sz w:val="22"/>
           <w:szCs w:val="22"/>
         </w:rPr>
-        <w:t xml:space="preserve">: Writes score and vector to </w:t>
+        <w:t xml:space="preserve">: Writes score and canonical vector to </w:t>
       </w:r>
       <w:r>
         <w:rPr>
@@ -8963,7 +10292,7 @@
           <w:sz w:val="22"/>
           <w:szCs w:val="22"/>
         </w:rPr>
-        <w:t xml:space="preserve">Process 5.0: Dual-Lane Triage &amp; Notification Broker (`FR-5.1` – `FR-5.5`)</w:t>
+        <w:t xml:space="preserve">Process 5.0: Dual-Lane Triage &amp; Notification Broker (`FR-5.1` – `FR-5.4`)</w:t>
       </w:r>
     </w:p>
     <w:p>
@@ -8984,7 +10313,35 @@
           <w:sz w:val="22"/>
           <w:szCs w:val="22"/>
         </w:rPr>
-        <w:t xml:space="preserve">◦  Orchestrates report-scoped encrypted message threads, enforcing dual-lane isolation: Class B (shared researcher/defender) vs. Class C (internal defender-only). Dispatches Class A metadata-only alerts to external mail services.</w:t>
+        <w:t xml:space="preserve">◦  Orchestrates report-scoped encrypted message threads, enforcing strict dual-lane isolation: Class B (shared researcher/defender) vs. Class C (internal defender-only). Dispatches Class A metadata-only alerts to external mail service </w:t>
+      </w:r>
+      <w:r>
+        <w:rPr>
+          <w:rFonts w:ascii="Times New Roman" w:cs="Times New Roman" w:eastAsia="Times New Roman" w:hAnsi="Times New Roman"/>
+          <w:b w:val="0"/>
+          <w:bCs w:val="0"/>
+          <w:i w:val="0"/>
+          <w:iCs w:val="0"/>
+          <w:u w:val="none"/>
+          <w:color w:val="000000"/>
+          <w:sz w:val="22"/>
+          <w:szCs w:val="22"/>
+        </w:rPr>
+        <w:t xml:space="preserve">E4: Resend</w:t>
+      </w:r>
+      <w:r>
+        <w:rPr>
+          <w:rFonts w:ascii="Times New Roman" w:cs="Times New Roman" w:eastAsia="Times New Roman" w:hAnsi="Times New Roman"/>
+          <w:b w:val="0"/>
+          <w:bCs w:val="0"/>
+          <w:i w:val="0"/>
+          <w:iCs w:val="0"/>
+          <w:u w:val="none"/>
+          <w:color w:val="000000"/>
+          <w:sz w:val="22"/>
+          <w:szCs w:val="22"/>
+        </w:rPr>
+        <w:t xml:space="preserve">.</w:t>
       </w:r>
     </w:p>
     <w:p>
@@ -9089,7 +10446,7 @@
           <w:sz w:val="22"/>
           <w:szCs w:val="22"/>
         </w:rPr>
-        <w:t xml:space="preserve">; Writes to </w:t>
+        <w:t xml:space="preserve">; Writes triage events to </w:t>
       </w:r>
       <w:r>
         <w:rPr>
@@ -9229,7 +10586,35 @@
           <w:sz w:val="22"/>
           <w:szCs w:val="22"/>
         </w:rPr>
-        <w:t xml:space="preserve">), executes live commit verification against the GitHub REST API v3 or validates encrypted configuration snapshots, and advances status to </w:t>
+        <w:t xml:space="preserve">), executes live commit verification against the GitHub REST API v3 (</w:t>
+      </w:r>
+      <w:r>
+        <w:rPr>
+          <w:rFonts w:ascii="Times New Roman" w:cs="Times New Roman" w:eastAsia="Times New Roman" w:hAnsi="Times New Roman"/>
+          <w:b w:val="0"/>
+          <w:bCs w:val="0"/>
+          <w:i w:val="0"/>
+          <w:iCs w:val="0"/>
+          <w:u w:val="none"/>
+          <w:color w:val="000000"/>
+          <w:sz w:val="22"/>
+          <w:szCs w:val="22"/>
+        </w:rPr>
+        <w:t xml:space="preserve">GET /repos/{owner}/{repo}/compare/{branch}...{sha}</w:t>
+      </w:r>
+      <w:r>
+        <w:rPr>
+          <w:rFonts w:ascii="Times New Roman" w:cs="Times New Roman" w:eastAsia="Times New Roman" w:hAnsi="Times New Roman"/>
+          <w:b w:val="0"/>
+          <w:bCs w:val="0"/>
+          <w:i w:val="0"/>
+          <w:iCs w:val="0"/>
+          <w:u w:val="none"/>
+          <w:color w:val="000000"/>
+          <w:sz w:val="22"/>
+          <w:szCs w:val="22"/>
+        </w:rPr>
+        <w:t xml:space="preserve">) or validates encrypted configuration snapshots bound to SHA-256 hashes, and advances report status to </w:t>
       </w:r>
       <w:r>
         <w:rPr>
@@ -9320,7 +10705,7 @@
           <w:sz w:val="22"/>
           <w:szCs w:val="22"/>
         </w:rPr>
-        <w:t xml:space="preserve">D4: Remediation Records &amp; Commit Hashes</w:t>
+        <w:t xml:space="preserve">D4: Remediation &amp; Commit Store</w:t>
       </w:r>
       <w:r>
         <w:rPr>
@@ -9376,7 +10761,7 @@
           <w:sz w:val="22"/>
           <w:szCs w:val="22"/>
         </w:rPr>
-        <w:t xml:space="preserve">E3: GitHub API</w:t>
+        <w:t xml:space="preserve">E3: Version Control Forge</w:t>
       </w:r>
       <w:r>
         <w:rPr>
@@ -9425,7 +10810,7 @@
           <w:sz w:val="22"/>
           <w:szCs w:val="22"/>
         </w:rPr>
-        <w:t xml:space="preserve">Process 7.0: Attested Retest Lifecycle &amp; Audit Ledger Engine (`FR-7.1` – `FR-7.7`, `FR-8.4` – `FR-8.5`)</w:t>
+        <w:t xml:space="preserve">Process 7.0: Attested Retest Lifecycle &amp; Audit Ledger Engine (`FR-7.1` – `FR-7.6`, `FR-7.7` [P2 Extension], `FR-8.4`, `FR-8.5`)</w:t>
       </w:r>
     </w:p>
     <w:p>
@@ -9446,35 +10831,91 @@
           <w:sz w:val="22"/>
           <w:szCs w:val="22"/>
         </w:rPr>
-        <w:t xml:space="preserve">◦  Executes the 15-state lifecycle state machine, records attested retest confirmations or timeout closures, appends SHA-256 hash-chained audit events (</w:t>
-      </w:r>
-      <w:r>
-        <w:rPr>
-          <w:rFonts w:ascii="Times New Roman" w:cs="Times New Roman" w:eastAsia="Times New Roman" w:hAnsi="Times New Roman"/>
-          <w:b w:val="0"/>
-          <w:bCs w:val="0"/>
-          <w:i w:val="0"/>
-          <w:iCs w:val="0"/>
-          <w:u w:val="none"/>
-          <w:color w:val="000000"/>
-          <w:sz w:val="22"/>
-          <w:szCs w:val="22"/>
-        </w:rPr>
-        <w:t xml:space="preserve">prev_hash</w:t>
-      </w:r>
-      <w:r>
-        <w:rPr>
-          <w:rFonts w:ascii="Times New Roman" w:cs="Times New Roman" w:eastAsia="Times New Roman" w:hAnsi="Times New Roman"/>
-          <w:b w:val="0"/>
-          <w:bCs w:val="0"/>
-          <w:i w:val="0"/>
-          <w:iCs w:val="0"/>
-          <w:u w:val="none"/>
-          <w:color w:val="000000"/>
-          <w:sz w:val="22"/>
-          <w:szCs w:val="22"/>
-        </w:rPr>
-        <w:t xml:space="preserve">), coordinates hourly claim-lease R2 garbage collection, and exports verifiable closure evidence packets.</w:t>
+        <w:t xml:space="preserve">◦  Executes the 15-state lifecycle automaton, records attested retest confirmations or timeout closures, appends SHA-256 dual hash-chained audit events (</w:t>
+      </w:r>
+      <w:r>
+        <w:rPr>
+          <w:rFonts w:ascii="Times New Roman" w:cs="Times New Roman" w:eastAsia="Times New Roman" w:hAnsi="Times New Roman"/>
+          <w:b w:val="0"/>
+          <w:bCs w:val="0"/>
+          <w:i w:val="0"/>
+          <w:iCs w:val="0"/>
+          <w:u w:val="none"/>
+          <w:color w:val="000000"/>
+          <w:sz w:val="22"/>
+          <w:szCs w:val="22"/>
+        </w:rPr>
+        <w:t xml:space="preserve">tenant_row_hash</w:t>
+      </w:r>
+      <w:r>
+        <w:rPr>
+          <w:rFonts w:ascii="Times New Roman" w:cs="Times New Roman" w:eastAsia="Times New Roman" w:hAnsi="Times New Roman"/>
+          <w:b w:val="0"/>
+          <w:bCs w:val="0"/>
+          <w:i w:val="0"/>
+          <w:iCs w:val="0"/>
+          <w:u w:val="none"/>
+          <w:color w:val="000000"/>
+          <w:sz w:val="22"/>
+          <w:szCs w:val="22"/>
+        </w:rPr>
+        <w:t xml:space="preserve"> and </w:t>
+      </w:r>
+      <w:r>
+        <w:rPr>
+          <w:rFonts w:ascii="Times New Roman" w:cs="Times New Roman" w:eastAsia="Times New Roman" w:hAnsi="Times New Roman"/>
+          <w:b w:val="0"/>
+          <w:bCs w:val="0"/>
+          <w:i w:val="0"/>
+          <w:iCs w:val="0"/>
+          <w:u w:val="none"/>
+          <w:color w:val="000000"/>
+          <w:sz w:val="22"/>
+          <w:szCs w:val="22"/>
+        </w:rPr>
+        <w:t xml:space="preserve">report_chain_hash</w:t>
+      </w:r>
+      <w:r>
+        <w:rPr>
+          <w:rFonts w:ascii="Times New Roman" w:cs="Times New Roman" w:eastAsia="Times New Roman" w:hAnsi="Times New Roman"/>
+          <w:b w:val="0"/>
+          <w:bCs w:val="0"/>
+          <w:i w:val="0"/>
+          <w:iCs w:val="0"/>
+          <w:u w:val="none"/>
+          <w:color w:val="000000"/>
+          <w:sz w:val="22"/>
+          <w:szCs w:val="22"/>
+        </w:rPr>
+        <w:t xml:space="preserve">), coordinates hourly claim-lease R2 garbage collection, and exports verifiable closure evidence packets (P2 extension under </w:t>
+      </w:r>
+      <w:r>
+        <w:rPr>
+          <w:rFonts w:ascii="Times New Roman" w:cs="Times New Roman" w:eastAsia="Times New Roman" w:hAnsi="Times New Roman"/>
+          <w:b w:val="0"/>
+          <w:bCs w:val="0"/>
+          <w:i w:val="0"/>
+          <w:iCs w:val="0"/>
+          <w:u w:val="none"/>
+          <w:color w:val="000000"/>
+          <w:sz w:val="22"/>
+          <w:szCs w:val="22"/>
+        </w:rPr>
+        <w:t xml:space="preserve">FR-7.7</w:t>
+      </w:r>
+      <w:r>
+        <w:rPr>
+          <w:rFonts w:ascii="Times New Roman" w:cs="Times New Roman" w:eastAsia="Times New Roman" w:hAnsi="Times New Roman"/>
+          <w:b w:val="0"/>
+          <w:bCs w:val="0"/>
+          <w:i w:val="0"/>
+          <w:iCs w:val="0"/>
+          <w:u w:val="none"/>
+          <w:color w:val="000000"/>
+          <w:sz w:val="22"/>
+          <w:szCs w:val="22"/>
+        </w:rPr>
+        <w:t xml:space="preserve">).</w:t>
       </w:r>
     </w:p>
     <w:p>
@@ -9622,6 +11063,34 @@
           <w:szCs w:val="22"/>
         </w:rPr>
         <w:t xml:space="preserve">D7</w:t>
+      </w:r>
+      <w:r>
+        <w:rPr>
+          <w:rFonts w:ascii="Times New Roman" w:cs="Times New Roman" w:eastAsia="Times New Roman" w:hAnsi="Times New Roman"/>
+          <w:b w:val="0"/>
+          <w:bCs w:val="0"/>
+          <w:i w:val="0"/>
+          <w:iCs w:val="0"/>
+          <w:u w:val="none"/>
+          <w:color w:val="000000"/>
+          <w:sz w:val="22"/>
+          <w:szCs w:val="22"/>
+        </w:rPr>
+        <w:t xml:space="preserve">; Purges expired attachments from </w:t>
+      </w:r>
+      <w:r>
+        <w:rPr>
+          <w:rFonts w:ascii="Times New Roman" w:cs="Times New Roman" w:eastAsia="Times New Roman" w:hAnsi="Times New Roman"/>
+          <w:b w:val="0"/>
+          <w:bCs w:val="0"/>
+          <w:i w:val="0"/>
+          <w:iCs w:val="0"/>
+          <w:u w:val="none"/>
+          <w:color w:val="000000"/>
+          <w:sz w:val="22"/>
+          <w:szCs w:val="22"/>
+        </w:rPr>
+        <w:t xml:space="preserve">D5</w:t>
       </w:r>
       <w:r>
         <w:rPr>
@@ -9966,7 +11435,7 @@
                 <w:sz w:val="20"/>
                 <w:szCs w:val="20"/>
               </w:rPr>
-              <w:t xml:space="preserve">Tenant metadata, slug bindings, subscription tiers, and domain challenges.</w:t>
+              <w:t xml:space="preserve">Tenant metadata, slug bindings, subscription tiers, and domain verification challenges.</w:t>
             </w:r>
           </w:p>
         </w:tc>
@@ -10033,7 +11502,7 @@
                 <w:sz w:val="20"/>
                 <w:szCs w:val="20"/>
               </w:rPr>
-              <w:t xml:space="preserve">Key Store &amp; Recipient Snapshots</w:t>
+              <w:t xml:space="preserve">Cryptographic Key Store</w:t>
             </w:r>
           </w:p>
         </w:tc>
@@ -10218,7 +11687,7 @@
                 <w:sz w:val="20"/>
                 <w:szCs w:val="20"/>
               </w:rPr>
-              <w:t xml:space="preserve">Reports &amp; Triage Threads</w:t>
+              <w:t xml:space="preserve">Reports &amp; Triage Message Store</w:t>
             </w:r>
           </w:p>
         </w:tc>
@@ -10431,7 +11900,7 @@
                 <w:sz w:val="20"/>
                 <w:szCs w:val="20"/>
               </w:rPr>
-              <w:t xml:space="preserve">Remediation Records &amp; Commit Hashes</w:t>
+              <w:t xml:space="preserve">Remediation &amp; Commit Store</w:t>
             </w:r>
           </w:p>
         </w:tc>
@@ -10588,7 +12057,7 @@
                 <w:sz w:val="20"/>
                 <w:szCs w:val="20"/>
               </w:rPr>
-              <w:t xml:space="preserve">Encrypted Attachments Bucket</w:t>
+              <w:t xml:space="preserve">Encrypted Attachment Store</w:t>
             </w:r>
           </w:p>
         </w:tc>
@@ -10745,7 +12214,7 @@
                 <w:sz w:val="20"/>
                 <w:szCs w:val="20"/>
               </w:rPr>
-              <w:t xml:space="preserve">Hash-Chained Audit Ledger</w:t>
+              <w:t xml:space="preserve">Hash-Chained Audit Ledger Store</w:t>
             </w:r>
           </w:p>
         </w:tc>
@@ -10835,35 +12304,63 @@
                 <w:sz w:val="20"/>
                 <w:szCs w:val="20"/>
               </w:rPr>
-              <w:t xml:space="preserve">Append-only sequence numbers, actor commitments, event digests, and cryptographic </w:t>
-            </w:r>
-            <w:r>
-              <w:rPr>
-                <w:rFonts w:ascii="Times New Roman" w:cs="Times New Roman" w:eastAsia="Times New Roman" w:hAnsi="Times New Roman"/>
-                <w:b w:val="0"/>
-                <w:bCs w:val="0"/>
-                <w:i w:val="0"/>
-                <w:iCs w:val="0"/>
-                <w:u w:val="none"/>
-                <w:color w:val="000000"/>
-                <w:sz w:val="20"/>
-                <w:szCs w:val="20"/>
-              </w:rPr>
-              <w:t xml:space="preserve">prev_hash</w:t>
-            </w:r>
-            <w:r>
-              <w:rPr>
-                <w:rFonts w:ascii="Times New Roman" w:cs="Times New Roman" w:eastAsia="Times New Roman" w:hAnsi="Times New Roman"/>
-                <w:b w:val="0"/>
-                <w:bCs w:val="0"/>
-                <w:i w:val="0"/>
-                <w:iCs w:val="0"/>
-                <w:u w:val="none"/>
-                <w:color w:val="000000"/>
-                <w:sz w:val="20"/>
-                <w:szCs w:val="20"/>
-              </w:rPr>
-              <w:t xml:space="preserve"> links.</w:t>
+              <w:t xml:space="preserve">Append-only sequence numbers, actor commitments, event digests, and cryptographic dual hash chains (</w:t>
+            </w:r>
+            <w:r>
+              <w:rPr>
+                <w:rFonts w:ascii="Times New Roman" w:cs="Times New Roman" w:eastAsia="Times New Roman" w:hAnsi="Times New Roman"/>
+                <w:b w:val="0"/>
+                <w:bCs w:val="0"/>
+                <w:i w:val="0"/>
+                <w:iCs w:val="0"/>
+                <w:u w:val="none"/>
+                <w:color w:val="000000"/>
+                <w:sz w:val="20"/>
+                <w:szCs w:val="20"/>
+              </w:rPr>
+              <w:t xml:space="preserve">tenant_row_hash</w:t>
+            </w:r>
+            <w:r>
+              <w:rPr>
+                <w:rFonts w:ascii="Times New Roman" w:cs="Times New Roman" w:eastAsia="Times New Roman" w:hAnsi="Times New Roman"/>
+                <w:b w:val="0"/>
+                <w:bCs w:val="0"/>
+                <w:i w:val="0"/>
+                <w:iCs w:val="0"/>
+                <w:u w:val="none"/>
+                <w:color w:val="000000"/>
+                <w:sz w:val="20"/>
+                <w:szCs w:val="20"/>
+              </w:rPr>
+              <w:t xml:space="preserve"> &amp; </w:t>
+            </w:r>
+            <w:r>
+              <w:rPr>
+                <w:rFonts w:ascii="Times New Roman" w:cs="Times New Roman" w:eastAsia="Times New Roman" w:hAnsi="Times New Roman"/>
+                <w:b w:val="0"/>
+                <w:bCs w:val="0"/>
+                <w:i w:val="0"/>
+                <w:iCs w:val="0"/>
+                <w:u w:val="none"/>
+                <w:color w:val="000000"/>
+                <w:sz w:val="20"/>
+                <w:szCs w:val="20"/>
+              </w:rPr>
+              <w:t xml:space="preserve">report_chain_hash</w:t>
+            </w:r>
+            <w:r>
+              <w:rPr>
+                <w:rFonts w:ascii="Times New Roman" w:cs="Times New Roman" w:eastAsia="Times New Roman" w:hAnsi="Times New Roman"/>
+                <w:b w:val="0"/>
+                <w:bCs w:val="0"/>
+                <w:i w:val="0"/>
+                <w:iCs w:val="0"/>
+                <w:u w:val="none"/>
+                <w:color w:val="000000"/>
+                <w:sz w:val="20"/>
+                <w:szCs w:val="20"/>
+              </w:rPr>
+              <w:t xml:space="preserve">).</w:t>
             </w:r>
           </w:p>
         </w:tc>
@@ -11048,7 +12545,7 @@
                 <w:sz w:val="20"/>
                 <w:szCs w:val="20"/>
               </w:rPr>
-              <w:t xml:space="preserve">Multi-tenant quota accounting, Priority-0 reserve floors, and active claim-lease records (</w:t>
+              <w:t xml:space="preserve">Multi-tenant quota accounting (20 MiB intake, 6 MiB reserve floor), and active claim-lease records (</w:t>
             </w:r>
             <w:r>
               <w:rPr>
@@ -11460,7 +12957,7 @@
           <w:sz w:val="18"/>
           <w:szCs w:val="18"/>
         </w:rPr>
-        <w:t xml:space="preserve">:  * RBAC, Session Validation, Turnstile verification.                 :</w:t>
+        <w:t xml:space="preserve">:  * RBAC, CSPRNG Session Validation, Turnstile verification.          :</w:t>
       </w:r>
     </w:p>
     <w:p>
@@ -11500,7 +12997,7 @@
           <w:sz w:val="18"/>
           <w:szCs w:val="18"/>
         </w:rPr>
-        <w:t xml:space="preserve">            | TLS 1.3 Pooled TCP (bbt_app_runtime)</w:t>
+        <w:t xml:space="preserve">            | TLS 1.3 Pooled TCP (bbt_app role)</w:t>
       </w:r>
     </w:p>
     <w:p>
@@ -11580,7 +13077,7 @@
           <w:sz w:val="18"/>
           <w:szCs w:val="18"/>
         </w:rPr>
-        <w:t xml:space="preserve">:  * Unprivileged bbt_app_runtime role (NOSUPERUSER NOBYPASSRLS).      :</w:t>
+        <w:t xml:space="preserve">:  * Unprivileged bbt_app role (NOSUPERUSER NOBYPASSRLS).               :</w:t>
       </w:r>
     </w:p>
     <w:p>
@@ -11600,7 +13097,7 @@
           <w:sz w:val="18"/>
           <w:szCs w:val="18"/>
         </w:rPr>
-        <w:t xml:space="preserve">:  * Append-only audit ledger prevents tampering or deletion.           :</w:t>
+        <w:t xml:space="preserve">:  * Dual hash-chained audit ledger prevents tampering or deletion.    :</w:t>
       </w:r>
     </w:p>
     <w:p>
@@ -12116,35 +13613,91 @@
                 <w:sz w:val="20"/>
                 <w:szCs w:val="20"/>
               </w:rPr>
-              <w:t xml:space="preserve">).&lt;br/&gt;3. Hourly cron requests require Ed25519-signed JWTs (</w:t>
-            </w:r>
-            <w:r>
-              <w:rPr>
-                <w:rFonts w:ascii="Times New Roman" w:cs="Times New Roman" w:eastAsia="Times New Roman" w:hAnsi="Times New Roman"/>
-                <w:b w:val="0"/>
-                <w:bCs w:val="0"/>
-                <w:i w:val="0"/>
-                <w:iCs w:val="0"/>
-                <w:u w:val="none"/>
-                <w:color w:val="000000"/>
-                <w:sz w:val="20"/>
-                <w:szCs w:val="20"/>
-              </w:rPr>
-              <w:t xml:space="preserve">X-Cron-Signature</w:t>
-            </w:r>
-            <w:r>
-              <w:rPr>
-                <w:rFonts w:ascii="Times New Roman" w:cs="Times New Roman" w:eastAsia="Times New Roman" w:hAnsi="Times New Roman"/>
-                <w:b w:val="0"/>
-                <w:bCs w:val="0"/>
-                <w:i w:val="0"/>
-                <w:iCs w:val="0"/>
-                <w:u w:val="none"/>
-                <w:color w:val="000000"/>
-                <w:sz w:val="20"/>
-                <w:szCs w:val="20"/>
-              </w:rPr>
-              <w:t xml:space="preserve">).</w:t>
+              <w:t xml:space="preserve">).&lt;br/&gt;3. Hourly cron requests require HMAC-SHA256 authentication (</w:t>
+            </w:r>
+            <w:r>
+              <w:rPr>
+                <w:rFonts w:ascii="Times New Roman" w:cs="Times New Roman" w:eastAsia="Times New Roman" w:hAnsi="Times New Roman"/>
+                <w:b w:val="0"/>
+                <w:bCs w:val="0"/>
+                <w:i w:val="0"/>
+                <w:iCs w:val="0"/>
+                <w:u w:val="none"/>
+                <w:color w:val="000000"/>
+                <w:sz w:val="20"/>
+                <w:szCs w:val="20"/>
+              </w:rPr>
+              <w:t xml:space="preserve">X-Cron-Timestamp</w:t>
+            </w:r>
+            <w:r>
+              <w:rPr>
+                <w:rFonts w:ascii="Times New Roman" w:cs="Times New Roman" w:eastAsia="Times New Roman" w:hAnsi="Times New Roman"/>
+                <w:b w:val="0"/>
+                <w:bCs w:val="0"/>
+                <w:i w:val="0"/>
+                <w:iCs w:val="0"/>
+                <w:u w:val="none"/>
+                <w:color w:val="000000"/>
+                <w:sz w:val="20"/>
+                <w:szCs w:val="20"/>
+              </w:rPr>
+              <w:t xml:space="preserve"> and </w:t>
+            </w:r>
+            <w:r>
+              <w:rPr>
+                <w:rFonts w:ascii="Times New Roman" w:cs="Times New Roman" w:eastAsia="Times New Roman" w:hAnsi="Times New Roman"/>
+                <w:b w:val="0"/>
+                <w:bCs w:val="0"/>
+                <w:i w:val="0"/>
+                <w:iCs w:val="0"/>
+                <w:u w:val="none"/>
+                <w:color w:val="000000"/>
+                <w:sz w:val="20"/>
+                <w:szCs w:val="20"/>
+              </w:rPr>
+              <w:t xml:space="preserve">X-Cron-Signature: sha256=&lt;64-hex-hmac&gt;</w:t>
+            </w:r>
+            <w:r>
+              <w:rPr>
+                <w:rFonts w:ascii="Times New Roman" w:cs="Times New Roman" w:eastAsia="Times New Roman" w:hAnsi="Times New Roman"/>
+                <w:b w:val="0"/>
+                <w:bCs w:val="0"/>
+                <w:i w:val="0"/>
+                <w:iCs w:val="0"/>
+                <w:u w:val="none"/>
+                <w:color w:val="000000"/>
+                <w:sz w:val="20"/>
+                <w:szCs w:val="20"/>
+              </w:rPr>
+              <w:t xml:space="preserve">) on </w:t>
+            </w:r>
+            <w:r>
+              <w:rPr>
+                <w:rFonts w:ascii="Times New Roman" w:cs="Times New Roman" w:eastAsia="Times New Roman" w:hAnsi="Times New Roman"/>
+                <w:b w:val="0"/>
+                <w:bCs w:val="0"/>
+                <w:i w:val="0"/>
+                <w:iCs w:val="0"/>
+                <w:u w:val="none"/>
+                <w:color w:val="000000"/>
+                <w:sz w:val="20"/>
+                <w:szCs w:val="20"/>
+              </w:rPr>
+              <w:t xml:space="preserve">/api/v1/internal/cron/sla-check</w:t>
+            </w:r>
+            <w:r>
+              <w:rPr>
+                <w:rFonts w:ascii="Times New Roman" w:cs="Times New Roman" w:eastAsia="Times New Roman" w:hAnsi="Times New Roman"/>
+                <w:b w:val="0"/>
+                <w:bCs w:val="0"/>
+                <w:i w:val="0"/>
+                <w:iCs w:val="0"/>
+                <w:u w:val="none"/>
+                <w:color w:val="000000"/>
+                <w:sz w:val="20"/>
+                <w:szCs w:val="20"/>
+              </w:rPr>
+              <w:t xml:space="preserve">.</w:t>
             </w:r>
           </w:p>
         </w:tc>
@@ -12232,6 +13785,34 @@
                 <w:szCs w:val="20"/>
               </w:rPr>
               <w:t xml:space="preserve">FR-5.4</w:t>
+            </w:r>
+            <w:r>
+              <w:rPr>
+                <w:rFonts w:ascii="Times New Roman" w:cs="Times New Roman" w:eastAsia="Times New Roman" w:hAnsi="Times New Roman"/>
+                <w:b w:val="0"/>
+                <w:bCs w:val="0"/>
+                <w:i w:val="0"/>
+                <w:iCs w:val="0"/>
+                <w:u w:val="none"/>
+                <w:color w:val="000000"/>
+                <w:sz w:val="20"/>
+                <w:szCs w:val="20"/>
+              </w:rPr>
+              <w:t xml:space="preserve">, </w:t>
+            </w:r>
+            <w:r>
+              <w:rPr>
+                <w:rFonts w:ascii="Times New Roman" w:cs="Times New Roman" w:eastAsia="Times New Roman" w:hAnsi="Times New Roman"/>
+                <w:b w:val="0"/>
+                <w:bCs w:val="0"/>
+                <w:i w:val="0"/>
+                <w:iCs w:val="0"/>
+                <w:u w:val="none"/>
+                <w:color w:val="000000"/>
+                <w:sz w:val="20"/>
+                <w:szCs w:val="20"/>
+              </w:rPr>
+              <w:t xml:space="preserve">FR-8.4c</w:t>
             </w:r>
           </w:p>
         </w:tc>
@@ -12329,21 +13910,49 @@
                 <w:sz w:val="20"/>
                 <w:szCs w:val="20"/>
               </w:rPr>
-              <w:t xml:space="preserve">1. Client payloads use OpenPGP SEIPDv2 with AEAD integrity verification.&lt;br/&gt;2. Audit ledger enforces append-only semantics via PostgreSQL triggers and SHA-256 hash chaining (</w:t>
-            </w:r>
-            <w:r>
-              <w:rPr>
-                <w:rFonts w:ascii="Times New Roman" w:cs="Times New Roman" w:eastAsia="Times New Roman" w:hAnsi="Times New Roman"/>
-                <w:b w:val="0"/>
-                <w:bCs w:val="0"/>
-                <w:i w:val="0"/>
-                <w:iCs w:val="0"/>
-                <w:u w:val="none"/>
-                <w:color w:val="000000"/>
-                <w:sz w:val="20"/>
-                <w:szCs w:val="20"/>
-              </w:rPr>
-              <w:t xml:space="preserve">prev_hash</w:t>
+              <w:t xml:space="preserve">1. Client payloads use OpenPGP SEIPDv2 with AEAD integrity verification.&lt;br/&gt;2. Audit ledger enforces append-only semantics via PostgreSQL triggers and SHA-256 dual hash chaining (</w:t>
+            </w:r>
+            <w:r>
+              <w:rPr>
+                <w:rFonts w:ascii="Times New Roman" w:cs="Times New Roman" w:eastAsia="Times New Roman" w:hAnsi="Times New Roman"/>
+                <w:b w:val="0"/>
+                <w:bCs w:val="0"/>
+                <w:i w:val="0"/>
+                <w:iCs w:val="0"/>
+                <w:u w:val="none"/>
+                <w:color w:val="000000"/>
+                <w:sz w:val="20"/>
+                <w:szCs w:val="20"/>
+              </w:rPr>
+              <w:t xml:space="preserve">tenant_row_hash</w:t>
+            </w:r>
+            <w:r>
+              <w:rPr>
+                <w:rFonts w:ascii="Times New Roman" w:cs="Times New Roman" w:eastAsia="Times New Roman" w:hAnsi="Times New Roman"/>
+                <w:b w:val="0"/>
+                <w:bCs w:val="0"/>
+                <w:i w:val="0"/>
+                <w:iCs w:val="0"/>
+                <w:u w:val="none"/>
+                <w:color w:val="000000"/>
+                <w:sz w:val="20"/>
+                <w:szCs w:val="20"/>
+              </w:rPr>
+              <w:t xml:space="preserve"> and </w:t>
+            </w:r>
+            <w:r>
+              <w:rPr>
+                <w:rFonts w:ascii="Times New Roman" w:cs="Times New Roman" w:eastAsia="Times New Roman" w:hAnsi="Times New Roman"/>
+                <w:b w:val="0"/>
+                <w:bCs w:val="0"/>
+                <w:i w:val="0"/>
+                <w:iCs w:val="0"/>
+                <w:u w:val="none"/>
+                <w:color w:val="000000"/>
+                <w:sz w:val="20"/>
+                <w:szCs w:val="20"/>
+              </w:rPr>
+              <w:t xml:space="preserve">report_chain_hash</w:t>
             </w:r>
             <w:r>
               <w:rPr>
@@ -12584,49 +14193,49 @@
                 <w:sz w:val="20"/>
                 <w:szCs w:val="20"/>
               </w:rPr>
-              <w:t xml:space="preserve">ahead</w:t>
-            </w:r>
-            <w:r>
-              <w:rPr>
-                <w:rFonts w:ascii="Times New Roman" w:cs="Times New Roman" w:eastAsia="Times New Roman" w:hAnsi="Times New Roman"/>
-                <w:b w:val="0"/>
-                <w:bCs w:val="0"/>
-                <w:i w:val="0"/>
-                <w:iCs w:val="0"/>
-                <w:u w:val="none"/>
-                <w:color w:val="000000"/>
-                <w:sz w:val="20"/>
-                <w:szCs w:val="20"/>
-              </w:rPr>
-              <w:t xml:space="preserve">/</w:t>
-            </w:r>
-            <w:r>
-              <w:rPr>
-                <w:rFonts w:ascii="Times New Roman" w:cs="Times New Roman" w:eastAsia="Times New Roman" w:hAnsi="Times New Roman"/>
-                <w:b w:val="0"/>
-                <w:bCs w:val="0"/>
-                <w:i w:val="0"/>
-                <w:iCs w:val="0"/>
-                <w:u w:val="none"/>
-                <w:color w:val="000000"/>
-                <w:sz w:val="20"/>
-                <w:szCs w:val="20"/>
-              </w:rPr>
-              <w:t xml:space="preserve">identical</w:t>
-            </w:r>
-            <w:r>
-              <w:rPr>
-                <w:rFonts w:ascii="Times New Roman" w:cs="Times New Roman" w:eastAsia="Times New Roman" w:hAnsi="Times New Roman"/>
-                <w:b w:val="0"/>
-                <w:bCs w:val="0"/>
-                <w:i w:val="0"/>
-                <w:iCs w:val="0"/>
-                <w:u w:val="none"/>
-                <w:color w:val="000000"/>
-                <w:sz w:val="20"/>
-                <w:szCs w:val="20"/>
-              </w:rPr>
-              <w:t xml:space="preserve"> check) or an immutable config hash.&lt;br/&gt;2. Retest closures generate cryptographic Closure Evidence Exports signed with Ed25519.</w:t>
+              <w:t xml:space="preserve">compare/{branch}...{sha}</w:t>
+            </w:r>
+            <w:r>
+              <w:rPr>
+                <w:rFonts w:ascii="Times New Roman" w:cs="Times New Roman" w:eastAsia="Times New Roman" w:hAnsi="Times New Roman"/>
+                <w:b w:val="0"/>
+                <w:bCs w:val="0"/>
+                <w:i w:val="0"/>
+                <w:iCs w:val="0"/>
+                <w:u w:val="none"/>
+                <w:color w:val="000000"/>
+                <w:sz w:val="20"/>
+                <w:szCs w:val="20"/>
+              </w:rPr>
+              <w:t xml:space="preserve">) or an immutable config hash.&lt;br/&gt;2. Retest closures generate cryptographic Closure Evidence Exports signed with Ed25519 (Priority 2 Extension under </w:t>
+            </w:r>
+            <w:r>
+              <w:rPr>
+                <w:rFonts w:ascii="Times New Roman" w:cs="Times New Roman" w:eastAsia="Times New Roman" w:hAnsi="Times New Roman"/>
+                <w:b w:val="0"/>
+                <w:bCs w:val="0"/>
+                <w:i w:val="0"/>
+                <w:iCs w:val="0"/>
+                <w:u w:val="none"/>
+                <w:color w:val="000000"/>
+                <w:sz w:val="20"/>
+                <w:szCs w:val="20"/>
+              </w:rPr>
+              <w:t xml:space="preserve">FR-7.7</w:t>
+            </w:r>
+            <w:r>
+              <w:rPr>
+                <w:rFonts w:ascii="Times New Roman" w:cs="Times New Roman" w:eastAsia="Times New Roman" w:hAnsi="Times New Roman"/>
+                <w:b w:val="0"/>
+                <w:bCs w:val="0"/>
+                <w:i w:val="0"/>
+                <w:iCs w:val="0"/>
+                <w:u w:val="none"/>
+                <w:color w:val="000000"/>
+                <w:sz w:val="20"/>
+                <w:szCs w:val="20"/>
+              </w:rPr>
+              <w:t xml:space="preserve">).</w:t>
             </w:r>
           </w:p>
         </w:tc>
@@ -12867,7 +14476,35 @@
                 <w:sz w:val="20"/>
                 <w:szCs w:val="20"/>
               </w:rPr>
-              <w:t xml:space="preserve"> values are never stored in database retry caches.</w:t>
+              <w:t xml:space="preserve"> values are never stored in database retry caches; sessions use CSPRNG tokens with SHA-256 hashes in </w:t>
+            </w:r>
+            <w:r>
+              <w:rPr>
+                <w:rFonts w:ascii="Times New Roman" w:cs="Times New Roman" w:eastAsia="Times New Roman" w:hAnsi="Times New Roman"/>
+                <w:b w:val="0"/>
+                <w:bCs w:val="0"/>
+                <w:i w:val="0"/>
+                <w:iCs w:val="0"/>
+                <w:u w:val="none"/>
+                <w:color w:val="000000"/>
+                <w:sz w:val="20"/>
+                <w:szCs w:val="20"/>
+              </w:rPr>
+              <w:t xml:space="preserve">token_hash</w:t>
+            </w:r>
+            <w:r>
+              <w:rPr>
+                <w:rFonts w:ascii="Times New Roman" w:cs="Times New Roman" w:eastAsia="Times New Roman" w:hAnsi="Times New Roman"/>
+                <w:b w:val="0"/>
+                <w:bCs w:val="0"/>
+                <w:i w:val="0"/>
+                <w:iCs w:val="0"/>
+                <w:u w:val="none"/>
+                <w:color w:val="000000"/>
+                <w:sz w:val="20"/>
+                <w:szCs w:val="20"/>
+              </w:rPr>
+              <w:t xml:space="preserve">.</w:t>
             </w:r>
           </w:p>
         </w:tc>
@@ -12927,6 +14564,34 @@
                 <w:szCs w:val="20"/>
               </w:rPr>
               <w:t xml:space="preserve">FR-5.2</w:t>
+            </w:r>
+            <w:r>
+              <w:rPr>
+                <w:rFonts w:ascii="Times New Roman" w:cs="Times New Roman" w:eastAsia="Times New Roman" w:hAnsi="Times New Roman"/>
+                <w:b w:val="0"/>
+                <w:bCs w:val="0"/>
+                <w:i w:val="0"/>
+                <w:iCs w:val="0"/>
+                <w:u w:val="none"/>
+                <w:color w:val="000000"/>
+                <w:sz w:val="20"/>
+                <w:szCs w:val="20"/>
+              </w:rPr>
+              <w:t xml:space="preserve">, </w:t>
+            </w:r>
+            <w:r>
+              <w:rPr>
+                <w:rFonts w:ascii="Times New Roman" w:cs="Times New Roman" w:eastAsia="Times New Roman" w:hAnsi="Times New Roman"/>
+                <w:b w:val="0"/>
+                <w:bCs w:val="0"/>
+                <w:i w:val="0"/>
+                <w:iCs w:val="0"/>
+                <w:u w:val="none"/>
+                <w:color w:val="000000"/>
+                <w:sz w:val="20"/>
+                <w:szCs w:val="20"/>
+              </w:rPr>
+              <w:t xml:space="preserve">FR-1.3b</w:t>
             </w:r>
             <w:r>
               <w:rPr>
@@ -13052,7 +14717,63 @@
                 <w:sz w:val="20"/>
                 <w:szCs w:val="20"/>
               </w:rPr>
-              <w:t xml:space="preserve">1. Cloudflare Turnstile bot verification required before issuing submission session tokens.&lt;br/&gt;2. Shared-store rate limiter restricts unauthenticated submissions (5 req/hr/IP).&lt;br/&gt;3. Strict storage quotas: 50 MB DB cap, 1.0 GiB R2 tenant cap, and 300 KiB Priority-0 reserve floor.</w:t>
+              <w:t xml:space="preserve">1. Cloudflare Turnstile bot verification required before issuing submission session tokens.&lt;br/&gt;2. Shared-store rate limiter restricts unauthenticated submissions to 10 submissions/hour/IP (</w:t>
+            </w:r>
+            <w:r>
+              <w:rPr>
+                <w:rFonts w:ascii="Times New Roman" w:cs="Times New Roman" w:eastAsia="Times New Roman" w:hAnsi="Times New Roman"/>
+                <w:b w:val="0"/>
+                <w:bCs w:val="0"/>
+                <w:i w:val="0"/>
+                <w:iCs w:val="0"/>
+                <w:u w:val="none"/>
+                <w:color w:val="000000"/>
+                <w:sz w:val="20"/>
+                <w:szCs w:val="20"/>
+              </w:rPr>
+              <w:t xml:space="preserve">FR-8.3</w:t>
+            </w:r>
+            <w:r>
+              <w:rPr>
+                <w:rFonts w:ascii="Times New Roman" w:cs="Times New Roman" w:eastAsia="Times New Roman" w:hAnsi="Times New Roman"/>
+                <w:b w:val="0"/>
+                <w:bCs w:val="0"/>
+                <w:i w:val="0"/>
+                <w:iCs w:val="0"/>
+                <w:u w:val="none"/>
+                <w:color w:val="000000"/>
+                <w:sz w:val="20"/>
+                <w:szCs w:val="20"/>
+              </w:rPr>
+              <w:t xml:space="preserve">).&lt;br/&gt;3. Strict multi-tenant storage quotas: separate 20 MiB intake pool and 6 MiB Priority-0 reserve floor (</w:t>
+            </w:r>
+            <w:r>
+              <w:rPr>
+                <w:rFonts w:ascii="Times New Roman" w:cs="Times New Roman" w:eastAsia="Times New Roman" w:hAnsi="Times New Roman"/>
+                <w:b w:val="0"/>
+                <w:bCs w:val="0"/>
+                <w:i w:val="0"/>
+                <w:iCs w:val="0"/>
+                <w:u w:val="none"/>
+                <w:color w:val="000000"/>
+                <w:sz w:val="20"/>
+                <w:szCs w:val="20"/>
+              </w:rPr>
+              <w:t xml:space="preserve">FR-8.4</w:t>
+            </w:r>
+            <w:r>
+              <w:rPr>
+                <w:rFonts w:ascii="Times New Roman" w:cs="Times New Roman" w:eastAsia="Times New Roman" w:hAnsi="Times New Roman"/>
+                <w:b w:val="0"/>
+                <w:bCs w:val="0"/>
+                <w:i w:val="0"/>
+                <w:iCs w:val="0"/>
+                <w:u w:val="none"/>
+                <w:color w:val="000000"/>
+                <w:sz w:val="20"/>
+                <w:szCs w:val="20"/>
+              </w:rPr>
+              <w:t xml:space="preserve">).</w:t>
             </w:r>
           </w:p>
         </w:tc>
@@ -13293,21 +15014,21 @@
                 <w:sz w:val="20"/>
                 <w:szCs w:val="20"/>
               </w:rPr>
-              <w:t xml:space="preserve">.&lt;br/&gt;2. Runtime executes under </w:t>
-            </w:r>
-            <w:r>
-              <w:rPr>
-                <w:rFonts w:ascii="Times New Roman" w:cs="Times New Roman" w:eastAsia="Times New Roman" w:hAnsi="Times New Roman"/>
-                <w:b w:val="0"/>
-                <w:bCs w:val="0"/>
-                <w:i w:val="0"/>
-                <w:iCs w:val="0"/>
-                <w:u w:val="none"/>
-                <w:color w:val="000000"/>
-                <w:sz w:val="20"/>
-                <w:szCs w:val="20"/>
-              </w:rPr>
-              <w:t xml:space="preserve">bbt_app_runtime</w:t>
+              <w:t xml:space="preserve">.&lt;br/&gt;2. Runtime executes under unprivileged role </w:t>
+            </w:r>
+            <w:r>
+              <w:rPr>
+                <w:rFonts w:ascii="Times New Roman" w:cs="Times New Roman" w:eastAsia="Times New Roman" w:hAnsi="Times New Roman"/>
+                <w:b w:val="0"/>
+                <w:bCs w:val="0"/>
+                <w:i w:val="0"/>
+                <w:iCs w:val="0"/>
+                <w:u w:val="none"/>
+                <w:color w:val="000000"/>
+                <w:sz w:val="20"/>
+                <w:szCs w:val="20"/>
+              </w:rPr>
+              <w:t xml:space="preserve">bbt_app</w:t>
             </w:r>
             <w:r>
               <w:rPr>
@@ -13465,6 +15186,879 @@
                 <w:szCs w:val="20"/>
               </w:rPr>
               <w:t xml:space="preserve">FR-1.1</w:t>
+            </w:r>
+          </w:p>
+        </w:tc>
+      </w:tr>
+    </w:tbl>
+    <w:p>
+      <w:pPr>
+        <w:pBdr>
+          <w:bottom w:val="single" w:sz="12" w:space="1" w:color="000000"/>
+        </w:pBdr>
+        <w:spacing w:before="120" w:after="120"/>
+      </w:pPr>
+    </w:p>
+    <w:p>
+      <w:pPr>
+        <w:spacing w:before="180" w:after="80" w:line="240" w:lineRule="auto"/>
+        <w:jc w:val="left"/>
+        <w:keepNext/>
+      </w:pPr>
+      <w:r>
+        <w:rPr>
+          <w:rFonts w:ascii="Times New Roman" w:cs="Times New Roman" w:eastAsia="Times New Roman" w:hAnsi="Times New Roman"/>
+          <w:b/>
+          <w:bCs/>
+          <w:i w:val="0"/>
+          <w:iCs w:val="0"/>
+          <w:u w:val="none"/>
+          <w:color w:val="000000"/>
+          <w:sz w:val="24"/>
+          <w:szCs w:val="24"/>
+        </w:rPr>
+        <w:t xml:space="preserve">4.3 Defensible System Boundaries: What BugBountyTrack Controls vs Does NOT Control</w:t>
+      </w:r>
+    </w:p>
+    <w:p>
+      <w:pPr>
+        <w:spacing w:before="60" w:after="80" w:line="240" w:lineRule="auto"/>
+        <w:jc w:val="left"/>
+      </w:pPr>
+      <w:r>
+        <w:rPr>
+          <w:rFonts w:ascii="Times New Roman" w:cs="Times New Roman" w:eastAsia="Times New Roman" w:hAnsi="Times New Roman"/>
+          <w:b w:val="0"/>
+          <w:bCs w:val="0"/>
+          <w:i w:val="0"/>
+          <w:iCs w:val="0"/>
+          <w:u w:val="none"/>
+          <w:color w:val="000000"/>
+          <w:sz w:val="22"/>
+          <w:szCs w:val="22"/>
+        </w:rPr>
+        <w:t xml:space="preserve">To establish honest engineering boundaries and prevent false assurances, the table below explicitly defines what BugBountyTrack architecturally controls versus external operational factors beyond its perimeter:</w:t>
+      </w:r>
+    </w:p>
+    <w:tbl>
+      <w:tblPr>
+        <w:tblW w:w="9360" w:type="dxa"/>
+        <w:tblBorders>
+          <w:top w:val="single" w:sz="6" w:space="0" w:color="000000"/>
+          <w:left w:val="single" w:sz="6" w:space="0" w:color="000000"/>
+          <w:bottom w:val="single" w:sz="6" w:space="0" w:color="000000"/>
+          <w:right w:val="single" w:sz="6" w:space="0" w:color="000000"/>
+          <w:insideH w:val="single" w:sz="4" w:space="0" w:color="000000"/>
+          <w:insideV w:val="single" w:sz="4" w:space="0" w:color="000000"/>
+        </w:tblBorders>
+        <w:tblLayout w:type="fixed"/>
+        <w:tblCellMar>
+          <w:top w:w="80" w:type="dxa"/>
+          <w:left w:w="120" w:type="dxa"/>
+          <w:bottom w:w="80" w:type="dxa"/>
+          <w:right w:w="120" w:type="dxa"/>
+        </w:tblCellMar>
+      </w:tblPr>
+      <w:tblGrid>
+        <w:gridCol w:w="3120"/>
+        <w:gridCol w:w="3120"/>
+        <w:gridCol w:w="3120"/>
+      </w:tblGrid>
+      <w:tr>
+        <w:trPr>
+          <w:tblHeader/>
+          <w:cantSplit/>
+        </w:trPr>
+        <w:tc>
+          <w:tcPr>
+            <w:tcW w:w="3120" w:type="dxa"/>
+            <w:tcBorders>
+              <w:top w:val="single" w:sz="4" w:color="000000"/>
+              <w:left w:val="single" w:sz="4" w:color="000000"/>
+              <w:bottom w:val="single" w:sz="4" w:color="000000"/>
+              <w:right w:val="single" w:sz="4" w:color="000000"/>
+            </w:tcBorders>
+            <w:vAlign w:val="center"/>
+          </w:tcPr>
+          <w:p>
+            <w:pPr>
+              <w:spacing w:before="40" w:after="40" w:line="240" w:lineRule="auto"/>
+            </w:pPr>
+            <w:r>
+              <w:rPr>
+                <w:rFonts w:ascii="Times New Roman" w:cs="Times New Roman" w:eastAsia="Times New Roman" w:hAnsi="Times New Roman"/>
+                <w:b/>
+                <w:bCs/>
+                <w:i w:val="0"/>
+                <w:iCs w:val="0"/>
+                <w:u w:val="none"/>
+                <w:color w:val="000000"/>
+                <w:sz w:val="20"/>
+                <w:szCs w:val="20"/>
+              </w:rPr>
+              <w:t xml:space="preserve">System Domain</w:t>
+            </w:r>
+          </w:p>
+        </w:tc>
+        <w:tc>
+          <w:tcPr>
+            <w:tcW w:w="3120" w:type="dxa"/>
+            <w:tcBorders>
+              <w:top w:val="single" w:sz="4" w:color="000000"/>
+              <w:left w:val="single" w:sz="4" w:color="000000"/>
+              <w:bottom w:val="single" w:sz="4" w:color="000000"/>
+              <w:right w:val="single" w:sz="4" w:color="000000"/>
+            </w:tcBorders>
+            <w:vAlign w:val="center"/>
+          </w:tcPr>
+          <w:p>
+            <w:pPr>
+              <w:spacing w:before="40" w:after="40" w:line="240" w:lineRule="auto"/>
+            </w:pPr>
+            <w:r>
+              <w:rPr>
+                <w:rFonts w:ascii="Times New Roman" w:cs="Times New Roman" w:eastAsia="Times New Roman" w:hAnsi="Times New Roman"/>
+                <w:b/>
+                <w:bCs/>
+                <w:i w:val="0"/>
+                <w:iCs w:val="0"/>
+                <w:u w:val="none"/>
+                <w:color w:val="000000"/>
+                <w:sz w:val="20"/>
+                <w:szCs w:val="20"/>
+              </w:rPr>
+              <w:t xml:space="preserve">What BugBountyTrack DOES Architecturally Control</w:t>
+            </w:r>
+          </w:p>
+        </w:tc>
+        <w:tc>
+          <w:tcPr>
+            <w:tcW w:w="3120" w:type="dxa"/>
+            <w:tcBorders>
+              <w:top w:val="single" w:sz="4" w:color="000000"/>
+              <w:left w:val="single" w:sz="4" w:color="000000"/>
+              <w:bottom w:val="single" w:sz="4" w:color="000000"/>
+              <w:right w:val="single" w:sz="4" w:color="000000"/>
+            </w:tcBorders>
+            <w:vAlign w:val="center"/>
+          </w:tcPr>
+          <w:p>
+            <w:pPr>
+              <w:spacing w:before="40" w:after="40" w:line="240" w:lineRule="auto"/>
+            </w:pPr>
+            <w:r>
+              <w:rPr>
+                <w:rFonts w:ascii="Times New Roman" w:cs="Times New Roman" w:eastAsia="Times New Roman" w:hAnsi="Times New Roman"/>
+                <w:b/>
+                <w:bCs/>
+                <w:i w:val="0"/>
+                <w:iCs w:val="0"/>
+                <w:u w:val="none"/>
+                <w:color w:val="000000"/>
+                <w:sz w:val="20"/>
+                <w:szCs w:val="20"/>
+              </w:rPr>
+              <w:t xml:space="preserve">What BugBountyTrack DOES NOT Control (External Dependencies)</w:t>
+            </w:r>
+          </w:p>
+        </w:tc>
+      </w:tr>
+      <w:tr>
+        <w:trPr>
+          <w:cantSplit/>
+        </w:trPr>
+        <w:tc>
+          <w:tcPr>
+            <w:tcW w:w="3120" w:type="dxa"/>
+            <w:tcBorders>
+              <w:top w:val="single" w:sz="4" w:color="000000"/>
+              <w:left w:val="single" w:sz="4" w:color="000000"/>
+              <w:bottom w:val="single" w:sz="4" w:color="000000"/>
+              <w:right w:val="single" w:sz="4" w:color="000000"/>
+            </w:tcBorders>
+            <w:vAlign w:val="center"/>
+          </w:tcPr>
+          <w:p>
+            <w:pPr>
+              <w:spacing w:before="40" w:after="40" w:line="240" w:lineRule="auto"/>
+            </w:pPr>
+            <w:r>
+              <w:rPr>
+                <w:rFonts w:ascii="Times New Roman" w:cs="Times New Roman" w:eastAsia="Times New Roman" w:hAnsi="Times New Roman"/>
+                <w:b/>
+                <w:bCs/>
+                <w:i w:val="0"/>
+                <w:iCs w:val="0"/>
+                <w:u w:val="none"/>
+                <w:color w:val="000000"/>
+                <w:sz w:val="20"/>
+                <w:szCs w:val="20"/>
+              </w:rPr>
+              <w:t xml:space="preserve">Cryptographic Confidentiality</w:t>
+            </w:r>
+          </w:p>
+        </w:tc>
+        <w:tc>
+          <w:tcPr>
+            <w:tcW w:w="3120" w:type="dxa"/>
+            <w:tcBorders>
+              <w:top w:val="single" w:sz="4" w:color="000000"/>
+              <w:left w:val="single" w:sz="4" w:color="000000"/>
+              <w:bottom w:val="single" w:sz="4" w:color="000000"/>
+              <w:right w:val="single" w:sz="4" w:color="000000"/>
+            </w:tcBorders>
+            <w:vAlign w:val="center"/>
+          </w:tcPr>
+          <w:p>
+            <w:pPr>
+              <w:spacing w:before="40" w:after="40" w:line="240" w:lineRule="auto"/>
+            </w:pPr>
+            <w:r>
+              <w:rPr>
+                <w:rFonts w:ascii="Times New Roman" w:cs="Times New Roman" w:eastAsia="Times New Roman" w:hAnsi="Times New Roman"/>
+                <w:b w:val="0"/>
+                <w:bCs w:val="0"/>
+                <w:i w:val="0"/>
+                <w:iCs w:val="0"/>
+                <w:u w:val="none"/>
+                <w:color w:val="000000"/>
+                <w:sz w:val="20"/>
+                <w:szCs w:val="20"/>
+              </w:rPr>
+              <w:t xml:space="preserve">In-browser client encryption/decryption using OpenPGP.js v6 Curve25519; server-side zero-knowledge storage; mathematical segregation of Class B (shared) vs Class C (internal) ciphertexts.</w:t>
+            </w:r>
+          </w:p>
+        </w:tc>
+        <w:tc>
+          <w:tcPr>
+            <w:tcW w:w="3120" w:type="dxa"/>
+            <w:tcBorders>
+              <w:top w:val="single" w:sz="4" w:color="000000"/>
+              <w:left w:val="single" w:sz="4" w:color="000000"/>
+              <w:bottom w:val="single" w:sz="4" w:color="000000"/>
+              <w:right w:val="single" w:sz="4" w:color="000000"/>
+            </w:tcBorders>
+            <w:vAlign w:val="center"/>
+          </w:tcPr>
+          <w:p>
+            <w:pPr>
+              <w:spacing w:before="40" w:after="40" w:line="240" w:lineRule="auto"/>
+            </w:pPr>
+            <w:r>
+              <w:rPr>
+                <w:rFonts w:ascii="Times New Roman" w:cs="Times New Roman" w:eastAsia="Times New Roman" w:hAnsi="Times New Roman"/>
+                <w:b w:val="0"/>
+                <w:bCs w:val="0"/>
+                <w:i w:val="0"/>
+                <w:iCs w:val="0"/>
+                <w:u w:val="none"/>
+                <w:color w:val="000000"/>
+                <w:sz w:val="20"/>
+                <w:szCs w:val="20"/>
+              </w:rPr>
+              <w:t xml:space="preserve">Client endpoint integrity; malware, keyloggers, or malicious browser extensions on researcher/defender devices; compromised physical machines.</w:t>
+            </w:r>
+          </w:p>
+        </w:tc>
+      </w:tr>
+      <w:tr>
+        <w:trPr>
+          <w:cantSplit/>
+        </w:trPr>
+        <w:tc>
+          <w:tcPr>
+            <w:tcW w:w="3120" w:type="dxa"/>
+            <w:tcBorders>
+              <w:top w:val="single" w:sz="4" w:color="000000"/>
+              <w:left w:val="single" w:sz="4" w:color="000000"/>
+              <w:bottom w:val="single" w:sz="4" w:color="000000"/>
+              <w:right w:val="single" w:sz="4" w:color="000000"/>
+            </w:tcBorders>
+            <w:vAlign w:val="center"/>
+          </w:tcPr>
+          <w:p>
+            <w:pPr>
+              <w:spacing w:before="40" w:after="40" w:line="240" w:lineRule="auto"/>
+            </w:pPr>
+            <w:r>
+              <w:rPr>
+                <w:rFonts w:ascii="Times New Roman" w:cs="Times New Roman" w:eastAsia="Times New Roman" w:hAnsi="Times New Roman"/>
+                <w:b/>
+                <w:bCs/>
+                <w:i w:val="0"/>
+                <w:iCs w:val="0"/>
+                <w:u w:val="none"/>
+                <w:color w:val="000000"/>
+                <w:sz w:val="20"/>
+                <w:szCs w:val="20"/>
+              </w:rPr>
+              <w:t xml:space="preserve">Application &amp; API Routing</w:t>
+            </w:r>
+          </w:p>
+        </w:tc>
+        <w:tc>
+          <w:tcPr>
+            <w:tcW w:w="3120" w:type="dxa"/>
+            <w:tcBorders>
+              <w:top w:val="single" w:sz="4" w:color="000000"/>
+              <w:left w:val="single" w:sz="4" w:color="000000"/>
+              <w:bottom w:val="single" w:sz="4" w:color="000000"/>
+              <w:right w:val="single" w:sz="4" w:color="000000"/>
+            </w:tcBorders>
+            <w:vAlign w:val="center"/>
+          </w:tcPr>
+          <w:p>
+            <w:pPr>
+              <w:spacing w:before="40" w:after="40" w:line="240" w:lineRule="auto"/>
+            </w:pPr>
+            <w:r>
+              <w:rPr>
+                <w:rFonts w:ascii="Times New Roman" w:cs="Times New Roman" w:eastAsia="Times New Roman" w:hAnsi="Times New Roman"/>
+                <w:b w:val="0"/>
+                <w:bCs w:val="0"/>
+                <w:i w:val="0"/>
+                <w:iCs w:val="0"/>
+                <w:u w:val="none"/>
+                <w:color w:val="000000"/>
+                <w:sz w:val="20"/>
+                <w:szCs w:val="20"/>
+              </w:rPr>
+              <w:t xml:space="preserve">Stateless API routing; rate limiting (10 submissions/hr/IP); session token issuance (256-bit CSPRNG); Argon2id password KDF; HMAC-SHA256 cron signature validation.</w:t>
+            </w:r>
+          </w:p>
+        </w:tc>
+        <w:tc>
+          <w:tcPr>
+            <w:tcW w:w="3120" w:type="dxa"/>
+            <w:tcBorders>
+              <w:top w:val="single" w:sz="4" w:color="000000"/>
+              <w:left w:val="single" w:sz="4" w:color="000000"/>
+              <w:bottom w:val="single" w:sz="4" w:color="000000"/>
+              <w:right w:val="single" w:sz="4" w:color="000000"/>
+            </w:tcBorders>
+            <w:vAlign w:val="center"/>
+          </w:tcPr>
+          <w:p>
+            <w:pPr>
+              <w:spacing w:before="40" w:after="40" w:line="240" w:lineRule="auto"/>
+            </w:pPr>
+            <w:r>
+              <w:rPr>
+                <w:rFonts w:ascii="Times New Roman" w:cs="Times New Roman" w:eastAsia="Times New Roman" w:hAnsi="Times New Roman"/>
+                <w:b w:val="0"/>
+                <w:bCs w:val="0"/>
+                <w:i w:val="0"/>
+                <w:iCs w:val="0"/>
+                <w:u w:val="none"/>
+                <w:color w:val="000000"/>
+                <w:sz w:val="20"/>
+                <w:szCs w:val="20"/>
+              </w:rPr>
+              <w:t xml:space="preserve">Network-level BGP routing or Anycast IP hijacking; upstream DNS provider compromises; ISP-level TLS interception if client root certificates are tampered with.</w:t>
+            </w:r>
+          </w:p>
+        </w:tc>
+      </w:tr>
+      <w:tr>
+        <w:trPr>
+          <w:cantSplit/>
+        </w:trPr>
+        <w:tc>
+          <w:tcPr>
+            <w:tcW w:w="3120" w:type="dxa"/>
+            <w:tcBorders>
+              <w:top w:val="single" w:sz="4" w:color="000000"/>
+              <w:left w:val="single" w:sz="4" w:color="000000"/>
+              <w:bottom w:val="single" w:sz="4" w:color="000000"/>
+              <w:right w:val="single" w:sz="4" w:color="000000"/>
+            </w:tcBorders>
+            <w:vAlign w:val="center"/>
+          </w:tcPr>
+          <w:p>
+            <w:pPr>
+              <w:spacing w:before="40" w:after="40" w:line="240" w:lineRule="auto"/>
+            </w:pPr>
+            <w:r>
+              <w:rPr>
+                <w:rFonts w:ascii="Times New Roman" w:cs="Times New Roman" w:eastAsia="Times New Roman" w:hAnsi="Times New Roman"/>
+                <w:b/>
+                <w:bCs/>
+                <w:i w:val="0"/>
+                <w:iCs w:val="0"/>
+                <w:u w:val="none"/>
+                <w:color w:val="000000"/>
+                <w:sz w:val="20"/>
+                <w:szCs w:val="20"/>
+              </w:rPr>
+              <w:t xml:space="preserve">Remediation Attestation</w:t>
+            </w:r>
+          </w:p>
+        </w:tc>
+        <w:tc>
+          <w:tcPr>
+            <w:tcW w:w="3120" w:type="dxa"/>
+            <w:tcBorders>
+              <w:top w:val="single" w:sz="4" w:color="000000"/>
+              <w:left w:val="single" w:sz="4" w:color="000000"/>
+              <w:bottom w:val="single" w:sz="4" w:color="000000"/>
+              <w:right w:val="single" w:sz="4" w:color="000000"/>
+            </w:tcBorders>
+            <w:vAlign w:val="center"/>
+          </w:tcPr>
+          <w:p>
+            <w:pPr>
+              <w:spacing w:before="40" w:after="40" w:line="240" w:lineRule="auto"/>
+            </w:pPr>
+            <w:r>
+              <w:rPr>
+                <w:rFonts w:ascii="Times New Roman" w:cs="Times New Roman" w:eastAsia="Times New Roman" w:hAnsi="Times New Roman"/>
+                <w:b w:val="0"/>
+                <w:bCs w:val="0"/>
+                <w:i w:val="0"/>
+                <w:iCs w:val="0"/>
+                <w:u w:val="none"/>
+                <w:color w:val="000000"/>
+                <w:sz w:val="20"/>
+                <w:szCs w:val="20"/>
+              </w:rPr>
+              <w:t xml:space="preserve">Automated querying of GitHub REST API v3 to confirm commit existence and branch ancestry (</w:t>
+            </w:r>
+            <w:r>
+              <w:rPr>
+                <w:rFonts w:ascii="Times New Roman" w:cs="Times New Roman" w:eastAsia="Times New Roman" w:hAnsi="Times New Roman"/>
+                <w:b w:val="0"/>
+                <w:bCs w:val="0"/>
+                <w:i w:val="0"/>
+                <w:iCs w:val="0"/>
+                <w:u w:val="none"/>
+                <w:color w:val="000000"/>
+                <w:sz w:val="20"/>
+                <w:szCs w:val="20"/>
+              </w:rPr>
+              <w:t xml:space="preserve">compare/{branch}...{sha}</w:t>
+            </w:r>
+            <w:r>
+              <w:rPr>
+                <w:rFonts w:ascii="Times New Roman" w:cs="Times New Roman" w:eastAsia="Times New Roman" w:hAnsi="Times New Roman"/>
+                <w:b w:val="0"/>
+                <w:bCs w:val="0"/>
+                <w:i w:val="0"/>
+                <w:iCs w:val="0"/>
+                <w:u w:val="none"/>
+                <w:color w:val="000000"/>
+                <w:sz w:val="20"/>
+                <w:szCs w:val="20"/>
+              </w:rPr>
+              <w:t xml:space="preserve">); cryptographic SHA-256 hash binding of configuration files.</w:t>
+            </w:r>
+          </w:p>
+        </w:tc>
+        <w:tc>
+          <w:tcPr>
+            <w:tcW w:w="3120" w:type="dxa"/>
+            <w:tcBorders>
+              <w:top w:val="single" w:sz="4" w:color="000000"/>
+              <w:left w:val="single" w:sz="4" w:color="000000"/>
+              <w:bottom w:val="single" w:sz="4" w:color="000000"/>
+              <w:right w:val="single" w:sz="4" w:color="000000"/>
+            </w:tcBorders>
+            <w:vAlign w:val="center"/>
+          </w:tcPr>
+          <w:p>
+            <w:pPr>
+              <w:spacing w:before="40" w:after="40" w:line="240" w:lineRule="auto"/>
+            </w:pPr>
+            <w:r>
+              <w:rPr>
+                <w:rFonts w:ascii="Times New Roman" w:cs="Times New Roman" w:eastAsia="Times New Roman" w:hAnsi="Times New Roman"/>
+                <w:b w:val="0"/>
+                <w:bCs w:val="0"/>
+                <w:i w:val="0"/>
+                <w:iCs w:val="0"/>
+                <w:u w:val="none"/>
+                <w:color w:val="000000"/>
+                <w:sz w:val="20"/>
+                <w:szCs w:val="20"/>
+              </w:rPr>
+              <w:t xml:space="preserve">Real-world server deployment of the verified commit; whether defender deployed the patch to production; defender server infrastructure security or CI/CD runner compromises.</w:t>
+            </w:r>
+          </w:p>
+        </w:tc>
+      </w:tr>
+      <w:tr>
+        <w:trPr>
+          <w:cantSplit/>
+        </w:trPr>
+        <w:tc>
+          <w:tcPr>
+            <w:tcW w:w="3120" w:type="dxa"/>
+            <w:tcBorders>
+              <w:top w:val="single" w:sz="4" w:color="000000"/>
+              <w:left w:val="single" w:sz="4" w:color="000000"/>
+              <w:bottom w:val="single" w:sz="4" w:color="000000"/>
+              <w:right w:val="single" w:sz="4" w:color="000000"/>
+            </w:tcBorders>
+            <w:vAlign w:val="center"/>
+          </w:tcPr>
+          <w:p>
+            <w:pPr>
+              <w:spacing w:before="40" w:after="40" w:line="240" w:lineRule="auto"/>
+            </w:pPr>
+            <w:r>
+              <w:rPr>
+                <w:rFonts w:ascii="Times New Roman" w:cs="Times New Roman" w:eastAsia="Times New Roman" w:hAnsi="Times New Roman"/>
+                <w:b/>
+                <w:bCs/>
+                <w:i w:val="0"/>
+                <w:iCs w:val="0"/>
+                <w:u w:val="none"/>
+                <w:color w:val="000000"/>
+                <w:sz w:val="20"/>
+                <w:szCs w:val="20"/>
+              </w:rPr>
+              <w:t xml:space="preserve">Database &amp; Multi-Tenancy</w:t>
+            </w:r>
+          </w:p>
+        </w:tc>
+        <w:tc>
+          <w:tcPr>
+            <w:tcW w:w="3120" w:type="dxa"/>
+            <w:tcBorders>
+              <w:top w:val="single" w:sz="4" w:color="000000"/>
+              <w:left w:val="single" w:sz="4" w:color="000000"/>
+              <w:bottom w:val="single" w:sz="4" w:color="000000"/>
+              <w:right w:val="single" w:sz="4" w:color="000000"/>
+            </w:tcBorders>
+            <w:vAlign w:val="center"/>
+          </w:tcPr>
+          <w:p>
+            <w:pPr>
+              <w:spacing w:before="40" w:after="40" w:line="240" w:lineRule="auto"/>
+            </w:pPr>
+            <w:r>
+              <w:rPr>
+                <w:rFonts w:ascii="Times New Roman" w:cs="Times New Roman" w:eastAsia="Times New Roman" w:hAnsi="Times New Roman"/>
+                <w:b w:val="0"/>
+                <w:bCs w:val="0"/>
+                <w:i w:val="0"/>
+                <w:iCs w:val="0"/>
+                <w:u w:val="none"/>
+                <w:color w:val="000000"/>
+                <w:sz w:val="20"/>
+                <w:szCs w:val="20"/>
+              </w:rPr>
+              <w:t xml:space="preserve">Database tenant isolation via PostgreSQL </w:t>
+            </w:r>
+            <w:r>
+              <w:rPr>
+                <w:rFonts w:ascii="Times New Roman" w:cs="Times New Roman" w:eastAsia="Times New Roman" w:hAnsi="Times New Roman"/>
+                <w:b w:val="0"/>
+                <w:bCs w:val="0"/>
+                <w:i w:val="0"/>
+                <w:iCs w:val="0"/>
+                <w:u w:val="none"/>
+                <w:color w:val="000000"/>
+                <w:sz w:val="20"/>
+                <w:szCs w:val="20"/>
+              </w:rPr>
+              <w:t xml:space="preserve">FORCE ROW LEVEL SECURITY</w:t>
+            </w:r>
+            <w:r>
+              <w:rPr>
+                <w:rFonts w:ascii="Times New Roman" w:cs="Times New Roman" w:eastAsia="Times New Roman" w:hAnsi="Times New Roman"/>
+                <w:b w:val="0"/>
+                <w:bCs w:val="0"/>
+                <w:i w:val="0"/>
+                <w:iCs w:val="0"/>
+                <w:u w:val="none"/>
+                <w:color w:val="000000"/>
+                <w:sz w:val="20"/>
+                <w:szCs w:val="20"/>
+              </w:rPr>
+              <w:t xml:space="preserve">; unprivileged execution via </w:t>
+            </w:r>
+            <w:r>
+              <w:rPr>
+                <w:rFonts w:ascii="Times New Roman" w:cs="Times New Roman" w:eastAsia="Times New Roman" w:hAnsi="Times New Roman"/>
+                <w:b w:val="0"/>
+                <w:bCs w:val="0"/>
+                <w:i w:val="0"/>
+                <w:iCs w:val="0"/>
+                <w:u w:val="none"/>
+                <w:color w:val="000000"/>
+                <w:sz w:val="20"/>
+                <w:szCs w:val="20"/>
+              </w:rPr>
+              <w:t xml:space="preserve">bbt_app</w:t>
+            </w:r>
+            <w:r>
+              <w:rPr>
+                <w:rFonts w:ascii="Times New Roman" w:cs="Times New Roman" w:eastAsia="Times New Roman" w:hAnsi="Times New Roman"/>
+                <w:b w:val="0"/>
+                <w:bCs w:val="0"/>
+                <w:i w:val="0"/>
+                <w:iCs w:val="0"/>
+                <w:u w:val="none"/>
+                <w:color w:val="000000"/>
+                <w:sz w:val="20"/>
+                <w:szCs w:val="20"/>
+              </w:rPr>
+              <w:t xml:space="preserve"> role; append-only dual hash-chained audit logging (</w:t>
+            </w:r>
+            <w:r>
+              <w:rPr>
+                <w:rFonts w:ascii="Times New Roman" w:cs="Times New Roman" w:eastAsia="Times New Roman" w:hAnsi="Times New Roman"/>
+                <w:b w:val="0"/>
+                <w:bCs w:val="0"/>
+                <w:i w:val="0"/>
+                <w:iCs w:val="0"/>
+                <w:u w:val="none"/>
+                <w:color w:val="000000"/>
+                <w:sz w:val="20"/>
+                <w:szCs w:val="20"/>
+              </w:rPr>
+              <w:t xml:space="preserve">FR-8.5</w:t>
+            </w:r>
+            <w:r>
+              <w:rPr>
+                <w:rFonts w:ascii="Times New Roman" w:cs="Times New Roman" w:eastAsia="Times New Roman" w:hAnsi="Times New Roman"/>
+                <w:b w:val="0"/>
+                <w:bCs w:val="0"/>
+                <w:i w:val="0"/>
+                <w:iCs w:val="0"/>
+                <w:u w:val="none"/>
+                <w:color w:val="000000"/>
+                <w:sz w:val="20"/>
+                <w:szCs w:val="20"/>
+              </w:rPr>
+              <w:t xml:space="preserve">).</w:t>
+            </w:r>
+          </w:p>
+        </w:tc>
+        <w:tc>
+          <w:tcPr>
+            <w:tcW w:w="3120" w:type="dxa"/>
+            <w:tcBorders>
+              <w:top w:val="single" w:sz="4" w:color="000000"/>
+              <w:left w:val="single" w:sz="4" w:color="000000"/>
+              <w:bottom w:val="single" w:sz="4" w:color="000000"/>
+              <w:right w:val="single" w:sz="4" w:color="000000"/>
+            </w:tcBorders>
+            <w:vAlign w:val="center"/>
+          </w:tcPr>
+          <w:p>
+            <w:pPr>
+              <w:spacing w:before="40" w:after="40" w:line="240" w:lineRule="auto"/>
+            </w:pPr>
+            <w:r>
+              <w:rPr>
+                <w:rFonts w:ascii="Times New Roman" w:cs="Times New Roman" w:eastAsia="Times New Roman" w:hAnsi="Times New Roman"/>
+                <w:b w:val="0"/>
+                <w:bCs w:val="0"/>
+                <w:i w:val="0"/>
+                <w:iCs w:val="0"/>
+                <w:u w:val="none"/>
+                <w:color w:val="000000"/>
+                <w:sz w:val="20"/>
+                <w:szCs w:val="20"/>
+              </w:rPr>
+              <w:t xml:space="preserve">Physical hardware or hypervisor integrity of cloud database provider (Neon); physical infrastructure seizure; external side-channel attacks on host hardware.</w:t>
+            </w:r>
+          </w:p>
+        </w:tc>
+      </w:tr>
+      <w:tr>
+        <w:trPr>
+          <w:cantSplit/>
+        </w:trPr>
+        <w:tc>
+          <w:tcPr>
+            <w:tcW w:w="3120" w:type="dxa"/>
+            <w:tcBorders>
+              <w:top w:val="single" w:sz="4" w:color="000000"/>
+              <w:left w:val="single" w:sz="4" w:color="000000"/>
+              <w:bottom w:val="single" w:sz="4" w:color="000000"/>
+              <w:right w:val="single" w:sz="4" w:color="000000"/>
+            </w:tcBorders>
+            <w:vAlign w:val="center"/>
+          </w:tcPr>
+          <w:p>
+            <w:pPr>
+              <w:spacing w:before="40" w:after="40" w:line="240" w:lineRule="auto"/>
+            </w:pPr>
+            <w:r>
+              <w:rPr>
+                <w:rFonts w:ascii="Times New Roman" w:cs="Times New Roman" w:eastAsia="Times New Roman" w:hAnsi="Times New Roman"/>
+                <w:b/>
+                <w:bCs/>
+                <w:i w:val="0"/>
+                <w:iCs w:val="0"/>
+                <w:u w:val="none"/>
+                <w:color w:val="000000"/>
+                <w:sz w:val="20"/>
+                <w:szCs w:val="20"/>
+              </w:rPr>
+              <w:t xml:space="preserve">Object Storage &amp; Evidence</w:t>
+            </w:r>
+          </w:p>
+        </w:tc>
+        <w:tc>
+          <w:tcPr>
+            <w:tcW w:w="3120" w:type="dxa"/>
+            <w:tcBorders>
+              <w:top w:val="single" w:sz="4" w:color="000000"/>
+              <w:left w:val="single" w:sz="4" w:color="000000"/>
+              <w:bottom w:val="single" w:sz="4" w:color="000000"/>
+              <w:right w:val="single" w:sz="4" w:color="000000"/>
+            </w:tcBorders>
+            <w:vAlign w:val="center"/>
+          </w:tcPr>
+          <w:p>
+            <w:pPr>
+              <w:spacing w:before="40" w:after="40" w:line="240" w:lineRule="auto"/>
+            </w:pPr>
+            <w:r>
+              <w:rPr>
+                <w:rFonts w:ascii="Times New Roman" w:cs="Times New Roman" w:eastAsia="Times New Roman" w:hAnsi="Times New Roman"/>
+                <w:b w:val="0"/>
+                <w:bCs w:val="0"/>
+                <w:i w:val="0"/>
+                <w:iCs w:val="0"/>
+                <w:u w:val="none"/>
+                <w:color w:val="000000"/>
+                <w:sz w:val="20"/>
+                <w:szCs w:val="20"/>
+              </w:rPr>
+              <w:t xml:space="preserve">Time-limited presigned S3 URLs (15-min lease); RFC 9580 SEIPDv2 binary ciphertext storage; automated hourly lease reclamation and quota enforcement (20 MiB intake, 6 MiB reserve).</w:t>
+            </w:r>
+          </w:p>
+        </w:tc>
+        <w:tc>
+          <w:tcPr>
+            <w:tcW w:w="3120" w:type="dxa"/>
+            <w:tcBorders>
+              <w:top w:val="single" w:sz="4" w:color="000000"/>
+              <w:left w:val="single" w:sz="4" w:color="000000"/>
+              <w:bottom w:val="single" w:sz="4" w:color="000000"/>
+              <w:right w:val="single" w:sz="4" w:color="000000"/>
+            </w:tcBorders>
+            <w:vAlign w:val="center"/>
+          </w:tcPr>
+          <w:p>
+            <w:pPr>
+              <w:spacing w:before="40" w:after="40" w:line="240" w:lineRule="auto"/>
+            </w:pPr>
+            <w:r>
+              <w:rPr>
+                <w:rFonts w:ascii="Times New Roman" w:cs="Times New Roman" w:eastAsia="Times New Roman" w:hAnsi="Times New Roman"/>
+                <w:b w:val="0"/>
+                <w:bCs w:val="0"/>
+                <w:i w:val="0"/>
+                <w:iCs w:val="0"/>
+                <w:u w:val="none"/>
+                <w:color w:val="000000"/>
+                <w:sz w:val="20"/>
+                <w:szCs w:val="20"/>
+              </w:rPr>
+              <w:t xml:space="preserve">Cloudflare R2 underlying physical storage hardware; third-party cloud provider internal outages; unencrypted temporary local copies saved by users outside the platform.</w:t>
+            </w:r>
+          </w:p>
+        </w:tc>
+      </w:tr>
+      <w:tr>
+        <w:trPr>
+          <w:cantSplit/>
+        </w:trPr>
+        <w:tc>
+          <w:tcPr>
+            <w:tcW w:w="3120" w:type="dxa"/>
+            <w:tcBorders>
+              <w:top w:val="single" w:sz="4" w:color="000000"/>
+              <w:left w:val="single" w:sz="4" w:color="000000"/>
+              <w:bottom w:val="single" w:sz="4" w:color="000000"/>
+              <w:right w:val="single" w:sz="4" w:color="000000"/>
+            </w:tcBorders>
+            <w:vAlign w:val="center"/>
+          </w:tcPr>
+          <w:p>
+            <w:pPr>
+              <w:spacing w:before="40" w:after="40" w:line="240" w:lineRule="auto"/>
+            </w:pPr>
+            <w:r>
+              <w:rPr>
+                <w:rFonts w:ascii="Times New Roman" w:cs="Times New Roman" w:eastAsia="Times New Roman" w:hAnsi="Times New Roman"/>
+                <w:b/>
+                <w:bCs/>
+                <w:i w:val="0"/>
+                <w:iCs w:val="0"/>
+                <w:u w:val="none"/>
+                <w:color w:val="000000"/>
+                <w:sz w:val="20"/>
+                <w:szCs w:val="20"/>
+              </w:rPr>
+              <w:t xml:space="preserve">Notifications &amp; Messaging</w:t>
+            </w:r>
+          </w:p>
+        </w:tc>
+        <w:tc>
+          <w:tcPr>
+            <w:tcW w:w="3120" w:type="dxa"/>
+            <w:tcBorders>
+              <w:top w:val="single" w:sz="4" w:color="000000"/>
+              <w:left w:val="single" w:sz="4" w:color="000000"/>
+              <w:bottom w:val="single" w:sz="4" w:color="000000"/>
+              <w:right w:val="single" w:sz="4" w:color="000000"/>
+            </w:tcBorders>
+            <w:vAlign w:val="center"/>
+          </w:tcPr>
+          <w:p>
+            <w:pPr>
+              <w:spacing w:before="40" w:after="40" w:line="240" w:lineRule="auto"/>
+            </w:pPr>
+            <w:r>
+              <w:rPr>
+                <w:rFonts w:ascii="Times New Roman" w:cs="Times New Roman" w:eastAsia="Times New Roman" w:hAnsi="Times New Roman"/>
+                <w:b w:val="0"/>
+                <w:bCs w:val="0"/>
+                <w:i w:val="0"/>
+                <w:iCs w:val="0"/>
+                <w:u w:val="none"/>
+                <w:color w:val="000000"/>
+                <w:sz w:val="20"/>
+                <w:szCs w:val="20"/>
+              </w:rPr>
+              <w:t xml:space="preserve">Zero-plaintext Class A operational metadata payloads dispatched to the notification provider; redaction of vulnerability descriptions from alert emails.</w:t>
+            </w:r>
+          </w:p>
+        </w:tc>
+        <w:tc>
+          <w:tcPr>
+            <w:tcW w:w="3120" w:type="dxa"/>
+            <w:tcBorders>
+              <w:top w:val="single" w:sz="4" w:color="000000"/>
+              <w:left w:val="single" w:sz="4" w:color="000000"/>
+              <w:bottom w:val="single" w:sz="4" w:color="000000"/>
+              <w:right w:val="single" w:sz="4" w:color="000000"/>
+            </w:tcBorders>
+            <w:vAlign w:val="center"/>
+          </w:tcPr>
+          <w:p>
+            <w:pPr>
+              <w:spacing w:before="40" w:after="40" w:line="240" w:lineRule="auto"/>
+            </w:pPr>
+            <w:r>
+              <w:rPr>
+                <w:rFonts w:ascii="Times New Roman" w:cs="Times New Roman" w:eastAsia="Times New Roman" w:hAnsi="Times New Roman"/>
+                <w:b w:val="0"/>
+                <w:bCs w:val="0"/>
+                <w:i w:val="0"/>
+                <w:iCs w:val="0"/>
+                <w:u w:val="none"/>
+                <w:color w:val="000000"/>
+                <w:sz w:val="20"/>
+                <w:szCs w:val="20"/>
+              </w:rPr>
+              <w:t xml:space="preserve">Upstream SMTP deliverability; recipient mail server spam filters; mail server security at rest on the recipient's mail provider.</w:t>
             </w:r>
           </w:p>
         </w:tc>
@@ -13551,7 +16145,7 @@
       <w:r>
         <w:drawing>
           <wp:inline xmlns:wp="http://schemas.openxmlformats.org/drawingml/2006/wordprocessingDrawing" xmlns:a="http://schemas.openxmlformats.org/drawingml/2006/main" xmlns:pic="http://schemas.openxmlformats.org/drawingml/2006/picture" xmlns:r="http://schemas.openxmlformats.org/officeDocument/2006/relationships" distT="0" distB="0" distL="0" distR="0">
-            <wp:extent cx="5800000" cy="5372787"/>
+            <wp:extent cx="5800000" cy="5639795"/>
             <wp:effectExtent l="0" t="0" r="0" b="0"/>
             <wp:docPr id="204" name="Figure 3.4 Cloud Infrastructure Topology Diagram" descr="Figure 3.4 Cloud Infrastructure Topology Diagram"/>
             <wp:cNvGraphicFramePr>
@@ -13575,7 +16169,7 @@
                   <pic:spPr>
                     <a:xfrm>
                       <a:off x="0" y="0"/>
-                      <a:ext cx="5800000" cy="5372787"/>
+                      <a:ext cx="5800000" cy="5639795"/>
                     </a:xfrm>
                     <a:prstGeom prst="rect">
                       <a:avLst/>
@@ -13854,7 +16448,7 @@
           <w:sz w:val="18"/>
           <w:szCs w:val="18"/>
         </w:rPr>
-        <w:t xml:space="preserve">|                   |                              |                               | sub-150ms cold starts via optimized route bundling.  |</w:t>
+        <w:t xml:space="preserve">|                   |                              |                               | warm p95 &lt;= 400 ms, cold start &lt;= 1,200 ms (NFR-01). |</w:t>
       </w:r>
     </w:p>
     <w:p>
@@ -13934,7 +16528,7 @@
           <w:sz w:val="18"/>
           <w:szCs w:val="18"/>
         </w:rPr>
-        <w:t xml:space="preserve">|                   |                              |                               | robust RLS engine and ACID transactions for audit.   |</w:t>
+        <w:t xml:space="preserve">|                   |                              |                               | robust RLS engine (bbt_app role) &amp; ACID audit ledger.|</w:t>
       </w:r>
     </w:p>
     <w:p>
@@ -14254,7 +16848,7 @@
           <w:sz w:val="18"/>
           <w:szCs w:val="18"/>
         </w:rPr>
-        <w:t xml:space="preserve">|                   |                              |                               | with cryptographically signed Ed25519 tokens.        |</w:t>
+        <w:t xml:space="preserve">|                   |                              |                               | via HMAC-SHA256 on /api/v1/internal/cron/sla-check.  |</w:t>
       </w:r>
     </w:p>
     <w:p>
@@ -15695,7 +18289,35 @@
                 <w:sz w:val="20"/>
                 <w:szCs w:val="20"/>
               </w:rPr>
-              <w:t xml:space="preserve">Commercial SLA, hourly cron jobs, zero cold-start optimization</w:t>
+              <w:t xml:space="preserve">Commercial SLA (99.5% uptime </w:t>
+            </w:r>
+            <w:r>
+              <w:rPr>
+                <w:rFonts w:ascii="Times New Roman" w:cs="Times New Roman" w:eastAsia="Times New Roman" w:hAnsi="Times New Roman"/>
+                <w:b w:val="0"/>
+                <w:bCs w:val="0"/>
+                <w:i w:val="0"/>
+                <w:iCs w:val="0"/>
+                <w:u w:val="none"/>
+                <w:color w:val="000000"/>
+                <w:sz w:val="20"/>
+                <w:szCs w:val="20"/>
+              </w:rPr>
+              <w:t xml:space="preserve">NFR-07</w:t>
+            </w:r>
+            <w:r>
+              <w:rPr>
+                <w:rFonts w:ascii="Times New Roman" w:cs="Times New Roman" w:eastAsia="Times New Roman" w:hAnsi="Times New Roman"/>
+                <w:b w:val="0"/>
+                <w:bCs w:val="0"/>
+                <w:i w:val="0"/>
+                <w:iCs w:val="0"/>
+                <w:u w:val="none"/>
+                <w:color w:val="000000"/>
+                <w:sz w:val="20"/>
+                <w:szCs w:val="20"/>
+              </w:rPr>
+              <w:t xml:space="preserve">), zero cold-start optimization</w:t>
             </w:r>
           </w:p>
         </w:tc>
@@ -16974,7 +19596,7 @@
                 <w:sz w:val="20"/>
                 <w:szCs w:val="20"/>
               </w:rPr>
-              <w:t xml:space="preserve">UC-01</w:t>
+              <w:t xml:space="preserve">UC-06</w:t>
             </w:r>
             <w:r>
               <w:rPr>
@@ -17002,7 +19624,7 @@
                 <w:sz w:val="20"/>
                 <w:szCs w:val="20"/>
               </w:rPr>
-              <w:t xml:space="preserve">UC-05</w:t>
+              <w:t xml:space="preserve">UC-07</w:t>
             </w:r>
           </w:p>
         </w:tc>
@@ -17033,35 +19655,63 @@
                 <w:sz w:val="20"/>
                 <w:szCs w:val="20"/>
               </w:rPr>
-              <w:t xml:space="preserve">Argon2id session generation; TOTP MFA step-up verification; </w:t>
-            </w:r>
-            <w:r>
-              <w:rPr>
-                <w:rFonts w:ascii="Times New Roman" w:cs="Times New Roman" w:eastAsia="Times New Roman" w:hAnsi="Times New Roman"/>
-                <w:b w:val="0"/>
-                <w:bCs w:val="0"/>
-                <w:i w:val="0"/>
-                <w:iCs w:val="0"/>
-                <w:u w:val="none"/>
-                <w:color w:val="000000"/>
-                <w:sz w:val="20"/>
-                <w:szCs w:val="20"/>
-              </w:rPr>
-              <w:t xml:space="preserve">organization_id</w:t>
-            </w:r>
-            <w:r>
-              <w:rPr>
-                <w:rFonts w:ascii="Times New Roman" w:cs="Times New Roman" w:eastAsia="Times New Roman" w:hAnsi="Times New Roman"/>
-                <w:b w:val="0"/>
-                <w:bCs w:val="0"/>
-                <w:i w:val="0"/>
-                <w:iCs w:val="0"/>
-                <w:u w:val="none"/>
-                <w:color w:val="000000"/>
-                <w:sz w:val="20"/>
-                <w:szCs w:val="20"/>
-              </w:rPr>
-              <w:t xml:space="preserve"> context injection.</w:t>
+              <w:t xml:space="preserve">CSPRNG session token issuance (SHA-256 </w:t>
+            </w:r>
+            <w:r>
+              <w:rPr>
+                <w:rFonts w:ascii="Times New Roman" w:cs="Times New Roman" w:eastAsia="Times New Roman" w:hAnsi="Times New Roman"/>
+                <w:b w:val="0"/>
+                <w:bCs w:val="0"/>
+                <w:i w:val="0"/>
+                <w:iCs w:val="0"/>
+                <w:u w:val="none"/>
+                <w:color w:val="000000"/>
+                <w:sz w:val="20"/>
+                <w:szCs w:val="20"/>
+              </w:rPr>
+              <w:t xml:space="preserve">token_hash</w:t>
+            </w:r>
+            <w:r>
+              <w:rPr>
+                <w:rFonts w:ascii="Times New Roman" w:cs="Times New Roman" w:eastAsia="Times New Roman" w:hAnsi="Times New Roman"/>
+                <w:b w:val="0"/>
+                <w:bCs w:val="0"/>
+                <w:i w:val="0"/>
+                <w:iCs w:val="0"/>
+                <w:u w:val="none"/>
+                <w:color w:val="000000"/>
+                <w:sz w:val="20"/>
+                <w:szCs w:val="20"/>
+              </w:rPr>
+              <w:t xml:space="preserve">); Argon2id password KDF; TOTP MFA step-up verification; </w:t>
+            </w:r>
+            <w:r>
+              <w:rPr>
+                <w:rFonts w:ascii="Times New Roman" w:cs="Times New Roman" w:eastAsia="Times New Roman" w:hAnsi="Times New Roman"/>
+                <w:b w:val="0"/>
+                <w:bCs w:val="0"/>
+                <w:i w:val="0"/>
+                <w:iCs w:val="0"/>
+                <w:u w:val="none"/>
+                <w:color w:val="000000"/>
+                <w:sz w:val="20"/>
+                <w:szCs w:val="20"/>
+              </w:rPr>
+              <w:t xml:space="preserve">bbt_app</w:t>
+            </w:r>
+            <w:r>
+              <w:rPr>
+                <w:rFonts w:ascii="Times New Roman" w:cs="Times New Roman" w:eastAsia="Times New Roman" w:hAnsi="Times New Roman"/>
+                <w:b w:val="0"/>
+                <w:bCs w:val="0"/>
+                <w:i w:val="0"/>
+                <w:iCs w:val="0"/>
+                <w:u w:val="none"/>
+                <w:color w:val="000000"/>
+                <w:sz w:val="20"/>
+                <w:szCs w:val="20"/>
+              </w:rPr>
+              <w:t xml:space="preserve"> role tenant context injection.</w:t>
             </w:r>
           </w:p>
         </w:tc>
@@ -17243,6 +19893,34 @@
                 <w:sz w:val="20"/>
                 <w:szCs w:val="20"/>
               </w:rPr>
+              <w:t xml:space="preserve">FR-2.4</w:t>
+            </w:r>
+            <w:r>
+              <w:rPr>
+                <w:rFonts w:ascii="Times New Roman" w:cs="Times New Roman" w:eastAsia="Times New Roman" w:hAnsi="Times New Roman"/>
+                <w:b w:val="0"/>
+                <w:bCs w:val="0"/>
+                <w:i w:val="0"/>
+                <w:iCs w:val="0"/>
+                <w:u w:val="none"/>
+                <w:color w:val="000000"/>
+                <w:sz w:val="20"/>
+                <w:szCs w:val="20"/>
+              </w:rPr>
+              <w:t xml:space="preserve">, </w:t>
+            </w:r>
+            <w:r>
+              <w:rPr>
+                <w:rFonts w:ascii="Times New Roman" w:cs="Times New Roman" w:eastAsia="Times New Roman" w:hAnsi="Times New Roman"/>
+                <w:b w:val="0"/>
+                <w:bCs w:val="0"/>
+                <w:i w:val="0"/>
+                <w:iCs w:val="0"/>
+                <w:u w:val="none"/>
+                <w:color w:val="000000"/>
+                <w:sz w:val="20"/>
+                <w:szCs w:val="20"/>
+              </w:rPr>
               <w:t xml:space="preserve">FR-2.5</w:t>
             </w:r>
             <w:r>
@@ -17302,7 +19980,35 @@
                 <w:sz w:val="20"/>
                 <w:szCs w:val="20"/>
               </w:rPr>
-              <w:t xml:space="preserve">UC-02</w:t>
+              <w:t xml:space="preserve">UC-01</w:t>
+            </w:r>
+            <w:r>
+              <w:rPr>
+                <w:rFonts w:ascii="Times New Roman" w:cs="Times New Roman" w:eastAsia="Times New Roman" w:hAnsi="Times New Roman"/>
+                <w:b w:val="0"/>
+                <w:bCs w:val="0"/>
+                <w:i w:val="0"/>
+                <w:iCs w:val="0"/>
+                <w:u w:val="none"/>
+                <w:color w:val="000000"/>
+                <w:sz w:val="20"/>
+                <w:szCs w:val="20"/>
+              </w:rPr>
+              <w:t xml:space="preserve">, </w:t>
+            </w:r>
+            <w:r>
+              <w:rPr>
+                <w:rFonts w:ascii="Times New Roman" w:cs="Times New Roman" w:eastAsia="Times New Roman" w:hAnsi="Times New Roman"/>
+                <w:b w:val="0"/>
+                <w:bCs w:val="0"/>
+                <w:i w:val="0"/>
+                <w:iCs w:val="0"/>
+                <w:u w:val="none"/>
+                <w:color w:val="000000"/>
+                <w:sz w:val="20"/>
+                <w:szCs w:val="20"/>
+              </w:rPr>
+              <w:t xml:space="preserve">UC-06</w:t>
             </w:r>
           </w:p>
         </w:tc>
@@ -17545,6 +20251,34 @@
               </w:rPr>
               <w:t xml:space="preserve">FR-8.3</w:t>
             </w:r>
+            <w:r>
+              <w:rPr>
+                <w:rFonts w:ascii="Times New Roman" w:cs="Times New Roman" w:eastAsia="Times New Roman" w:hAnsi="Times New Roman"/>
+                <w:b w:val="0"/>
+                <w:bCs w:val="0"/>
+                <w:i w:val="0"/>
+                <w:iCs w:val="0"/>
+                <w:u w:val="none"/>
+                <w:color w:val="000000"/>
+                <w:sz w:val="20"/>
+                <w:szCs w:val="20"/>
+              </w:rPr>
+              <w:t xml:space="preserve">, </w:t>
+            </w:r>
+            <w:r>
+              <w:rPr>
+                <w:rFonts w:ascii="Times New Roman" w:cs="Times New Roman" w:eastAsia="Times New Roman" w:hAnsi="Times New Roman"/>
+                <w:b w:val="0"/>
+                <w:bCs w:val="0"/>
+                <w:i w:val="0"/>
+                <w:iCs w:val="0"/>
+                <w:u w:val="none"/>
+                <w:color w:val="000000"/>
+                <w:sz w:val="20"/>
+                <w:szCs w:val="20"/>
+              </w:rPr>
+              <w:t xml:space="preserve">FR-8.4</w:t>
+            </w:r>
           </w:p>
         </w:tc>
         <w:tc>
@@ -17605,7 +20339,7 @@
                 <w:sz w:val="20"/>
                 <w:szCs w:val="20"/>
               </w:rPr>
-              <w:t xml:space="preserve">Turnstile CAPTCHA validation; presigned S3 upload; zero raw plaintext in SQL insert; </w:t>
+              <w:t xml:space="preserve">Turnstile CAPTCHA validation; rate limiting (10 req/hr/IP); presigned S3 upload; zero raw plaintext in SQL insert; 20 MiB intake / 6 MiB reserve quota check; </w:t>
             </w:r>
             <w:r>
               <w:rPr>
@@ -17877,7 +20611,35 @@
                 <w:sz w:val="20"/>
                 <w:szCs w:val="20"/>
               </w:rPr>
-              <w:t xml:space="preserve">100% mathematical parity across 45 FIRST.org test fixtures; calculation completes in &lt; 5 ms.</w:t>
+              <w:t xml:space="preserve">Accepts valid metrics in any order; 100% mathematical parity across 45 FIRST.org test fixtures; calculation completes in &lt; 5 ms (</w:t>
+            </w:r>
+            <w:r>
+              <w:rPr>
+                <w:rFonts w:ascii="Times New Roman" w:cs="Times New Roman" w:eastAsia="Times New Roman" w:hAnsi="Times New Roman"/>
+                <w:b w:val="0"/>
+                <w:bCs w:val="0"/>
+                <w:i w:val="0"/>
+                <w:iCs w:val="0"/>
+                <w:u w:val="none"/>
+                <w:color w:val="000000"/>
+                <w:sz w:val="20"/>
+                <w:szCs w:val="20"/>
+              </w:rPr>
+              <w:t xml:space="preserve">NFR-02</w:t>
+            </w:r>
+            <w:r>
+              <w:rPr>
+                <w:rFonts w:ascii="Times New Roman" w:cs="Times New Roman" w:eastAsia="Times New Roman" w:hAnsi="Times New Roman"/>
+                <w:b w:val="0"/>
+                <w:bCs w:val="0"/>
+                <w:i w:val="0"/>
+                <w:iCs w:val="0"/>
+                <w:u w:val="none"/>
+                <w:color w:val="000000"/>
+                <w:sz w:val="20"/>
+                <w:szCs w:val="20"/>
+              </w:rPr>
+              <w:t xml:space="preserve">).</w:t>
             </w:r>
           </w:p>
         </w:tc>
@@ -18059,7 +20821,7 @@
                 <w:sz w:val="20"/>
                 <w:szCs w:val="20"/>
               </w:rPr>
-              <w:t xml:space="preserve">FR-5.5</w:t>
+              <w:t xml:space="preserve">FR-5.4</w:t>
             </w:r>
           </w:p>
         </w:tc>
@@ -18090,6 +20852,34 @@
                 <w:sz w:val="20"/>
                 <w:szCs w:val="20"/>
               </w:rPr>
+              <w:t xml:space="preserve">UC-02</w:t>
+            </w:r>
+            <w:r>
+              <w:rPr>
+                <w:rFonts w:ascii="Times New Roman" w:cs="Times New Roman" w:eastAsia="Times New Roman" w:hAnsi="Times New Roman"/>
+                <w:b w:val="0"/>
+                <w:bCs w:val="0"/>
+                <w:i w:val="0"/>
+                <w:iCs w:val="0"/>
+                <w:u w:val="none"/>
+                <w:color w:val="000000"/>
+                <w:sz w:val="20"/>
+                <w:szCs w:val="20"/>
+              </w:rPr>
+              <w:t xml:space="preserve">, </w:t>
+            </w:r>
+            <w:r>
+              <w:rPr>
+                <w:rFonts w:ascii="Times New Roman" w:cs="Times New Roman" w:eastAsia="Times New Roman" w:hAnsi="Times New Roman"/>
+                <w:b w:val="0"/>
+                <w:bCs w:val="0"/>
+                <w:i w:val="0"/>
+                <w:iCs w:val="0"/>
+                <w:u w:val="none"/>
+                <w:color w:val="000000"/>
+                <w:sz w:val="20"/>
+                <w:szCs w:val="20"/>
+              </w:rPr>
               <w:t xml:space="preserve">UC-03</w:t>
             </w:r>
           </w:p>
@@ -18121,7 +20911,7 @@
                 <w:sz w:val="20"/>
                 <w:szCs w:val="20"/>
               </w:rPr>
-              <w:t xml:space="preserve">Dual-lane message separation (Class B vs C); recipient version snapshot matching; minimal metadata email dispatch.</w:t>
+              <w:t xml:space="preserve">Dual-lane message separation (Class B vs C); recipient version snapshot matching; minimal metadata email dispatch via Resend.</w:t>
             </w:r>
           </w:p>
         </w:tc>
@@ -18379,35 +21169,7 @@
                 <w:sz w:val="20"/>
                 <w:szCs w:val="20"/>
               </w:rPr>
-              <w:t xml:space="preserve">ahead</w:t>
-            </w:r>
-            <w:r>
-              <w:rPr>
-                <w:rFonts w:ascii="Times New Roman" w:cs="Times New Roman" w:eastAsia="Times New Roman" w:hAnsi="Times New Roman"/>
-                <w:b w:val="0"/>
-                <w:bCs w:val="0"/>
-                <w:i w:val="0"/>
-                <w:iCs w:val="0"/>
-                <w:u w:val="none"/>
-                <w:color w:val="000000"/>
-                <w:sz w:val="20"/>
-                <w:szCs w:val="20"/>
-              </w:rPr>
-              <w:t xml:space="preserve">/</w:t>
-            </w:r>
-            <w:r>
-              <w:rPr>
-                <w:rFonts w:ascii="Times New Roman" w:cs="Times New Roman" w:eastAsia="Times New Roman" w:hAnsi="Times New Roman"/>
-                <w:b w:val="0"/>
-                <w:bCs w:val="0"/>
-                <w:i w:val="0"/>
-                <w:iCs w:val="0"/>
-                <w:u w:val="none"/>
-                <w:color w:val="000000"/>
-                <w:sz w:val="20"/>
-                <w:szCs w:val="20"/>
-              </w:rPr>
-              <w:t xml:space="preserve">identical</w:t>
+              <w:t xml:space="preserve">compare/{branch}...{sha}</w:t>
             </w:r>
             <w:r>
               <w:rPr>
@@ -18575,6 +21337,118 @@
                 <w:sz w:val="20"/>
                 <w:szCs w:val="20"/>
               </w:rPr>
+              <w:t xml:space="preserve">FR-7.3</w:t>
+            </w:r>
+            <w:r>
+              <w:rPr>
+                <w:rFonts w:ascii="Times New Roman" w:cs="Times New Roman" w:eastAsia="Times New Roman" w:hAnsi="Times New Roman"/>
+                <w:b w:val="0"/>
+                <w:bCs w:val="0"/>
+                <w:i w:val="0"/>
+                <w:iCs w:val="0"/>
+                <w:u w:val="none"/>
+                <w:color w:val="000000"/>
+                <w:sz w:val="20"/>
+                <w:szCs w:val="20"/>
+              </w:rPr>
+              <w:t xml:space="preserve">, </w:t>
+            </w:r>
+            <w:r>
+              <w:rPr>
+                <w:rFonts w:ascii="Times New Roman" w:cs="Times New Roman" w:eastAsia="Times New Roman" w:hAnsi="Times New Roman"/>
+                <w:b w:val="0"/>
+                <w:bCs w:val="0"/>
+                <w:i w:val="0"/>
+                <w:iCs w:val="0"/>
+                <w:u w:val="none"/>
+                <w:color w:val="000000"/>
+                <w:sz w:val="20"/>
+                <w:szCs w:val="20"/>
+              </w:rPr>
+              <w:t xml:space="preserve">FR-7.4</w:t>
+            </w:r>
+            <w:r>
+              <w:rPr>
+                <w:rFonts w:ascii="Times New Roman" w:cs="Times New Roman" w:eastAsia="Times New Roman" w:hAnsi="Times New Roman"/>
+                <w:b w:val="0"/>
+                <w:bCs w:val="0"/>
+                <w:i w:val="0"/>
+                <w:iCs w:val="0"/>
+                <w:u w:val="none"/>
+                <w:color w:val="000000"/>
+                <w:sz w:val="20"/>
+                <w:szCs w:val="20"/>
+              </w:rPr>
+              <w:t xml:space="preserve">, </w:t>
+            </w:r>
+            <w:r>
+              <w:rPr>
+                <w:rFonts w:ascii="Times New Roman" w:cs="Times New Roman" w:eastAsia="Times New Roman" w:hAnsi="Times New Roman"/>
+                <w:b w:val="0"/>
+                <w:bCs w:val="0"/>
+                <w:i w:val="0"/>
+                <w:iCs w:val="0"/>
+                <w:u w:val="none"/>
+                <w:color w:val="000000"/>
+                <w:sz w:val="20"/>
+                <w:szCs w:val="20"/>
+              </w:rPr>
+              <w:t xml:space="preserve">FR-7.5</w:t>
+            </w:r>
+            <w:r>
+              <w:rPr>
+                <w:rFonts w:ascii="Times New Roman" w:cs="Times New Roman" w:eastAsia="Times New Roman" w:hAnsi="Times New Roman"/>
+                <w:b w:val="0"/>
+                <w:bCs w:val="0"/>
+                <w:i w:val="0"/>
+                <w:iCs w:val="0"/>
+                <w:u w:val="none"/>
+                <w:color w:val="000000"/>
+                <w:sz w:val="20"/>
+                <w:szCs w:val="20"/>
+              </w:rPr>
+              <w:t xml:space="preserve">, </w:t>
+            </w:r>
+            <w:r>
+              <w:rPr>
+                <w:rFonts w:ascii="Times New Roman" w:cs="Times New Roman" w:eastAsia="Times New Roman" w:hAnsi="Times New Roman"/>
+                <w:b w:val="0"/>
+                <w:bCs w:val="0"/>
+                <w:i w:val="0"/>
+                <w:iCs w:val="0"/>
+                <w:u w:val="none"/>
+                <w:color w:val="000000"/>
+                <w:sz w:val="20"/>
+                <w:szCs w:val="20"/>
+              </w:rPr>
+              <w:t xml:space="preserve">FR-7.6</w:t>
+            </w:r>
+            <w:r>
+              <w:rPr>
+                <w:rFonts w:ascii="Times New Roman" w:cs="Times New Roman" w:eastAsia="Times New Roman" w:hAnsi="Times New Roman"/>
+                <w:b w:val="0"/>
+                <w:bCs w:val="0"/>
+                <w:i w:val="0"/>
+                <w:iCs w:val="0"/>
+                <w:u w:val="none"/>
+                <w:color w:val="000000"/>
+                <w:sz w:val="20"/>
+                <w:szCs w:val="20"/>
+              </w:rPr>
+              <w:t xml:space="preserve">, </w:t>
+            </w:r>
+            <w:r>
+              <w:rPr>
+                <w:rFonts w:ascii="Times New Roman" w:cs="Times New Roman" w:eastAsia="Times New Roman" w:hAnsi="Times New Roman"/>
+                <w:b w:val="0"/>
+                <w:bCs w:val="0"/>
+                <w:i w:val="0"/>
+                <w:iCs w:val="0"/>
+                <w:u w:val="none"/>
+                <w:color w:val="000000"/>
+                <w:sz w:val="20"/>
+                <w:szCs w:val="20"/>
+              </w:rPr>
               <w:t xml:space="preserve">FR-7.7</w:t>
             </w:r>
             <w:r>
@@ -18662,7 +21536,7 @@
                 <w:sz w:val="20"/>
                 <w:szCs w:val="20"/>
               </w:rPr>
-              <w:t xml:space="preserve">UC-04</w:t>
+              <w:t xml:space="preserve">UC-05</w:t>
             </w:r>
             <w:r>
               <w:rPr>
@@ -18690,34 +21564,6 @@
                 <w:sz w:val="20"/>
                 <w:szCs w:val="20"/>
               </w:rPr>
-              <w:t xml:space="preserve">UC-06</w:t>
-            </w:r>
-            <w:r>
-              <w:rPr>
-                <w:rFonts w:ascii="Times New Roman" w:cs="Times New Roman" w:eastAsia="Times New Roman" w:hAnsi="Times New Roman"/>
-                <w:b w:val="0"/>
-                <w:bCs w:val="0"/>
-                <w:i w:val="0"/>
-                <w:iCs w:val="0"/>
-                <w:u w:val="none"/>
-                <w:color w:val="000000"/>
-                <w:sz w:val="20"/>
-                <w:szCs w:val="20"/>
-              </w:rPr>
-              <w:t xml:space="preserve">, </w:t>
-            </w:r>
-            <w:r>
-              <w:rPr>
-                <w:rFonts w:ascii="Times New Roman" w:cs="Times New Roman" w:eastAsia="Times New Roman" w:hAnsi="Times New Roman"/>
-                <w:b w:val="0"/>
-                <w:bCs w:val="0"/>
-                <w:i w:val="0"/>
-                <w:iCs w:val="0"/>
-                <w:u w:val="none"/>
-                <w:color w:val="000000"/>
-                <w:sz w:val="20"/>
-                <w:szCs w:val="20"/>
-              </w:rPr>
               <w:t xml:space="preserve">UC-07</w:t>
             </w:r>
           </w:p>
@@ -18749,35 +21595,63 @@
                 <w:sz w:val="20"/>
                 <w:szCs w:val="20"/>
               </w:rPr>
-              <w:t xml:space="preserve">15-state transition guard; append-only </w:t>
-            </w:r>
-            <w:r>
-              <w:rPr>
-                <w:rFonts w:ascii="Times New Roman" w:cs="Times New Roman" w:eastAsia="Times New Roman" w:hAnsi="Times New Roman"/>
-                <w:b w:val="0"/>
-                <w:bCs w:val="0"/>
-                <w:i w:val="0"/>
-                <w:iCs w:val="0"/>
-                <w:u w:val="none"/>
-                <w:color w:val="000000"/>
-                <w:sz w:val="20"/>
-                <w:szCs w:val="20"/>
-              </w:rPr>
-              <w:t xml:space="preserve">prev_hash</w:t>
-            </w:r>
-            <w:r>
-              <w:rPr>
-                <w:rFonts w:ascii="Times New Roman" w:cs="Times New Roman" w:eastAsia="Times New Roman" w:hAnsi="Times New Roman"/>
-                <w:b w:val="0"/>
-                <w:bCs w:val="0"/>
-                <w:i w:val="0"/>
-                <w:iCs w:val="0"/>
-                <w:u w:val="none"/>
-                <w:color w:val="000000"/>
-                <w:sz w:val="20"/>
-                <w:szCs w:val="20"/>
-              </w:rPr>
-              <w:t xml:space="preserve"> chaining; hourly claim-lease R2 reclamation; signed closure export.</w:t>
+              <w:t xml:space="preserve">15-state transition guard; append-only dual hash-chained audit logging (</w:t>
+            </w:r>
+            <w:r>
+              <w:rPr>
+                <w:rFonts w:ascii="Times New Roman" w:cs="Times New Roman" w:eastAsia="Times New Roman" w:hAnsi="Times New Roman"/>
+                <w:b w:val="0"/>
+                <w:bCs w:val="0"/>
+                <w:i w:val="0"/>
+                <w:iCs w:val="0"/>
+                <w:u w:val="none"/>
+                <w:color w:val="000000"/>
+                <w:sz w:val="20"/>
+                <w:szCs w:val="20"/>
+              </w:rPr>
+              <w:t xml:space="preserve">tenant_row_hash</w:t>
+            </w:r>
+            <w:r>
+              <w:rPr>
+                <w:rFonts w:ascii="Times New Roman" w:cs="Times New Roman" w:eastAsia="Times New Roman" w:hAnsi="Times New Roman"/>
+                <w:b w:val="0"/>
+                <w:bCs w:val="0"/>
+                <w:i w:val="0"/>
+                <w:iCs w:val="0"/>
+                <w:u w:val="none"/>
+                <w:color w:val="000000"/>
+                <w:sz w:val="20"/>
+                <w:szCs w:val="20"/>
+              </w:rPr>
+              <w:t xml:space="preserve"> &amp; </w:t>
+            </w:r>
+            <w:r>
+              <w:rPr>
+                <w:rFonts w:ascii="Times New Roman" w:cs="Times New Roman" w:eastAsia="Times New Roman" w:hAnsi="Times New Roman"/>
+                <w:b w:val="0"/>
+                <w:bCs w:val="0"/>
+                <w:i w:val="0"/>
+                <w:iCs w:val="0"/>
+                <w:u w:val="none"/>
+                <w:color w:val="000000"/>
+                <w:sz w:val="20"/>
+                <w:szCs w:val="20"/>
+              </w:rPr>
+              <w:t xml:space="preserve">report_chain_hash</w:t>
+            </w:r>
+            <w:r>
+              <w:rPr>
+                <w:rFonts w:ascii="Times New Roman" w:cs="Times New Roman" w:eastAsia="Times New Roman" w:hAnsi="Times New Roman"/>
+                <w:b w:val="0"/>
+                <w:bCs w:val="0"/>
+                <w:i w:val="0"/>
+                <w:iCs w:val="0"/>
+                <w:u w:val="none"/>
+                <w:color w:val="000000"/>
+                <w:sz w:val="20"/>
+                <w:szCs w:val="20"/>
+              </w:rPr>
+              <w:t xml:space="preserve">); hourly claim-lease R2 reclamation; signed closure export (P2 extension).</w:t>
             </w:r>
           </w:p>
         </w:tc>
@@ -18867,7 +21741,7 @@
           <w:sz w:val="22"/>
           <w:szCs w:val="22"/>
         </w:rPr>
-        <w:t xml:space="preserve">High-Level Architecture &amp; Cloud Topology Specification (Version 1.0)</w:t>
+        <w:t xml:space="preserve">High-Level Architecture &amp; Cloud Topology Specification (Revision 1.1)</w:t>
       </w:r>
       <w:r>
         <w:rPr>
@@ -18937,7 +21811,35 @@
           <w:sz w:val="22"/>
           <w:szCs w:val="22"/>
         </w:rPr>
-        <w:t xml:space="preserve">). All architectural patterns, trust boundaries, data flows, and infrastructure cost models have been rigorously formulated to satisfy the University Final Year Project syllabus.</w:t>
+        <w:t xml:space="preserve">). All architectural patterns, trust boundaries, data flows, and infrastructure cost models have been rigorously formulated to satisfy the University Final Year Project syllabus and align completely with the approved IEEE 830 Software Requirements Specification (</w:t>
+      </w:r>
+      <w:r>
+        <w:rPr>
+          <w:rFonts w:ascii="Times New Roman" w:cs="Times New Roman" w:eastAsia="Times New Roman" w:hAnsi="Times New Roman"/>
+          <w:b w:val="0"/>
+          <w:bCs w:val="0"/>
+          <w:i w:val="0"/>
+          <w:iCs w:val="0"/>
+          <w:u w:val="none"/>
+          <w:color w:val="000000"/>
+          <w:sz w:val="22"/>
+          <w:szCs w:val="22"/>
+        </w:rPr>
+        <w:t xml:space="preserve">Revision 2.8</w:t>
+      </w:r>
+      <w:r>
+        <w:rPr>
+          <w:rFonts w:ascii="Times New Roman" w:cs="Times New Roman" w:eastAsia="Times New Roman" w:hAnsi="Times New Roman"/>
+          <w:b w:val="0"/>
+          <w:bCs w:val="0"/>
+          <w:i w:val="0"/>
+          <w:iCs w:val="0"/>
+          <w:u w:val="none"/>
+          <w:color w:val="000000"/>
+          <w:sz w:val="22"/>
+          <w:szCs w:val="22"/>
+        </w:rPr>
+        <w:t xml:space="preserve">).</w:t>
       </w:r>
     </w:p>
     <w:p>
@@ -19217,7 +22119,7 @@
           <w:sz w:val="22"/>
           <w:szCs w:val="22"/>
         </w:rPr>
-        <w:t xml:space="preserve">: October 14, 2026</w:t>
+        <w:t xml:space="preserve">: October 16, 2026</w:t>
       </w:r>
     </w:p>
     <w:p>

</xml_diff>

<commit_message>
docs(arch): add Implementation Phases section, align P1/P2 mappings, and ground precise engineering explanations
</commit_message>
<xml_diff>
--- a/Resources/HIGH_LEVEL_ARCHITECTURE.docx
+++ b/Resources/HIGH_LEVEL_ARCHITECTURE.docx
@@ -299,7 +299,7 @@
                 <w:sz w:val="20"/>
                 <w:szCs w:val="20"/>
               </w:rPr>
-              <w:t xml:space="preserve">Revision 1.1 (Academic Milestone Baseline — Evaluator Aligned)</w:t>
+              <w:t xml:space="preserve">Revision 1.2 (Academic Milestone Baseline — Evaluator Aligned)</w:t>
             </w:r>
           </w:p>
         </w:tc>
@@ -2519,7 +2519,7 @@
           <w:sz w:val="22"/>
           <w:szCs w:val="22"/>
         </w:rPr>
-        <w:t xml:space="preserve">: Application servers, database administrators, and cloud hosting providers possess zero technical capability to decrypt submitted vulnerability bodies or attachments.</w:t>
+        <w:t xml:space="preserve">: Application servers, database storage engines, and hosting providers hold only armored ciphertexts and operational metadata; they lack access to the client-held private keys required to decrypt report descriptions or attachments without unauthorized access to client endpoint keystores.</w:t>
       </w:r>
     </w:p>
     <w:p>
@@ -2680,7 +2680,7 @@
           <w:sz w:val="22"/>
           <w:szCs w:val="22"/>
         </w:rPr>
-        <w:t xml:space="preserve">) is immutably anchored in an append-only ledger using SHA-256 dual state chaining (</w:t>
+        <w:t xml:space="preserve">) is cryptographically chained in an append-only audit ledger using SHA-256 hashes (</w:t>
       </w:r>
       <w:r>
         <w:rPr>
@@ -2736,7 +2736,7 @@
           <w:sz w:val="22"/>
           <w:szCs w:val="22"/>
         </w:rPr>
-        <w:t xml:space="preserve">).</w:t>
+        <w:t xml:space="preserve">), enabling independent verification of tamper-evident event ordering.</w:t>
       </w:r>
     </w:p>
     <w:p>
@@ -4186,7 +4186,7 @@
           <w:sz w:val="22"/>
           <w:szCs w:val="22"/>
         </w:rPr>
-        <w:t xml:space="preserve"> AST cleansing, neutralizing the 100-vector OWASP XSS attack corpus prior to DOM injection.</w:t>
+        <w:t xml:space="preserve"> AST cleansing, filtering unsafe HTML elements, scripting attributes, and dangerous URI schemes via strict Markdown AST sanitization prior to DOM rendering.</w:t>
       </w:r>
     </w:p>
     <w:p>
@@ -4962,7 +4962,7 @@
           <w:sz w:val="22"/>
           <w:szCs w:val="22"/>
         </w:rPr>
-        <w:t xml:space="preserve">).</w:t>
+        <w:t xml:space="preserve">), verifying computational parity against the 45 official FIRST.org reference test fixtures.</w:t>
       </w:r>
     </w:p>
     <w:p>
@@ -8049,7 +8049,7 @@
           <w:sz w:val="22"/>
           <w:szCs w:val="22"/>
         </w:rPr>
-        <w:t xml:space="preserve">FR-7.7</w:t>
+        <w:t xml:space="preserve">FR-8.6</w:t>
       </w:r>
       <w:r>
         <w:rPr>
@@ -10810,7 +10810,7 @@
           <w:sz w:val="22"/>
           <w:szCs w:val="22"/>
         </w:rPr>
-        <w:t xml:space="preserve">Process 7.0: Attested Retest Lifecycle &amp; Audit Ledger Engine (`FR-7.1` – `FR-7.6`, `FR-7.7` [P2 Extension], `FR-8.4`, `FR-8.5`)</w:t>
+        <w:t xml:space="preserve">Process 7.0: Attested Retest Lifecycle &amp; Audit Ledger Engine (`FR-7.1` – `FR-7.7`, `FR-8.4`, `FR-8.5`, `FR-8.6` [P2 Extension])</w:t>
       </w:r>
     </w:p>
     <w:p>
@@ -10831,7 +10831,35 @@
           <w:sz w:val="22"/>
           <w:szCs w:val="22"/>
         </w:rPr>
-        <w:t xml:space="preserve">◦  Executes the 15-state lifecycle automaton, records attested retest confirmations or timeout closures, appends SHA-256 dual hash-chained audit events (</w:t>
+        <w:t xml:space="preserve">◦  Executes the 15-state lifecycle automaton, records attested retest confirmations or timeout closures, executes controlled report reopening (</w:t>
+      </w:r>
+      <w:r>
+        <w:rPr>
+          <w:rFonts w:ascii="Times New Roman" w:cs="Times New Roman" w:eastAsia="Times New Roman" w:hAnsi="Times New Roman"/>
+          <w:b w:val="0"/>
+          <w:bCs w:val="0"/>
+          <w:i w:val="0"/>
+          <w:iCs w:val="0"/>
+          <w:u w:val="none"/>
+          <w:color w:val="000000"/>
+          <w:sz w:val="22"/>
+          <w:szCs w:val="22"/>
+        </w:rPr>
+        <w:t xml:space="preserve">FR-7.7</w:t>
+      </w:r>
+      <w:r>
+        <w:rPr>
+          <w:rFonts w:ascii="Times New Roman" w:cs="Times New Roman" w:eastAsia="Times New Roman" w:hAnsi="Times New Roman"/>
+          <w:b w:val="0"/>
+          <w:bCs w:val="0"/>
+          <w:i w:val="0"/>
+          <w:iCs w:val="0"/>
+          <w:u w:val="none"/>
+          <w:color w:val="000000"/>
+          <w:sz w:val="22"/>
+          <w:szCs w:val="22"/>
+        </w:rPr>
+        <w:t xml:space="preserve">), appends SHA-256 dual hash-chained audit events (</w:t>
       </w:r>
       <w:r>
         <w:rPr>
@@ -10901,7 +10929,7 @@
           <w:sz w:val="22"/>
           <w:szCs w:val="22"/>
         </w:rPr>
-        <w:t xml:space="preserve">FR-7.7</w:t>
+        <w:t xml:space="preserve">FR-8.6</w:t>
       </w:r>
       <w:r>
         <w:rPr>
@@ -14221,7 +14249,7 @@
                 <w:sz w:val="20"/>
                 <w:szCs w:val="20"/>
               </w:rPr>
-              <w:t xml:space="preserve">FR-7.7</w:t>
+              <w:t xml:space="preserve">FR-8.6</w:t>
             </w:r>
             <w:r>
               <w:rPr>
@@ -14322,7 +14350,7 @@
                 <w:sz w:val="20"/>
                 <w:szCs w:val="20"/>
               </w:rPr>
-              <w:t xml:space="preserve">FR-7.7</w:t>
+              <w:t xml:space="preserve">FR-8.6</w:t>
             </w:r>
           </w:p>
         </w:tc>
@@ -19150,7 +19178,1348 @@
           <w:sz w:val="28"/>
           <w:szCs w:val="28"/>
         </w:rPr>
-        <w:t xml:space="preserve">6. Bidirectional Architecture Traceability Matrix (RTM)</w:t>
+        <w:t xml:space="preserve">6. Implementation Phases and Clarifications</w:t>
+      </w:r>
+    </w:p>
+    <w:p>
+      <w:pPr>
+        <w:spacing w:before="180" w:after="80" w:line="240" w:lineRule="auto"/>
+        <w:jc w:val="left"/>
+        <w:keepNext/>
+      </w:pPr>
+      <w:r>
+        <w:rPr>
+          <w:rFonts w:ascii="Times New Roman" w:cs="Times New Roman" w:eastAsia="Times New Roman" w:hAnsi="Times New Roman"/>
+          <w:b/>
+          <w:bCs/>
+          <w:i w:val="0"/>
+          <w:iCs w:val="0"/>
+          <w:u w:val="none"/>
+          <w:color w:val="000000"/>
+          <w:sz w:val="24"/>
+          <w:szCs w:val="24"/>
+        </w:rPr>
+        <w:t xml:space="preserve">6.1 Phase 1 Working Demonstration: Core Workflow Baseline</w:t>
+      </w:r>
+    </w:p>
+    <w:p>
+      <w:pPr>
+        <w:spacing w:before="60" w:after="80" w:line="240" w:lineRule="auto"/>
+        <w:jc w:val="left"/>
+      </w:pPr>
+      <w:r>
+        <w:rPr>
+          <w:rFonts w:ascii="Times New Roman" w:cs="Times New Roman" w:eastAsia="Times New Roman" w:hAnsi="Times New Roman"/>
+          <w:b w:val="0"/>
+          <w:bCs w:val="0"/>
+          <w:i w:val="0"/>
+          <w:iCs w:val="0"/>
+          <w:u w:val="none"/>
+          <w:color w:val="000000"/>
+          <w:sz w:val="22"/>
+          <w:szCs w:val="22"/>
+        </w:rPr>
+        <w:t xml:space="preserve">To ground system development in working code and avoid premature document churn, the first implementation milestone will deliver the complete central end-to-end vulnerability coordination workflow:</w:t>
+      </w:r>
+    </w:p>
+    <w:p>
+      <w:pPr>
+        <w:spacing w:before="60" w:after="80" w:line="240" w:lineRule="auto"/>
+        <w:jc w:val="left"/>
+      </w:pPr>
+      <w:r>
+        <w:rPr>
+          <w:rFonts w:ascii="Times New Roman" w:cs="Times New Roman" w:eastAsia="Times New Roman" w:hAnsi="Times New Roman"/>
+          <w:b w:val="0"/>
+          <w:bCs w:val="0"/>
+          <w:i w:val="0"/>
+          <w:iCs w:val="0"/>
+          <w:u w:val="none"/>
+          <w:color w:val="000000"/>
+          <w:sz w:val="22"/>
+          <w:szCs w:val="22"/>
+        </w:rPr>
+        <w:t xml:space="preserve">Submit Encrypted Report -&gt; Review &amp; Triage -&gt; Record Fix Evidence -&gt; Retest Attestation -&gt; Record Closure Outcome</w:t>
+      </w:r>
+    </w:p>
+    <w:p>
+      <w:pPr>
+        <w:spacing w:before="60" w:after="80" w:line="240" w:lineRule="auto"/>
+        <w:jc w:val="left"/>
+      </w:pPr>
+      <w:r>
+        <w:rPr>
+          <w:rFonts w:ascii="Times New Roman" w:cs="Times New Roman" w:eastAsia="Times New Roman" w:hAnsi="Times New Roman"/>
+          <w:b w:val="0"/>
+          <w:bCs w:val="0"/>
+          <w:i w:val="0"/>
+          <w:iCs w:val="0"/>
+          <w:u w:val="none"/>
+          <w:color w:val="000000"/>
+          <w:sz w:val="22"/>
+          <w:szCs w:val="22"/>
+        </w:rPr>
+        <w:t xml:space="preserve">This central demonstration validates all essential cross-tier interfaces:</w:t>
+      </w:r>
+    </w:p>
+    <w:p>
+      <w:pPr>
+        <w:spacing w:before="30" w:after="30" w:line="240" w:lineRule="auto"/>
+        <w:jc w:val="left"/>
+        <w:ind w:left="360"/>
+      </w:pPr>
+      <w:r>
+        <w:rPr>
+          <w:rFonts w:ascii="Times New Roman" w:cs="Times New Roman" w:eastAsia="Times New Roman" w:hAnsi="Times New Roman"/>
+          <w:b w:val="0"/>
+          <w:bCs w:val="0"/>
+          <w:i w:val="0"/>
+          <w:iCs w:val="0"/>
+          <w:u w:val="none"/>
+          <w:color w:val="000000"/>
+          <w:sz w:val="22"/>
+          <w:szCs w:val="22"/>
+        </w:rPr>
+        <w:t xml:space="preserve">1. </w:t>
+      </w:r>
+      <w:r>
+        <w:rPr>
+          <w:rFonts w:ascii="Times New Roman" w:cs="Times New Roman" w:eastAsia="Times New Roman" w:hAnsi="Times New Roman"/>
+          <w:b/>
+          <w:bCs/>
+          <w:i w:val="0"/>
+          <w:iCs w:val="0"/>
+          <w:u w:val="none"/>
+          <w:color w:val="000000"/>
+          <w:sz w:val="22"/>
+          <w:szCs w:val="22"/>
+        </w:rPr>
+        <w:t xml:space="preserve">Intake &amp; Cryptographic Isolation</w:t>
+      </w:r>
+      <w:r>
+        <w:rPr>
+          <w:rFonts w:ascii="Times New Roman" w:cs="Times New Roman" w:eastAsia="Times New Roman" w:hAnsi="Times New Roman"/>
+          <w:b w:val="0"/>
+          <w:bCs w:val="0"/>
+          <w:i w:val="0"/>
+          <w:iCs w:val="0"/>
+          <w:u w:val="none"/>
+          <w:color w:val="000000"/>
+          <w:sz w:val="22"/>
+          <w:szCs w:val="22"/>
+        </w:rPr>
+        <w:t xml:space="preserve">: A security researcher generates an ephemeral keypair in browser memory, encrypts report content using OpenPGP.js v6 Curve25519, and submits ciphertext to the serverless API with zero server plaintext visibility.</w:t>
+      </w:r>
+    </w:p>
+    <w:p>
+      <w:pPr>
+        <w:spacing w:before="30" w:after="30" w:line="240" w:lineRule="auto"/>
+        <w:jc w:val="left"/>
+        <w:ind w:left="360"/>
+      </w:pPr>
+      <w:r>
+        <w:rPr>
+          <w:rFonts w:ascii="Times New Roman" w:cs="Times New Roman" w:eastAsia="Times New Roman" w:hAnsi="Times New Roman"/>
+          <w:b w:val="0"/>
+          <w:bCs w:val="0"/>
+          <w:i w:val="0"/>
+          <w:iCs w:val="0"/>
+          <w:u w:val="none"/>
+          <w:color w:val="000000"/>
+          <w:sz w:val="22"/>
+          <w:szCs w:val="22"/>
+        </w:rPr>
+        <w:t xml:space="preserve">2. </w:t>
+      </w:r>
+      <w:r>
+        <w:rPr>
+          <w:rFonts w:ascii="Times New Roman" w:cs="Times New Roman" w:eastAsia="Times New Roman" w:hAnsi="Times New Roman"/>
+          <w:b/>
+          <w:bCs/>
+          <w:i w:val="0"/>
+          <w:iCs w:val="0"/>
+          <w:u w:val="none"/>
+          <w:color w:val="000000"/>
+          <w:sz w:val="22"/>
+          <w:szCs w:val="22"/>
+        </w:rPr>
+        <w:t xml:space="preserve">Defender Review &amp; CVSS Scoring</w:t>
+      </w:r>
+      <w:r>
+        <w:rPr>
+          <w:rFonts w:ascii="Times New Roman" w:cs="Times New Roman" w:eastAsia="Times New Roman" w:hAnsi="Times New Roman"/>
+          <w:b w:val="0"/>
+          <w:bCs w:val="0"/>
+          <w:i w:val="0"/>
+          <w:iCs w:val="0"/>
+          <w:u w:val="none"/>
+          <w:color w:val="000000"/>
+          <w:sz w:val="22"/>
+          <w:szCs w:val="22"/>
+        </w:rPr>
+        <w:t xml:space="preserve">: An authenticated organization defender (</w:t>
+      </w:r>
+      <w:r>
+        <w:rPr>
+          <w:rFonts w:ascii="Times New Roman" w:cs="Times New Roman" w:eastAsia="Times New Roman" w:hAnsi="Times New Roman"/>
+          <w:b w:val="0"/>
+          <w:bCs w:val="0"/>
+          <w:i w:val="0"/>
+          <w:iCs w:val="0"/>
+          <w:u w:val="none"/>
+          <w:color w:val="000000"/>
+          <w:sz w:val="22"/>
+          <w:szCs w:val="22"/>
+        </w:rPr>
+        <w:t xml:space="preserve">__Host-bbt-session</w:t>
+      </w:r>
+      <w:r>
+        <w:rPr>
+          <w:rFonts w:ascii="Times New Roman" w:cs="Times New Roman" w:eastAsia="Times New Roman" w:hAnsi="Times New Roman"/>
+          <w:b w:val="0"/>
+          <w:bCs w:val="0"/>
+          <w:i w:val="0"/>
+          <w:iCs w:val="0"/>
+          <w:u w:val="none"/>
+          <w:color w:val="000000"/>
+          <w:sz w:val="22"/>
+          <w:szCs w:val="22"/>
+        </w:rPr>
+        <w:t xml:space="preserve">, </w:t>
+      </w:r>
+      <w:r>
+        <w:rPr>
+          <w:rFonts w:ascii="Times New Roman" w:cs="Times New Roman" w:eastAsia="Times New Roman" w:hAnsi="Times New Roman"/>
+          <w:b w:val="0"/>
+          <w:bCs w:val="0"/>
+          <w:i w:val="0"/>
+          <w:iCs w:val="0"/>
+          <w:u w:val="none"/>
+          <w:color w:val="000000"/>
+          <w:sz w:val="22"/>
+          <w:szCs w:val="22"/>
+        </w:rPr>
+        <w:t xml:space="preserve">SameSite=Lax</w:t>
+      </w:r>
+      <w:r>
+        <w:rPr>
+          <w:rFonts w:ascii="Times New Roman" w:cs="Times New Roman" w:eastAsia="Times New Roman" w:hAnsi="Times New Roman"/>
+          <w:b w:val="0"/>
+          <w:bCs w:val="0"/>
+          <w:i w:val="0"/>
+          <w:iCs w:val="0"/>
+          <w:u w:val="none"/>
+          <w:color w:val="000000"/>
+          <w:sz w:val="22"/>
+          <w:szCs w:val="22"/>
+        </w:rPr>
+        <w:t xml:space="preserve">) decrypts report metadata client-side, reviews triage parameters, and verifies deterministic FIRST.org CVSS v3.1 calculation.</w:t>
+      </w:r>
+    </w:p>
+    <w:p>
+      <w:pPr>
+        <w:spacing w:before="30" w:after="30" w:line="240" w:lineRule="auto"/>
+        <w:jc w:val="left"/>
+        <w:ind w:left="360"/>
+      </w:pPr>
+      <w:r>
+        <w:rPr>
+          <w:rFonts w:ascii="Times New Roman" w:cs="Times New Roman" w:eastAsia="Times New Roman" w:hAnsi="Times New Roman"/>
+          <w:b w:val="0"/>
+          <w:bCs w:val="0"/>
+          <w:i w:val="0"/>
+          <w:iCs w:val="0"/>
+          <w:u w:val="none"/>
+          <w:color w:val="000000"/>
+          <w:sz w:val="22"/>
+          <w:szCs w:val="22"/>
+        </w:rPr>
+        <w:t xml:space="preserve">3. </w:t>
+      </w:r>
+      <w:r>
+        <w:rPr>
+          <w:rFonts w:ascii="Times New Roman" w:cs="Times New Roman" w:eastAsia="Times New Roman" w:hAnsi="Times New Roman"/>
+          <w:b/>
+          <w:bCs/>
+          <w:i w:val="0"/>
+          <w:iCs w:val="0"/>
+          <w:u w:val="none"/>
+          <w:color w:val="000000"/>
+          <w:sz w:val="22"/>
+          <w:szCs w:val="22"/>
+        </w:rPr>
+        <w:t xml:space="preserve">Remediation Evidence Verification</w:t>
+      </w:r>
+      <w:r>
+        <w:rPr>
+          <w:rFonts w:ascii="Times New Roman" w:cs="Times New Roman" w:eastAsia="Times New Roman" w:hAnsi="Times New Roman"/>
+          <w:b w:val="0"/>
+          <w:bCs w:val="0"/>
+          <w:i w:val="0"/>
+          <w:iCs w:val="0"/>
+          <w:u w:val="none"/>
+          <w:color w:val="000000"/>
+          <w:sz w:val="22"/>
+          <w:szCs w:val="22"/>
+        </w:rPr>
+        <w:t xml:space="preserve">: A defender records a remediation claim verified through the GitHub REST API (</w:t>
+      </w:r>
+      <w:r>
+        <w:rPr>
+          <w:rFonts w:ascii="Times New Roman" w:cs="Times New Roman" w:eastAsia="Times New Roman" w:hAnsi="Times New Roman"/>
+          <w:b w:val="0"/>
+          <w:bCs w:val="0"/>
+          <w:i w:val="0"/>
+          <w:iCs w:val="0"/>
+          <w:u w:val="none"/>
+          <w:color w:val="000000"/>
+          <w:sz w:val="22"/>
+          <w:szCs w:val="22"/>
+        </w:rPr>
+        <w:t xml:space="preserve">compare/{branch}...{sha}</w:t>
+      </w:r>
+      <w:r>
+        <w:rPr>
+          <w:rFonts w:ascii="Times New Roman" w:cs="Times New Roman" w:eastAsia="Times New Roman" w:hAnsi="Times New Roman"/>
+          <w:b w:val="0"/>
+          <w:bCs w:val="0"/>
+          <w:i w:val="0"/>
+          <w:iCs w:val="0"/>
+          <w:u w:val="none"/>
+          <w:color w:val="000000"/>
+          <w:sz w:val="22"/>
+          <w:szCs w:val="22"/>
+        </w:rPr>
+        <w:t xml:space="preserve">) or an encrypted configuration snapshot bound to a SHA-256 hash.</w:t>
+      </w:r>
+    </w:p>
+    <w:p>
+      <w:pPr>
+        <w:spacing w:before="30" w:after="30" w:line="240" w:lineRule="auto"/>
+        <w:jc w:val="left"/>
+        <w:ind w:left="360"/>
+      </w:pPr>
+      <w:r>
+        <w:rPr>
+          <w:rFonts w:ascii="Times New Roman" w:cs="Times New Roman" w:eastAsia="Times New Roman" w:hAnsi="Times New Roman"/>
+          <w:b w:val="0"/>
+          <w:bCs w:val="0"/>
+          <w:i w:val="0"/>
+          <w:iCs w:val="0"/>
+          <w:u w:val="none"/>
+          <w:color w:val="000000"/>
+          <w:sz w:val="22"/>
+          <w:szCs w:val="22"/>
+        </w:rPr>
+        <w:t xml:space="preserve">4. </w:t>
+      </w:r>
+      <w:r>
+        <w:rPr>
+          <w:rFonts w:ascii="Times New Roman" w:cs="Times New Roman" w:eastAsia="Times New Roman" w:hAnsi="Times New Roman"/>
+          <w:b/>
+          <w:bCs/>
+          <w:i w:val="0"/>
+          <w:iCs w:val="0"/>
+          <w:u w:val="none"/>
+          <w:color w:val="000000"/>
+          <w:sz w:val="22"/>
+          <w:szCs w:val="22"/>
+        </w:rPr>
+        <w:t xml:space="preserve">Attested Retest</w:t>
+      </w:r>
+      <w:r>
+        <w:rPr>
+          <w:rFonts w:ascii="Times New Roman" w:cs="Times New Roman" w:eastAsia="Times New Roman" w:hAnsi="Times New Roman"/>
+          <w:b w:val="0"/>
+          <w:bCs w:val="0"/>
+          <w:i w:val="0"/>
+          <w:iCs w:val="0"/>
+          <w:u w:val="none"/>
+          <w:color w:val="000000"/>
+          <w:sz w:val="22"/>
+          <w:szCs w:val="22"/>
+        </w:rPr>
+        <w:t xml:space="preserve">: The researcher verifies the remediation and submits an attested outcome (</w:t>
+      </w:r>
+      <w:r>
+        <w:rPr>
+          <w:rFonts w:ascii="Times New Roman" w:cs="Times New Roman" w:eastAsia="Times New Roman" w:hAnsi="Times New Roman"/>
+          <w:b w:val="0"/>
+          <w:bCs w:val="0"/>
+          <w:i w:val="0"/>
+          <w:iCs w:val="0"/>
+          <w:u w:val="none"/>
+          <w:color w:val="000000"/>
+          <w:sz w:val="22"/>
+          <w:szCs w:val="22"/>
+        </w:rPr>
+        <w:t xml:space="preserve">VERIFIED_RESEARCHER</w:t>
+      </w:r>
+      <w:r>
+        <w:rPr>
+          <w:rFonts w:ascii="Times New Roman" w:cs="Times New Roman" w:eastAsia="Times New Roman" w:hAnsi="Times New Roman"/>
+          <w:b w:val="0"/>
+          <w:bCs w:val="0"/>
+          <w:i w:val="0"/>
+          <w:iCs w:val="0"/>
+          <w:u w:val="none"/>
+          <w:color w:val="000000"/>
+          <w:sz w:val="22"/>
+          <w:szCs w:val="22"/>
+        </w:rPr>
+        <w:t xml:space="preserve"> or </w:t>
+      </w:r>
+      <w:r>
+        <w:rPr>
+          <w:rFonts w:ascii="Times New Roman" w:cs="Times New Roman" w:eastAsia="Times New Roman" w:hAnsi="Times New Roman"/>
+          <w:b w:val="0"/>
+          <w:bCs w:val="0"/>
+          <w:i w:val="0"/>
+          <w:iCs w:val="0"/>
+          <w:u w:val="none"/>
+          <w:color w:val="000000"/>
+          <w:sz w:val="22"/>
+          <w:szCs w:val="22"/>
+        </w:rPr>
+        <w:t xml:space="preserve">RETEST_FAILED</w:t>
+      </w:r>
+      <w:r>
+        <w:rPr>
+          <w:rFonts w:ascii="Times New Roman" w:cs="Times New Roman" w:eastAsia="Times New Roman" w:hAnsi="Times New Roman"/>
+          <w:b w:val="0"/>
+          <w:bCs w:val="0"/>
+          <w:i w:val="0"/>
+          <w:iCs w:val="0"/>
+          <w:u w:val="none"/>
+          <w:color w:val="000000"/>
+          <w:sz w:val="22"/>
+          <w:szCs w:val="22"/>
+        </w:rPr>
+        <w:t xml:space="preserve">).</w:t>
+      </w:r>
+    </w:p>
+    <w:p>
+      <w:pPr>
+        <w:spacing w:before="30" w:after="30" w:line="240" w:lineRule="auto"/>
+        <w:jc w:val="left"/>
+        <w:ind w:left="360"/>
+      </w:pPr>
+      <w:r>
+        <w:rPr>
+          <w:rFonts w:ascii="Times New Roman" w:cs="Times New Roman" w:eastAsia="Times New Roman" w:hAnsi="Times New Roman"/>
+          <w:b w:val="0"/>
+          <w:bCs w:val="0"/>
+          <w:i w:val="0"/>
+          <w:iCs w:val="0"/>
+          <w:u w:val="none"/>
+          <w:color w:val="000000"/>
+          <w:sz w:val="22"/>
+          <w:szCs w:val="22"/>
+        </w:rPr>
+        <w:t xml:space="preserve">5. </w:t>
+      </w:r>
+      <w:r>
+        <w:rPr>
+          <w:rFonts w:ascii="Times New Roman" w:cs="Times New Roman" w:eastAsia="Times New Roman" w:hAnsi="Times New Roman"/>
+          <w:b/>
+          <w:bCs/>
+          <w:i w:val="0"/>
+          <w:iCs w:val="0"/>
+          <w:u w:val="none"/>
+          <w:color w:val="000000"/>
+          <w:sz w:val="22"/>
+          <w:szCs w:val="22"/>
+        </w:rPr>
+        <w:t xml:space="preserve">Closure &amp; Ledger Recording</w:t>
+      </w:r>
+      <w:r>
+        <w:rPr>
+          <w:rFonts w:ascii="Times New Roman" w:cs="Times New Roman" w:eastAsia="Times New Roman" w:hAnsi="Times New Roman"/>
+          <w:b w:val="0"/>
+          <w:bCs w:val="0"/>
+          <w:i w:val="0"/>
+          <w:iCs w:val="0"/>
+          <w:u w:val="none"/>
+          <w:color w:val="000000"/>
+          <w:sz w:val="22"/>
+          <w:szCs w:val="22"/>
+        </w:rPr>
+        <w:t xml:space="preserve">: The state machine advances to a terminal status and appends an immutable, hash-chained record to the PostgreSQL audit ledger.</w:t>
+      </w:r>
+    </w:p>
+    <w:p>
+      <w:pPr>
+        <w:spacing w:before="180" w:after="80" w:line="240" w:lineRule="auto"/>
+        <w:jc w:val="left"/>
+        <w:keepNext/>
+      </w:pPr>
+      <w:r>
+        <w:rPr>
+          <w:rFonts w:ascii="Times New Roman" w:cs="Times New Roman" w:eastAsia="Times New Roman" w:hAnsi="Times New Roman"/>
+          <w:b/>
+          <w:bCs/>
+          <w:i w:val="0"/>
+          <w:iCs w:val="0"/>
+          <w:u w:val="none"/>
+          <w:color w:val="000000"/>
+          <w:sz w:val="24"/>
+          <w:szCs w:val="24"/>
+        </w:rPr>
+        <w:t xml:space="preserve">6.2 Milestone Staging vs. Requirement Priority Obligations</w:t>
+      </w:r>
+    </w:p>
+    <w:p>
+      <w:pPr>
+        <w:spacing w:before="60" w:after="80" w:line="240" w:lineRule="auto"/>
+        <w:jc w:val="left"/>
+      </w:pPr>
+      <w:r>
+        <w:rPr>
+          <w:rFonts w:ascii="Times New Roman" w:cs="Times New Roman" w:eastAsia="Times New Roman" w:hAnsi="Times New Roman"/>
+          <w:b w:val="0"/>
+          <w:bCs w:val="0"/>
+          <w:i w:val="0"/>
+          <w:iCs w:val="0"/>
+          <w:u w:val="none"/>
+          <w:color w:val="000000"/>
+          <w:sz w:val="22"/>
+          <w:szCs w:val="22"/>
+        </w:rPr>
+        <w:t xml:space="preserve">Sequencing functional features across subsequent implementation milestones organizes the engineering development plan; </w:t>
+      </w:r>
+      <w:r>
+        <w:rPr>
+          <w:rFonts w:ascii="Times New Roman" w:cs="Times New Roman" w:eastAsia="Times New Roman" w:hAnsi="Times New Roman"/>
+          <w:b/>
+          <w:bCs/>
+          <w:i w:val="0"/>
+          <w:iCs w:val="0"/>
+          <w:u w:val="none"/>
+          <w:color w:val="000000"/>
+          <w:sz w:val="22"/>
+          <w:szCs w:val="22"/>
+        </w:rPr>
+        <w:t xml:space="preserve">it does not remove or diminish any P1 obligation</w:t>
+      </w:r>
+      <w:r>
+        <w:rPr>
+          <w:rFonts w:ascii="Times New Roman" w:cs="Times New Roman" w:eastAsia="Times New Roman" w:hAnsi="Times New Roman"/>
+          <w:b w:val="0"/>
+          <w:bCs w:val="0"/>
+          <w:i w:val="0"/>
+          <w:iCs w:val="0"/>
+          <w:u w:val="none"/>
+          <w:color w:val="000000"/>
+          <w:sz w:val="22"/>
+          <w:szCs w:val="22"/>
+        </w:rPr>
+        <w:t xml:space="preserve"> established in the submitted and approved IEEE 830 SRS (</w:t>
+      </w:r>
+      <w:r>
+        <w:rPr>
+          <w:rFonts w:ascii="Times New Roman" w:cs="Times New Roman" w:eastAsia="Times New Roman" w:hAnsi="Times New Roman"/>
+          <w:b w:val="0"/>
+          <w:bCs w:val="0"/>
+          <w:i w:val="0"/>
+          <w:iCs w:val="0"/>
+          <w:u w:val="none"/>
+          <w:color w:val="000000"/>
+          <w:sz w:val="22"/>
+          <w:szCs w:val="22"/>
+        </w:rPr>
+        <w:t xml:space="preserve">Revision 2.8</w:t>
+      </w:r>
+      <w:r>
+        <w:rPr>
+          <w:rFonts w:ascii="Times New Roman" w:cs="Times New Roman" w:eastAsia="Times New Roman" w:hAnsi="Times New Roman"/>
+          <w:b w:val="0"/>
+          <w:bCs w:val="0"/>
+          <w:i w:val="0"/>
+          <w:iCs w:val="0"/>
+          <w:u w:val="none"/>
+          <w:color w:val="000000"/>
+          <w:sz w:val="22"/>
+          <w:szCs w:val="22"/>
+        </w:rPr>
+        <w:t xml:space="preserve">).</w:t>
+      </w:r>
+    </w:p>
+    <w:p>
+      <w:pPr>
+        <w:spacing w:before="30" w:after="30" w:line="240" w:lineRule="auto"/>
+        <w:jc w:val="left"/>
+        <w:ind w:left="360"/>
+      </w:pPr>
+      <w:r>
+        <w:rPr>
+          <w:rFonts w:ascii="Times New Roman" w:cs="Times New Roman" w:eastAsia="Times New Roman" w:hAnsi="Times New Roman"/>
+          <w:b w:val="0"/>
+          <w:bCs w:val="0"/>
+          <w:i w:val="0"/>
+          <w:iCs w:val="0"/>
+          <w:u w:val="none"/>
+          <w:color w:val="000000"/>
+          <w:sz w:val="22"/>
+          <w:szCs w:val="22"/>
+        </w:rPr>
+        <w:t xml:space="preserve">•  </w:t>
+      </w:r>
+      <w:r>
+        <w:rPr>
+          <w:rFonts w:ascii="Times New Roman" w:cs="Times New Roman" w:eastAsia="Times New Roman" w:hAnsi="Times New Roman"/>
+          <w:b/>
+          <w:bCs/>
+          <w:i w:val="0"/>
+          <w:iCs w:val="0"/>
+          <w:u w:val="none"/>
+          <w:color w:val="000000"/>
+          <w:sz w:val="22"/>
+          <w:szCs w:val="22"/>
+        </w:rPr>
+        <w:t xml:space="preserve">Mandatory P1 Invariants</w:t>
+      </w:r>
+      <w:r>
+        <w:rPr>
+          <w:rFonts w:ascii="Times New Roman" w:cs="Times New Roman" w:eastAsia="Times New Roman" w:hAnsi="Times New Roman"/>
+          <w:b w:val="0"/>
+          <w:bCs w:val="0"/>
+          <w:i w:val="0"/>
+          <w:iCs w:val="0"/>
+          <w:u w:val="none"/>
+          <w:color w:val="000000"/>
+          <w:sz w:val="22"/>
+          <w:szCs w:val="22"/>
+        </w:rPr>
+        <w:t xml:space="preserve">: All requirements designated as </w:t>
+      </w:r>
+      <w:r>
+        <w:rPr>
+          <w:rFonts w:ascii="Times New Roman" w:cs="Times New Roman" w:eastAsia="Times New Roman" w:hAnsi="Times New Roman"/>
+          <w:b w:val="0"/>
+          <w:bCs w:val="0"/>
+          <w:i w:val="0"/>
+          <w:iCs w:val="0"/>
+          <w:u w:val="none"/>
+          <w:color w:val="000000"/>
+          <w:sz w:val="22"/>
+          <w:szCs w:val="22"/>
+        </w:rPr>
+        <w:t xml:space="preserve">P1</w:t>
+      </w:r>
+      <w:r>
+        <w:rPr>
+          <w:rFonts w:ascii="Times New Roman" w:cs="Times New Roman" w:eastAsia="Times New Roman" w:hAnsi="Times New Roman"/>
+          <w:b w:val="0"/>
+          <w:bCs w:val="0"/>
+          <w:i w:val="0"/>
+          <w:iCs w:val="0"/>
+          <w:u w:val="none"/>
+          <w:color w:val="000000"/>
+          <w:sz w:val="22"/>
+          <w:szCs w:val="22"/>
+        </w:rPr>
+        <w:t xml:space="preserve"> in the approved specification—including RFC 9116 </w:t>
+      </w:r>
+      <w:r>
+        <w:rPr>
+          <w:rFonts w:ascii="Times New Roman" w:cs="Times New Roman" w:eastAsia="Times New Roman" w:hAnsi="Times New Roman"/>
+          <w:b w:val="0"/>
+          <w:bCs w:val="0"/>
+          <w:i w:val="0"/>
+          <w:iCs w:val="0"/>
+          <w:u w:val="none"/>
+          <w:color w:val="000000"/>
+          <w:sz w:val="22"/>
+          <w:szCs w:val="22"/>
+        </w:rPr>
+        <w:t xml:space="preserve">security.txt</w:t>
+      </w:r>
+      <w:r>
+        <w:rPr>
+          <w:rFonts w:ascii="Times New Roman" w:cs="Times New Roman" w:eastAsia="Times New Roman" w:hAnsi="Times New Roman"/>
+          <w:b w:val="0"/>
+          <w:bCs w:val="0"/>
+          <w:i w:val="0"/>
+          <w:iCs w:val="0"/>
+          <w:u w:val="none"/>
+          <w:color w:val="000000"/>
+          <w:sz w:val="22"/>
+          <w:szCs w:val="22"/>
+        </w:rPr>
+        <w:t xml:space="preserve"> manifest generation (</w:t>
+      </w:r>
+      <w:r>
+        <w:rPr>
+          <w:rFonts w:ascii="Times New Roman" w:cs="Times New Roman" w:eastAsia="Times New Roman" w:hAnsi="Times New Roman"/>
+          <w:b w:val="0"/>
+          <w:bCs w:val="0"/>
+          <w:i w:val="0"/>
+          <w:iCs w:val="0"/>
+          <w:u w:val="none"/>
+          <w:color w:val="000000"/>
+          <w:sz w:val="22"/>
+          <w:szCs w:val="22"/>
+        </w:rPr>
+        <w:t xml:space="preserve">FR-2</w:t>
+      </w:r>
+      <w:r>
+        <w:rPr>
+          <w:rFonts w:ascii="Times New Roman" w:cs="Times New Roman" w:eastAsia="Times New Roman" w:hAnsi="Times New Roman"/>
+          <w:b w:val="0"/>
+          <w:bCs w:val="0"/>
+          <w:i w:val="0"/>
+          <w:iCs w:val="0"/>
+          <w:u w:val="none"/>
+          <w:color w:val="000000"/>
+          <w:sz w:val="22"/>
+          <w:szCs w:val="22"/>
+        </w:rPr>
+        <w:t xml:space="preserve">), dual-lane triage message isolation (</w:t>
+      </w:r>
+      <w:r>
+        <w:rPr>
+          <w:rFonts w:ascii="Times New Roman" w:cs="Times New Roman" w:eastAsia="Times New Roman" w:hAnsi="Times New Roman"/>
+          <w:b w:val="0"/>
+          <w:bCs w:val="0"/>
+          <w:i w:val="0"/>
+          <w:iCs w:val="0"/>
+          <w:u w:val="none"/>
+          <w:color w:val="000000"/>
+          <w:sz w:val="22"/>
+          <w:szCs w:val="22"/>
+        </w:rPr>
+        <w:t xml:space="preserve">FR-5</w:t>
+      </w:r>
+      <w:r>
+        <w:rPr>
+          <w:rFonts w:ascii="Times New Roman" w:cs="Times New Roman" w:eastAsia="Times New Roman" w:hAnsi="Times New Roman"/>
+          <w:b w:val="0"/>
+          <w:bCs w:val="0"/>
+          <w:i w:val="0"/>
+          <w:iCs w:val="0"/>
+          <w:u w:val="none"/>
+          <w:color w:val="000000"/>
+          <w:sz w:val="22"/>
+          <w:szCs w:val="22"/>
+        </w:rPr>
+        <w:t xml:space="preserve">), state machine quota pause handling (</w:t>
+      </w:r>
+      <w:r>
+        <w:rPr>
+          <w:rFonts w:ascii="Times New Roman" w:cs="Times New Roman" w:eastAsia="Times New Roman" w:hAnsi="Times New Roman"/>
+          <w:b w:val="0"/>
+          <w:bCs w:val="0"/>
+          <w:i w:val="0"/>
+          <w:iCs w:val="0"/>
+          <w:u w:val="none"/>
+          <w:color w:val="000000"/>
+          <w:sz w:val="22"/>
+          <w:szCs w:val="22"/>
+        </w:rPr>
+        <w:t xml:space="preserve">FR-7.5</w:t>
+      </w:r>
+      <w:r>
+        <w:rPr>
+          <w:rFonts w:ascii="Times New Roman" w:cs="Times New Roman" w:eastAsia="Times New Roman" w:hAnsi="Times New Roman"/>
+          <w:b w:val="0"/>
+          <w:bCs w:val="0"/>
+          <w:i w:val="0"/>
+          <w:iCs w:val="0"/>
+          <w:u w:val="none"/>
+          <w:color w:val="000000"/>
+          <w:sz w:val="22"/>
+          <w:szCs w:val="22"/>
+        </w:rPr>
+        <w:t xml:space="preserve">), controlled report reopening (</w:t>
+      </w:r>
+      <w:r>
+        <w:rPr>
+          <w:rFonts w:ascii="Times New Roman" w:cs="Times New Roman" w:eastAsia="Times New Roman" w:hAnsi="Times New Roman"/>
+          <w:b w:val="0"/>
+          <w:bCs w:val="0"/>
+          <w:i w:val="0"/>
+          <w:iCs w:val="0"/>
+          <w:u w:val="none"/>
+          <w:color w:val="000000"/>
+          <w:sz w:val="22"/>
+          <w:szCs w:val="22"/>
+        </w:rPr>
+        <w:t xml:space="preserve">FR-7.7</w:t>
+      </w:r>
+      <w:r>
+        <w:rPr>
+          <w:rFonts w:ascii="Times New Roman" w:cs="Times New Roman" w:eastAsia="Times New Roman" w:hAnsi="Times New Roman"/>
+          <w:b w:val="0"/>
+          <w:bCs w:val="0"/>
+          <w:i w:val="0"/>
+          <w:iCs w:val="0"/>
+          <w:u w:val="none"/>
+          <w:color w:val="000000"/>
+          <w:sz w:val="22"/>
+          <w:szCs w:val="22"/>
+        </w:rPr>
+        <w:t xml:space="preserve">), database Row-Level Security (</w:t>
+      </w:r>
+      <w:r>
+        <w:rPr>
+          <w:rFonts w:ascii="Times New Roman" w:cs="Times New Roman" w:eastAsia="Times New Roman" w:hAnsi="Times New Roman"/>
+          <w:b w:val="0"/>
+          <w:bCs w:val="0"/>
+          <w:i w:val="0"/>
+          <w:iCs w:val="0"/>
+          <w:u w:val="none"/>
+          <w:color w:val="000000"/>
+          <w:sz w:val="22"/>
+          <w:szCs w:val="22"/>
+        </w:rPr>
+        <w:t xml:space="preserve">FR-8.2</w:t>
+      </w:r>
+      <w:r>
+        <w:rPr>
+          <w:rFonts w:ascii="Times New Roman" w:cs="Times New Roman" w:eastAsia="Times New Roman" w:hAnsi="Times New Roman"/>
+          <w:b w:val="0"/>
+          <w:bCs w:val="0"/>
+          <w:i w:val="0"/>
+          <w:iCs w:val="0"/>
+          <w:u w:val="none"/>
+          <w:color w:val="000000"/>
+          <w:sz w:val="22"/>
+          <w:szCs w:val="22"/>
+        </w:rPr>
+        <w:t xml:space="preserve">), and append-only audit chaining (</w:t>
+      </w:r>
+      <w:r>
+        <w:rPr>
+          <w:rFonts w:ascii="Times New Roman" w:cs="Times New Roman" w:eastAsia="Times New Roman" w:hAnsi="Times New Roman"/>
+          <w:b w:val="0"/>
+          <w:bCs w:val="0"/>
+          <w:i w:val="0"/>
+          <w:iCs w:val="0"/>
+          <w:u w:val="none"/>
+          <w:color w:val="000000"/>
+          <w:sz w:val="22"/>
+          <w:szCs w:val="22"/>
+        </w:rPr>
+        <w:t xml:space="preserve">FR-8.5</w:t>
+      </w:r>
+      <w:r>
+        <w:rPr>
+          <w:rFonts w:ascii="Times New Roman" w:cs="Times New Roman" w:eastAsia="Times New Roman" w:hAnsi="Times New Roman"/>
+          <w:b w:val="0"/>
+          <w:bCs w:val="0"/>
+          <w:i w:val="0"/>
+          <w:iCs w:val="0"/>
+          <w:u w:val="none"/>
+          <w:color w:val="000000"/>
+          <w:sz w:val="22"/>
+          <w:szCs w:val="22"/>
+        </w:rPr>
+        <w:t xml:space="preserve">)—remain planned mandatory deliverables for subsequent development sprints.</w:t>
+      </w:r>
+    </w:p>
+    <w:p>
+      <w:pPr>
+        <w:spacing w:before="30" w:after="30" w:line="240" w:lineRule="auto"/>
+        <w:jc w:val="left"/>
+        <w:ind w:left="360"/>
+      </w:pPr>
+      <w:r>
+        <w:rPr>
+          <w:rFonts w:ascii="Times New Roman" w:cs="Times New Roman" w:eastAsia="Times New Roman" w:hAnsi="Times New Roman"/>
+          <w:b w:val="0"/>
+          <w:bCs w:val="0"/>
+          <w:i w:val="0"/>
+          <w:iCs w:val="0"/>
+          <w:u w:val="none"/>
+          <w:color w:val="000000"/>
+          <w:sz w:val="22"/>
+          <w:szCs w:val="22"/>
+        </w:rPr>
+        <w:t xml:space="preserve">•  </w:t>
+      </w:r>
+      <w:r>
+        <w:rPr>
+          <w:rFonts w:ascii="Times New Roman" w:cs="Times New Roman" w:eastAsia="Times New Roman" w:hAnsi="Times New Roman"/>
+          <w:b/>
+          <w:bCs/>
+          <w:i w:val="0"/>
+          <w:iCs w:val="0"/>
+          <w:u w:val="none"/>
+          <w:color w:val="000000"/>
+          <w:sz w:val="22"/>
+          <w:szCs w:val="22"/>
+        </w:rPr>
+        <w:t xml:space="preserve">Secondary P2 Extensions</w:t>
+      </w:r>
+      <w:r>
+        <w:rPr>
+          <w:rFonts w:ascii="Times New Roman" w:cs="Times New Roman" w:eastAsia="Times New Roman" w:hAnsi="Times New Roman"/>
+          <w:b w:val="0"/>
+          <w:bCs w:val="0"/>
+          <w:i w:val="0"/>
+          <w:iCs w:val="0"/>
+          <w:u w:val="none"/>
+          <w:color w:val="000000"/>
+          <w:sz w:val="22"/>
+          <w:szCs w:val="22"/>
+        </w:rPr>
+        <w:t xml:space="preserve">: Features formally categorized as </w:t>
+      </w:r>
+      <w:r>
+        <w:rPr>
+          <w:rFonts w:ascii="Times New Roman" w:cs="Times New Roman" w:eastAsia="Times New Roman" w:hAnsi="Times New Roman"/>
+          <w:b w:val="0"/>
+          <w:bCs w:val="0"/>
+          <w:i w:val="0"/>
+          <w:iCs w:val="0"/>
+          <w:u w:val="none"/>
+          <w:color w:val="000000"/>
+          <w:sz w:val="22"/>
+          <w:szCs w:val="22"/>
+        </w:rPr>
+        <w:t xml:space="preserve">P2</w:t>
+      </w:r>
+      <w:r>
+        <w:rPr>
+          <w:rFonts w:ascii="Times New Roman" w:cs="Times New Roman" w:eastAsia="Times New Roman" w:hAnsi="Times New Roman"/>
+          <w:b w:val="0"/>
+          <w:bCs w:val="0"/>
+          <w:i w:val="0"/>
+          <w:iCs w:val="0"/>
+          <w:u w:val="none"/>
+          <w:color w:val="000000"/>
+          <w:sz w:val="22"/>
+          <w:szCs w:val="22"/>
+        </w:rPr>
+        <w:t xml:space="preserve"> in the submitted SRS—specifically Redacted Closure Evidence Exports (</w:t>
+      </w:r>
+      <w:r>
+        <w:rPr>
+          <w:rFonts w:ascii="Times New Roman" w:cs="Times New Roman" w:eastAsia="Times New Roman" w:hAnsi="Times New Roman"/>
+          <w:b w:val="0"/>
+          <w:bCs w:val="0"/>
+          <w:i w:val="0"/>
+          <w:iCs w:val="0"/>
+          <w:u w:val="none"/>
+          <w:color w:val="000000"/>
+          <w:sz w:val="22"/>
+          <w:szCs w:val="22"/>
+        </w:rPr>
+        <w:t xml:space="preserve">FR-8.6</w:t>
+      </w:r>
+      <w:r>
+        <w:rPr>
+          <w:rFonts w:ascii="Times New Roman" w:cs="Times New Roman" w:eastAsia="Times New Roman" w:hAnsi="Times New Roman"/>
+          <w:b w:val="0"/>
+          <w:bCs w:val="0"/>
+          <w:i w:val="0"/>
+          <w:iCs w:val="0"/>
+          <w:u w:val="none"/>
+          <w:color w:val="000000"/>
+          <w:sz w:val="22"/>
+          <w:szCs w:val="22"/>
+        </w:rPr>
+        <w:t xml:space="preserve">), automated disaster recovery drills (</w:t>
+      </w:r>
+      <w:r>
+        <w:rPr>
+          <w:rFonts w:ascii="Times New Roman" w:cs="Times New Roman" w:eastAsia="Times New Roman" w:hAnsi="Times New Roman"/>
+          <w:b w:val="0"/>
+          <w:bCs w:val="0"/>
+          <w:i w:val="0"/>
+          <w:iCs w:val="0"/>
+          <w:u w:val="none"/>
+          <w:color w:val="000000"/>
+          <w:sz w:val="22"/>
+          <w:szCs w:val="22"/>
+        </w:rPr>
+        <w:t xml:space="preserve">FR-8.7</w:t>
+      </w:r>
+      <w:r>
+        <w:rPr>
+          <w:rFonts w:ascii="Times New Roman" w:cs="Times New Roman" w:eastAsia="Times New Roman" w:hAnsi="Times New Roman"/>
+          <w:b w:val="0"/>
+          <w:bCs w:val="0"/>
+          <w:i w:val="0"/>
+          <w:iCs w:val="0"/>
+          <w:u w:val="none"/>
+          <w:color w:val="000000"/>
+          <w:sz w:val="22"/>
+          <w:szCs w:val="22"/>
+        </w:rPr>
+        <w:t xml:space="preserve">), and advanced export tooling—are scheduled after the core </w:t>
+      </w:r>
+      <w:r>
+        <w:rPr>
+          <w:rFonts w:ascii="Times New Roman" w:cs="Times New Roman" w:eastAsia="Times New Roman" w:hAnsi="Times New Roman"/>
+          <w:b w:val="0"/>
+          <w:bCs w:val="0"/>
+          <w:i w:val="0"/>
+          <w:iCs w:val="0"/>
+          <w:u w:val="none"/>
+          <w:color w:val="000000"/>
+          <w:sz w:val="22"/>
+          <w:szCs w:val="22"/>
+        </w:rPr>
+        <w:t xml:space="preserve">P1</w:t>
+      </w:r>
+      <w:r>
+        <w:rPr>
+          <w:rFonts w:ascii="Times New Roman" w:cs="Times New Roman" w:eastAsia="Times New Roman" w:hAnsi="Times New Roman"/>
+          <w:b w:val="0"/>
+          <w:bCs w:val="0"/>
+          <w:i w:val="0"/>
+          <w:iCs w:val="0"/>
+          <w:u w:val="none"/>
+          <w:color w:val="000000"/>
+          <w:sz w:val="22"/>
+          <w:szCs w:val="22"/>
+        </w:rPr>
+        <w:t xml:space="preserve"> operational pipeline is verified through running tests.</w:t>
+      </w:r>
+    </w:p>
+    <w:p>
+      <w:pPr>
+        <w:spacing w:before="180" w:after="80" w:line="240" w:lineRule="auto"/>
+        <w:jc w:val="left"/>
+        <w:keepNext/>
+      </w:pPr>
+      <w:r>
+        <w:rPr>
+          <w:rFonts w:ascii="Times New Roman" w:cs="Times New Roman" w:eastAsia="Times New Roman" w:hAnsi="Times New Roman"/>
+          <w:b/>
+          <w:bCs/>
+          <w:i w:val="0"/>
+          <w:iCs w:val="0"/>
+          <w:u w:val="none"/>
+          <w:color w:val="000000"/>
+          <w:sz w:val="24"/>
+          <w:szCs w:val="24"/>
+        </w:rPr>
+        <w:t xml:space="preserve">6.3 Supervisor Governance on Scope Realignment</w:t>
+      </w:r>
+    </w:p>
+    <w:p>
+      <w:pPr>
+        <w:spacing w:before="60" w:after="80" w:line="240" w:lineRule="auto"/>
+        <w:jc w:val="left"/>
+      </w:pPr>
+      <w:r>
+        <w:rPr>
+          <w:rFonts w:ascii="Times New Roman" w:cs="Times New Roman" w:eastAsia="Times New Roman" w:hAnsi="Times New Roman"/>
+          <w:b w:val="0"/>
+          <w:bCs w:val="0"/>
+          <w:i w:val="0"/>
+          <w:iCs w:val="0"/>
+          <w:u w:val="none"/>
+          <w:color w:val="000000"/>
+          <w:sz w:val="22"/>
+          <w:szCs w:val="22"/>
+        </w:rPr>
+        <w:t xml:space="preserve">If empirical testing during early implementation reveals that advanced edge-case mechanisms—specifically:</w:t>
+      </w:r>
+    </w:p>
+    <w:p>
+      <w:pPr>
+        <w:spacing w:before="30" w:after="30" w:line="240" w:lineRule="auto"/>
+        <w:jc w:val="left"/>
+        <w:ind w:left="360"/>
+      </w:pPr>
+      <w:r>
+        <w:rPr>
+          <w:rFonts w:ascii="Times New Roman" w:cs="Times New Roman" w:eastAsia="Times New Roman" w:hAnsi="Times New Roman"/>
+          <w:b w:val="0"/>
+          <w:bCs w:val="0"/>
+          <w:i w:val="0"/>
+          <w:iCs w:val="0"/>
+          <w:u w:val="none"/>
+          <w:color w:val="000000"/>
+          <w:sz w:val="22"/>
+          <w:szCs w:val="22"/>
+        </w:rPr>
+        <w:t xml:space="preserve">1. Multi-recipient historical key re-wrapping upon defender offboarding (</w:t>
+      </w:r>
+      <w:r>
+        <w:rPr>
+          <w:rFonts w:ascii="Times New Roman" w:cs="Times New Roman" w:eastAsia="Times New Roman" w:hAnsi="Times New Roman"/>
+          <w:b w:val="0"/>
+          <w:bCs w:val="0"/>
+          <w:i w:val="0"/>
+          <w:iCs w:val="0"/>
+          <w:u w:val="none"/>
+          <w:color w:val="000000"/>
+          <w:sz w:val="22"/>
+          <w:szCs w:val="22"/>
+        </w:rPr>
+        <w:t xml:space="preserve">FR-3.8</w:t>
+      </w:r>
+      <w:r>
+        <w:rPr>
+          <w:rFonts w:ascii="Times New Roman" w:cs="Times New Roman" w:eastAsia="Times New Roman" w:hAnsi="Times New Roman"/>
+          <w:b w:val="0"/>
+          <w:bCs w:val="0"/>
+          <w:i w:val="0"/>
+          <w:iCs w:val="0"/>
+          <w:u w:val="none"/>
+          <w:color w:val="000000"/>
+          <w:sz w:val="22"/>
+          <w:szCs w:val="22"/>
+        </w:rPr>
+        <w:t xml:space="preserve">),</w:t>
+      </w:r>
+    </w:p>
+    <w:p>
+      <w:pPr>
+        <w:spacing w:before="30" w:after="30" w:line="240" w:lineRule="auto"/>
+        <w:jc w:val="left"/>
+        <w:ind w:left="360"/>
+      </w:pPr>
+      <w:r>
+        <w:rPr>
+          <w:rFonts w:ascii="Times New Roman" w:cs="Times New Roman" w:eastAsia="Times New Roman" w:hAnsi="Times New Roman"/>
+          <w:b w:val="0"/>
+          <w:bCs w:val="0"/>
+          <w:i w:val="0"/>
+          <w:iCs w:val="0"/>
+          <w:u w:val="none"/>
+          <w:color w:val="000000"/>
+          <w:sz w:val="22"/>
+          <w:szCs w:val="22"/>
+        </w:rPr>
+        <w:t xml:space="preserve">2. Offline Organization Master Recovery Key unlocking procedures (</w:t>
+      </w:r>
+      <w:r>
+        <w:rPr>
+          <w:rFonts w:ascii="Times New Roman" w:cs="Times New Roman" w:eastAsia="Times New Roman" w:hAnsi="Times New Roman"/>
+          <w:b w:val="0"/>
+          <w:bCs w:val="0"/>
+          <w:i w:val="0"/>
+          <w:iCs w:val="0"/>
+          <w:u w:val="none"/>
+          <w:color w:val="000000"/>
+          <w:sz w:val="22"/>
+          <w:szCs w:val="22"/>
+        </w:rPr>
+        <w:t xml:space="preserve">FR-1.2b</w:t>
+      </w:r>
+      <w:r>
+        <w:rPr>
+          <w:rFonts w:ascii="Times New Roman" w:cs="Times New Roman" w:eastAsia="Times New Roman" w:hAnsi="Times New Roman"/>
+          <w:b w:val="0"/>
+          <w:bCs w:val="0"/>
+          <w:i w:val="0"/>
+          <w:iCs w:val="0"/>
+          <w:u w:val="none"/>
+          <w:color w:val="000000"/>
+          <w:sz w:val="22"/>
+          <w:szCs w:val="22"/>
+        </w:rPr>
+        <w:t xml:space="preserve">), or</w:t>
+      </w:r>
+    </w:p>
+    <w:p>
+      <w:pPr>
+        <w:spacing w:before="30" w:after="30" w:line="240" w:lineRule="auto"/>
+        <w:jc w:val="left"/>
+        <w:ind w:left="360"/>
+      </w:pPr>
+      <w:r>
+        <w:rPr>
+          <w:rFonts w:ascii="Times New Roman" w:cs="Times New Roman" w:eastAsia="Times New Roman" w:hAnsi="Times New Roman"/>
+          <w:b w:val="0"/>
+          <w:bCs w:val="0"/>
+          <w:i w:val="0"/>
+          <w:iCs w:val="0"/>
+          <w:u w:val="none"/>
+          <w:color w:val="000000"/>
+          <w:sz w:val="22"/>
+          <w:szCs w:val="22"/>
+        </w:rPr>
+        <w:t xml:space="preserve">3. Dual concurrent audit ledger chains (</w:t>
+      </w:r>
+      <w:r>
+        <w:rPr>
+          <w:rFonts w:ascii="Times New Roman" w:cs="Times New Roman" w:eastAsia="Times New Roman" w:hAnsi="Times New Roman"/>
+          <w:b w:val="0"/>
+          <w:bCs w:val="0"/>
+          <w:i w:val="0"/>
+          <w:iCs w:val="0"/>
+          <w:u w:val="none"/>
+          <w:color w:val="000000"/>
+          <w:sz w:val="22"/>
+          <w:szCs w:val="22"/>
+        </w:rPr>
+        <w:t xml:space="preserve">tenant_row_hash</w:t>
+      </w:r>
+      <w:r>
+        <w:rPr>
+          <w:rFonts w:ascii="Times New Roman" w:cs="Times New Roman" w:eastAsia="Times New Roman" w:hAnsi="Times New Roman"/>
+          <w:b w:val="0"/>
+          <w:bCs w:val="0"/>
+          <w:i w:val="0"/>
+          <w:iCs w:val="0"/>
+          <w:u w:val="none"/>
+          <w:color w:val="000000"/>
+          <w:sz w:val="22"/>
+          <w:szCs w:val="22"/>
+        </w:rPr>
+        <w:t xml:space="preserve"> and </w:t>
+      </w:r>
+      <w:r>
+        <w:rPr>
+          <w:rFonts w:ascii="Times New Roman" w:cs="Times New Roman" w:eastAsia="Times New Roman" w:hAnsi="Times New Roman"/>
+          <w:b w:val="0"/>
+          <w:bCs w:val="0"/>
+          <w:i w:val="0"/>
+          <w:iCs w:val="0"/>
+          <w:u w:val="none"/>
+          <w:color w:val="000000"/>
+          <w:sz w:val="22"/>
+          <w:szCs w:val="22"/>
+        </w:rPr>
+        <w:t xml:space="preserve">report_chain_hash</w:t>
+      </w:r>
+      <w:r>
+        <w:rPr>
+          <w:rFonts w:ascii="Times New Roman" w:cs="Times New Roman" w:eastAsia="Times New Roman" w:hAnsi="Times New Roman"/>
+          <w:b w:val="0"/>
+          <w:bCs w:val="0"/>
+          <w:i w:val="0"/>
+          <w:iCs w:val="0"/>
+          <w:u w:val="none"/>
+          <w:color w:val="000000"/>
+          <w:sz w:val="22"/>
+          <w:szCs w:val="22"/>
+        </w:rPr>
+        <w:t xml:space="preserve">, </w:t>
+      </w:r>
+      <w:r>
+        <w:rPr>
+          <w:rFonts w:ascii="Times New Roman" w:cs="Times New Roman" w:eastAsia="Times New Roman" w:hAnsi="Times New Roman"/>
+          <w:b w:val="0"/>
+          <w:bCs w:val="0"/>
+          <w:i w:val="0"/>
+          <w:iCs w:val="0"/>
+          <w:u w:val="none"/>
+          <w:color w:val="000000"/>
+          <w:sz w:val="22"/>
+          <w:szCs w:val="22"/>
+        </w:rPr>
+        <w:t xml:space="preserve">FR-8.5</w:t>
+      </w:r>
+      <w:r>
+        <w:rPr>
+          <w:rFonts w:ascii="Times New Roman" w:cs="Times New Roman" w:eastAsia="Times New Roman" w:hAnsi="Times New Roman"/>
+          <w:b w:val="0"/>
+          <w:bCs w:val="0"/>
+          <w:i w:val="0"/>
+          <w:iCs w:val="0"/>
+          <w:u w:val="none"/>
+          <w:color w:val="000000"/>
+          <w:sz w:val="22"/>
+          <w:szCs w:val="22"/>
+        </w:rPr>
+        <w:t xml:space="preserve">)—</w:t>
+      </w:r>
+    </w:p>
+    <w:p>
+      <w:pPr>
+        <w:spacing w:before="60" w:after="80" w:line="240" w:lineRule="auto"/>
+        <w:jc w:val="left"/>
+      </w:pPr>
+      <w:r>
+        <w:rPr>
+          <w:rFonts w:ascii="Times New Roman" w:cs="Times New Roman" w:eastAsia="Times New Roman" w:hAnsi="Times New Roman"/>
+          <w:b w:val="0"/>
+          <w:bCs w:val="0"/>
+          <w:i w:val="0"/>
+          <w:iCs w:val="0"/>
+          <w:u w:val="none"/>
+          <w:color w:val="000000"/>
+          <w:sz w:val="22"/>
+          <w:szCs w:val="22"/>
+        </w:rPr>
+        <w:t xml:space="preserve">introduce disproportionate architectural complexity or stability risks within the academic semester timeframe, the student author will formally propose explicit scope deferrals directly to the FYP Academic Supervisor (Sir Umar Hayat).</w:t>
+      </w:r>
+    </w:p>
+    <w:p>
+      <w:pPr>
+        <w:spacing w:before="60" w:after="80" w:line="240" w:lineRule="auto"/>
+        <w:jc w:val="left"/>
+      </w:pPr>
+      <w:r>
+        <w:rPr>
+          <w:rFonts w:ascii="Times New Roman" w:cs="Times New Roman" w:eastAsia="Times New Roman" w:hAnsi="Times New Roman"/>
+          <w:b w:val="0"/>
+          <w:bCs w:val="0"/>
+          <w:i w:val="0"/>
+          <w:iCs w:val="0"/>
+          <w:u w:val="none"/>
+          <w:color w:val="000000"/>
+          <w:sz w:val="22"/>
+          <w:szCs w:val="22"/>
+        </w:rPr>
+        <w:t xml:space="preserve">Architectural specifications must not silently relabel or dilute submitted </w:t>
+      </w:r>
+      <w:r>
+        <w:rPr>
+          <w:rFonts w:ascii="Times New Roman" w:cs="Times New Roman" w:eastAsia="Times New Roman" w:hAnsi="Times New Roman"/>
+          <w:b w:val="0"/>
+          <w:bCs w:val="0"/>
+          <w:i w:val="0"/>
+          <w:iCs w:val="0"/>
+          <w:u w:val="none"/>
+          <w:color w:val="000000"/>
+          <w:sz w:val="22"/>
+          <w:szCs w:val="22"/>
+        </w:rPr>
+        <w:t xml:space="preserve">P1</w:t>
+      </w:r>
+      <w:r>
+        <w:rPr>
+          <w:rFonts w:ascii="Times New Roman" w:cs="Times New Roman" w:eastAsia="Times New Roman" w:hAnsi="Times New Roman"/>
+          <w:b w:val="0"/>
+          <w:bCs w:val="0"/>
+          <w:i w:val="0"/>
+          <w:iCs w:val="0"/>
+          <w:u w:val="none"/>
+          <w:color w:val="000000"/>
+          <w:sz w:val="22"/>
+          <w:szCs w:val="22"/>
+        </w:rPr>
+        <w:t xml:space="preserve"> requirements as optional without formal academic supervisor consultation and written endorsement.</w:t>
+      </w:r>
+    </w:p>
+    <w:p>
+      <w:pPr>
+        <w:pBdr>
+          <w:bottom w:val="single" w:sz="12" w:space="1" w:color="000000"/>
+        </w:pBdr>
+        <w:spacing w:before="120" w:after="120"/>
+      </w:pPr>
+    </w:p>
+    <w:p>
+      <w:pPr>
+        <w:spacing w:before="240" w:after="100" w:line="240" w:lineRule="auto"/>
+        <w:jc w:val="left"/>
+        <w:keepNext/>
+        <w:pBdr>
+          <w:bottom w:val="single" w:sz="6" w:space="4" w:color="000000"/>
+        </w:pBdr>
+      </w:pPr>
+      <w:r>
+        <w:rPr>
+          <w:rFonts w:ascii="Times New Roman" w:cs="Times New Roman" w:eastAsia="Times New Roman" w:hAnsi="Times New Roman"/>
+          <w:b/>
+          <w:bCs/>
+          <w:i w:val="0"/>
+          <w:iCs w:val="0"/>
+          <w:u w:val="none"/>
+          <w:color w:val="000000"/>
+          <w:sz w:val="28"/>
+          <w:szCs w:val="28"/>
+        </w:rPr>
+        <w:t xml:space="preserve">7. Bidirectional Architecture Traceability Matrix (RTM)</w:t>
       </w:r>
     </w:p>
     <w:p>
@@ -20611,7 +21980,7 @@
                 <w:sz w:val="20"/>
                 <w:szCs w:val="20"/>
               </w:rPr>
-              <w:t xml:space="preserve">Accepts valid metrics in any order; 100% mathematical parity across 45 FIRST.org test fixtures; calculation completes in &lt; 5 ms (</w:t>
+              <w:t xml:space="preserve">Accepts valid metrics in any order; computational parity across 45 FIRST.org test fixtures; calculation completes in &lt; 5 ms (</w:t>
             </w:r>
             <w:r>
               <w:rPr>
@@ -21507,6 +22876,76 @@
               </w:rPr>
               <w:t xml:space="preserve">FR-8.5</w:t>
             </w:r>
+            <w:r>
+              <w:rPr>
+                <w:rFonts w:ascii="Times New Roman" w:cs="Times New Roman" w:eastAsia="Times New Roman" w:hAnsi="Times New Roman"/>
+                <w:b w:val="0"/>
+                <w:bCs w:val="0"/>
+                <w:i w:val="0"/>
+                <w:iCs w:val="0"/>
+                <w:u w:val="none"/>
+                <w:color w:val="000000"/>
+                <w:sz w:val="20"/>
+                <w:szCs w:val="20"/>
+              </w:rPr>
+              <w:t xml:space="preserve">, </w:t>
+            </w:r>
+            <w:r>
+              <w:rPr>
+                <w:rFonts w:ascii="Times New Roman" w:cs="Times New Roman" w:eastAsia="Times New Roman" w:hAnsi="Times New Roman"/>
+                <w:b w:val="0"/>
+                <w:bCs w:val="0"/>
+                <w:i w:val="0"/>
+                <w:iCs w:val="0"/>
+                <w:u w:val="none"/>
+                <w:color w:val="000000"/>
+                <w:sz w:val="20"/>
+                <w:szCs w:val="20"/>
+              </w:rPr>
+              <w:t xml:space="preserve">FR-8.6</w:t>
+            </w:r>
+            <w:r>
+              <w:rPr>
+                <w:rFonts w:ascii="Times New Roman" w:cs="Times New Roman" w:eastAsia="Times New Roman" w:hAnsi="Times New Roman"/>
+                <w:b w:val="0"/>
+                <w:bCs w:val="0"/>
+                <w:i w:val="0"/>
+                <w:iCs w:val="0"/>
+                <w:u w:val="none"/>
+                <w:color w:val="000000"/>
+                <w:sz w:val="20"/>
+                <w:szCs w:val="20"/>
+              </w:rPr>
+              <w:t xml:space="preserve"> (</w:t>
+            </w:r>
+            <w:r>
+              <w:rPr>
+                <w:rFonts w:ascii="Times New Roman" w:cs="Times New Roman" w:eastAsia="Times New Roman" w:hAnsi="Times New Roman"/>
+                <w:b w:val="0"/>
+                <w:bCs w:val="0"/>
+                <w:i w:val="0"/>
+                <w:iCs w:val="0"/>
+                <w:u w:val="none"/>
+                <w:color w:val="000000"/>
+                <w:sz w:val="20"/>
+                <w:szCs w:val="20"/>
+              </w:rPr>
+              <w:t xml:space="preserve">P2</w:t>
+            </w:r>
+            <w:r>
+              <w:rPr>
+                <w:rFonts w:ascii="Times New Roman" w:cs="Times New Roman" w:eastAsia="Times New Roman" w:hAnsi="Times New Roman"/>
+                <w:b w:val="0"/>
+                <w:bCs w:val="0"/>
+                <w:i w:val="0"/>
+                <w:iCs w:val="0"/>
+                <w:u w:val="none"/>
+                <w:color w:val="000000"/>
+                <w:sz w:val="20"/>
+                <w:szCs w:val="20"/>
+              </w:rPr>
+              <w:t xml:space="preserve">)</w:t>
+            </w:r>
           </w:p>
         </w:tc>
         <w:tc>
@@ -21564,6 +23003,34 @@
                 <w:sz w:val="20"/>
                 <w:szCs w:val="20"/>
               </w:rPr>
+              <w:t xml:space="preserve">UC-06</w:t>
+            </w:r>
+            <w:r>
+              <w:rPr>
+                <w:rFonts w:ascii="Times New Roman" w:cs="Times New Roman" w:eastAsia="Times New Roman" w:hAnsi="Times New Roman"/>
+                <w:b w:val="0"/>
+                <w:bCs w:val="0"/>
+                <w:i w:val="0"/>
+                <w:iCs w:val="0"/>
+                <w:u w:val="none"/>
+                <w:color w:val="000000"/>
+                <w:sz w:val="20"/>
+                <w:szCs w:val="20"/>
+              </w:rPr>
+              <w:t xml:space="preserve">, </w:t>
+            </w:r>
+            <w:r>
+              <w:rPr>
+                <w:rFonts w:ascii="Times New Roman" w:cs="Times New Roman" w:eastAsia="Times New Roman" w:hAnsi="Times New Roman"/>
+                <w:b w:val="0"/>
+                <w:bCs w:val="0"/>
+                <w:i w:val="0"/>
+                <w:iCs w:val="0"/>
+                <w:u w:val="none"/>
+                <w:color w:val="000000"/>
+                <w:sz w:val="20"/>
+                <w:szCs w:val="20"/>
+              </w:rPr>
               <w:t xml:space="preserve">UC-07</w:t>
             </w:r>
           </w:p>
@@ -21595,7 +23062,35 @@
                 <w:sz w:val="20"/>
                 <w:szCs w:val="20"/>
               </w:rPr>
-              <w:t xml:space="preserve">15-state transition guard; append-only dual hash-chained audit logging (</w:t>
+              <w:t xml:space="preserve">15-state transition guard; controlled reopening (</w:t>
+            </w:r>
+            <w:r>
+              <w:rPr>
+                <w:rFonts w:ascii="Times New Roman" w:cs="Times New Roman" w:eastAsia="Times New Roman" w:hAnsi="Times New Roman"/>
+                <w:b w:val="0"/>
+                <w:bCs w:val="0"/>
+                <w:i w:val="0"/>
+                <w:iCs w:val="0"/>
+                <w:u w:val="none"/>
+                <w:color w:val="000000"/>
+                <w:sz w:val="20"/>
+                <w:szCs w:val="20"/>
+              </w:rPr>
+              <w:t xml:space="preserve">FR-7.7</w:t>
+            </w:r>
+            <w:r>
+              <w:rPr>
+                <w:rFonts w:ascii="Times New Roman" w:cs="Times New Roman" w:eastAsia="Times New Roman" w:hAnsi="Times New Roman"/>
+                <w:b w:val="0"/>
+                <w:bCs w:val="0"/>
+                <w:i w:val="0"/>
+                <w:iCs w:val="0"/>
+                <w:u w:val="none"/>
+                <w:color w:val="000000"/>
+                <w:sz w:val="20"/>
+                <w:szCs w:val="20"/>
+              </w:rPr>
+              <w:t xml:space="preserve">); append-only dual hash-chained audit logging (</w:t>
             </w:r>
             <w:r>
               <w:rPr>
@@ -21651,7 +23146,35 @@
                 <w:sz w:val="20"/>
                 <w:szCs w:val="20"/>
               </w:rPr>
-              <w:t xml:space="preserve">); hourly claim-lease R2 reclamation; signed closure export (P2 extension).</w:t>
+              <w:t xml:space="preserve">); hourly claim-lease R2 reclamation; signed closure export (</w:t>
+            </w:r>
+            <w:r>
+              <w:rPr>
+                <w:rFonts w:ascii="Times New Roman" w:cs="Times New Roman" w:eastAsia="Times New Roman" w:hAnsi="Times New Roman"/>
+                <w:b w:val="0"/>
+                <w:bCs w:val="0"/>
+                <w:i w:val="0"/>
+                <w:iCs w:val="0"/>
+                <w:u w:val="none"/>
+                <w:color w:val="000000"/>
+                <w:sz w:val="20"/>
+                <w:szCs w:val="20"/>
+              </w:rPr>
+              <w:t xml:space="preserve">FR-8.6</w:t>
+            </w:r>
+            <w:r>
+              <w:rPr>
+                <w:rFonts w:ascii="Times New Roman" w:cs="Times New Roman" w:eastAsia="Times New Roman" w:hAnsi="Times New Roman"/>
+                <w:b w:val="0"/>
+                <w:bCs w:val="0"/>
+                <w:i w:val="0"/>
+                <w:iCs w:val="0"/>
+                <w:u w:val="none"/>
+                <w:color w:val="000000"/>
+                <w:sz w:val="20"/>
+                <w:szCs w:val="20"/>
+              </w:rPr>
+              <w:t xml:space="preserve">, P2 extension).</w:t>
             </w:r>
           </w:p>
         </w:tc>
@@ -21686,7 +23209,7 @@
           <w:sz w:val="28"/>
           <w:szCs w:val="28"/>
         </w:rPr>
-        <w:t xml:space="preserve">7. Document Submission &amp; Milestone Sign-Off</w:t>
+        <w:t xml:space="preserve">8. Document Submission &amp; Milestone Sign-Off</w:t>
       </w:r>
     </w:p>
     <w:p>
@@ -21707,7 +23230,7 @@
           <w:sz w:val="24"/>
           <w:szCs w:val="24"/>
         </w:rPr>
-        <w:t xml:space="preserve">7.1 Single Student Author Endorsement</w:t>
+        <w:t xml:space="preserve">8.1 Single Student Author Endorsement</w:t>
       </w:r>
     </w:p>
     <w:p>
@@ -21741,7 +23264,7 @@
           <w:sz w:val="22"/>
           <w:szCs w:val="22"/>
         </w:rPr>
-        <w:t xml:space="preserve">High-Level Architecture &amp; Cloud Topology Specification (Revision 1.1)</w:t>
+        <w:t xml:space="preserve">High-Level Architecture &amp; Cloud Topology Specification (Revision 1.2)</w:t>
       </w:r>
       <w:r>
         <w:rPr>
@@ -21811,7 +23334,7 @@
           <w:sz w:val="22"/>
           <w:szCs w:val="22"/>
         </w:rPr>
-        <w:t xml:space="preserve">). All architectural patterns, trust boundaries, data flows, and infrastructure cost models have been rigorously formulated to satisfy the University Final Year Project syllabus and align completely with the approved IEEE 830 Software Requirements Specification (</w:t>
+        <w:t xml:space="preserve">). All architectural patterns, trust boundaries, data flows, and infrastructure cost models have been formulated to satisfy the University Final Year Project syllabus and align completely with the approved IEEE 830 Software Requirements Specification (</w:t>
       </w:r>
       <w:r>
         <w:rPr>
@@ -22148,7 +23671,7 @@
           <w:sz w:val="24"/>
           <w:szCs w:val="24"/>
         </w:rPr>
-        <w:t xml:space="preserve">7.2 Academic Supervisor Review &amp; Endorsement</w:t>
+        <w:t xml:space="preserve">8.2 Academic Supervisor Review &amp; Endorsement</w:t>
       </w:r>
     </w:p>
     <w:p>

</xml_diff>

<commit_message>
docs(arch): finalize Week 3 architecture with balanced DFDs, restored SRS performance targets, and honest budget estimates
</commit_message>
<xml_diff>
--- a/Resources/HIGH_LEVEL_ARCHITECTURE.docx
+++ b/Resources/HIGH_LEVEL_ARCHITECTURE.docx
@@ -299,7 +299,7 @@
                 <w:sz w:val="20"/>
                 <w:szCs w:val="20"/>
               </w:rPr>
-              <w:t xml:space="preserve">Revision 1.2 (Academic Milestone Baseline — Evaluator Aligned)</w:t>
+              <w:t xml:space="preserve">Revision 1.2 (Milestone Architecture Baseline — Work-in-Progress Review)</w:t>
             </w:r>
           </w:p>
         </w:tc>
@@ -1117,7 +1117,7 @@
                 <w:sz w:val="20"/>
                 <w:szCs w:val="20"/>
               </w:rPr>
-              <w:t xml:space="preserve">Google Drive Document Link</w:t>
+              <w:t xml:space="preserve">Requirements Baseline</w:t>
             </w:r>
           </w:p>
         </w:tc>
@@ -1148,7 +1148,35 @@
                 <w:sz w:val="20"/>
                 <w:szCs w:val="20"/>
               </w:rPr>
-              <w:t xml:space="preserve">View High-Level Architecture Specification (Google Drive)</w:t>
+              <w:t xml:space="preserve">Submitted IEEE 830 SRS (</w:t>
+            </w:r>
+            <w:r>
+              <w:rPr>
+                <w:rFonts w:ascii="Times New Roman" w:cs="Times New Roman" w:eastAsia="Times New Roman" w:hAnsi="Times New Roman"/>
+                <w:b w:val="0"/>
+                <w:bCs w:val="0"/>
+                <w:i w:val="0"/>
+                <w:iCs w:val="0"/>
+                <w:u w:val="none"/>
+                <w:color w:val="000000"/>
+                <w:sz w:val="20"/>
+                <w:szCs w:val="20"/>
+              </w:rPr>
+              <w:t xml:space="preserve">Revision 2.8</w:t>
+            </w:r>
+            <w:r>
+              <w:rPr>
+                <w:rFonts w:ascii="Times New Roman" w:cs="Times New Roman" w:eastAsia="Times New Roman" w:hAnsi="Times New Roman"/>
+                <w:b w:val="0"/>
+                <w:bCs w:val="0"/>
+                <w:i w:val="0"/>
+                <w:iCs w:val="0"/>
+                <w:u w:val="none"/>
+                <w:color w:val="000000"/>
+                <w:sz w:val="20"/>
+                <w:szCs w:val="20"/>
+              </w:rPr>
+              <w:t xml:space="preserve">, Pending Formal Supervisor Evaluation)</w:t>
             </w:r>
           </w:p>
         </w:tc>
@@ -1304,7 +1332,7 @@
                 <w:sz w:val="20"/>
                 <w:szCs w:val="20"/>
               </w:rPr>
-              <w:t xml:space="preserve">Cloud &amp; Repository Reference</w:t>
+              <w:t xml:space="preserve">Repository &amp; Cloud Reference</w:t>
             </w:r>
           </w:p>
         </w:tc>
@@ -1469,7 +1497,7 @@
                 <w:sz w:val="20"/>
                 <w:szCs w:val="20"/>
               </w:rPr>
-              <w:t xml:space="preserve">Complete IEEE 830 SRS (</w:t>
+              <w:t xml:space="preserve">Complete Submitted IEEE 830 SRS (</w:t>
             </w:r>
             <w:r>
               <w:rPr>
@@ -1707,7 +1735,7 @@
                 <w:sz w:val="20"/>
                 <w:szCs w:val="20"/>
               </w:rPr>
-              <w:t xml:space="preserve">3-Tier Zero-Plaintext Model, DFD Level 0 &amp; Level 1, Defensible System Boundaries, and Cloud Topology Justification</w:t>
+              <w:t xml:space="preserve">3-Tier Zero-Plaintext Model, Balanced DFD Level 0 &amp; Level 1, Defensible System Boundaries, and Cloud Topology Justification</w:t>
             </w:r>
           </w:p>
         </w:tc>
@@ -2289,7 +2317,7 @@
           <w:sz w:val="22"/>
           <w:szCs w:val="22"/>
         </w:rPr>
-        <w:t xml:space="preserve">: Tickets cannot be closed on informal declarations. Defenders must supply verifiable proof—either an authoritative GitHub commit SHA verified via the GitHub REST API v3 (</w:t>
+        <w:t xml:space="preserve">: Tickets cannot be closed on informal declarations. Defenders must supply verifiable proof—either an authoritative GitHub commit SHA checked for ancestry via the GitHub REST API v3 (</w:t>
       </w:r>
       <w:r>
         <w:rPr>
@@ -2359,7 +2387,7 @@
           <w:sz w:val="22"/>
           <w:szCs w:val="22"/>
         </w:rPr>
-        <w:t xml:space="preserve">tenant_row_hash</w:t>
+        <w:t xml:space="preserve">row_hash</w:t>
       </w:r>
       <w:r>
         <w:rPr>
@@ -2470,7 +2498,7 @@
           <w:sz w:val="22"/>
           <w:szCs w:val="22"/>
         </w:rPr>
-        <w:t xml:space="preserve">The high-level architecture is optimized against four primary non-functional engineering constraints:</w:t>
+        <w:t xml:space="preserve">The high-level architecture is designed against four primary non-functional engineering objectives:</w:t>
       </w:r>
     </w:p>
     <w:p>
@@ -2505,7 +2533,7 @@
           <w:sz w:val="22"/>
           <w:szCs w:val="22"/>
         </w:rPr>
-        <w:t xml:space="preserve">Confidentiality &amp; Minimal Trust (`NFR-04`, `NFR-05`)</w:t>
+        <w:t xml:space="preserve">Confidentiality &amp; Minimal Trust (`NFR-03`, `NFR-05`)</w:t>
       </w:r>
       <w:r>
         <w:rPr>
@@ -2694,7 +2722,7 @@
           <w:sz w:val="22"/>
           <w:szCs w:val="22"/>
         </w:rPr>
-        <w:t xml:space="preserve">tenant_row_hash</w:t>
+        <w:t xml:space="preserve">row_hash</w:t>
       </w:r>
       <w:r>
         <w:rPr>
@@ -2736,7 +2764,7 @@
           <w:sz w:val="22"/>
           <w:szCs w:val="22"/>
         </w:rPr>
-        <w:t xml:space="preserve">), enabling independent verification of tamper-evident event ordering.</w:t>
+        <w:t xml:space="preserve">), restricting application-level modification and supporting detection of changes to recorded history.</w:t>
       </w:r>
     </w:p>
     <w:p>
@@ -2771,21 +2799,49 @@
           <w:sz w:val="22"/>
           <w:szCs w:val="22"/>
         </w:rPr>
-        <w:t xml:space="preserve">Sub-Second Operational Latency (`NFR-01`, `NFR-02`)</w:t>
-      </w:r>
-      <w:r>
-        <w:rPr>
-          <w:rFonts w:ascii="Times New Roman" w:cs="Times New Roman" w:eastAsia="Times New Roman" w:hAnsi="Times New Roman"/>
-          <w:b w:val="0"/>
-          <w:bCs w:val="0"/>
-          <w:i w:val="0"/>
-          <w:iCs w:val="0"/>
-          <w:u w:val="none"/>
-          <w:color w:val="000000"/>
-          <w:sz w:val="22"/>
-          <w:szCs w:val="22"/>
-        </w:rPr>
-        <w:t xml:space="preserve">: API serverless routes achieve p95 latency &lt;= 400 ms on warm invocations and &lt;= 1,200 ms on cold starts; client-side OpenPGP v6 Curve25519 key generation executes in &lt; 50 ms; deterministic CVSS v3.1 scoring executes in &lt; 5 ms.</w:t>
+        <w:t xml:space="preserve">Operational Latency Targets (`NFR-01`, `FR-4`)</w:t>
+      </w:r>
+      <w:r>
+        <w:rPr>
+          <w:rFonts w:ascii="Times New Roman" w:cs="Times New Roman" w:eastAsia="Times New Roman" w:hAnsi="Times New Roman"/>
+          <w:b w:val="0"/>
+          <w:bCs w:val="0"/>
+          <w:i w:val="0"/>
+          <w:iCs w:val="0"/>
+          <w:u w:val="none"/>
+          <w:color w:val="000000"/>
+          <w:sz w:val="22"/>
+          <w:szCs w:val="22"/>
+        </w:rPr>
+        <w:t xml:space="preserve">: The system establishes engineering performance targets of p95 latency &lt;= 400 ms and p99 latency &lt;= 800 ms for core API operations under specified benchmark loads (</w:t>
+      </w:r>
+      <w:r>
+        <w:rPr>
+          <w:rFonts w:ascii="Times New Roman" w:cs="Times New Roman" w:eastAsia="Times New Roman" w:hAnsi="Times New Roman"/>
+          <w:b w:val="0"/>
+          <w:bCs w:val="0"/>
+          <w:i w:val="0"/>
+          <w:iCs w:val="0"/>
+          <w:u w:val="none"/>
+          <w:color w:val="000000"/>
+          <w:sz w:val="22"/>
+          <w:szCs w:val="22"/>
+        </w:rPr>
+        <w:t xml:space="preserve">NFR-01</w:t>
+      </w:r>
+      <w:r>
+        <w:rPr>
+          <w:rFonts w:ascii="Times New Roman" w:cs="Times New Roman" w:eastAsia="Times New Roman" w:hAnsi="Times New Roman"/>
+          <w:b w:val="0"/>
+          <w:bCs w:val="0"/>
+          <w:i w:val="0"/>
+          <w:iCs w:val="0"/>
+          <w:u w:val="none"/>
+          <w:color w:val="000000"/>
+          <w:sz w:val="22"/>
+          <w:szCs w:val="22"/>
+        </w:rPr>
+        <w:t xml:space="preserve">), with client-side OpenPGP v6 Curve25519 key generation targeted at &lt; 50 ms and deterministic CVSS v3.1 scoring targeted at &lt; 5 ms as proposed design goals.</w:t>
       </w:r>
     </w:p>
     <w:p>
@@ -2820,21 +2876,21 @@
           <w:sz w:val="22"/>
           <w:szCs w:val="22"/>
         </w:rPr>
-        <w:t xml:space="preserve">Zero-Dollar Academic Feasibility &amp; Linear Commercial Scaling</w:t>
-      </w:r>
-      <w:r>
-        <w:rPr>
-          <w:rFonts w:ascii="Times New Roman" w:cs="Times New Roman" w:eastAsia="Times New Roman" w:hAnsi="Times New Roman"/>
-          <w:b w:val="0"/>
-          <w:bCs w:val="0"/>
-          <w:i w:val="0"/>
-          <w:iCs w:val="0"/>
-          <w:u w:val="none"/>
-          <w:color w:val="000000"/>
-          <w:sz w:val="22"/>
-          <w:szCs w:val="22"/>
-        </w:rPr>
-        <w:t xml:space="preserve">: The entire production architecture operates at </w:t>
+        <w:t xml:space="preserve">Cloud Infrastructure Feasibility</w:t>
+      </w:r>
+      <w:r>
+        <w:rPr>
+          <w:rFonts w:ascii="Times New Roman" w:cs="Times New Roman" w:eastAsia="Times New Roman" w:hAnsi="Times New Roman"/>
+          <w:b w:val="0"/>
+          <w:bCs w:val="0"/>
+          <w:i w:val="0"/>
+          <w:iCs w:val="0"/>
+          <w:u w:val="none"/>
+          <w:color w:val="000000"/>
+          <w:sz w:val="22"/>
+          <w:szCs w:val="22"/>
+        </w:rPr>
+        <w:t xml:space="preserve">: The architecture establishes an engineering cost model estimated at </w:t>
       </w:r>
       <w:r>
         <w:rPr>
@@ -2862,7 +2918,7 @@
           <w:sz w:val="22"/>
           <w:szCs w:val="22"/>
         </w:rPr>
-        <w:t xml:space="preserve"> on verified permanent free tiers for university evaluation, while commercial scaling requires only </w:t>
+        <w:t xml:space="preserve"> during academic demonstration by operating within cloud provider free allowances, while commercial multi-tenant operation is projected at an estimated baseline of </w:t>
       </w:r>
       <w:r>
         <w:rPr>
@@ -2890,7 +2946,7 @@
           <w:sz w:val="22"/>
           <w:szCs w:val="22"/>
         </w:rPr>
-        <w:t xml:space="preserve"> for 10–25 organizations.</w:t>
+        <w:t xml:space="preserve"> for 10–25 small organizations, subject to actual platform workload and provider quota adjustments.</w:t>
       </w:r>
     </w:p>
     <w:p>
@@ -3531,7 +3587,7 @@
           <w:sz w:val="18"/>
           <w:szCs w:val="18"/>
         </w:rPr>
-        <w:t xml:space="preserve">|    * Dual Hash-Chained Audit Ledger (tenant_row_hash &amp; report_chain_hash)     |</w:t>
+        <w:t xml:space="preserve">|    * Dual Hash-Chained Audit Ledger (row_hash &amp; report_chain_hash)            |</w:t>
       </w:r>
     </w:p>
     <w:p>
@@ -3822,7 +3878,7 @@
           <w:sz w:val="22"/>
           <w:szCs w:val="22"/>
         </w:rPr>
-        <w:t xml:space="preserve"> WebCrypto API and WebAssembly for high-speed Curve25519 (</w:t>
+        <w:t xml:space="preserve"> WebCrypto API and WebAssembly for Curve25519 (</w:t>
       </w:r>
       <w:r>
         <w:rPr>
@@ -3899,7 +3955,7 @@
           <w:sz w:val="22"/>
           <w:szCs w:val="22"/>
         </w:rPr>
-        <w:t xml:space="preserve">◦  Account-less ephemeral key generation (&lt; 50 ms).</w:t>
+        <w:t xml:space="preserve">◦  Account-less ephemeral key generation (&lt; 50 ms target).</w:t>
       </w:r>
     </w:p>
     <w:p>
@@ -3948,7 +4004,35 @@
           <w:sz w:val="22"/>
           <w:szCs w:val="22"/>
         </w:rPr>
-        <w:t xml:space="preserve">) and organization recovery keys.</w:t>
+        <w:t xml:space="preserve">) and organization recovery keys (</w:t>
+      </w:r>
+      <w:r>
+        <w:rPr>
+          <w:rFonts w:ascii="Times New Roman" w:cs="Times New Roman" w:eastAsia="Times New Roman" w:hAnsi="Times New Roman"/>
+          <w:b w:val="0"/>
+          <w:bCs w:val="0"/>
+          <w:i w:val="0"/>
+          <w:iCs w:val="0"/>
+          <w:u w:val="none"/>
+          <w:color w:val="000000"/>
+          <w:sz w:val="22"/>
+          <w:szCs w:val="22"/>
+        </w:rPr>
+        <w:t xml:space="preserve">FR-3.6</w:t>
+      </w:r>
+      <w:r>
+        <w:rPr>
+          <w:rFonts w:ascii="Times New Roman" w:cs="Times New Roman" w:eastAsia="Times New Roman" w:hAnsi="Times New Roman"/>
+          <w:b w:val="0"/>
+          <w:bCs w:val="0"/>
+          <w:i w:val="0"/>
+          <w:iCs w:val="0"/>
+          <w:u w:val="none"/>
+          <w:color w:val="000000"/>
+          <w:sz w:val="22"/>
+          <w:szCs w:val="22"/>
+        </w:rPr>
+        <w:t xml:space="preserve">).</w:t>
       </w:r>
     </w:p>
     <w:p>
@@ -4081,7 +4165,7 @@
           <w:sz w:val="22"/>
           <w:szCs w:val="22"/>
         </w:rPr>
-        <w:t xml:space="preserve">).</w:t>
+        <w:t xml:space="preserve">). Guest passphrases are entered and processed strictly within browser memory and are never transmitted to application servers.</w:t>
       </w:r>
     </w:p>
     <w:p>
@@ -4360,7 +4444,7 @@
           <w:sz w:val="22"/>
           <w:szCs w:val="22"/>
         </w:rPr>
-        <w:t xml:space="preserve">). Serverless functions are stateless, achieving warm p95 response times &lt;= 400 ms and cold-start execution &lt;= 1,200 ms (</w:t>
+        <w:t xml:space="preserve">). Serverless functions are stateless, with an engineering design latency target of p95 &lt;= 400 ms and p99 &lt;= 800 ms under specified benchmark conditions (</w:t>
       </w:r>
       <w:r>
         <w:rPr>
@@ -4906,21 +4990,21 @@
           <w:sz w:val="22"/>
           <w:szCs w:val="22"/>
         </w:rPr>
-        <w:t xml:space="preserve"> ceiling function in &lt; 5 ms (</w:t>
-      </w:r>
-      <w:r>
-        <w:rPr>
-          <w:rFonts w:ascii="Times New Roman" w:cs="Times New Roman" w:eastAsia="Times New Roman" w:hAnsi="Times New Roman"/>
-          <w:b w:val="0"/>
-          <w:bCs w:val="0"/>
-          <w:i w:val="0"/>
-          <w:iCs w:val="0"/>
-          <w:u w:val="none"/>
-          <w:color w:val="000000"/>
-          <w:sz w:val="22"/>
-          <w:szCs w:val="22"/>
-        </w:rPr>
-        <w:t xml:space="preserve">NFR-02</w:t>
+        <w:t xml:space="preserve"> ceiling function with a proposed design target of &lt; 5 ms (</w:t>
+      </w:r>
+      <w:r>
+        <w:rPr>
+          <w:rFonts w:ascii="Times New Roman" w:cs="Times New Roman" w:eastAsia="Times New Roman" w:hAnsi="Times New Roman"/>
+          <w:b w:val="0"/>
+          <w:bCs w:val="0"/>
+          <w:i w:val="0"/>
+          <w:iCs w:val="0"/>
+          <w:u w:val="none"/>
+          <w:color w:val="000000"/>
+          <w:sz w:val="22"/>
+          <w:szCs w:val="22"/>
+        </w:rPr>
+        <w:t xml:space="preserve">FR-4</w:t>
       </w:r>
       <w:r>
         <w:rPr>
@@ -5011,7 +5095,7 @@
           <w:sz w:val="22"/>
           <w:szCs w:val="22"/>
         </w:rPr>
-        <w:t xml:space="preserve">: Integrates with the GitHub REST API v3 to verify commit existence and branch inclusion via </w:t>
+        <w:t xml:space="preserve">: Integrates with the GitHub REST API v3 to check commit existence and verify its ancestry relationship with the target branch via </w:t>
       </w:r>
       <w:r>
         <w:rPr>
@@ -5067,7 +5151,7 @@
           <w:sz w:val="22"/>
           <w:szCs w:val="22"/>
         </w:rPr>
-        <w:t xml:space="preserve">), dispatches metadata-only notification emails via Resend (</w:t>
+        <w:t xml:space="preserve">). A successful API response confirms repository ancestry; it does not establish production deployment or prove the fix works. Dispatches metadata-only notification emails via Resend (</w:t>
       </w:r>
       <w:r>
         <w:rPr>
@@ -5193,7 +5277,7 @@
           <w:sz w:val="22"/>
           <w:szCs w:val="22"/>
         </w:rPr>
-        <w:t xml:space="preserve">FR-8.4c</w:t>
+        <w:t xml:space="preserve">FR-5.4</w:t>
       </w:r>
       <w:r>
         <w:rPr>
@@ -5549,21 +5633,49 @@
           <w:sz w:val="22"/>
           <w:szCs w:val="22"/>
         </w:rPr>
-        <w:t xml:space="preserve">tenant_row_hash</w:t>
-      </w:r>
-      <w:r>
-        <w:rPr>
-          <w:rFonts w:ascii="Times New Roman" w:cs="Times New Roman" w:eastAsia="Times New Roman" w:hAnsi="Times New Roman"/>
-          <w:b w:val="0"/>
-          <w:bCs w:val="0"/>
-          <w:i w:val="0"/>
-          <w:iCs w:val="0"/>
-          <w:u w:val="none"/>
-          <w:color w:val="000000"/>
-          <w:sz w:val="22"/>
-          <w:szCs w:val="22"/>
-        </w:rPr>
-        <w:t xml:space="preserve">: A tenant-wide chronological hash chain linking all organization audit events.</w:t>
+        <w:t xml:space="preserve">row_hash</w:t>
+      </w:r>
+      <w:r>
+        <w:rPr>
+          <w:rFonts w:ascii="Times New Roman" w:cs="Times New Roman" w:eastAsia="Times New Roman" w:hAnsi="Times New Roman"/>
+          <w:b w:val="0"/>
+          <w:bCs w:val="0"/>
+          <w:i w:val="0"/>
+          <w:iCs w:val="0"/>
+          <w:u w:val="none"/>
+          <w:color w:val="000000"/>
+          <w:sz w:val="22"/>
+          <w:szCs w:val="22"/>
+        </w:rPr>
+        <w:t xml:space="preserve">: The canonical tenant-wide chronological hash chain linking all organization audit events (</w:t>
+      </w:r>
+      <w:r>
+        <w:rPr>
+          <w:rFonts w:ascii="Times New Roman" w:cs="Times New Roman" w:eastAsia="Times New Roman" w:hAnsi="Times New Roman"/>
+          <w:b w:val="0"/>
+          <w:bCs w:val="0"/>
+          <w:i w:val="0"/>
+          <w:iCs w:val="0"/>
+          <w:u w:val="none"/>
+          <w:color w:val="000000"/>
+          <w:sz w:val="22"/>
+          <w:szCs w:val="22"/>
+        </w:rPr>
+        <w:t xml:space="preserve">row_hash = SHA-256(prev_tenant_row_hash || "|" || event_digest)</w:t>
+      </w:r>
+      <w:r>
+        <w:rPr>
+          <w:rFonts w:ascii="Times New Roman" w:cs="Times New Roman" w:eastAsia="Times New Roman" w:hAnsi="Times New Roman"/>
+          <w:b w:val="0"/>
+          <w:bCs w:val="0"/>
+          <w:i w:val="0"/>
+          <w:iCs w:val="0"/>
+          <w:u w:val="none"/>
+          <w:color w:val="000000"/>
+          <w:sz w:val="22"/>
+          <w:szCs w:val="22"/>
+        </w:rPr>
+        <w:t xml:space="preserve">).</w:t>
       </w:r>
     </w:p>
     <w:p>
@@ -5612,7 +5724,35 @@
           <w:sz w:val="22"/>
           <w:szCs w:val="22"/>
         </w:rPr>
-        <w:t xml:space="preserve">: A report-scoped hash chain linking the lifecycle events of an individual report.</w:t>
+        <w:t xml:space="preserve">: The report-scoped hash chain linking the lifecycle events of an individual report (</w:t>
+      </w:r>
+      <w:r>
+        <w:rPr>
+          <w:rFonts w:ascii="Times New Roman" w:cs="Times New Roman" w:eastAsia="Times New Roman" w:hAnsi="Times New Roman"/>
+          <w:b w:val="0"/>
+          <w:bCs w:val="0"/>
+          <w:i w:val="0"/>
+          <w:iCs w:val="0"/>
+          <w:u w:val="none"/>
+          <w:color w:val="000000"/>
+          <w:sz w:val="22"/>
+          <w:szCs w:val="22"/>
+        </w:rPr>
+        <w:t xml:space="preserve">report_chain_hash = SHA-256(prev_report_chain_hash || "|" || event_digest)</w:t>
+      </w:r>
+      <w:r>
+        <w:rPr>
+          <w:rFonts w:ascii="Times New Roman" w:cs="Times New Roman" w:eastAsia="Times New Roman" w:hAnsi="Times New Roman"/>
+          <w:b w:val="0"/>
+          <w:bCs w:val="0"/>
+          <w:i w:val="0"/>
+          <w:iCs w:val="0"/>
+          <w:u w:val="none"/>
+          <w:color w:val="000000"/>
+          <w:sz w:val="22"/>
+          <w:szCs w:val="22"/>
+        </w:rPr>
+        <w:t xml:space="preserve">).</w:t>
       </w:r>
     </w:p>
     <w:p>
@@ -5632,35 +5772,7 @@
           <w:sz w:val="22"/>
           <w:szCs w:val="22"/>
         </w:rPr>
-        <w:t xml:space="preserve">Both chains compute SHA-256 digests over </w:t>
-      </w:r>
-      <w:r>
-        <w:rPr>
-          <w:rFonts w:ascii="Times New Roman" w:cs="Times New Roman" w:eastAsia="Times New Roman" w:hAnsi="Times New Roman"/>
-          <w:b w:val="0"/>
-          <w:bCs w:val="0"/>
-          <w:i w:val="0"/>
-          <w:iCs w:val="0"/>
-          <w:u w:val="none"/>
-          <w:color w:val="000000"/>
-          <w:sz w:val="22"/>
-          <w:szCs w:val="22"/>
-        </w:rPr>
-        <w:t xml:space="preserve">(prev_hash, sequence_no, event_type, actor_id, payload_digest, timestamp)</w:t>
-      </w:r>
-      <w:r>
-        <w:rPr>
-          <w:rFonts w:ascii="Times New Roman" w:cs="Times New Roman" w:eastAsia="Times New Roman" w:hAnsi="Times New Roman"/>
-          <w:b w:val="0"/>
-          <w:bCs w:val="0"/>
-          <w:i w:val="0"/>
-          <w:iCs w:val="0"/>
-          <w:u w:val="none"/>
-          <w:color w:val="000000"/>
-          <w:sz w:val="22"/>
-          <w:szCs w:val="22"/>
-        </w:rPr>
-        <w:t xml:space="preserve">.</w:t>
+        <w:t xml:space="preserve">This dual-chain structure restricts application-level modification and supports independent detection of changes to recorded history.</w:t>
       </w:r>
     </w:p>
     <w:p>
@@ -5695,6 +5807,55 @@
           <w:sz w:val="22"/>
           <w:szCs w:val="22"/>
         </w:rPr>
+        <w:t xml:space="preserve">Storage Quota Enforcement (`FR-8.4`)</w:t>
+      </w:r>
+      <w:r>
+        <w:rPr>
+          <w:rFonts w:ascii="Times New Roman" w:cs="Times New Roman" w:eastAsia="Times New Roman" w:hAnsi="Times New Roman"/>
+          <w:b w:val="0"/>
+          <w:bCs w:val="0"/>
+          <w:i w:val="0"/>
+          <w:iCs w:val="0"/>
+          <w:u w:val="none"/>
+          <w:color w:val="000000"/>
+          <w:sz w:val="22"/>
+          <w:szCs w:val="22"/>
+        </w:rPr>
+        <w:t xml:space="preserve">: The database layer enforces multi-tenant capacity boundaries: a 20 MiB intake pool for pending/unverified reports, a 6 MiB security and triage reserve, and a 300 KiB Priority-0 floor within that reserve strictly reserved for compact critical operations (such as researcher reply/retest attestations and status updates).</w:t>
+      </w:r>
+    </w:p>
+    <w:p>
+      <w:pPr>
+        <w:spacing w:before="30" w:after="30" w:line="240" w:lineRule="auto"/>
+        <w:jc w:val="left"/>
+        <w:ind w:left="360"/>
+      </w:pPr>
+      <w:r>
+        <w:rPr>
+          <w:rFonts w:ascii="Times New Roman" w:cs="Times New Roman" w:eastAsia="Times New Roman" w:hAnsi="Times New Roman"/>
+          <w:b w:val="0"/>
+          <w:bCs w:val="0"/>
+          <w:i w:val="0"/>
+          <w:iCs w:val="0"/>
+          <w:u w:val="none"/>
+          <w:color w:val="000000"/>
+          <w:sz w:val="22"/>
+          <w:szCs w:val="22"/>
+        </w:rPr>
+        <w:t xml:space="preserve">•  </w:t>
+      </w:r>
+      <w:r>
+        <w:rPr>
+          <w:rFonts w:ascii="Times New Roman" w:cs="Times New Roman" w:eastAsia="Times New Roman" w:hAnsi="Times New Roman"/>
+          <w:b/>
+          <w:bCs/>
+          <w:i w:val="0"/>
+          <w:iCs w:val="0"/>
+          <w:u w:val="none"/>
+          <w:color w:val="000000"/>
+          <w:sz w:val="22"/>
+          <w:szCs w:val="22"/>
+        </w:rPr>
         <w:t xml:space="preserve">Cloudflare R2 Object Storage</w:t>
       </w:r>
       <w:r>
@@ -5709,7 +5870,7 @@
           <w:sz w:val="22"/>
           <w:szCs w:val="22"/>
         </w:rPr>
-        <w:t xml:space="preserve">: S3-compatible, zero-egress-fee distributed object storage holding client-encrypted binary PoC attachments. Objects are addressed by immutable UUIDv4 keys and protected at rest by Cloudflare SSE-R2 AES-256 encryption.</w:t>
+        <w:t xml:space="preserve">: S3-compatible distributed object storage holding client-encrypted binary PoC attachments. Objects are addressed by immutable UUIDv4 keys and protected at rest by Cloudflare SSE-R2 AES-256 encryption.</w:t>
       </w:r>
     </w:p>
     <w:p>
@@ -5769,7 +5930,7 @@
       <w:r>
         <w:drawing>
           <wp:inline xmlns:wp="http://schemas.openxmlformats.org/drawingml/2006/wordprocessingDrawing" xmlns:a="http://schemas.openxmlformats.org/drawingml/2006/main" xmlns:pic="http://schemas.openxmlformats.org/drawingml/2006/picture" xmlns:r="http://schemas.openxmlformats.org/officeDocument/2006/relationships" distT="0" distB="0" distL="0" distR="0">
-            <wp:extent cx="5800000" cy="6461139"/>
+            <wp:extent cx="5800000" cy="6366691"/>
             <wp:effectExtent l="0" t="0" r="0" b="0"/>
             <wp:docPr id="201" name="Figure 3.1 3-Tier Zero-Plaintext Architecture Diagram" descr="Figure 3.1 3-Tier Zero-Plaintext Architecture Diagram"/>
             <wp:cNvGraphicFramePr>
@@ -5793,7 +5954,7 @@
                   <pic:spPr>
                     <a:xfrm>
                       <a:off x="0" y="0"/>
-                      <a:ext cx="5800000" cy="6461139"/>
+                      <a:ext cx="5800000" cy="6366691"/>
                     </a:xfrm>
                     <a:prstGeom prst="rect">
                       <a:avLst/>
@@ -7055,7 +7216,7 @@
                 <w:sz w:val="20"/>
                 <w:szCs w:val="20"/>
               </w:rPr>
-              <w:t xml:space="preserve"> and commit metadata.</w:t>
+              <w:t xml:space="preserve"> to confirm commit existence and branch ancestry.</w:t>
             </w:r>
           </w:p>
         </w:tc>
@@ -7473,7 +7634,7 @@
                 <w:sz w:val="20"/>
                 <w:szCs w:val="20"/>
               </w:rPr>
-              <w:t xml:space="preserve">FR-8.4c</w:t>
+              <w:t xml:space="preserve">FR-5.4</w:t>
             </w:r>
             <w:r>
               <w:rPr>
@@ -7602,7 +7763,7 @@
       <w:r>
         <w:drawing>
           <wp:inline xmlns:wp="http://schemas.openxmlformats.org/drawingml/2006/wordprocessingDrawing" xmlns:a="http://schemas.openxmlformats.org/drawingml/2006/main" xmlns:pic="http://schemas.openxmlformats.org/drawingml/2006/picture" xmlns:r="http://schemas.openxmlformats.org/officeDocument/2006/relationships" distT="0" distB="0" distL="0" distR="0">
-            <wp:extent cx="5800000" cy="4656781"/>
+            <wp:extent cx="5800000" cy="3989775"/>
             <wp:effectExtent l="0" t="0" r="0" b="0"/>
             <wp:docPr id="202" name="Figure 3.2 DFD Level 0 Context Diagram" descr="Figure 3.2 DFD Level 0 Context Diagram"/>
             <wp:cNvGraphicFramePr>
@@ -7626,7 +7787,7 @@
                   <pic:spPr>
                     <a:xfrm>
                       <a:off x="0" y="0"/>
-                      <a:ext cx="5800000" cy="4656781"/>
+                      <a:ext cx="5800000" cy="3989775"/>
                     </a:xfrm>
                     <a:prstGeom prst="rect">
                       <a:avLst/>
@@ -7769,7 +7930,21 @@
           <w:sz w:val="22"/>
           <w:szCs w:val="22"/>
         </w:rPr>
-        <w:t xml:space="preserve">), Turnstile verification tokens, encrypted vulnerability submission payloads (Class B ciphertext), guest recovery passphrases, encrypted triage responses, and attested retest verdicts.</w:t>
+        <w:t xml:space="preserve">), Turnstile verification tokens, encrypted vulnerability submission payloads (Class B ciphertext), encrypted triage responses, and attested retest verdicts. </w:t>
+      </w:r>
+      <w:r>
+        <w:rPr>
+          <w:rFonts w:ascii="Times New Roman" w:cs="Times New Roman" w:eastAsia="Times New Roman" w:hAnsi="Times New Roman"/>
+          <w:b w:val="0"/>
+          <w:bCs w:val="0"/>
+          <w:i/>
+          <w:iCs/>
+          <w:u w:val="none"/>
+          <w:color w:val="000000"/>
+          <w:sz w:val="22"/>
+          <w:szCs w:val="22"/>
+        </w:rPr>
+        <w:t xml:space="preserve">Note: Guest recovery passphrases are entered and processed strictly within browser memory and are never transmitted to the backend.</w:t>
       </w:r>
     </w:p>
     <w:p>
@@ -8175,7 +8350,7 @@
           <w:sz w:val="22"/>
           <w:szCs w:val="22"/>
         </w:rPr>
-        <w:t xml:space="preserve">, author, timestamp, parent tree), branch comparison inclusion flags (</w:t>
+        <w:t xml:space="preserve">, author, timestamp, parent tree), branch ancestry status (</w:t>
       </w:r>
       <w:r>
         <w:rPr>
@@ -8336,7 +8511,7 @@
           <w:sz w:val="22"/>
           <w:szCs w:val="22"/>
         </w:rPr>
-        <w:t xml:space="preserve">) and branch compare queries (</w:t>
+        <w:t xml:space="preserve">) and branch ancestry comparison queries (</w:t>
       </w:r>
       <w:r>
         <w:rPr>
@@ -8448,7 +8623,7 @@
           <w:sz w:val="22"/>
           <w:szCs w:val="22"/>
         </w:rPr>
-        <w:t xml:space="preserve">: Minimal Class A operational metadata notification payloads (organization name, report tracking ID, coarse status update, zero plaintext vulnerability descriptions).</w:t>
+        <w:t xml:space="preserve">: Minimal Class A operational metadata notification payloads (organization name, report tracking ID, coarse status update; strictly excluding confidential report content).</w:t>
       </w:r>
     </w:p>
     <w:p>
@@ -8791,7 +8966,7 @@
           <w:sz w:val="22"/>
           <w:szCs w:val="22"/>
         </w:rPr>
-        <w:t xml:space="preserve">FR-8.4c</w:t>
+        <w:t xml:space="preserve">FR-5.4</w:t>
       </w:r>
       <w:r>
         <w:rPr>
@@ -8959,7 +9134,12 @@
           <w:sz w:val="22"/>
           <w:szCs w:val="22"/>
         </w:rPr>
-        <w:t xml:space="preserve"> into seven discrete functional sub-processes interacting with seven persistent data stores:</w:t>
+        <w:t xml:space="preserve"> into seven discrete functional sub-processes interacting with seven persistent data stores and the six external boundary entities:</w:t>
+      </w:r>
+    </w:p>
+    <w:p>
+      <w:r>
+        <w:br w:type="page"/>
       </w:r>
     </w:p>
     <w:p>
@@ -8970,7 +9150,7 @@
       <w:r>
         <w:drawing>
           <wp:inline xmlns:wp="http://schemas.openxmlformats.org/drawingml/2006/wordprocessingDrawing" xmlns:a="http://schemas.openxmlformats.org/drawingml/2006/main" xmlns:pic="http://schemas.openxmlformats.org/drawingml/2006/picture" xmlns:r="http://schemas.openxmlformats.org/officeDocument/2006/relationships" distT="0" distB="0" distL="0" distR="0">
-            <wp:extent cx="5800000" cy="1708740"/>
+            <wp:extent cx="5800000" cy="6660469"/>
             <wp:effectExtent l="0" t="0" r="0" b="0"/>
             <wp:docPr id="203" name="Figure 3.3 DFD Level 1 Functional Decomposition Diagram" descr="Figure 3.3 DFD Level 1 Functional Decomposition Diagram"/>
             <wp:cNvGraphicFramePr>
@@ -8994,7 +9174,7 @@
                   <pic:spPr>
                     <a:xfrm>
                       <a:off x="0" y="0"/>
-                      <a:ext cx="5800000" cy="1708740"/>
+                      <a:ext cx="5800000" cy="6660469"/>
                     </a:xfrm>
                     <a:prstGeom prst="rect">
                       <a:avLst/>
@@ -9711,7 +9891,7 @@
           <w:sz w:val="22"/>
           <w:szCs w:val="22"/>
         </w:rPr>
-        <w:t xml:space="preserve">), checks storage quota boundaries (20 MiB intake pool, 6 MiB reserve floor, </w:t>
+        <w:t xml:space="preserve">), checks storage quota boundaries (20 MiB intake pool, 6 MiB security reserve with 300 KiB Priority-0 floor, </w:t>
       </w:r>
       <w:r>
         <w:rPr>
@@ -9739,21 +9919,49 @@
           <w:sz w:val="22"/>
           <w:szCs w:val="22"/>
         </w:rPr>
-        <w:t xml:space="preserve">), generates S3 presigned upload URLs, stores encrypted binary attachments in </w:t>
-      </w:r>
-      <w:r>
-        <w:rPr>
-          <w:rFonts w:ascii="Times New Roman" w:cs="Times New Roman" w:eastAsia="Times New Roman" w:hAnsi="Times New Roman"/>
-          <w:b w:val="0"/>
-          <w:bCs w:val="0"/>
-          <w:i w:val="0"/>
-          <w:iCs w:val="0"/>
-          <w:u w:val="none"/>
-          <w:color w:val="000000"/>
-          <w:sz w:val="22"/>
-          <w:szCs w:val="22"/>
-        </w:rPr>
-        <w:t xml:space="preserve">D5</w:t>
+        <w:t xml:space="preserve">), generates S3 presigned upload URLs referencing hosted service </w:t>
+      </w:r>
+      <w:r>
+        <w:rPr>
+          <w:rFonts w:ascii="Times New Roman" w:cs="Times New Roman" w:eastAsia="Times New Roman" w:hAnsi="Times New Roman"/>
+          <w:b w:val="0"/>
+          <w:bCs w:val="0"/>
+          <w:i w:val="0"/>
+          <w:iCs w:val="0"/>
+          <w:u w:val="none"/>
+          <w:color w:val="000000"/>
+          <w:sz w:val="22"/>
+          <w:szCs w:val="22"/>
+        </w:rPr>
+        <w:t xml:space="preserve">E5: Cloudflare R2</w:t>
+      </w:r>
+      <w:r>
+        <w:rPr>
+          <w:rFonts w:ascii="Times New Roman" w:cs="Times New Roman" w:eastAsia="Times New Roman" w:hAnsi="Times New Roman"/>
+          <w:b w:val="0"/>
+          <w:bCs w:val="0"/>
+          <w:i w:val="0"/>
+          <w:iCs w:val="0"/>
+          <w:u w:val="none"/>
+          <w:color w:val="000000"/>
+          <w:sz w:val="22"/>
+          <w:szCs w:val="22"/>
+        </w:rPr>
+        <w:t xml:space="preserve">, catalogs attachment metadata in </w:t>
+      </w:r>
+      <w:r>
+        <w:rPr>
+          <w:rFonts w:ascii="Times New Roman" w:cs="Times New Roman" w:eastAsia="Times New Roman" w:hAnsi="Times New Roman"/>
+          <w:b w:val="0"/>
+          <w:bCs w:val="0"/>
+          <w:i w:val="0"/>
+          <w:iCs w:val="0"/>
+          <w:u w:val="none"/>
+          <w:color w:val="000000"/>
+          <w:sz w:val="22"/>
+          <w:szCs w:val="22"/>
+        </w:rPr>
+        <w:t xml:space="preserve">D5: Encrypted Attachment Registry</w:t>
       </w:r>
       <w:r>
         <w:rPr>
@@ -9970,7 +10178,7 @@
           <w:sz w:val="22"/>
           <w:szCs w:val="22"/>
         </w:rPr>
-        <w:t xml:space="preserve">D5: Encrypted Attachment Store</w:t>
+        <w:t xml:space="preserve">D5: Encrypted Attachment Registry</w:t>
       </w:r>
       <w:r>
         <w:rPr>
@@ -10027,6 +10235,34 @@
           <w:szCs w:val="22"/>
         </w:rPr>
         <w:t xml:space="preserve">P4</w:t>
+      </w:r>
+      <w:r>
+        <w:rPr>
+          <w:rFonts w:ascii="Times New Roman" w:cs="Times New Roman" w:eastAsia="Times New Roman" w:hAnsi="Times New Roman"/>
+          <w:b w:val="0"/>
+          <w:bCs w:val="0"/>
+          <w:i w:val="0"/>
+          <w:iCs w:val="0"/>
+          <w:u w:val="none"/>
+          <w:color w:val="000000"/>
+          <w:sz w:val="22"/>
+          <w:szCs w:val="22"/>
+        </w:rPr>
+        <w:t xml:space="preserve">; Requests presigns from </w:t>
+      </w:r>
+      <w:r>
+        <w:rPr>
+          <w:rFonts w:ascii="Times New Roman" w:cs="Times New Roman" w:eastAsia="Times New Roman" w:hAnsi="Times New Roman"/>
+          <w:b w:val="0"/>
+          <w:bCs w:val="0"/>
+          <w:i w:val="0"/>
+          <w:iCs w:val="0"/>
+          <w:u w:val="none"/>
+          <w:color w:val="000000"/>
+          <w:sz w:val="22"/>
+          <w:szCs w:val="22"/>
+        </w:rPr>
+        <w:t xml:space="preserve">E5</w:t>
       </w:r>
       <w:r>
         <w:rPr>
@@ -10124,21 +10360,21 @@
           <w:sz w:val="22"/>
           <w:szCs w:val="22"/>
         </w:rPr>
-        <w:t xml:space="preserve"> coefficient in &lt; 5 ms (</w:t>
-      </w:r>
-      <w:r>
-        <w:rPr>
-          <w:rFonts w:ascii="Times New Roman" w:cs="Times New Roman" w:eastAsia="Times New Roman" w:hAnsi="Times New Roman"/>
-          <w:b w:val="0"/>
-          <w:bCs w:val="0"/>
-          <w:i w:val="0"/>
-          <w:iCs w:val="0"/>
-          <w:u w:val="none"/>
-          <w:color w:val="000000"/>
-          <w:sz w:val="22"/>
-          <w:szCs w:val="22"/>
-        </w:rPr>
-        <w:t xml:space="preserve">NFR-02</w:t>
+        <w:t xml:space="preserve"> coefficient with a design target of &lt; 5 ms (</w:t>
+      </w:r>
+      <w:r>
+        <w:rPr>
+          <w:rFonts w:ascii="Times New Roman" w:cs="Times New Roman" w:eastAsia="Times New Roman" w:hAnsi="Times New Roman"/>
+          <w:b w:val="0"/>
+          <w:bCs w:val="0"/>
+          <w:i w:val="0"/>
+          <w:iCs w:val="0"/>
+          <w:u w:val="none"/>
+          <w:color w:val="000000"/>
+          <w:sz w:val="22"/>
+          <w:szCs w:val="22"/>
+        </w:rPr>
+        <w:t xml:space="preserve">FR-4</w:t>
       </w:r>
       <w:r>
         <w:rPr>
@@ -10586,7 +10822,7 @@
           <w:sz w:val="22"/>
           <w:szCs w:val="22"/>
         </w:rPr>
-        <w:t xml:space="preserve">), executes live commit verification against the GitHub REST API v3 (</w:t>
+        <w:t xml:space="preserve">), executes commit existence and ancestry verification against the GitHub REST API v3 (</w:t>
       </w:r>
       <w:r>
         <w:rPr>
@@ -10873,7 +11109,7 @@
           <w:sz w:val="22"/>
           <w:szCs w:val="22"/>
         </w:rPr>
-        <w:t xml:space="preserve">tenant_row_hash</w:t>
+        <w:t xml:space="preserve">row_hash</w:t>
       </w:r>
       <w:r>
         <w:rPr>
@@ -10915,7 +11151,63 @@
           <w:sz w:val="22"/>
           <w:szCs w:val="22"/>
         </w:rPr>
-        <w:t xml:space="preserve">), coordinates hourly claim-lease R2 garbage collection, and exports verifiable closure evidence packets (P2 extension under </w:t>
+        <w:t xml:space="preserve">), coordinates hourly claim-lease cleanup by purging expired objects from </w:t>
+      </w:r>
+      <w:r>
+        <w:rPr>
+          <w:rFonts w:ascii="Times New Roman" w:cs="Times New Roman" w:eastAsia="Times New Roman" w:hAnsi="Times New Roman"/>
+          <w:b w:val="0"/>
+          <w:bCs w:val="0"/>
+          <w:i w:val="0"/>
+          <w:iCs w:val="0"/>
+          <w:u w:val="none"/>
+          <w:color w:val="000000"/>
+          <w:sz w:val="22"/>
+          <w:szCs w:val="22"/>
+        </w:rPr>
+        <w:t xml:space="preserve">E5: Cloudflare R2 Service</w:t>
+      </w:r>
+      <w:r>
+        <w:rPr>
+          <w:rFonts w:ascii="Times New Roman" w:cs="Times New Roman" w:eastAsia="Times New Roman" w:hAnsi="Times New Roman"/>
+          <w:b w:val="0"/>
+          <w:bCs w:val="0"/>
+          <w:i w:val="0"/>
+          <w:iCs w:val="0"/>
+          <w:u w:val="none"/>
+          <w:color w:val="000000"/>
+          <w:sz w:val="22"/>
+          <w:szCs w:val="22"/>
+        </w:rPr>
+        <w:t xml:space="preserve">, updating records in </w:t>
+      </w:r>
+      <w:r>
+        <w:rPr>
+          <w:rFonts w:ascii="Times New Roman" w:cs="Times New Roman" w:eastAsia="Times New Roman" w:hAnsi="Times New Roman"/>
+          <w:b w:val="0"/>
+          <w:bCs w:val="0"/>
+          <w:i w:val="0"/>
+          <w:iCs w:val="0"/>
+          <w:u w:val="none"/>
+          <w:color w:val="000000"/>
+          <w:sz w:val="22"/>
+          <w:szCs w:val="22"/>
+        </w:rPr>
+        <w:t xml:space="preserve">D5: Encrypted Attachment Registry</w:t>
+      </w:r>
+      <w:r>
+        <w:rPr>
+          <w:rFonts w:ascii="Times New Roman" w:cs="Times New Roman" w:eastAsia="Times New Roman" w:hAnsi="Times New Roman"/>
+          <w:b w:val="0"/>
+          <w:bCs w:val="0"/>
+          <w:i w:val="0"/>
+          <w:iCs w:val="0"/>
+          <w:u w:val="none"/>
+          <w:color w:val="000000"/>
+          <w:sz w:val="22"/>
+          <w:szCs w:val="22"/>
+        </w:rPr>
+        <w:t xml:space="preserve">, and exporting verifiable closure evidence packets (P2 extension under </w:t>
       </w:r>
       <w:r>
         <w:rPr>
@@ -11104,7 +11396,35 @@
           <w:sz w:val="22"/>
           <w:szCs w:val="22"/>
         </w:rPr>
-        <w:t xml:space="preserve">; Purges expired attachments from </w:t>
+        <w:t xml:space="preserve">; Purges expired attachments via </w:t>
+      </w:r>
+      <w:r>
+        <w:rPr>
+          <w:rFonts w:ascii="Times New Roman" w:cs="Times New Roman" w:eastAsia="Times New Roman" w:hAnsi="Times New Roman"/>
+          <w:b w:val="0"/>
+          <w:bCs w:val="0"/>
+          <w:i w:val="0"/>
+          <w:iCs w:val="0"/>
+          <w:u w:val="none"/>
+          <w:color w:val="000000"/>
+          <w:sz w:val="22"/>
+          <w:szCs w:val="22"/>
+        </w:rPr>
+        <w:t xml:space="preserve">E5</w:t>
+      </w:r>
+      <w:r>
+        <w:rPr>
+          <w:rFonts w:ascii="Times New Roman" w:cs="Times New Roman" w:eastAsia="Times New Roman" w:hAnsi="Times New Roman"/>
+          <w:b w:val="0"/>
+          <w:bCs w:val="0"/>
+          <w:i w:val="0"/>
+          <w:iCs w:val="0"/>
+          <w:u w:val="none"/>
+          <w:color w:val="000000"/>
+          <w:sz w:val="22"/>
+          <w:szCs w:val="22"/>
+        </w:rPr>
+        <w:t xml:space="preserve"> and updates </w:t>
       </w:r>
       <w:r>
         <w:rPr>
@@ -12085,7 +12405,7 @@
                 <w:sz w:val="20"/>
                 <w:szCs w:val="20"/>
               </w:rPr>
-              <w:t xml:space="preserve">Encrypted Attachment Store</w:t>
+              <w:t xml:space="preserve">Encrypted Attachment Registry</w:t>
             </w:r>
           </w:p>
         </w:tc>
@@ -12116,21 +12436,21 @@
                 <w:sz w:val="20"/>
                 <w:szCs w:val="20"/>
               </w:rPr>
-              <w:t xml:space="preserve">Cloudflare R2 (</w:t>
-            </w:r>
-            <w:r>
-              <w:rPr>
-                <w:rFonts w:ascii="Times New Roman" w:cs="Times New Roman" w:eastAsia="Times New Roman" w:hAnsi="Times New Roman"/>
-                <w:b w:val="0"/>
-                <w:bCs w:val="0"/>
-                <w:i w:val="0"/>
-                <w:iCs w:val="0"/>
-                <w:u w:val="none"/>
-                <w:color w:val="000000"/>
-                <w:sz w:val="20"/>
-                <w:szCs w:val="20"/>
-              </w:rPr>
-              <w:t xml:space="preserve">bbt-attachments-prod</w:t>
+              <w:t xml:space="preserve">Neon PostgreSQL (</w:t>
+            </w:r>
+            <w:r>
+              <w:rPr>
+                <w:rFonts w:ascii="Times New Roman" w:cs="Times New Roman" w:eastAsia="Times New Roman" w:hAnsi="Times New Roman"/>
+                <w:b w:val="0"/>
+                <w:bCs w:val="0"/>
+                <w:i w:val="0"/>
+                <w:iCs w:val="0"/>
+                <w:u w:val="none"/>
+                <w:color w:val="000000"/>
+                <w:sz w:val="20"/>
+                <w:szCs w:val="20"/>
+              </w:rPr>
+              <w:t xml:space="preserve">bbt_core.attachments</w:t>
             </w:r>
             <w:r>
               <w:rPr>
@@ -12175,7 +12495,35 @@
                 <w:sz w:val="20"/>
                 <w:szCs w:val="20"/>
               </w:rPr>
-              <w:t xml:space="preserve">Encrypted binary attachments (RFC 9580 SEIPDv2 packets), immutable UUID keys, zero plaintext.</w:t>
+              <w:t xml:space="preserve">Database catalog of encrypted attachment metadata, UUID keys, byte sizes, and digests, referencing objects hosted in Cloudflare R2 (</w:t>
+            </w:r>
+            <w:r>
+              <w:rPr>
+                <w:rFonts w:ascii="Times New Roman" w:cs="Times New Roman" w:eastAsia="Times New Roman" w:hAnsi="Times New Roman"/>
+                <w:b w:val="0"/>
+                <w:bCs w:val="0"/>
+                <w:i w:val="0"/>
+                <w:iCs w:val="0"/>
+                <w:u w:val="none"/>
+                <w:color w:val="000000"/>
+                <w:sz w:val="20"/>
+                <w:szCs w:val="20"/>
+              </w:rPr>
+              <w:t xml:space="preserve">E5</w:t>
+            </w:r>
+            <w:r>
+              <w:rPr>
+                <w:rFonts w:ascii="Times New Roman" w:cs="Times New Roman" w:eastAsia="Times New Roman" w:hAnsi="Times New Roman"/>
+                <w:b w:val="0"/>
+                <w:bCs w:val="0"/>
+                <w:i w:val="0"/>
+                <w:iCs w:val="0"/>
+                <w:u w:val="none"/>
+                <w:color w:val="000000"/>
+                <w:sz w:val="20"/>
+                <w:szCs w:val="20"/>
+              </w:rPr>
+              <w:t xml:space="preserve">).</w:t>
             </w:r>
           </w:p>
         </w:tc>
@@ -12346,7 +12694,7 @@
                 <w:sz w:val="20"/>
                 <w:szCs w:val="20"/>
               </w:rPr>
-              <w:t xml:space="preserve">tenant_row_hash</w:t>
+              <w:t xml:space="preserve">row_hash</w:t>
             </w:r>
             <w:r>
               <w:rPr>
@@ -12573,7 +12921,7 @@
                 <w:sz w:val="20"/>
                 <w:szCs w:val="20"/>
               </w:rPr>
-              <w:t xml:space="preserve">Multi-tenant quota accounting (20 MiB intake, 6 MiB reserve floor), and active claim-lease records (</w:t>
+              <w:t xml:space="preserve">Multi-tenant quota accounting (20 MiB intake, 6 MiB security reserve, 300 KiB Priority-0 floor), and active claim-lease records (</w:t>
             </w:r>
             <w:r>
               <w:rPr>
@@ -13125,7 +13473,7 @@
           <w:sz w:val="18"/>
           <w:szCs w:val="18"/>
         </w:rPr>
-        <w:t xml:space="preserve">:  * Dual hash-chained audit ledger prevents tampering or deletion.    :</w:t>
+        <w:t xml:space="preserve">:  * Restricts application modification &amp; detects history tampering.   :</w:t>
       </w:r>
     </w:p>
     <w:p>
@@ -13814,34 +14162,6 @@
               </w:rPr>
               <w:t xml:space="preserve">FR-5.4</w:t>
             </w:r>
-            <w:r>
-              <w:rPr>
-                <w:rFonts w:ascii="Times New Roman" w:cs="Times New Roman" w:eastAsia="Times New Roman" w:hAnsi="Times New Roman"/>
-                <w:b w:val="0"/>
-                <w:bCs w:val="0"/>
-                <w:i w:val="0"/>
-                <w:iCs w:val="0"/>
-                <w:u w:val="none"/>
-                <w:color w:val="000000"/>
-                <w:sz w:val="20"/>
-                <w:szCs w:val="20"/>
-              </w:rPr>
-              <w:t xml:space="preserve">, </w:t>
-            </w:r>
-            <w:r>
-              <w:rPr>
-                <w:rFonts w:ascii="Times New Roman" w:cs="Times New Roman" w:eastAsia="Times New Roman" w:hAnsi="Times New Roman"/>
-                <w:b w:val="0"/>
-                <w:bCs w:val="0"/>
-                <w:i w:val="0"/>
-                <w:iCs w:val="0"/>
-                <w:u w:val="none"/>
-                <w:color w:val="000000"/>
-                <w:sz w:val="20"/>
-                <w:szCs w:val="20"/>
-              </w:rPr>
-              <w:t xml:space="preserve">FR-8.4c</w:t>
-            </w:r>
           </w:p>
         </w:tc>
       </w:tr>
@@ -13938,21 +14258,21 @@
                 <w:sz w:val="20"/>
                 <w:szCs w:val="20"/>
               </w:rPr>
-              <w:t xml:space="preserve">1. Client payloads use OpenPGP SEIPDv2 with AEAD integrity verification.&lt;br/&gt;2. Audit ledger enforces append-only semantics via PostgreSQL triggers and SHA-256 dual hash chaining (</w:t>
-            </w:r>
-            <w:r>
-              <w:rPr>
-                <w:rFonts w:ascii="Times New Roman" w:cs="Times New Roman" w:eastAsia="Times New Roman" w:hAnsi="Times New Roman"/>
-                <w:b w:val="0"/>
-                <w:bCs w:val="0"/>
-                <w:i w:val="0"/>
-                <w:iCs w:val="0"/>
-                <w:u w:val="none"/>
-                <w:color w:val="000000"/>
-                <w:sz w:val="20"/>
-                <w:szCs w:val="20"/>
-              </w:rPr>
-              <w:t xml:space="preserve">tenant_row_hash</w:t>
+              <w:t xml:space="preserve">1. Client payloads use OpenPGP SEIPDv2 with AEAD integrity verification.&lt;br/&gt;2. Audit ledger restricts application-level modification via database permissions and supports tamper detection via SHA-256 dual hash chaining (</w:t>
+            </w:r>
+            <w:r>
+              <w:rPr>
+                <w:rFonts w:ascii="Times New Roman" w:cs="Times New Roman" w:eastAsia="Times New Roman" w:hAnsi="Times New Roman"/>
+                <w:b w:val="0"/>
+                <w:bCs w:val="0"/>
+                <w:i w:val="0"/>
+                <w:iCs w:val="0"/>
+                <w:u w:val="none"/>
+                <w:color w:val="000000"/>
+                <w:sz w:val="20"/>
+                <w:szCs w:val="20"/>
+              </w:rPr>
+              <w:t xml:space="preserve">row_hash</w:t>
             </w:r>
             <w:r>
               <w:rPr>
@@ -14207,7 +14527,7 @@
                 <w:sz w:val="20"/>
                 <w:szCs w:val="20"/>
               </w:rPr>
-              <w:t xml:space="preserve">1. Fixing requires automated verification of a real GitHub commit SHA via the GitHub REST API v3 (</w:t>
+              <w:t xml:space="preserve">1. Fixing requires automated check of commit existence and branch ancestry via the GitHub REST API v3 (</w:t>
             </w:r>
             <w:r>
               <w:rPr>
@@ -14448,7 +14768,7 @@
                 <w:sz w:val="20"/>
                 <w:szCs w:val="20"/>
               </w:rPr>
-              <w:t xml:space="preserve">1. Client-Side OpenPGP v6 Curve25519 encryption: server and database store strictly ciphertext (</w:t>
+              <w:t xml:space="preserve">1. Client-Side OpenPGP v6 Curve25519 encryption: server and database store strictly ciphertext envelopes (</w:t>
             </w:r>
             <w:r>
               <w:rPr>
@@ -14773,7 +15093,7 @@
                 <w:sz w:val="20"/>
                 <w:szCs w:val="20"/>
               </w:rPr>
-              <w:t xml:space="preserve">).&lt;br/&gt;3. Strict multi-tenant storage quotas: separate 20 MiB intake pool and 6 MiB Priority-0 reserve floor (</w:t>
+              <w:t xml:space="preserve">).&lt;br/&gt;3. Strict multi-tenant storage quotas: separate 20 MiB intake pool, 6 MiB security reserve, and 300 KiB Priority-0 reserve floor (</w:t>
             </w:r>
             <w:r>
               <w:rPr>
@@ -16055,7 +16375,7 @@
                 <w:sz w:val="20"/>
                 <w:szCs w:val="20"/>
               </w:rPr>
-              <w:t xml:space="preserve">Zero-plaintext Class A operational metadata payloads dispatched to the notification provider; redaction of vulnerability descriptions from alert emails.</w:t>
+              <w:t xml:space="preserve">Notifications contain only approved Class A metadata and exclude confidential report content; redaction of vulnerability descriptions from alert emails.</w:t>
             </w:r>
           </w:p>
         </w:tc>
@@ -16239,666 +16559,1275 @@
         <w:t xml:space="preserve">5.2 Component-by-Component Technology Stack Justification</w:t>
       </w:r>
     </w:p>
-    <w:p>
-      <w:pPr>
-        <w:spacing w:before="0" w:after="0" w:line="200" w:lineRule="auto"/>
-        <w:ind w:left="360"/>
-      </w:pPr>
-      <w:r>
-        <w:rPr>
-          <w:rFonts w:ascii="Times New Roman" w:cs="Times New Roman" w:eastAsia="Times New Roman" w:hAnsi="Times New Roman"/>
-          <w:b w:val="0"/>
-          <w:bCs w:val="0"/>
-          <w:i w:val="0"/>
-          <w:iCs w:val="0"/>
-          <w:u w:val="none"/>
-          <w:color w:val="000000"/>
-          <w:sz w:val="18"/>
-          <w:szCs w:val="18"/>
-        </w:rPr>
-        <w:t xml:space="preserve">+-------------------------------------------------------------------------------------------------------------------------+</w:t>
-      </w:r>
-    </w:p>
-    <w:p>
-      <w:pPr>
-        <w:spacing w:before="0" w:after="0" w:line="200" w:lineRule="auto"/>
-        <w:ind w:left="360"/>
-      </w:pPr>
-      <w:r>
-        <w:rPr>
-          <w:rFonts w:ascii="Times New Roman" w:cs="Times New Roman" w:eastAsia="Times New Roman" w:hAnsi="Times New Roman"/>
-          <w:b w:val="0"/>
-          <w:bCs w:val="0"/>
-          <w:i w:val="0"/>
-          <w:iCs w:val="0"/>
-          <w:u w:val="none"/>
-          <w:color w:val="000000"/>
-          <w:sz w:val="18"/>
-          <w:szCs w:val="18"/>
-        </w:rPr>
-        <w:t xml:space="preserve">|                                    TECHNOLOGY STACK EVALUATION &amp; JUSTIFICATION MATRIX                                   |</w:t>
-      </w:r>
-    </w:p>
-    <w:p>
-      <w:pPr>
-        <w:spacing w:before="0" w:after="0" w:line="200" w:lineRule="auto"/>
-        <w:ind w:left="360"/>
-      </w:pPr>
-      <w:r>
-        <w:rPr>
-          <w:rFonts w:ascii="Times New Roman" w:cs="Times New Roman" w:eastAsia="Times New Roman" w:hAnsi="Times New Roman"/>
-          <w:b w:val="0"/>
-          <w:bCs w:val="0"/>
-          <w:i w:val="0"/>
-          <w:iCs w:val="0"/>
-          <w:u w:val="none"/>
-          <w:color w:val="000000"/>
-          <w:sz w:val="18"/>
-          <w:szCs w:val="18"/>
-        </w:rPr>
-        <w:t xml:space="preserve">+-------------------+------------------------------+-------------------------------+--------------------------------------+</w:t>
-      </w:r>
-    </w:p>
-    <w:p>
-      <w:pPr>
-        <w:spacing w:before="0" w:after="0" w:line="200" w:lineRule="auto"/>
-        <w:ind w:left="360"/>
-      </w:pPr>
-      <w:r>
-        <w:rPr>
-          <w:rFonts w:ascii="Times New Roman" w:cs="Times New Roman" w:eastAsia="Times New Roman" w:hAnsi="Times New Roman"/>
-          <w:b w:val="0"/>
-          <w:bCs w:val="0"/>
-          <w:i w:val="0"/>
-          <w:iCs w:val="0"/>
-          <w:u w:val="none"/>
-          <w:color w:val="000000"/>
-          <w:sz w:val="18"/>
-          <w:szCs w:val="18"/>
-        </w:rPr>
-        <w:t xml:space="preserve">| Subsystem Layer   | Chosen Technology            | Primary Alternatives Evaluated| Architectural Rationale &amp; Trade-Off |</w:t>
-      </w:r>
-    </w:p>
-    <w:p>
-      <w:pPr>
-        <w:spacing w:before="0" w:after="0" w:line="200" w:lineRule="auto"/>
-        <w:ind w:left="360"/>
-      </w:pPr>
-      <w:r>
-        <w:rPr>
-          <w:rFonts w:ascii="Times New Roman" w:cs="Times New Roman" w:eastAsia="Times New Roman" w:hAnsi="Times New Roman"/>
-          <w:b w:val="0"/>
-          <w:bCs w:val="0"/>
-          <w:i w:val="0"/>
-          <w:iCs w:val="0"/>
-          <w:u w:val="none"/>
-          <w:color w:val="000000"/>
-          <w:sz w:val="18"/>
-          <w:szCs w:val="18"/>
-        </w:rPr>
-        <w:t xml:space="preserve">+-------------------+------------------------------+-------------------------------+--------------------------------------+</w:t>
-      </w:r>
-    </w:p>
-    <w:p>
-      <w:pPr>
-        <w:spacing w:before="0" w:after="0" w:line="200" w:lineRule="auto"/>
-        <w:ind w:left="360"/>
-      </w:pPr>
-      <w:r>
-        <w:rPr>
-          <w:rFonts w:ascii="Times New Roman" w:cs="Times New Roman" w:eastAsia="Times New Roman" w:hAnsi="Times New Roman"/>
-          <w:b w:val="0"/>
-          <w:bCs w:val="0"/>
-          <w:i w:val="0"/>
-          <w:iCs w:val="0"/>
-          <w:u w:val="none"/>
-          <w:color w:val="000000"/>
-          <w:sz w:val="18"/>
-          <w:szCs w:val="18"/>
-        </w:rPr>
-        <w:t xml:space="preserve">| Frontend &amp; API    | Next.js 14+ App Router       | React SPA + Express.js API;    | Unified TypeScript codebase eliminates API contract  |</w:t>
-      </w:r>
-    </w:p>
-    <w:p>
-      <w:pPr>
-        <w:spacing w:before="0" w:after="0" w:line="200" w:lineRule="auto"/>
-        <w:ind w:left="360"/>
-      </w:pPr>
-      <w:r>
-        <w:rPr>
-          <w:rFonts w:ascii="Times New Roman" w:cs="Times New Roman" w:eastAsia="Times New Roman" w:hAnsi="Times New Roman"/>
-          <w:b w:val="0"/>
-          <w:bCs w:val="0"/>
-          <w:i w:val="0"/>
-          <w:iCs w:val="0"/>
-          <w:u w:val="none"/>
-          <w:color w:val="000000"/>
-          <w:sz w:val="18"/>
-          <w:szCs w:val="18"/>
-        </w:rPr>
-        <w:t xml:space="preserve">| Fullstack Engine  | (Node.js 22 LTS on Vercel)   | Go / Gin Microservices        | drift; React Server Components provide zero-bundle   |</w:t>
-      </w:r>
-    </w:p>
-    <w:p>
-      <w:pPr>
-        <w:spacing w:before="0" w:after="0" w:line="200" w:lineRule="auto"/>
-        <w:ind w:left="360"/>
-      </w:pPr>
-      <w:r>
-        <w:rPr>
-          <w:rFonts w:ascii="Times New Roman" w:cs="Times New Roman" w:eastAsia="Times New Roman" w:hAnsi="Times New Roman"/>
-          <w:b w:val="0"/>
-          <w:bCs w:val="0"/>
-          <w:i w:val="0"/>
-          <w:iCs w:val="0"/>
-          <w:u w:val="none"/>
-          <w:color w:val="000000"/>
-          <w:sz w:val="18"/>
-          <w:szCs w:val="18"/>
-        </w:rPr>
-        <w:t xml:space="preserve">|                   |                              |                               | rendering; Serverless scales to zero with no idle fee|</w:t>
-      </w:r>
-    </w:p>
-    <w:p>
-      <w:pPr>
-        <w:spacing w:before="0" w:after="0" w:line="200" w:lineRule="auto"/>
-        <w:ind w:left="360"/>
-      </w:pPr>
-      <w:r>
-        <w:rPr>
-          <w:rFonts w:ascii="Times New Roman" w:cs="Times New Roman" w:eastAsia="Times New Roman" w:hAnsi="Times New Roman"/>
-          <w:b w:val="0"/>
-          <w:bCs w:val="0"/>
-          <w:i w:val="0"/>
-          <w:iCs w:val="0"/>
-          <w:u w:val="none"/>
-          <w:color w:val="000000"/>
-          <w:sz w:val="18"/>
-          <w:szCs w:val="18"/>
-        </w:rPr>
-        <w:t xml:space="preserve">+-------------------+------------------------------+-------------------------------+--------------------------------------+</w:t>
-      </w:r>
-    </w:p>
-    <w:p>
-      <w:pPr>
-        <w:spacing w:before="0" w:after="0" w:line="200" w:lineRule="auto"/>
-        <w:ind w:left="360"/>
-      </w:pPr>
-      <w:r>
-        <w:rPr>
-          <w:rFonts w:ascii="Times New Roman" w:cs="Times New Roman" w:eastAsia="Times New Roman" w:hAnsi="Times New Roman"/>
-          <w:b w:val="0"/>
-          <w:bCs w:val="0"/>
-          <w:i w:val="0"/>
-          <w:iCs w:val="0"/>
-          <w:u w:val="none"/>
-          <w:color w:val="000000"/>
-          <w:sz w:val="18"/>
-          <w:szCs w:val="18"/>
-        </w:rPr>
-        <w:t xml:space="preserve">| Application       | Vercel Serverless Compute    | AWS ECS / Fargate (Docker);   | Eliminates container orchestration toil, OS patching,|</w:t>
-      </w:r>
-    </w:p>
-    <w:p>
-      <w:pPr>
-        <w:spacing w:before="0" w:after="0" w:line="200" w:lineRule="auto"/>
-        <w:ind w:left="360"/>
-      </w:pPr>
-      <w:r>
-        <w:rPr>
-          <w:rFonts w:ascii="Times New Roman" w:cs="Times New Roman" w:eastAsia="Times New Roman" w:hAnsi="Times New Roman"/>
-          <w:b w:val="0"/>
-          <w:bCs w:val="0"/>
-          <w:i w:val="0"/>
-          <w:iCs w:val="0"/>
-          <w:u w:val="none"/>
-          <w:color w:val="000000"/>
-          <w:sz w:val="18"/>
-          <w:szCs w:val="18"/>
-        </w:rPr>
-        <w:t xml:space="preserve">| Runtime Fleet     | (Global Edge + Lambda Core)  | Kubernetes (EKS / GKE); VPS   | and VPC maintenance for a solo student engineer;     |</w:t>
-      </w:r>
-    </w:p>
-    <w:p>
-      <w:pPr>
-        <w:spacing w:before="0" w:after="0" w:line="200" w:lineRule="auto"/>
-        <w:ind w:left="360"/>
-      </w:pPr>
-      <w:r>
-        <w:rPr>
-          <w:rFonts w:ascii="Times New Roman" w:cs="Times New Roman" w:eastAsia="Times New Roman" w:hAnsi="Times New Roman"/>
-          <w:b w:val="0"/>
-          <w:bCs w:val="0"/>
-          <w:i w:val="0"/>
-          <w:iCs w:val="0"/>
-          <w:u w:val="none"/>
-          <w:color w:val="000000"/>
-          <w:sz w:val="18"/>
-          <w:szCs w:val="18"/>
-        </w:rPr>
-        <w:t xml:space="preserve">|                   |                              |                               | warm p95 &lt;= 400 ms, cold start &lt;= 1,200 ms (NFR-01). |</w:t>
-      </w:r>
-    </w:p>
-    <w:p>
-      <w:pPr>
-        <w:spacing w:before="0" w:after="0" w:line="200" w:lineRule="auto"/>
-        <w:ind w:left="360"/>
-      </w:pPr>
-      <w:r>
-        <w:rPr>
-          <w:rFonts w:ascii="Times New Roman" w:cs="Times New Roman" w:eastAsia="Times New Roman" w:hAnsi="Times New Roman"/>
-          <w:b w:val="0"/>
-          <w:bCs w:val="0"/>
-          <w:i w:val="0"/>
-          <w:iCs w:val="0"/>
-          <w:u w:val="none"/>
-          <w:color w:val="000000"/>
-          <w:sz w:val="18"/>
-          <w:szCs w:val="18"/>
-        </w:rPr>
-        <w:t xml:space="preserve">+-------------------+------------------------------+-------------------------------+--------------------------------------+</w:t>
-      </w:r>
-    </w:p>
-    <w:p>
-      <w:pPr>
-        <w:spacing w:before="0" w:after="0" w:line="200" w:lineRule="auto"/>
-        <w:ind w:left="360"/>
-      </w:pPr>
-      <w:r>
-        <w:rPr>
-          <w:rFonts w:ascii="Times New Roman" w:cs="Times New Roman" w:eastAsia="Times New Roman" w:hAnsi="Times New Roman"/>
-          <w:b w:val="0"/>
-          <w:bCs w:val="0"/>
-          <w:i w:val="0"/>
-          <w:iCs w:val="0"/>
-          <w:u w:val="none"/>
-          <w:color w:val="000000"/>
-          <w:sz w:val="18"/>
-          <w:szCs w:val="18"/>
-        </w:rPr>
-        <w:t xml:space="preserve">| Relational        | Neon Serverless PostgreSQL 16| Supabase; AWS Aurora;         | True serverless compute autoscaling (0.25 to 2 CU);  |</w:t>
-      </w:r>
-    </w:p>
-    <w:p>
-      <w:pPr>
-        <w:spacing w:before="0" w:after="0" w:line="200" w:lineRule="auto"/>
-        <w:ind w:left="360"/>
-      </w:pPr>
-      <w:r>
-        <w:rPr>
-          <w:rFonts w:ascii="Times New Roman" w:cs="Times New Roman" w:eastAsia="Times New Roman" w:hAnsi="Times New Roman"/>
-          <w:b w:val="0"/>
-          <w:bCs w:val="0"/>
-          <w:i w:val="0"/>
-          <w:iCs w:val="0"/>
-          <w:u w:val="none"/>
-          <w:color w:val="000000"/>
-          <w:sz w:val="18"/>
-          <w:szCs w:val="18"/>
-        </w:rPr>
-        <w:t xml:space="preserve">| Database Engine   | (with PgBouncer Pooling)     | MongoDB Atlas; DynamoDB       | built-in PgBouncer pooling prevents connection drops;|</w:t>
-      </w:r>
-    </w:p>
-    <w:p>
-      <w:pPr>
-        <w:spacing w:before="0" w:after="0" w:line="200" w:lineRule="auto"/>
-        <w:ind w:left="360"/>
-      </w:pPr>
-      <w:r>
-        <w:rPr>
-          <w:rFonts w:ascii="Times New Roman" w:cs="Times New Roman" w:eastAsia="Times New Roman" w:hAnsi="Times New Roman"/>
-          <w:b w:val="0"/>
-          <w:bCs w:val="0"/>
-          <w:i w:val="0"/>
-          <w:iCs w:val="0"/>
-          <w:u w:val="none"/>
-          <w:color w:val="000000"/>
-          <w:sz w:val="18"/>
-          <w:szCs w:val="18"/>
-        </w:rPr>
-        <w:t xml:space="preserve">|                   |                              |                               | robust RLS engine (bbt_app role) &amp; ACID audit ledger.|</w:t>
-      </w:r>
-    </w:p>
-    <w:p>
-      <w:pPr>
-        <w:spacing w:before="0" w:after="0" w:line="200" w:lineRule="auto"/>
-        <w:ind w:left="360"/>
-      </w:pPr>
-      <w:r>
-        <w:rPr>
-          <w:rFonts w:ascii="Times New Roman" w:cs="Times New Roman" w:eastAsia="Times New Roman" w:hAnsi="Times New Roman"/>
-          <w:b w:val="0"/>
-          <w:bCs w:val="0"/>
-          <w:i w:val="0"/>
-          <w:iCs w:val="0"/>
-          <w:u w:val="none"/>
-          <w:color w:val="000000"/>
-          <w:sz w:val="18"/>
-          <w:szCs w:val="18"/>
-        </w:rPr>
-        <w:t xml:space="preserve">+-------------------+------------------------------+-------------------------------+--------------------------------------+</w:t>
-      </w:r>
-    </w:p>
-    <w:p>
-      <w:pPr>
-        <w:spacing w:before="0" w:after="0" w:line="200" w:lineRule="auto"/>
-        <w:ind w:left="360"/>
-      </w:pPr>
-      <w:r>
-        <w:rPr>
-          <w:rFonts w:ascii="Times New Roman" w:cs="Times New Roman" w:eastAsia="Times New Roman" w:hAnsi="Times New Roman"/>
-          <w:b w:val="0"/>
-          <w:bCs w:val="0"/>
-          <w:i w:val="0"/>
-          <w:iCs w:val="0"/>
-          <w:u w:val="none"/>
-          <w:color w:val="000000"/>
-          <w:sz w:val="18"/>
-          <w:szCs w:val="18"/>
-        </w:rPr>
-        <w:t xml:space="preserve">| Object Storage    | Cloudflare R2                | AWS S3 Standard;              | S3-compatible API with ZERO bandwidth egress fees    |</w:t>
-      </w:r>
-    </w:p>
-    <w:p>
-      <w:pPr>
-        <w:spacing w:before="0" w:after="0" w:line="200" w:lineRule="auto"/>
-        <w:ind w:left="360"/>
-      </w:pPr>
-      <w:r>
-        <w:rPr>
-          <w:rFonts w:ascii="Times New Roman" w:cs="Times New Roman" w:eastAsia="Times New Roman" w:hAnsi="Times New Roman"/>
-          <w:b w:val="0"/>
-          <w:bCs w:val="0"/>
-          <w:i w:val="0"/>
-          <w:iCs w:val="0"/>
-          <w:u w:val="none"/>
-          <w:color w:val="000000"/>
-          <w:sz w:val="18"/>
-          <w:szCs w:val="18"/>
-        </w:rPr>
-        <w:t xml:space="preserve">| Persistence       | (Direct Presigned Uploads)   | Google Cloud Storage (GCS)    | (eliminating unbounded egress billing risks from     |</w:t>
-      </w:r>
-    </w:p>
-    <w:p>
-      <w:pPr>
-        <w:spacing w:before="0" w:after="0" w:line="200" w:lineRule="auto"/>
-        <w:ind w:left="360"/>
-      </w:pPr>
-      <w:r>
-        <w:rPr>
-          <w:rFonts w:ascii="Times New Roman" w:cs="Times New Roman" w:eastAsia="Times New Roman" w:hAnsi="Times New Roman"/>
-          <w:b w:val="0"/>
-          <w:bCs w:val="0"/>
-          <w:i w:val="0"/>
-          <w:iCs w:val="0"/>
-          <w:u w:val="none"/>
-          <w:color w:val="000000"/>
-          <w:sz w:val="18"/>
-          <w:szCs w:val="18"/>
-        </w:rPr>
-        <w:t xml:space="preserve">|                   |                              |                               | large PoC video downloads); global multi-region speed|</w:t>
-      </w:r>
-    </w:p>
-    <w:p>
-      <w:pPr>
-        <w:spacing w:before="0" w:after="0" w:line="200" w:lineRule="auto"/>
-        <w:ind w:left="360"/>
-      </w:pPr>
-      <w:r>
-        <w:rPr>
-          <w:rFonts w:ascii="Times New Roman" w:cs="Times New Roman" w:eastAsia="Times New Roman" w:hAnsi="Times New Roman"/>
-          <w:b w:val="0"/>
-          <w:bCs w:val="0"/>
-          <w:i w:val="0"/>
-          <w:iCs w:val="0"/>
-          <w:u w:val="none"/>
-          <w:color w:val="000000"/>
-          <w:sz w:val="18"/>
-          <w:szCs w:val="18"/>
-        </w:rPr>
-        <w:t xml:space="preserve">+-------------------+------------------------------+-------------------------------+--------------------------------------+</w:t>
-      </w:r>
-    </w:p>
-    <w:p>
-      <w:pPr>
-        <w:spacing w:before="0" w:after="0" w:line="200" w:lineRule="auto"/>
-        <w:ind w:left="360"/>
-      </w:pPr>
-      <w:r>
-        <w:rPr>
-          <w:rFonts w:ascii="Times New Roman" w:cs="Times New Roman" w:eastAsia="Times New Roman" w:hAnsi="Times New Roman"/>
-          <w:b w:val="0"/>
-          <w:bCs w:val="0"/>
-          <w:i w:val="0"/>
-          <w:iCs w:val="0"/>
-          <w:u w:val="none"/>
-          <w:color w:val="000000"/>
-          <w:sz w:val="18"/>
-          <w:szCs w:val="18"/>
-        </w:rPr>
-        <w:t xml:space="preserve">| Bot Protection &amp;  | Cloudflare Turnstile         | Google reCAPTCHA v3;          | Privacy-preserving, non-interactive bot verification;|</w:t>
-      </w:r>
-    </w:p>
-    <w:p>
-      <w:pPr>
-        <w:spacing w:before="0" w:after="0" w:line="200" w:lineRule="auto"/>
-        <w:ind w:left="360"/>
-      </w:pPr>
-      <w:r>
-        <w:rPr>
-          <w:rFonts w:ascii="Times New Roman" w:cs="Times New Roman" w:eastAsia="Times New Roman" w:hAnsi="Times New Roman"/>
-          <w:b w:val="0"/>
-          <w:bCs w:val="0"/>
-          <w:i w:val="0"/>
-          <w:iCs w:val="0"/>
-          <w:u w:val="none"/>
-          <w:color w:val="000000"/>
-          <w:sz w:val="18"/>
-          <w:szCs w:val="18"/>
-        </w:rPr>
-        <w:t xml:space="preserve">| Perimeter Defense | &amp; Cloudflare Anycast WAF     | hCaptcha                      | zero user tracking cookies; seamless Next.js drop-in;|</w:t>
-      </w:r>
-    </w:p>
-    <w:p>
-      <w:pPr>
-        <w:spacing w:before="0" w:after="0" w:line="200" w:lineRule="auto"/>
-        <w:ind w:left="360"/>
-      </w:pPr>
-      <w:r>
-        <w:rPr>
-          <w:rFonts w:ascii="Times New Roman" w:cs="Times New Roman" w:eastAsia="Times New Roman" w:hAnsi="Times New Roman"/>
-          <w:b w:val="0"/>
-          <w:bCs w:val="0"/>
-          <w:i w:val="0"/>
-          <w:iCs w:val="0"/>
-          <w:u w:val="none"/>
-          <w:color w:val="000000"/>
-          <w:sz w:val="18"/>
-          <w:szCs w:val="18"/>
-        </w:rPr>
-        <w:t xml:space="preserve">|                   |                              |                               | protects unauthenticated guest intake endpoints.     |</w:t>
-      </w:r>
-    </w:p>
-    <w:p>
-      <w:pPr>
-        <w:spacing w:before="0" w:after="0" w:line="200" w:lineRule="auto"/>
-        <w:ind w:left="360"/>
-      </w:pPr>
-      <w:r>
-        <w:rPr>
-          <w:rFonts w:ascii="Times New Roman" w:cs="Times New Roman" w:eastAsia="Times New Roman" w:hAnsi="Times New Roman"/>
-          <w:b w:val="0"/>
-          <w:bCs w:val="0"/>
-          <w:i w:val="0"/>
-          <w:iCs w:val="0"/>
-          <w:u w:val="none"/>
-          <w:color w:val="000000"/>
-          <w:sz w:val="18"/>
-          <w:szCs w:val="18"/>
-        </w:rPr>
-        <w:t xml:space="preserve">+-------------------+------------------------------+-------------------------------+--------------------------------------+</w:t>
-      </w:r>
-    </w:p>
-    <w:p>
-      <w:pPr>
-        <w:spacing w:before="0" w:after="0" w:line="200" w:lineRule="auto"/>
-        <w:ind w:left="360"/>
-      </w:pPr>
-      <w:r>
-        <w:rPr>
-          <w:rFonts w:ascii="Times New Roman" w:cs="Times New Roman" w:eastAsia="Times New Roman" w:hAnsi="Times New Roman"/>
-          <w:b w:val="0"/>
-          <w:bCs w:val="0"/>
-          <w:i w:val="0"/>
-          <w:iCs w:val="0"/>
-          <w:u w:val="none"/>
-          <w:color w:val="000000"/>
-          <w:sz w:val="18"/>
-          <w:szCs w:val="18"/>
-        </w:rPr>
-        <w:t xml:space="preserve">| Transactional     | Resend API                   | AWS SES; SendGrid;            | Clean modern REST API with native React Email support|</w:t>
-      </w:r>
-    </w:p>
-    <w:p>
-      <w:pPr>
-        <w:spacing w:before="0" w:after="0" w:line="200" w:lineRule="auto"/>
-        <w:ind w:left="360"/>
-      </w:pPr>
-      <w:r>
-        <w:rPr>
-          <w:rFonts w:ascii="Times New Roman" w:cs="Times New Roman" w:eastAsia="Times New Roman" w:hAnsi="Times New Roman"/>
-          <w:b w:val="0"/>
-          <w:bCs w:val="0"/>
-          <w:i w:val="0"/>
-          <w:iCs w:val="0"/>
-          <w:u w:val="none"/>
-          <w:color w:val="000000"/>
-          <w:sz w:val="18"/>
-          <w:szCs w:val="18"/>
-        </w:rPr>
-        <w:t xml:space="preserve">| Notification Mail | (Node.js REST SDK)           | Postmark                      | and zero complex SMTP handshake overhead; free tier  |</w:t>
-      </w:r>
-    </w:p>
-    <w:p>
-      <w:pPr>
-        <w:spacing w:before="0" w:after="0" w:line="200" w:lineRule="auto"/>
-        <w:ind w:left="360"/>
-      </w:pPr>
-      <w:r>
-        <w:rPr>
-          <w:rFonts w:ascii="Times New Roman" w:cs="Times New Roman" w:eastAsia="Times New Roman" w:hAnsi="Times New Roman"/>
-          <w:b w:val="0"/>
-          <w:bCs w:val="0"/>
-          <w:i w:val="0"/>
-          <w:iCs w:val="0"/>
-          <w:u w:val="none"/>
-          <w:color w:val="000000"/>
-          <w:sz w:val="18"/>
-          <w:szCs w:val="18"/>
-        </w:rPr>
-        <w:t xml:space="preserve">|                   |                              |                               | provides 3,000 metadata-only alerts/month.           |</w:t>
-      </w:r>
-    </w:p>
-    <w:p>
-      <w:pPr>
-        <w:spacing w:before="0" w:after="0" w:line="200" w:lineRule="auto"/>
-        <w:ind w:left="360"/>
-      </w:pPr>
-      <w:r>
-        <w:rPr>
-          <w:rFonts w:ascii="Times New Roman" w:cs="Times New Roman" w:eastAsia="Times New Roman" w:hAnsi="Times New Roman"/>
-          <w:b w:val="0"/>
-          <w:bCs w:val="0"/>
-          <w:i w:val="0"/>
-          <w:iCs w:val="0"/>
-          <w:u w:val="none"/>
-          <w:color w:val="000000"/>
-          <w:sz w:val="18"/>
-          <w:szCs w:val="18"/>
-        </w:rPr>
-        <w:t xml:space="preserve">+-------------------+------------------------------+-------------------------------+--------------------------------------+</w:t>
-      </w:r>
-    </w:p>
-    <w:p>
-      <w:pPr>
-        <w:spacing w:before="0" w:after="0" w:line="200" w:lineRule="auto"/>
-        <w:ind w:left="360"/>
-      </w:pPr>
-      <w:r>
-        <w:rPr>
-          <w:rFonts w:ascii="Times New Roman" w:cs="Times New Roman" w:eastAsia="Times New Roman" w:hAnsi="Times New Roman"/>
-          <w:b w:val="0"/>
-          <w:bCs w:val="0"/>
-          <w:i w:val="0"/>
-          <w:iCs w:val="0"/>
-          <w:u w:val="none"/>
-          <w:color w:val="000000"/>
-          <w:sz w:val="18"/>
-          <w:szCs w:val="18"/>
-        </w:rPr>
-        <w:t xml:space="preserve">| Continuous        | GitHub Actions               | GitLab CI; CircleCI;          | Native repository integration; provides 2,000 free   |</w:t>
-      </w:r>
-    </w:p>
-    <w:p>
-      <w:pPr>
-        <w:spacing w:before="0" w:after="0" w:line="200" w:lineRule="auto"/>
-        <w:ind w:left="360"/>
-      </w:pPr>
-      <w:r>
-        <w:rPr>
-          <w:rFonts w:ascii="Times New Roman" w:cs="Times New Roman" w:eastAsia="Times New Roman" w:hAnsi="Times New Roman"/>
-          <w:b w:val="0"/>
-          <w:bCs w:val="0"/>
-          <w:i w:val="0"/>
-          <w:iCs w:val="0"/>
-          <w:u w:val="none"/>
-          <w:color w:val="000000"/>
-          <w:sz w:val="18"/>
-          <w:szCs w:val="18"/>
-        </w:rPr>
-        <w:t xml:space="preserve">| Automation &amp; Cron | (Ubuntu 22.04 LTS Runners)   | AWS EventBridge               | runner minutes/month; executes hourly scheduled jobs |</w:t>
-      </w:r>
-    </w:p>
-    <w:p>
-      <w:pPr>
-        <w:spacing w:before="0" w:after="0" w:line="200" w:lineRule="auto"/>
-        <w:ind w:left="360"/>
-      </w:pPr>
-      <w:r>
-        <w:rPr>
-          <w:rFonts w:ascii="Times New Roman" w:cs="Times New Roman" w:eastAsia="Times New Roman" w:hAnsi="Times New Roman"/>
-          <w:b w:val="0"/>
-          <w:bCs w:val="0"/>
-          <w:i w:val="0"/>
-          <w:iCs w:val="0"/>
-          <w:u w:val="none"/>
-          <w:color w:val="000000"/>
-          <w:sz w:val="18"/>
-          <w:szCs w:val="18"/>
-        </w:rPr>
-        <w:t xml:space="preserve">|                   |                              |                               | via HMAC-SHA256 on /api/v1/internal/cron/sla-check.  |</w:t>
-      </w:r>
-    </w:p>
-    <w:p>
-      <w:pPr>
-        <w:spacing w:before="0" w:after="0" w:line="200" w:lineRule="auto"/>
-        <w:ind w:left="360"/>
-      </w:pPr>
-      <w:r>
-        <w:rPr>
-          <w:rFonts w:ascii="Times New Roman" w:cs="Times New Roman" w:eastAsia="Times New Roman" w:hAnsi="Times New Roman"/>
-          <w:b w:val="0"/>
-          <w:bCs w:val="0"/>
-          <w:i w:val="0"/>
-          <w:iCs w:val="0"/>
-          <w:u w:val="none"/>
-          <w:color w:val="000000"/>
-          <w:sz w:val="18"/>
-          <w:szCs w:val="18"/>
-        </w:rPr>
-        <w:t xml:space="preserve">+-------------------+------------------------------+-------------------------------+--------------------------------------+</w:t>
-      </w:r>
-    </w:p>
+    <w:tbl>
+      <w:tblPr>
+        <w:tblW w:w="9360" w:type="dxa"/>
+        <w:tblBorders>
+          <w:top w:val="single" w:sz="6" w:space="0" w:color="000000"/>
+          <w:left w:val="single" w:sz="6" w:space="0" w:color="000000"/>
+          <w:bottom w:val="single" w:sz="6" w:space="0" w:color="000000"/>
+          <w:right w:val="single" w:sz="6" w:space="0" w:color="000000"/>
+          <w:insideH w:val="single" w:sz="4" w:space="0" w:color="000000"/>
+          <w:insideV w:val="single" w:sz="4" w:space="0" w:color="000000"/>
+        </w:tblBorders>
+        <w:tblLayout w:type="fixed"/>
+        <w:tblCellMar>
+          <w:top w:w="80" w:type="dxa"/>
+          <w:left w:w="120" w:type="dxa"/>
+          <w:bottom w:w="80" w:type="dxa"/>
+          <w:right w:w="120" w:type="dxa"/>
+        </w:tblCellMar>
+      </w:tblPr>
+      <w:tblGrid>
+        <w:gridCol w:w="2340"/>
+        <w:gridCol w:w="2340"/>
+        <w:gridCol w:w="2340"/>
+        <w:gridCol w:w="2340"/>
+      </w:tblGrid>
+      <w:tr>
+        <w:trPr>
+          <w:tblHeader/>
+          <w:cantSplit/>
+        </w:trPr>
+        <w:tc>
+          <w:tcPr>
+            <w:tcW w:w="2340" w:type="dxa"/>
+            <w:tcBorders>
+              <w:top w:val="single" w:sz="4" w:color="000000"/>
+              <w:left w:val="single" w:sz="4" w:color="000000"/>
+              <w:bottom w:val="single" w:sz="4" w:color="000000"/>
+              <w:right w:val="single" w:sz="4" w:color="000000"/>
+            </w:tcBorders>
+            <w:vAlign w:val="center"/>
+          </w:tcPr>
+          <w:p>
+            <w:pPr>
+              <w:spacing w:before="40" w:after="40" w:line="240" w:lineRule="auto"/>
+            </w:pPr>
+            <w:r>
+              <w:rPr>
+                <w:rFonts w:ascii="Times New Roman" w:cs="Times New Roman" w:eastAsia="Times New Roman" w:hAnsi="Times New Roman"/>
+                <w:b/>
+                <w:bCs/>
+                <w:i w:val="0"/>
+                <w:iCs w:val="0"/>
+                <w:u w:val="none"/>
+                <w:color w:val="000000"/>
+                <w:sz w:val="20"/>
+                <w:szCs w:val="20"/>
+              </w:rPr>
+              <w:t xml:space="preserve">Subsystem Layer</w:t>
+            </w:r>
+          </w:p>
+        </w:tc>
+        <w:tc>
+          <w:tcPr>
+            <w:tcW w:w="2340" w:type="dxa"/>
+            <w:tcBorders>
+              <w:top w:val="single" w:sz="4" w:color="000000"/>
+              <w:left w:val="single" w:sz="4" w:color="000000"/>
+              <w:bottom w:val="single" w:sz="4" w:color="000000"/>
+              <w:right w:val="single" w:sz="4" w:color="000000"/>
+            </w:tcBorders>
+            <w:vAlign w:val="center"/>
+          </w:tcPr>
+          <w:p>
+            <w:pPr>
+              <w:spacing w:before="40" w:after="40" w:line="240" w:lineRule="auto"/>
+            </w:pPr>
+            <w:r>
+              <w:rPr>
+                <w:rFonts w:ascii="Times New Roman" w:cs="Times New Roman" w:eastAsia="Times New Roman" w:hAnsi="Times New Roman"/>
+                <w:b/>
+                <w:bCs/>
+                <w:i w:val="0"/>
+                <w:iCs w:val="0"/>
+                <w:u w:val="none"/>
+                <w:color w:val="000000"/>
+                <w:sz w:val="20"/>
+                <w:szCs w:val="20"/>
+              </w:rPr>
+              <w:t xml:space="preserve">Chosen Technology</w:t>
+            </w:r>
+          </w:p>
+        </w:tc>
+        <w:tc>
+          <w:tcPr>
+            <w:tcW w:w="2340" w:type="dxa"/>
+            <w:tcBorders>
+              <w:top w:val="single" w:sz="4" w:color="000000"/>
+              <w:left w:val="single" w:sz="4" w:color="000000"/>
+              <w:bottom w:val="single" w:sz="4" w:color="000000"/>
+              <w:right w:val="single" w:sz="4" w:color="000000"/>
+            </w:tcBorders>
+            <w:vAlign w:val="center"/>
+          </w:tcPr>
+          <w:p>
+            <w:pPr>
+              <w:spacing w:before="40" w:after="40" w:line="240" w:lineRule="auto"/>
+            </w:pPr>
+            <w:r>
+              <w:rPr>
+                <w:rFonts w:ascii="Times New Roman" w:cs="Times New Roman" w:eastAsia="Times New Roman" w:hAnsi="Times New Roman"/>
+                <w:b/>
+                <w:bCs/>
+                <w:i w:val="0"/>
+                <w:iCs w:val="0"/>
+                <w:u w:val="none"/>
+                <w:color w:val="000000"/>
+                <w:sz w:val="20"/>
+                <w:szCs w:val="20"/>
+              </w:rPr>
+              <w:t xml:space="preserve">Primary Alternatives Evaluated</w:t>
+            </w:r>
+          </w:p>
+        </w:tc>
+        <w:tc>
+          <w:tcPr>
+            <w:tcW w:w="2340" w:type="dxa"/>
+            <w:tcBorders>
+              <w:top w:val="single" w:sz="4" w:color="000000"/>
+              <w:left w:val="single" w:sz="4" w:color="000000"/>
+              <w:bottom w:val="single" w:sz="4" w:color="000000"/>
+              <w:right w:val="single" w:sz="4" w:color="000000"/>
+            </w:tcBorders>
+            <w:vAlign w:val="center"/>
+          </w:tcPr>
+          <w:p>
+            <w:pPr>
+              <w:spacing w:before="40" w:after="40" w:line="240" w:lineRule="auto"/>
+            </w:pPr>
+            <w:r>
+              <w:rPr>
+                <w:rFonts w:ascii="Times New Roman" w:cs="Times New Roman" w:eastAsia="Times New Roman" w:hAnsi="Times New Roman"/>
+                <w:b/>
+                <w:bCs/>
+                <w:i w:val="0"/>
+                <w:iCs w:val="0"/>
+                <w:u w:val="none"/>
+                <w:color w:val="000000"/>
+                <w:sz w:val="20"/>
+                <w:szCs w:val="20"/>
+              </w:rPr>
+              <w:t xml:space="preserve">Architectural Rationale &amp; Trade-Off</w:t>
+            </w:r>
+          </w:p>
+        </w:tc>
+      </w:tr>
+      <w:tr>
+        <w:trPr>
+          <w:cantSplit/>
+        </w:trPr>
+        <w:tc>
+          <w:tcPr>
+            <w:tcW w:w="2340" w:type="dxa"/>
+            <w:tcBorders>
+              <w:top w:val="single" w:sz="4" w:color="000000"/>
+              <w:left w:val="single" w:sz="4" w:color="000000"/>
+              <w:bottom w:val="single" w:sz="4" w:color="000000"/>
+              <w:right w:val="single" w:sz="4" w:color="000000"/>
+            </w:tcBorders>
+            <w:vAlign w:val="center"/>
+          </w:tcPr>
+          <w:p>
+            <w:pPr>
+              <w:spacing w:before="40" w:after="40" w:line="240" w:lineRule="auto"/>
+            </w:pPr>
+            <w:r>
+              <w:rPr>
+                <w:rFonts w:ascii="Times New Roman" w:cs="Times New Roman" w:eastAsia="Times New Roman" w:hAnsi="Times New Roman"/>
+                <w:b/>
+                <w:bCs/>
+                <w:i w:val="0"/>
+                <w:iCs w:val="0"/>
+                <w:u w:val="none"/>
+                <w:color w:val="000000"/>
+                <w:sz w:val="20"/>
+                <w:szCs w:val="20"/>
+              </w:rPr>
+              <w:t xml:space="preserve">Frontend &amp; API Fullstack Engine</w:t>
+            </w:r>
+          </w:p>
+        </w:tc>
+        <w:tc>
+          <w:tcPr>
+            <w:tcW w:w="2340" w:type="dxa"/>
+            <w:tcBorders>
+              <w:top w:val="single" w:sz="4" w:color="000000"/>
+              <w:left w:val="single" w:sz="4" w:color="000000"/>
+              <w:bottom w:val="single" w:sz="4" w:color="000000"/>
+              <w:right w:val="single" w:sz="4" w:color="000000"/>
+            </w:tcBorders>
+            <w:vAlign w:val="center"/>
+          </w:tcPr>
+          <w:p>
+            <w:pPr>
+              <w:spacing w:before="40" w:after="40" w:line="240" w:lineRule="auto"/>
+            </w:pPr>
+            <w:r>
+              <w:rPr>
+                <w:rFonts w:ascii="Times New Roman" w:cs="Times New Roman" w:eastAsia="Times New Roman" w:hAnsi="Times New Roman"/>
+                <w:b/>
+                <w:bCs/>
+                <w:i w:val="0"/>
+                <w:iCs w:val="0"/>
+                <w:u w:val="none"/>
+                <w:color w:val="000000"/>
+                <w:sz w:val="20"/>
+                <w:szCs w:val="20"/>
+              </w:rPr>
+              <w:t xml:space="preserve">Next.js 14+ App Router</w:t>
+            </w:r>
+            <w:r>
+              <w:rPr>
+                <w:rFonts w:ascii="Times New Roman" w:cs="Times New Roman" w:eastAsia="Times New Roman" w:hAnsi="Times New Roman"/>
+                <w:b w:val="0"/>
+                <w:bCs w:val="0"/>
+                <w:i w:val="0"/>
+                <w:iCs w:val="0"/>
+                <w:u w:val="none"/>
+                <w:color w:val="000000"/>
+                <w:sz w:val="20"/>
+                <w:szCs w:val="20"/>
+              </w:rPr>
+              <w:t xml:space="preserve"> (Node.js 22 LTS on Vercel)</w:t>
+            </w:r>
+          </w:p>
+        </w:tc>
+        <w:tc>
+          <w:tcPr>
+            <w:tcW w:w="2340" w:type="dxa"/>
+            <w:tcBorders>
+              <w:top w:val="single" w:sz="4" w:color="000000"/>
+              <w:left w:val="single" w:sz="4" w:color="000000"/>
+              <w:bottom w:val="single" w:sz="4" w:color="000000"/>
+              <w:right w:val="single" w:sz="4" w:color="000000"/>
+            </w:tcBorders>
+            <w:vAlign w:val="center"/>
+          </w:tcPr>
+          <w:p>
+            <w:pPr>
+              <w:spacing w:before="40" w:after="40" w:line="240" w:lineRule="auto"/>
+            </w:pPr>
+            <w:r>
+              <w:rPr>
+                <w:rFonts w:ascii="Times New Roman" w:cs="Times New Roman" w:eastAsia="Times New Roman" w:hAnsi="Times New Roman"/>
+                <w:b w:val="0"/>
+                <w:bCs w:val="0"/>
+                <w:i w:val="0"/>
+                <w:iCs w:val="0"/>
+                <w:u w:val="none"/>
+                <w:color w:val="000000"/>
+                <w:sz w:val="20"/>
+                <w:szCs w:val="20"/>
+              </w:rPr>
+              <w:t xml:space="preserve">React SPA + Express.js API; Go / Gin Microservices</w:t>
+            </w:r>
+          </w:p>
+        </w:tc>
+        <w:tc>
+          <w:tcPr>
+            <w:tcW w:w="2340" w:type="dxa"/>
+            <w:tcBorders>
+              <w:top w:val="single" w:sz="4" w:color="000000"/>
+              <w:left w:val="single" w:sz="4" w:color="000000"/>
+              <w:bottom w:val="single" w:sz="4" w:color="000000"/>
+              <w:right w:val="single" w:sz="4" w:color="000000"/>
+            </w:tcBorders>
+            <w:vAlign w:val="center"/>
+          </w:tcPr>
+          <w:p>
+            <w:pPr>
+              <w:spacing w:before="40" w:after="40" w:line="240" w:lineRule="auto"/>
+            </w:pPr>
+            <w:r>
+              <w:rPr>
+                <w:rFonts w:ascii="Times New Roman" w:cs="Times New Roman" w:eastAsia="Times New Roman" w:hAnsi="Times New Roman"/>
+                <w:b w:val="0"/>
+                <w:bCs w:val="0"/>
+                <w:i w:val="0"/>
+                <w:iCs w:val="0"/>
+                <w:u w:val="none"/>
+                <w:color w:val="000000"/>
+                <w:sz w:val="20"/>
+                <w:szCs w:val="20"/>
+              </w:rPr>
+              <w:t xml:space="preserve">Unified TypeScript codebase eliminates API contract drift; React Server Components provide zero-bundle rendering; serverless architecture scales to zero during idle periods.</w:t>
+            </w:r>
+          </w:p>
+        </w:tc>
+      </w:tr>
+      <w:tr>
+        <w:trPr>
+          <w:cantSplit/>
+        </w:trPr>
+        <w:tc>
+          <w:tcPr>
+            <w:tcW w:w="2340" w:type="dxa"/>
+            <w:tcBorders>
+              <w:top w:val="single" w:sz="4" w:color="000000"/>
+              <w:left w:val="single" w:sz="4" w:color="000000"/>
+              <w:bottom w:val="single" w:sz="4" w:color="000000"/>
+              <w:right w:val="single" w:sz="4" w:color="000000"/>
+            </w:tcBorders>
+            <w:vAlign w:val="center"/>
+          </w:tcPr>
+          <w:p>
+            <w:pPr>
+              <w:spacing w:before="40" w:after="40" w:line="240" w:lineRule="auto"/>
+            </w:pPr>
+            <w:r>
+              <w:rPr>
+                <w:rFonts w:ascii="Times New Roman" w:cs="Times New Roman" w:eastAsia="Times New Roman" w:hAnsi="Times New Roman"/>
+                <w:b/>
+                <w:bCs/>
+                <w:i w:val="0"/>
+                <w:iCs w:val="0"/>
+                <w:u w:val="none"/>
+                <w:color w:val="000000"/>
+                <w:sz w:val="20"/>
+                <w:szCs w:val="20"/>
+              </w:rPr>
+              <w:t xml:space="preserve">Application Runtime Fleet</w:t>
+            </w:r>
+          </w:p>
+        </w:tc>
+        <w:tc>
+          <w:tcPr>
+            <w:tcW w:w="2340" w:type="dxa"/>
+            <w:tcBorders>
+              <w:top w:val="single" w:sz="4" w:color="000000"/>
+              <w:left w:val="single" w:sz="4" w:color="000000"/>
+              <w:bottom w:val="single" w:sz="4" w:color="000000"/>
+              <w:right w:val="single" w:sz="4" w:color="000000"/>
+            </w:tcBorders>
+            <w:vAlign w:val="center"/>
+          </w:tcPr>
+          <w:p>
+            <w:pPr>
+              <w:spacing w:before="40" w:after="40" w:line="240" w:lineRule="auto"/>
+            </w:pPr>
+            <w:r>
+              <w:rPr>
+                <w:rFonts w:ascii="Times New Roman" w:cs="Times New Roman" w:eastAsia="Times New Roman" w:hAnsi="Times New Roman"/>
+                <w:b/>
+                <w:bCs/>
+                <w:i w:val="0"/>
+                <w:iCs w:val="0"/>
+                <w:u w:val="none"/>
+                <w:color w:val="000000"/>
+                <w:sz w:val="20"/>
+                <w:szCs w:val="20"/>
+              </w:rPr>
+              <w:t xml:space="preserve">Vercel Serverless Compute</w:t>
+            </w:r>
+            <w:r>
+              <w:rPr>
+                <w:rFonts w:ascii="Times New Roman" w:cs="Times New Roman" w:eastAsia="Times New Roman" w:hAnsi="Times New Roman"/>
+                <w:b w:val="0"/>
+                <w:bCs w:val="0"/>
+                <w:i w:val="0"/>
+                <w:iCs w:val="0"/>
+                <w:u w:val="none"/>
+                <w:color w:val="000000"/>
+                <w:sz w:val="20"/>
+                <w:szCs w:val="20"/>
+              </w:rPr>
+              <w:t xml:space="preserve"> (Global Edge + Lambda Core)</w:t>
+            </w:r>
+          </w:p>
+        </w:tc>
+        <w:tc>
+          <w:tcPr>
+            <w:tcW w:w="2340" w:type="dxa"/>
+            <w:tcBorders>
+              <w:top w:val="single" w:sz="4" w:color="000000"/>
+              <w:left w:val="single" w:sz="4" w:color="000000"/>
+              <w:bottom w:val="single" w:sz="4" w:color="000000"/>
+              <w:right w:val="single" w:sz="4" w:color="000000"/>
+            </w:tcBorders>
+            <w:vAlign w:val="center"/>
+          </w:tcPr>
+          <w:p>
+            <w:pPr>
+              <w:spacing w:before="40" w:after="40" w:line="240" w:lineRule="auto"/>
+            </w:pPr>
+            <w:r>
+              <w:rPr>
+                <w:rFonts w:ascii="Times New Roman" w:cs="Times New Roman" w:eastAsia="Times New Roman" w:hAnsi="Times New Roman"/>
+                <w:b w:val="0"/>
+                <w:bCs w:val="0"/>
+                <w:i w:val="0"/>
+                <w:iCs w:val="0"/>
+                <w:u w:val="none"/>
+                <w:color w:val="000000"/>
+                <w:sz w:val="20"/>
+                <w:szCs w:val="20"/>
+              </w:rPr>
+              <w:t xml:space="preserve">AWS ECS / Fargate (Docker); Kubernetes (EKS / GKE); VPS</w:t>
+            </w:r>
+          </w:p>
+        </w:tc>
+        <w:tc>
+          <w:tcPr>
+            <w:tcW w:w="2340" w:type="dxa"/>
+            <w:tcBorders>
+              <w:top w:val="single" w:sz="4" w:color="000000"/>
+              <w:left w:val="single" w:sz="4" w:color="000000"/>
+              <w:bottom w:val="single" w:sz="4" w:color="000000"/>
+              <w:right w:val="single" w:sz="4" w:color="000000"/>
+            </w:tcBorders>
+            <w:vAlign w:val="center"/>
+          </w:tcPr>
+          <w:p>
+            <w:pPr>
+              <w:spacing w:before="40" w:after="40" w:line="240" w:lineRule="auto"/>
+            </w:pPr>
+            <w:r>
+              <w:rPr>
+                <w:rFonts w:ascii="Times New Roman" w:cs="Times New Roman" w:eastAsia="Times New Roman" w:hAnsi="Times New Roman"/>
+                <w:b w:val="0"/>
+                <w:bCs w:val="0"/>
+                <w:i w:val="0"/>
+                <w:iCs w:val="0"/>
+                <w:u w:val="none"/>
+                <w:color w:val="000000"/>
+                <w:sz w:val="20"/>
+                <w:szCs w:val="20"/>
+              </w:rPr>
+              <w:t xml:space="preserve">Eliminates container orchestration toil, OS patching, and VPC maintenance for a solo student engineer; engineering design target of p95 &lt;= 400 ms and p99 &lt;= 800 ms (</w:t>
+            </w:r>
+            <w:r>
+              <w:rPr>
+                <w:rFonts w:ascii="Times New Roman" w:cs="Times New Roman" w:eastAsia="Times New Roman" w:hAnsi="Times New Roman"/>
+                <w:b w:val="0"/>
+                <w:bCs w:val="0"/>
+                <w:i w:val="0"/>
+                <w:iCs w:val="0"/>
+                <w:u w:val="none"/>
+                <w:color w:val="000000"/>
+                <w:sz w:val="20"/>
+                <w:szCs w:val="20"/>
+              </w:rPr>
+              <w:t xml:space="preserve">NFR-01</w:t>
+            </w:r>
+            <w:r>
+              <w:rPr>
+                <w:rFonts w:ascii="Times New Roman" w:cs="Times New Roman" w:eastAsia="Times New Roman" w:hAnsi="Times New Roman"/>
+                <w:b w:val="0"/>
+                <w:bCs w:val="0"/>
+                <w:i w:val="0"/>
+                <w:iCs w:val="0"/>
+                <w:u w:val="none"/>
+                <w:color w:val="000000"/>
+                <w:sz w:val="20"/>
+                <w:szCs w:val="20"/>
+              </w:rPr>
+              <w:t xml:space="preserve">).</w:t>
+            </w:r>
+          </w:p>
+        </w:tc>
+      </w:tr>
+      <w:tr>
+        <w:trPr>
+          <w:cantSplit/>
+        </w:trPr>
+        <w:tc>
+          <w:tcPr>
+            <w:tcW w:w="2340" w:type="dxa"/>
+            <w:tcBorders>
+              <w:top w:val="single" w:sz="4" w:color="000000"/>
+              <w:left w:val="single" w:sz="4" w:color="000000"/>
+              <w:bottom w:val="single" w:sz="4" w:color="000000"/>
+              <w:right w:val="single" w:sz="4" w:color="000000"/>
+            </w:tcBorders>
+            <w:vAlign w:val="center"/>
+          </w:tcPr>
+          <w:p>
+            <w:pPr>
+              <w:spacing w:before="40" w:after="40" w:line="240" w:lineRule="auto"/>
+            </w:pPr>
+            <w:r>
+              <w:rPr>
+                <w:rFonts w:ascii="Times New Roman" w:cs="Times New Roman" w:eastAsia="Times New Roman" w:hAnsi="Times New Roman"/>
+                <w:b/>
+                <w:bCs/>
+                <w:i w:val="0"/>
+                <w:iCs w:val="0"/>
+                <w:u w:val="none"/>
+                <w:color w:val="000000"/>
+                <w:sz w:val="20"/>
+                <w:szCs w:val="20"/>
+              </w:rPr>
+              <w:t xml:space="preserve">Relational Database Engine</w:t>
+            </w:r>
+          </w:p>
+        </w:tc>
+        <w:tc>
+          <w:tcPr>
+            <w:tcW w:w="2340" w:type="dxa"/>
+            <w:tcBorders>
+              <w:top w:val="single" w:sz="4" w:color="000000"/>
+              <w:left w:val="single" w:sz="4" w:color="000000"/>
+              <w:bottom w:val="single" w:sz="4" w:color="000000"/>
+              <w:right w:val="single" w:sz="4" w:color="000000"/>
+            </w:tcBorders>
+            <w:vAlign w:val="center"/>
+          </w:tcPr>
+          <w:p>
+            <w:pPr>
+              <w:spacing w:before="40" w:after="40" w:line="240" w:lineRule="auto"/>
+            </w:pPr>
+            <w:r>
+              <w:rPr>
+                <w:rFonts w:ascii="Times New Roman" w:cs="Times New Roman" w:eastAsia="Times New Roman" w:hAnsi="Times New Roman"/>
+                <w:b/>
+                <w:bCs/>
+                <w:i w:val="0"/>
+                <w:iCs w:val="0"/>
+                <w:u w:val="none"/>
+                <w:color w:val="000000"/>
+                <w:sz w:val="20"/>
+                <w:szCs w:val="20"/>
+              </w:rPr>
+              <w:t xml:space="preserve">Neon Serverless PostgreSQL 16</w:t>
+            </w:r>
+            <w:r>
+              <w:rPr>
+                <w:rFonts w:ascii="Times New Roman" w:cs="Times New Roman" w:eastAsia="Times New Roman" w:hAnsi="Times New Roman"/>
+                <w:b w:val="0"/>
+                <w:bCs w:val="0"/>
+                <w:i w:val="0"/>
+                <w:iCs w:val="0"/>
+                <w:u w:val="none"/>
+                <w:color w:val="000000"/>
+                <w:sz w:val="20"/>
+                <w:szCs w:val="20"/>
+              </w:rPr>
+              <w:t xml:space="preserve"> (with PgBouncer Pooling)</w:t>
+            </w:r>
+          </w:p>
+        </w:tc>
+        <w:tc>
+          <w:tcPr>
+            <w:tcW w:w="2340" w:type="dxa"/>
+            <w:tcBorders>
+              <w:top w:val="single" w:sz="4" w:color="000000"/>
+              <w:left w:val="single" w:sz="4" w:color="000000"/>
+              <w:bottom w:val="single" w:sz="4" w:color="000000"/>
+              <w:right w:val="single" w:sz="4" w:color="000000"/>
+            </w:tcBorders>
+            <w:vAlign w:val="center"/>
+          </w:tcPr>
+          <w:p>
+            <w:pPr>
+              <w:spacing w:before="40" w:after="40" w:line="240" w:lineRule="auto"/>
+            </w:pPr>
+            <w:r>
+              <w:rPr>
+                <w:rFonts w:ascii="Times New Roman" w:cs="Times New Roman" w:eastAsia="Times New Roman" w:hAnsi="Times New Roman"/>
+                <w:b w:val="0"/>
+                <w:bCs w:val="0"/>
+                <w:i w:val="0"/>
+                <w:iCs w:val="0"/>
+                <w:u w:val="none"/>
+                <w:color w:val="000000"/>
+                <w:sz w:val="20"/>
+                <w:szCs w:val="20"/>
+              </w:rPr>
+              <w:t xml:space="preserve">Supabase; AWS Aurora; MongoDB Atlas; DynamoDB</w:t>
+            </w:r>
+          </w:p>
+        </w:tc>
+        <w:tc>
+          <w:tcPr>
+            <w:tcW w:w="2340" w:type="dxa"/>
+            <w:tcBorders>
+              <w:top w:val="single" w:sz="4" w:color="000000"/>
+              <w:left w:val="single" w:sz="4" w:color="000000"/>
+              <w:bottom w:val="single" w:sz="4" w:color="000000"/>
+              <w:right w:val="single" w:sz="4" w:color="000000"/>
+            </w:tcBorders>
+            <w:vAlign w:val="center"/>
+          </w:tcPr>
+          <w:p>
+            <w:pPr>
+              <w:spacing w:before="40" w:after="40" w:line="240" w:lineRule="auto"/>
+            </w:pPr>
+            <w:r>
+              <w:rPr>
+                <w:rFonts w:ascii="Times New Roman" w:cs="Times New Roman" w:eastAsia="Times New Roman" w:hAnsi="Times New Roman"/>
+                <w:b w:val="0"/>
+                <w:bCs w:val="0"/>
+                <w:i w:val="0"/>
+                <w:iCs w:val="0"/>
+                <w:u w:val="none"/>
+                <w:color w:val="000000"/>
+                <w:sz w:val="20"/>
+                <w:szCs w:val="20"/>
+              </w:rPr>
+              <w:t xml:space="preserve">True serverless compute autoscaling (0.25 to 2 CU); built-in PgBouncer pooling prevents connection drops; robust RLS engine (</w:t>
+            </w:r>
+            <w:r>
+              <w:rPr>
+                <w:rFonts w:ascii="Times New Roman" w:cs="Times New Roman" w:eastAsia="Times New Roman" w:hAnsi="Times New Roman"/>
+                <w:b w:val="0"/>
+                <w:bCs w:val="0"/>
+                <w:i w:val="0"/>
+                <w:iCs w:val="0"/>
+                <w:u w:val="none"/>
+                <w:color w:val="000000"/>
+                <w:sz w:val="20"/>
+                <w:szCs w:val="20"/>
+              </w:rPr>
+              <w:t xml:space="preserve">bbt_app</w:t>
+            </w:r>
+            <w:r>
+              <w:rPr>
+                <w:rFonts w:ascii="Times New Roman" w:cs="Times New Roman" w:eastAsia="Times New Roman" w:hAnsi="Times New Roman"/>
+                <w:b w:val="0"/>
+                <w:bCs w:val="0"/>
+                <w:i w:val="0"/>
+                <w:iCs w:val="0"/>
+                <w:u w:val="none"/>
+                <w:color w:val="000000"/>
+                <w:sz w:val="20"/>
+                <w:szCs w:val="20"/>
+              </w:rPr>
+              <w:t xml:space="preserve"> role) &amp; ACID audit ledger.</w:t>
+            </w:r>
+          </w:p>
+        </w:tc>
+      </w:tr>
+      <w:tr>
+        <w:trPr>
+          <w:cantSplit/>
+        </w:trPr>
+        <w:tc>
+          <w:tcPr>
+            <w:tcW w:w="2340" w:type="dxa"/>
+            <w:tcBorders>
+              <w:top w:val="single" w:sz="4" w:color="000000"/>
+              <w:left w:val="single" w:sz="4" w:color="000000"/>
+              <w:bottom w:val="single" w:sz="4" w:color="000000"/>
+              <w:right w:val="single" w:sz="4" w:color="000000"/>
+            </w:tcBorders>
+            <w:vAlign w:val="center"/>
+          </w:tcPr>
+          <w:p>
+            <w:pPr>
+              <w:spacing w:before="40" w:after="40" w:line="240" w:lineRule="auto"/>
+            </w:pPr>
+            <w:r>
+              <w:rPr>
+                <w:rFonts w:ascii="Times New Roman" w:cs="Times New Roman" w:eastAsia="Times New Roman" w:hAnsi="Times New Roman"/>
+                <w:b/>
+                <w:bCs/>
+                <w:i w:val="0"/>
+                <w:iCs w:val="0"/>
+                <w:u w:val="none"/>
+                <w:color w:val="000000"/>
+                <w:sz w:val="20"/>
+                <w:szCs w:val="20"/>
+              </w:rPr>
+              <w:t xml:space="preserve">Object Storage Persistence</w:t>
+            </w:r>
+          </w:p>
+        </w:tc>
+        <w:tc>
+          <w:tcPr>
+            <w:tcW w:w="2340" w:type="dxa"/>
+            <w:tcBorders>
+              <w:top w:val="single" w:sz="4" w:color="000000"/>
+              <w:left w:val="single" w:sz="4" w:color="000000"/>
+              <w:bottom w:val="single" w:sz="4" w:color="000000"/>
+              <w:right w:val="single" w:sz="4" w:color="000000"/>
+            </w:tcBorders>
+            <w:vAlign w:val="center"/>
+          </w:tcPr>
+          <w:p>
+            <w:pPr>
+              <w:spacing w:before="40" w:after="40" w:line="240" w:lineRule="auto"/>
+            </w:pPr>
+            <w:r>
+              <w:rPr>
+                <w:rFonts w:ascii="Times New Roman" w:cs="Times New Roman" w:eastAsia="Times New Roman" w:hAnsi="Times New Roman"/>
+                <w:b/>
+                <w:bCs/>
+                <w:i w:val="0"/>
+                <w:iCs w:val="0"/>
+                <w:u w:val="none"/>
+                <w:color w:val="000000"/>
+                <w:sz w:val="20"/>
+                <w:szCs w:val="20"/>
+              </w:rPr>
+              <w:t xml:space="preserve">Cloudflare R2</w:t>
+            </w:r>
+            <w:r>
+              <w:rPr>
+                <w:rFonts w:ascii="Times New Roman" w:cs="Times New Roman" w:eastAsia="Times New Roman" w:hAnsi="Times New Roman"/>
+                <w:b w:val="0"/>
+                <w:bCs w:val="0"/>
+                <w:i w:val="0"/>
+                <w:iCs w:val="0"/>
+                <w:u w:val="none"/>
+                <w:color w:val="000000"/>
+                <w:sz w:val="20"/>
+                <w:szCs w:val="20"/>
+              </w:rPr>
+              <w:t xml:space="preserve"> (Direct Presigned Uploads)</w:t>
+            </w:r>
+          </w:p>
+        </w:tc>
+        <w:tc>
+          <w:tcPr>
+            <w:tcW w:w="2340" w:type="dxa"/>
+            <w:tcBorders>
+              <w:top w:val="single" w:sz="4" w:color="000000"/>
+              <w:left w:val="single" w:sz="4" w:color="000000"/>
+              <w:bottom w:val="single" w:sz="4" w:color="000000"/>
+              <w:right w:val="single" w:sz="4" w:color="000000"/>
+            </w:tcBorders>
+            <w:vAlign w:val="center"/>
+          </w:tcPr>
+          <w:p>
+            <w:pPr>
+              <w:spacing w:before="40" w:after="40" w:line="240" w:lineRule="auto"/>
+            </w:pPr>
+            <w:r>
+              <w:rPr>
+                <w:rFonts w:ascii="Times New Roman" w:cs="Times New Roman" w:eastAsia="Times New Roman" w:hAnsi="Times New Roman"/>
+                <w:b w:val="0"/>
+                <w:bCs w:val="0"/>
+                <w:i w:val="0"/>
+                <w:iCs w:val="0"/>
+                <w:u w:val="none"/>
+                <w:color w:val="000000"/>
+                <w:sz w:val="20"/>
+                <w:szCs w:val="20"/>
+              </w:rPr>
+              <w:t xml:space="preserve">AWS S3 Standard; Google Cloud Storage (GCS)</w:t>
+            </w:r>
+          </w:p>
+        </w:tc>
+        <w:tc>
+          <w:tcPr>
+            <w:tcW w:w="2340" w:type="dxa"/>
+            <w:tcBorders>
+              <w:top w:val="single" w:sz="4" w:color="000000"/>
+              <w:left w:val="single" w:sz="4" w:color="000000"/>
+              <w:bottom w:val="single" w:sz="4" w:color="000000"/>
+              <w:right w:val="single" w:sz="4" w:color="000000"/>
+            </w:tcBorders>
+            <w:vAlign w:val="center"/>
+          </w:tcPr>
+          <w:p>
+            <w:pPr>
+              <w:spacing w:before="40" w:after="40" w:line="240" w:lineRule="auto"/>
+            </w:pPr>
+            <w:r>
+              <w:rPr>
+                <w:rFonts w:ascii="Times New Roman" w:cs="Times New Roman" w:eastAsia="Times New Roman" w:hAnsi="Times New Roman"/>
+                <w:b w:val="0"/>
+                <w:bCs w:val="0"/>
+                <w:i w:val="0"/>
+                <w:iCs w:val="0"/>
+                <w:u w:val="none"/>
+                <w:color w:val="000000"/>
+                <w:sz w:val="20"/>
+                <w:szCs w:val="20"/>
+              </w:rPr>
+              <w:t xml:space="preserve">S3-compatible API with zero egress fees, eliminating bandwidth charges for PoC downloads; provides predictable cost boundaries for academic demo and commercial sizing.</w:t>
+            </w:r>
+          </w:p>
+        </w:tc>
+      </w:tr>
+      <w:tr>
+        <w:trPr>
+          <w:cantSplit/>
+        </w:trPr>
+        <w:tc>
+          <w:tcPr>
+            <w:tcW w:w="2340" w:type="dxa"/>
+            <w:tcBorders>
+              <w:top w:val="single" w:sz="4" w:color="000000"/>
+              <w:left w:val="single" w:sz="4" w:color="000000"/>
+              <w:bottom w:val="single" w:sz="4" w:color="000000"/>
+              <w:right w:val="single" w:sz="4" w:color="000000"/>
+            </w:tcBorders>
+            <w:vAlign w:val="center"/>
+          </w:tcPr>
+          <w:p>
+            <w:pPr>
+              <w:spacing w:before="40" w:after="40" w:line="240" w:lineRule="auto"/>
+            </w:pPr>
+            <w:r>
+              <w:rPr>
+                <w:rFonts w:ascii="Times New Roman" w:cs="Times New Roman" w:eastAsia="Times New Roman" w:hAnsi="Times New Roman"/>
+                <w:b/>
+                <w:bCs/>
+                <w:i w:val="0"/>
+                <w:iCs w:val="0"/>
+                <w:u w:val="none"/>
+                <w:color w:val="000000"/>
+                <w:sz w:val="20"/>
+                <w:szCs w:val="20"/>
+              </w:rPr>
+              <w:t xml:space="preserve">Bot Protection &amp; Perimeter Defense</w:t>
+            </w:r>
+          </w:p>
+        </w:tc>
+        <w:tc>
+          <w:tcPr>
+            <w:tcW w:w="2340" w:type="dxa"/>
+            <w:tcBorders>
+              <w:top w:val="single" w:sz="4" w:color="000000"/>
+              <w:left w:val="single" w:sz="4" w:color="000000"/>
+              <w:bottom w:val="single" w:sz="4" w:color="000000"/>
+              <w:right w:val="single" w:sz="4" w:color="000000"/>
+            </w:tcBorders>
+            <w:vAlign w:val="center"/>
+          </w:tcPr>
+          <w:p>
+            <w:pPr>
+              <w:spacing w:before="40" w:after="40" w:line="240" w:lineRule="auto"/>
+            </w:pPr>
+            <w:r>
+              <w:rPr>
+                <w:rFonts w:ascii="Times New Roman" w:cs="Times New Roman" w:eastAsia="Times New Roman" w:hAnsi="Times New Roman"/>
+                <w:b/>
+                <w:bCs/>
+                <w:i w:val="0"/>
+                <w:iCs w:val="0"/>
+                <w:u w:val="none"/>
+                <w:color w:val="000000"/>
+                <w:sz w:val="20"/>
+                <w:szCs w:val="20"/>
+              </w:rPr>
+              <w:t xml:space="preserve">Cloudflare Turnstile</w:t>
+            </w:r>
+            <w:r>
+              <w:rPr>
+                <w:rFonts w:ascii="Times New Roman" w:cs="Times New Roman" w:eastAsia="Times New Roman" w:hAnsi="Times New Roman"/>
+                <w:b w:val="0"/>
+                <w:bCs w:val="0"/>
+                <w:i w:val="0"/>
+                <w:iCs w:val="0"/>
+                <w:u w:val="none"/>
+                <w:color w:val="000000"/>
+                <w:sz w:val="20"/>
+                <w:szCs w:val="20"/>
+              </w:rPr>
+              <w:t xml:space="preserve"> &amp; Cloudflare Anycast WAF</w:t>
+            </w:r>
+          </w:p>
+        </w:tc>
+        <w:tc>
+          <w:tcPr>
+            <w:tcW w:w="2340" w:type="dxa"/>
+            <w:tcBorders>
+              <w:top w:val="single" w:sz="4" w:color="000000"/>
+              <w:left w:val="single" w:sz="4" w:color="000000"/>
+              <w:bottom w:val="single" w:sz="4" w:color="000000"/>
+              <w:right w:val="single" w:sz="4" w:color="000000"/>
+            </w:tcBorders>
+            <w:vAlign w:val="center"/>
+          </w:tcPr>
+          <w:p>
+            <w:pPr>
+              <w:spacing w:before="40" w:after="40" w:line="240" w:lineRule="auto"/>
+            </w:pPr>
+            <w:r>
+              <w:rPr>
+                <w:rFonts w:ascii="Times New Roman" w:cs="Times New Roman" w:eastAsia="Times New Roman" w:hAnsi="Times New Roman"/>
+                <w:b w:val="0"/>
+                <w:bCs w:val="0"/>
+                <w:i w:val="0"/>
+                <w:iCs w:val="0"/>
+                <w:u w:val="none"/>
+                <w:color w:val="000000"/>
+                <w:sz w:val="20"/>
+                <w:szCs w:val="20"/>
+              </w:rPr>
+              <w:t xml:space="preserve">Google reCAPTCHA v3; hCaptcha</w:t>
+            </w:r>
+          </w:p>
+        </w:tc>
+        <w:tc>
+          <w:tcPr>
+            <w:tcW w:w="2340" w:type="dxa"/>
+            <w:tcBorders>
+              <w:top w:val="single" w:sz="4" w:color="000000"/>
+              <w:left w:val="single" w:sz="4" w:color="000000"/>
+              <w:bottom w:val="single" w:sz="4" w:color="000000"/>
+              <w:right w:val="single" w:sz="4" w:color="000000"/>
+            </w:tcBorders>
+            <w:vAlign w:val="center"/>
+          </w:tcPr>
+          <w:p>
+            <w:pPr>
+              <w:spacing w:before="40" w:after="40" w:line="240" w:lineRule="auto"/>
+            </w:pPr>
+            <w:r>
+              <w:rPr>
+                <w:rFonts w:ascii="Times New Roman" w:cs="Times New Roman" w:eastAsia="Times New Roman" w:hAnsi="Times New Roman"/>
+                <w:b w:val="0"/>
+                <w:bCs w:val="0"/>
+                <w:i w:val="0"/>
+                <w:iCs w:val="0"/>
+                <w:u w:val="none"/>
+                <w:color w:val="000000"/>
+                <w:sz w:val="20"/>
+                <w:szCs w:val="20"/>
+              </w:rPr>
+              <w:t xml:space="preserve">Privacy-preserving, non-interactive bot verification; zero user tracking cookies; seamless Next.js drop-in; protects unauthenticated guest intake endpoints.</w:t>
+            </w:r>
+          </w:p>
+        </w:tc>
+      </w:tr>
+      <w:tr>
+        <w:trPr>
+          <w:cantSplit/>
+        </w:trPr>
+        <w:tc>
+          <w:tcPr>
+            <w:tcW w:w="2340" w:type="dxa"/>
+            <w:tcBorders>
+              <w:top w:val="single" w:sz="4" w:color="000000"/>
+              <w:left w:val="single" w:sz="4" w:color="000000"/>
+              <w:bottom w:val="single" w:sz="4" w:color="000000"/>
+              <w:right w:val="single" w:sz="4" w:color="000000"/>
+            </w:tcBorders>
+            <w:vAlign w:val="center"/>
+          </w:tcPr>
+          <w:p>
+            <w:pPr>
+              <w:spacing w:before="40" w:after="40" w:line="240" w:lineRule="auto"/>
+            </w:pPr>
+            <w:r>
+              <w:rPr>
+                <w:rFonts w:ascii="Times New Roman" w:cs="Times New Roman" w:eastAsia="Times New Roman" w:hAnsi="Times New Roman"/>
+                <w:b/>
+                <w:bCs/>
+                <w:i w:val="0"/>
+                <w:iCs w:val="0"/>
+                <w:u w:val="none"/>
+                <w:color w:val="000000"/>
+                <w:sz w:val="20"/>
+                <w:szCs w:val="20"/>
+              </w:rPr>
+              <w:t xml:space="preserve">Transactional Notification Mail</w:t>
+            </w:r>
+          </w:p>
+        </w:tc>
+        <w:tc>
+          <w:tcPr>
+            <w:tcW w:w="2340" w:type="dxa"/>
+            <w:tcBorders>
+              <w:top w:val="single" w:sz="4" w:color="000000"/>
+              <w:left w:val="single" w:sz="4" w:color="000000"/>
+              <w:bottom w:val="single" w:sz="4" w:color="000000"/>
+              <w:right w:val="single" w:sz="4" w:color="000000"/>
+            </w:tcBorders>
+            <w:vAlign w:val="center"/>
+          </w:tcPr>
+          <w:p>
+            <w:pPr>
+              <w:spacing w:before="40" w:after="40" w:line="240" w:lineRule="auto"/>
+            </w:pPr>
+            <w:r>
+              <w:rPr>
+                <w:rFonts w:ascii="Times New Roman" w:cs="Times New Roman" w:eastAsia="Times New Roman" w:hAnsi="Times New Roman"/>
+                <w:b/>
+                <w:bCs/>
+                <w:i w:val="0"/>
+                <w:iCs w:val="0"/>
+                <w:u w:val="none"/>
+                <w:color w:val="000000"/>
+                <w:sz w:val="20"/>
+                <w:szCs w:val="20"/>
+              </w:rPr>
+              <w:t xml:space="preserve">Resend API</w:t>
+            </w:r>
+            <w:r>
+              <w:rPr>
+                <w:rFonts w:ascii="Times New Roman" w:cs="Times New Roman" w:eastAsia="Times New Roman" w:hAnsi="Times New Roman"/>
+                <w:b w:val="0"/>
+                <w:bCs w:val="0"/>
+                <w:i w:val="0"/>
+                <w:iCs w:val="0"/>
+                <w:u w:val="none"/>
+                <w:color w:val="000000"/>
+                <w:sz w:val="20"/>
+                <w:szCs w:val="20"/>
+              </w:rPr>
+              <w:t xml:space="preserve"> (Node.js REST SDK)</w:t>
+            </w:r>
+          </w:p>
+        </w:tc>
+        <w:tc>
+          <w:tcPr>
+            <w:tcW w:w="2340" w:type="dxa"/>
+            <w:tcBorders>
+              <w:top w:val="single" w:sz="4" w:color="000000"/>
+              <w:left w:val="single" w:sz="4" w:color="000000"/>
+              <w:bottom w:val="single" w:sz="4" w:color="000000"/>
+              <w:right w:val="single" w:sz="4" w:color="000000"/>
+            </w:tcBorders>
+            <w:vAlign w:val="center"/>
+          </w:tcPr>
+          <w:p>
+            <w:pPr>
+              <w:spacing w:before="40" w:after="40" w:line="240" w:lineRule="auto"/>
+            </w:pPr>
+            <w:r>
+              <w:rPr>
+                <w:rFonts w:ascii="Times New Roman" w:cs="Times New Roman" w:eastAsia="Times New Roman" w:hAnsi="Times New Roman"/>
+                <w:b w:val="0"/>
+                <w:bCs w:val="0"/>
+                <w:i w:val="0"/>
+                <w:iCs w:val="0"/>
+                <w:u w:val="none"/>
+                <w:color w:val="000000"/>
+                <w:sz w:val="20"/>
+                <w:szCs w:val="20"/>
+              </w:rPr>
+              <w:t xml:space="preserve">AWS SES; SendGrid; Postmark</w:t>
+            </w:r>
+          </w:p>
+        </w:tc>
+        <w:tc>
+          <w:tcPr>
+            <w:tcW w:w="2340" w:type="dxa"/>
+            <w:tcBorders>
+              <w:top w:val="single" w:sz="4" w:color="000000"/>
+              <w:left w:val="single" w:sz="4" w:color="000000"/>
+              <w:bottom w:val="single" w:sz="4" w:color="000000"/>
+              <w:right w:val="single" w:sz="4" w:color="000000"/>
+            </w:tcBorders>
+            <w:vAlign w:val="center"/>
+          </w:tcPr>
+          <w:p>
+            <w:pPr>
+              <w:spacing w:before="40" w:after="40" w:line="240" w:lineRule="auto"/>
+            </w:pPr>
+            <w:r>
+              <w:rPr>
+                <w:rFonts w:ascii="Times New Roman" w:cs="Times New Roman" w:eastAsia="Times New Roman" w:hAnsi="Times New Roman"/>
+                <w:b w:val="0"/>
+                <w:bCs w:val="0"/>
+                <w:i w:val="0"/>
+                <w:iCs w:val="0"/>
+                <w:u w:val="none"/>
+                <w:color w:val="000000"/>
+                <w:sz w:val="20"/>
+                <w:szCs w:val="20"/>
+              </w:rPr>
+              <w:t xml:space="preserve">Clean modern REST API with native React Email support and zero complex SMTP handshake overhead; free tier provides 3,000 metadata-only alerts/month.</w:t>
+            </w:r>
+          </w:p>
+        </w:tc>
+      </w:tr>
+      <w:tr>
+        <w:trPr>
+          <w:cantSplit/>
+        </w:trPr>
+        <w:tc>
+          <w:tcPr>
+            <w:tcW w:w="2340" w:type="dxa"/>
+            <w:tcBorders>
+              <w:top w:val="single" w:sz="4" w:color="000000"/>
+              <w:left w:val="single" w:sz="4" w:color="000000"/>
+              <w:bottom w:val="single" w:sz="4" w:color="000000"/>
+              <w:right w:val="single" w:sz="4" w:color="000000"/>
+            </w:tcBorders>
+            <w:vAlign w:val="center"/>
+          </w:tcPr>
+          <w:p>
+            <w:pPr>
+              <w:spacing w:before="40" w:after="40" w:line="240" w:lineRule="auto"/>
+            </w:pPr>
+            <w:r>
+              <w:rPr>
+                <w:rFonts w:ascii="Times New Roman" w:cs="Times New Roman" w:eastAsia="Times New Roman" w:hAnsi="Times New Roman"/>
+                <w:b/>
+                <w:bCs/>
+                <w:i w:val="0"/>
+                <w:iCs w:val="0"/>
+                <w:u w:val="none"/>
+                <w:color w:val="000000"/>
+                <w:sz w:val="20"/>
+                <w:szCs w:val="20"/>
+              </w:rPr>
+              <w:t xml:space="preserve">Continuous Automation &amp; Cron</w:t>
+            </w:r>
+          </w:p>
+        </w:tc>
+        <w:tc>
+          <w:tcPr>
+            <w:tcW w:w="2340" w:type="dxa"/>
+            <w:tcBorders>
+              <w:top w:val="single" w:sz="4" w:color="000000"/>
+              <w:left w:val="single" w:sz="4" w:color="000000"/>
+              <w:bottom w:val="single" w:sz="4" w:color="000000"/>
+              <w:right w:val="single" w:sz="4" w:color="000000"/>
+            </w:tcBorders>
+            <w:vAlign w:val="center"/>
+          </w:tcPr>
+          <w:p>
+            <w:pPr>
+              <w:spacing w:before="40" w:after="40" w:line="240" w:lineRule="auto"/>
+            </w:pPr>
+            <w:r>
+              <w:rPr>
+                <w:rFonts w:ascii="Times New Roman" w:cs="Times New Roman" w:eastAsia="Times New Roman" w:hAnsi="Times New Roman"/>
+                <w:b/>
+                <w:bCs/>
+                <w:i w:val="0"/>
+                <w:iCs w:val="0"/>
+                <w:u w:val="none"/>
+                <w:color w:val="000000"/>
+                <w:sz w:val="20"/>
+                <w:szCs w:val="20"/>
+              </w:rPr>
+              <w:t xml:space="preserve">GitHub Actions</w:t>
+            </w:r>
+            <w:r>
+              <w:rPr>
+                <w:rFonts w:ascii="Times New Roman" w:cs="Times New Roman" w:eastAsia="Times New Roman" w:hAnsi="Times New Roman"/>
+                <w:b w:val="0"/>
+                <w:bCs w:val="0"/>
+                <w:i w:val="0"/>
+                <w:iCs w:val="0"/>
+                <w:u w:val="none"/>
+                <w:color w:val="000000"/>
+                <w:sz w:val="20"/>
+                <w:szCs w:val="20"/>
+              </w:rPr>
+              <w:t xml:space="preserve"> (Ubuntu 22.04 LTS Runners)</w:t>
+            </w:r>
+          </w:p>
+        </w:tc>
+        <w:tc>
+          <w:tcPr>
+            <w:tcW w:w="2340" w:type="dxa"/>
+            <w:tcBorders>
+              <w:top w:val="single" w:sz="4" w:color="000000"/>
+              <w:left w:val="single" w:sz="4" w:color="000000"/>
+              <w:bottom w:val="single" w:sz="4" w:color="000000"/>
+              <w:right w:val="single" w:sz="4" w:color="000000"/>
+            </w:tcBorders>
+            <w:vAlign w:val="center"/>
+          </w:tcPr>
+          <w:p>
+            <w:pPr>
+              <w:spacing w:before="40" w:after="40" w:line="240" w:lineRule="auto"/>
+            </w:pPr>
+            <w:r>
+              <w:rPr>
+                <w:rFonts w:ascii="Times New Roman" w:cs="Times New Roman" w:eastAsia="Times New Roman" w:hAnsi="Times New Roman"/>
+                <w:b w:val="0"/>
+                <w:bCs w:val="0"/>
+                <w:i w:val="0"/>
+                <w:iCs w:val="0"/>
+                <w:u w:val="none"/>
+                <w:color w:val="000000"/>
+                <w:sz w:val="20"/>
+                <w:szCs w:val="20"/>
+              </w:rPr>
+              <w:t xml:space="preserve">GitLab CI; CircleCI; AWS EventBridge</w:t>
+            </w:r>
+          </w:p>
+        </w:tc>
+        <w:tc>
+          <w:tcPr>
+            <w:tcW w:w="2340" w:type="dxa"/>
+            <w:tcBorders>
+              <w:top w:val="single" w:sz="4" w:color="000000"/>
+              <w:left w:val="single" w:sz="4" w:color="000000"/>
+              <w:bottom w:val="single" w:sz="4" w:color="000000"/>
+              <w:right w:val="single" w:sz="4" w:color="000000"/>
+            </w:tcBorders>
+            <w:vAlign w:val="center"/>
+          </w:tcPr>
+          <w:p>
+            <w:pPr>
+              <w:spacing w:before="40" w:after="40" w:line="240" w:lineRule="auto"/>
+            </w:pPr>
+            <w:r>
+              <w:rPr>
+                <w:rFonts w:ascii="Times New Roman" w:cs="Times New Roman" w:eastAsia="Times New Roman" w:hAnsi="Times New Roman"/>
+                <w:b w:val="0"/>
+                <w:bCs w:val="0"/>
+                <w:i w:val="0"/>
+                <w:iCs w:val="0"/>
+                <w:u w:val="none"/>
+                <w:color w:val="000000"/>
+                <w:sz w:val="20"/>
+                <w:szCs w:val="20"/>
+              </w:rPr>
+              <w:t xml:space="preserve">Native repository integration; provides 2,000 free runner minutes/month; executes hourly scheduled jobs via HMAC-SHA256 on </w:t>
+            </w:r>
+            <w:r>
+              <w:rPr>
+                <w:rFonts w:ascii="Times New Roman" w:cs="Times New Roman" w:eastAsia="Times New Roman" w:hAnsi="Times New Roman"/>
+                <w:b w:val="0"/>
+                <w:bCs w:val="0"/>
+                <w:i w:val="0"/>
+                <w:iCs w:val="0"/>
+                <w:u w:val="none"/>
+                <w:color w:val="000000"/>
+                <w:sz w:val="20"/>
+                <w:szCs w:val="20"/>
+              </w:rPr>
+              <w:t xml:space="preserve">/api/v1/internal/cron/sla-check</w:t>
+            </w:r>
+            <w:r>
+              <w:rPr>
+                <w:rFonts w:ascii="Times New Roman" w:cs="Times New Roman" w:eastAsia="Times New Roman" w:hAnsi="Times New Roman"/>
+                <w:b w:val="0"/>
+                <w:bCs w:val="0"/>
+                <w:i w:val="0"/>
+                <w:iCs w:val="0"/>
+                <w:u w:val="none"/>
+                <w:color w:val="000000"/>
+                <w:sz w:val="20"/>
+                <w:szCs w:val="20"/>
+              </w:rPr>
+              <w:t xml:space="preserve"> (</w:t>
+            </w:r>
+            <w:r>
+              <w:rPr>
+                <w:rFonts w:ascii="Times New Roman" w:cs="Times New Roman" w:eastAsia="Times New Roman" w:hAnsi="Times New Roman"/>
+                <w:b w:val="0"/>
+                <w:bCs w:val="0"/>
+                <w:i w:val="0"/>
+                <w:iCs w:val="0"/>
+                <w:u w:val="none"/>
+                <w:color w:val="000000"/>
+                <w:sz w:val="20"/>
+                <w:szCs w:val="20"/>
+              </w:rPr>
+              <w:t xml:space="preserve">FR-5.4</w:t>
+            </w:r>
+            <w:r>
+              <w:rPr>
+                <w:rFonts w:ascii="Times New Roman" w:cs="Times New Roman" w:eastAsia="Times New Roman" w:hAnsi="Times New Roman"/>
+                <w:b w:val="0"/>
+                <w:bCs w:val="0"/>
+                <w:i w:val="0"/>
+                <w:iCs w:val="0"/>
+                <w:u w:val="none"/>
+                <w:color w:val="000000"/>
+                <w:sz w:val="20"/>
+                <w:szCs w:val="20"/>
+              </w:rPr>
+              <w:t xml:space="preserve">).</w:t>
+            </w:r>
+          </w:p>
+        </w:tc>
+      </w:tr>
+    </w:tbl>
     <w:p>
       <w:pPr>
         <w:pBdr>
@@ -16925,7 +17854,7 @@
           <w:sz w:val="24"/>
           <w:szCs w:val="24"/>
         </w:rPr>
-        <w:t xml:space="preserve">5.3 Infrastructure Cost Feasibility &amp; Financial Viability Analysis</w:t>
+        <w:t xml:space="preserve">5.3 Infrastructure Cost Feasibility &amp; Workload Sizing Analysis</w:t>
       </w:r>
     </w:p>
     <w:p>
@@ -16946,7 +17875,7 @@
           <w:sz w:val="22"/>
           <w:szCs w:val="22"/>
         </w:rPr>
-        <w:t xml:space="preserve">Academic Demonstration Budget (Zero-Cost Baseline)</w:t>
+        <w:t xml:space="preserve">Academic Demonstration Budget (Zero-Cost Baseline Estimate)</w:t>
       </w:r>
     </w:p>
     <w:p>
@@ -16966,7 +17895,7 @@
           <w:sz w:val="22"/>
           <w:szCs w:val="22"/>
         </w:rPr>
-        <w:t xml:space="preserve">To satisfy university evaluation requirements without requiring external departmental funding or personal cash outlay, the entire architecture operates within documented permanent free tiers:</w:t>
+        <w:t xml:space="preserve">To satisfy university evaluation requirements without requiring external departmental funding or personal cash outlay, the architecture is sized to operate within documented cloud provider free tier allowances during prototype demonstration:</w:t>
       </w:r>
     </w:p>
     <w:tbl>
@@ -17119,7 +18048,7 @@
                 <w:sz w:val="20"/>
                 <w:szCs w:val="20"/>
               </w:rPr>
-              <w:t xml:space="preserve">Demonstration Cost</w:t>
+              <w:t xml:space="preserve">Demonstration Cost Estimate</w:t>
             </w:r>
           </w:p>
         </w:tc>
@@ -17929,7 +18858,7 @@
                 <w:sz w:val="20"/>
                 <w:szCs w:val="20"/>
               </w:rPr>
-              <w:t xml:space="preserve">TOTAL ACADEMIC EVALUATION COST</w:t>
+              <w:t xml:space="preserve">TOTAL ACADEMIC EVALUATION ESTIMATE</w:t>
             </w:r>
           </w:p>
         </w:tc>
@@ -17991,7 +18920,7 @@
                 <w:sz w:val="20"/>
                 <w:szCs w:val="20"/>
               </w:rPr>
-              <w:t xml:space="preserve">Fully Functional FYP Prototype</w:t>
+              <w:t xml:space="preserve">Subject to Provider Quotas &amp; Workload</w:t>
             </w:r>
           </w:p>
         </w:tc>
@@ -18046,7 +18975,7 @@
           <w:sz w:val="22"/>
           <w:szCs w:val="22"/>
         </w:rPr>
-        <w:t xml:space="preserve">Commercial Production Budget (10–25 Organizations Baseline)</w:t>
+        <w:t xml:space="preserve">Commercial Production Budget (10–25 Organizations Workload Projection)</w:t>
       </w:r>
     </w:p>
     <w:p>
@@ -18066,7 +18995,7 @@
           <w:sz w:val="22"/>
           <w:szCs w:val="22"/>
         </w:rPr>
-        <w:t xml:space="preserve">When transitioning to commercial production for small software startups, the architecture scales linearly with minimal fixed overhead:</w:t>
+        <w:t xml:space="preserve">When transitioning to commercial production for small software startups, the architecture is projected to scale with minimal fixed infrastructure overhead:</w:t>
       </w:r>
     </w:p>
     <w:tbl>
@@ -18188,7 +19117,7 @@
                 <w:sz w:val="20"/>
                 <w:szCs w:val="20"/>
               </w:rPr>
-              <w:t xml:space="preserve">Purpose &amp; Sizing Bounds</w:t>
+              <w:t xml:space="preserve">Sizing Bounds &amp; Purpose</w:t>
             </w:r>
           </w:p>
         </w:tc>
@@ -18219,7 +19148,7 @@
                 <w:sz w:val="20"/>
                 <w:szCs w:val="20"/>
               </w:rPr>
-              <w:t xml:space="preserve">Monthly Cost ($USD)</w:t>
+              <w:t xml:space="preserve">Monthly Cost Estimate ($USD)</w:t>
             </w:r>
           </w:p>
         </w:tc>
@@ -18317,7 +19246,7 @@
                 <w:sz w:val="20"/>
                 <w:szCs w:val="20"/>
               </w:rPr>
-              <w:t xml:space="preserve">Commercial SLA (99.5% uptime </w:t>
+              <w:t xml:space="preserve">Commercial SLA (99.5% uptime target </w:t>
             </w:r>
             <w:r>
               <w:rPr>
@@ -18956,7 +19885,7 @@
                 <w:sz w:val="20"/>
                 <w:szCs w:val="20"/>
               </w:rPr>
-              <w:t xml:space="preserve">TOTAL COMMERCIAL RUNTIME BASELINE</w:t>
+              <w:t xml:space="preserve">TOTAL ESTIMATED MONTHLY RUNTIME BASELINE</w:t>
             </w:r>
           </w:p>
         </w:tc>
@@ -19018,7 +19947,7 @@
                 <w:sz w:val="20"/>
                 <w:szCs w:val="20"/>
               </w:rPr>
-              <w:t xml:space="preserve">Supports 25 Startups (~2,500 reports/year)</w:t>
+              <w:t xml:space="preserve">Baseline Projection for 10–25 Startups</w:t>
             </w:r>
           </w:p>
         </w:tc>
@@ -19076,7 +20005,7 @@
           <w:sz w:val="21"/>
           <w:szCs w:val="21"/>
         </w:rPr>
-        <w:t xml:space="preserve">Financial Viability Finding</w:t>
+        <w:t xml:space="preserve">Budget Sizing Note</w:t>
       </w:r>
       <w:r>
         <w:rPr>
@@ -19090,63 +20019,7 @@
           <w:sz w:val="21"/>
           <w:szCs w:val="21"/>
         </w:rPr>
-        <w:t xml:space="preserve">: At a modest commercial price point of </w:t>
-      </w:r>
-      <w:r>
-        <w:rPr>
-          <w:rFonts w:ascii="Times New Roman" w:cs="Times New Roman" w:eastAsia="Times New Roman" w:hAnsi="Times New Roman"/>
-          <w:b/>
-          <w:bCs/>
-          <w:i/>
-          <w:iCs/>
-          <w:u w:val="none"/>
-          <w:color w:val="000000"/>
-          <w:sz w:val="21"/>
-          <w:szCs w:val="21"/>
-        </w:rPr>
-        <w:t xml:space="preserve">$49.00/month per organization</w:t>
-      </w:r>
-      <w:r>
-        <w:rPr>
-          <w:rFonts w:ascii="Times New Roman" w:cs="Times New Roman" w:eastAsia="Times New Roman" w:hAnsi="Times New Roman"/>
-          <w:b w:val="0"/>
-          <w:bCs w:val="0"/>
-          <w:i/>
-          <w:iCs/>
-          <w:u w:val="none"/>
-          <w:color w:val="000000"/>
-          <w:sz w:val="21"/>
-          <w:szCs w:val="21"/>
-        </w:rPr>
-        <w:t xml:space="preserve"> for the Team Tier, BugBountyTrack achieves </w:t>
-      </w:r>
-      <w:r>
-        <w:rPr>
-          <w:rFonts w:ascii="Times New Roman" w:cs="Times New Roman" w:eastAsia="Times New Roman" w:hAnsi="Times New Roman"/>
-          <w:b/>
-          <w:bCs/>
-          <w:i/>
-          <w:iCs/>
-          <w:u w:val="none"/>
-          <w:color w:val="000000"/>
-          <w:sz w:val="21"/>
-          <w:szCs w:val="21"/>
-        </w:rPr>
-        <w:t xml:space="preserve">break-even profitability with just two paying customers</w:t>
-      </w:r>
-      <w:r>
-        <w:rPr>
-          <w:rFonts w:ascii="Times New Roman" w:cs="Times New Roman" w:eastAsia="Times New Roman" w:hAnsi="Times New Roman"/>
-          <w:b w:val="0"/>
-          <w:bCs w:val="0"/>
-          <w:i/>
-          <w:iCs/>
-          <w:u w:val="none"/>
-          <w:color w:val="000000"/>
-          <w:sz w:val="21"/>
-          <w:szCs w:val="21"/>
-        </w:rPr>
-        <w:t xml:space="preserve"> ($98.00 revenue - $61.00 cloud cost = +$37.00 net margin), establishing exceptional commercial sustainability.</w:t>
+        <w:t xml:space="preserve">: The figures above represent an engineering cost projection subject to cloud provider terms, pricing changes, and actual application throughput. Commercial operations will be calibrated against production usage rather than speculative profitability assertions.</w:t>
       </w:r>
     </w:p>
     <w:p>
@@ -19219,7 +20092,7 @@
           <w:sz w:val="22"/>
           <w:szCs w:val="22"/>
         </w:rPr>
-        <w:t xml:space="preserve">To ground system development in working code and avoid premature document churn, the first implementation milestone will deliver the complete central end-to-end vulnerability coordination workflow:</w:t>
+        <w:t xml:space="preserve">To ground system development in running software and avoid circular document revisions, the initial implementation milestone will demonstrate the complete central vulnerability coordination workflow:</w:t>
       </w:r>
     </w:p>
     <w:p>
@@ -19413,7 +20286,7 @@
           <w:sz w:val="22"/>
           <w:szCs w:val="22"/>
         </w:rPr>
-        <w:t xml:space="preserve">) decrypts report metadata client-side, reviews triage parameters, and verifies deterministic FIRST.org CVSS v3.1 calculation.</w:t>
+        <w:t xml:space="preserve">) decrypts encrypted report content client-side, reviews triage parameters, and verifies deterministic FIRST.org CVSS v3.1 calculation.</w:t>
       </w:r>
     </w:p>
     <w:p>
@@ -19490,7 +20363,7 @@
           <w:sz w:val="22"/>
           <w:szCs w:val="22"/>
         </w:rPr>
-        <w:t xml:space="preserve">) or an encrypted configuration snapshot bound to a SHA-256 hash.</w:t>
+        <w:t xml:space="preserve">) to confirm commit existence and branch ancestry, or submits an encrypted configuration snapshot bound to a SHA-256 hash.</w:t>
       </w:r>
     </w:p>
     <w:p>
@@ -19713,7 +20586,7 @@
           <w:sz w:val="22"/>
           <w:szCs w:val="22"/>
         </w:rPr>
-        <w:t xml:space="preserve"> established in the submitted and approved IEEE 830 SRS (</w:t>
+        <w:t xml:space="preserve"> established in the submitted IEEE 830 SRS (</w:t>
       </w:r>
       <w:r>
         <w:rPr>
@@ -19818,7 +20691,7 @@
           <w:sz w:val="22"/>
           <w:szCs w:val="22"/>
         </w:rPr>
-        <w:t xml:space="preserve"> in the approved specification—including RFC 9116 </w:t>
+        <w:t xml:space="preserve"> in the submitted specification—including RFC 9116 </w:t>
       </w:r>
       <w:r>
         <w:rPr>
@@ -20300,7 +21173,35 @@
           <w:sz w:val="22"/>
           <w:szCs w:val="22"/>
         </w:rPr>
-        <w:t xml:space="preserve">FR-1.2b</w:t>
+        <w:t xml:space="preserve">FR-3.6</w:t>
+      </w:r>
+      <w:r>
+        <w:rPr>
+          <w:rFonts w:ascii="Times New Roman" w:cs="Times New Roman" w:eastAsia="Times New Roman" w:hAnsi="Times New Roman"/>
+          <w:b w:val="0"/>
+          <w:bCs w:val="0"/>
+          <w:i w:val="0"/>
+          <w:iCs w:val="0"/>
+          <w:u w:val="none"/>
+          <w:color w:val="000000"/>
+          <w:sz w:val="22"/>
+          <w:szCs w:val="22"/>
+        </w:rPr>
+        <w:t xml:space="preserve">, </w:t>
+      </w:r>
+      <w:r>
+        <w:rPr>
+          <w:rFonts w:ascii="Times New Roman" w:cs="Times New Roman" w:eastAsia="Times New Roman" w:hAnsi="Times New Roman"/>
+          <w:b w:val="0"/>
+          <w:bCs w:val="0"/>
+          <w:i w:val="0"/>
+          <w:iCs w:val="0"/>
+          <w:u w:val="none"/>
+          <w:color w:val="000000"/>
+          <w:sz w:val="22"/>
+          <w:szCs w:val="22"/>
+        </w:rPr>
+        <w:t xml:space="preserve">FR-3.8b</w:t>
       </w:r>
       <w:r>
         <w:rPr>
@@ -20349,7 +21250,7 @@
           <w:sz w:val="22"/>
           <w:szCs w:val="22"/>
         </w:rPr>
-        <w:t xml:space="preserve">tenant_row_hash</w:t>
+        <w:t xml:space="preserve">row_hash</w:t>
       </w:r>
       <w:r>
         <w:rPr>
@@ -21708,7 +22609,7 @@
                 <w:sz w:val="20"/>
                 <w:szCs w:val="20"/>
               </w:rPr>
-              <w:t xml:space="preserve">Turnstile CAPTCHA validation; rate limiting (10 req/hr/IP); presigned S3 upload; zero raw plaintext in SQL insert; 20 MiB intake / 6 MiB reserve quota check; </w:t>
+              <w:t xml:space="preserve">Turnstile CAPTCHA validation; rate limiting (10 req/hr/IP); presigned S3 upload referencing E5; zero raw plaintext in SQL insert; 20 MiB intake / 6 MiB reserve quota check; </w:t>
             </w:r>
             <w:r>
               <w:rPr>
@@ -21980,21 +22881,21 @@
                 <w:sz w:val="20"/>
                 <w:szCs w:val="20"/>
               </w:rPr>
-              <w:t xml:space="preserve">Accepts valid metrics in any order; computational parity across 45 FIRST.org test fixtures; calculation completes in &lt; 5 ms (</w:t>
-            </w:r>
-            <w:r>
-              <w:rPr>
-                <w:rFonts w:ascii="Times New Roman" w:cs="Times New Roman" w:eastAsia="Times New Roman" w:hAnsi="Times New Roman"/>
-                <w:b w:val="0"/>
-                <w:bCs w:val="0"/>
-                <w:i w:val="0"/>
-                <w:iCs w:val="0"/>
-                <w:u w:val="none"/>
-                <w:color w:val="000000"/>
-                <w:sz w:val="20"/>
-                <w:szCs w:val="20"/>
-              </w:rPr>
-              <w:t xml:space="preserve">NFR-02</w:t>
+              <w:t xml:space="preserve">Accepts valid metrics in any order; computational parity across 45 FIRST.org test fixtures; calculation completes in &lt; 5 ms proposed design target (</w:t>
+            </w:r>
+            <w:r>
+              <w:rPr>
+                <w:rFonts w:ascii="Times New Roman" w:cs="Times New Roman" w:eastAsia="Times New Roman" w:hAnsi="Times New Roman"/>
+                <w:b w:val="0"/>
+                <w:bCs w:val="0"/>
+                <w:i w:val="0"/>
+                <w:iCs w:val="0"/>
+                <w:u w:val="none"/>
+                <w:color w:val="000000"/>
+                <w:sz w:val="20"/>
+                <w:szCs w:val="20"/>
+              </w:rPr>
+              <w:t xml:space="preserve">FR-4</w:t>
             </w:r>
             <w:r>
               <w:rPr>
@@ -22251,6 +23152,34 @@
               </w:rPr>
               <w:t xml:space="preserve">UC-03</w:t>
             </w:r>
+            <w:r>
+              <w:rPr>
+                <w:rFonts w:ascii="Times New Roman" w:cs="Times New Roman" w:eastAsia="Times New Roman" w:hAnsi="Times New Roman"/>
+                <w:b w:val="0"/>
+                <w:bCs w:val="0"/>
+                <w:i w:val="0"/>
+                <w:iCs w:val="0"/>
+                <w:u w:val="none"/>
+                <w:color w:val="000000"/>
+                <w:sz w:val="20"/>
+                <w:szCs w:val="20"/>
+              </w:rPr>
+              <w:t xml:space="preserve">, </w:t>
+            </w:r>
+            <w:r>
+              <w:rPr>
+                <w:rFonts w:ascii="Times New Roman" w:cs="Times New Roman" w:eastAsia="Times New Roman" w:hAnsi="Times New Roman"/>
+                <w:b w:val="0"/>
+                <w:bCs w:val="0"/>
+                <w:i w:val="0"/>
+                <w:iCs w:val="0"/>
+                <w:u w:val="none"/>
+                <w:color w:val="000000"/>
+                <w:sz w:val="20"/>
+                <w:szCs w:val="20"/>
+              </w:rPr>
+              <w:t xml:space="preserve">UC-07</w:t>
+            </w:r>
           </w:p>
         </w:tc>
         <w:tc>
@@ -22280,7 +23209,35 @@
                 <w:sz w:val="20"/>
                 <w:szCs w:val="20"/>
               </w:rPr>
-              <w:t xml:space="preserve">Dual-lane message separation (Class B vs C); recipient version snapshot matching; minimal metadata email dispatch via Resend.</w:t>
+              <w:t xml:space="preserve">Dual-lane message separation (Class B vs C); recipient version snapshot matching; minimal metadata email dispatch via Resend; scheduled cron execution via HMAC-SHA256 (</w:t>
+            </w:r>
+            <w:r>
+              <w:rPr>
+                <w:rFonts w:ascii="Times New Roman" w:cs="Times New Roman" w:eastAsia="Times New Roman" w:hAnsi="Times New Roman"/>
+                <w:b w:val="0"/>
+                <w:bCs w:val="0"/>
+                <w:i w:val="0"/>
+                <w:iCs w:val="0"/>
+                <w:u w:val="none"/>
+                <w:color w:val="000000"/>
+                <w:sz w:val="20"/>
+                <w:szCs w:val="20"/>
+              </w:rPr>
+              <w:t xml:space="preserve">FR-5.4</w:t>
+            </w:r>
+            <w:r>
+              <w:rPr>
+                <w:rFonts w:ascii="Times New Roman" w:cs="Times New Roman" w:eastAsia="Times New Roman" w:hAnsi="Times New Roman"/>
+                <w:b w:val="0"/>
+                <w:bCs w:val="0"/>
+                <w:i w:val="0"/>
+                <w:iCs w:val="0"/>
+                <w:u w:val="none"/>
+                <w:color w:val="000000"/>
+                <w:sz w:val="20"/>
+                <w:szCs w:val="20"/>
+              </w:rPr>
+              <w:t xml:space="preserve">).</w:t>
             </w:r>
           </w:p>
         </w:tc>
@@ -22524,7 +23481,7 @@
                 <w:sz w:val="20"/>
                 <w:szCs w:val="20"/>
               </w:rPr>
-              <w:t xml:space="preserve">GitHub REST API commit validation (</w:t>
+              <w:t xml:space="preserve">GitHub REST API commit verification (</w:t>
             </w:r>
             <w:r>
               <w:rPr>
@@ -22552,7 +23509,7 @@
                 <w:sz w:val="20"/>
                 <w:szCs w:val="20"/>
               </w:rPr>
-              <w:t xml:space="preserve">); encrypted config snapshot hash binding.</w:t>
+              <w:t xml:space="preserve">) confirming commit existence and branch ancestry; encrypted config snapshot hash binding.</w:t>
             </w:r>
           </w:p>
         </w:tc>
@@ -23104,7 +24061,7 @@
                 <w:sz w:val="20"/>
                 <w:szCs w:val="20"/>
               </w:rPr>
-              <w:t xml:space="preserve">tenant_row_hash</w:t>
+              <w:t xml:space="preserve">row_hash</w:t>
             </w:r>
             <w:r>
               <w:rPr>
@@ -23146,7 +24103,7 @@
                 <w:sz w:val="20"/>
                 <w:szCs w:val="20"/>
               </w:rPr>
-              <w:t xml:space="preserve">); hourly claim-lease R2 reclamation; signed closure export (</w:t>
+              <w:t xml:space="preserve">); hourly claim-lease R2 reclamation via E5 and D5; signed closure export (</w:t>
             </w:r>
             <w:r>
               <w:rPr>
@@ -23334,7 +24291,7 @@
           <w:sz w:val="22"/>
           <w:szCs w:val="22"/>
         </w:rPr>
-        <w:t xml:space="preserve">). All architectural patterns, trust boundaries, data flows, and infrastructure cost models have been formulated to satisfy the University Final Year Project syllabus and align completely with the approved IEEE 830 Software Requirements Specification (</w:t>
+        <w:t xml:space="preserve">). All architectural patterns, trust boundaries, data flows, and infrastructure cost estimates have been formulated as a work-in-progress deliverable to satisfy the University Final Year Project syllabus and align completely with the submitted IEEE 830 Software Requirements Specification (</w:t>
       </w:r>
       <w:r>
         <w:rPr>

</xml_diff>